<commit_message>
feat: Phase 5 — posts & media
Co-Authored-By: Claude Sonnet 4.6 <noreply@anthropic.com>
</commit_message>
<xml_diff>
--- a/moments_product_spec.docx
+++ b/moments_product_spec.docx
@@ -314,7 +314,7 @@
         <w:pStyle w:val="ListParagraph"/>
         <w:numPr>
           <w:ilvl w:val="0"/>
-          <w:numId w:val="2"/>
+          <w:numId w:val="4"/>
         </w:numPr>
         <w:spacing w:before="40" w:after="40"/>
       </w:pPr>
@@ -327,7 +327,7 @@
         <w:pStyle w:val="ListParagraph"/>
         <w:numPr>
           <w:ilvl w:val="0"/>
-          <w:numId w:val="2"/>
+          <w:numId w:val="4"/>
         </w:numPr>
         <w:spacing w:before="40" w:after="40"/>
       </w:pPr>
@@ -340,7 +340,7 @@
         <w:pStyle w:val="ListParagraph"/>
         <w:numPr>
           <w:ilvl w:val="0"/>
-          <w:numId w:val="2"/>
+          <w:numId w:val="4"/>
         </w:numPr>
         <w:spacing w:before="40" w:after="40"/>
       </w:pPr>
@@ -353,7 +353,7 @@
         <w:pStyle w:val="ListParagraph"/>
         <w:numPr>
           <w:ilvl w:val="0"/>
-          <w:numId w:val="2"/>
+          <w:numId w:val="4"/>
         </w:numPr>
         <w:spacing w:before="40" w:after="40"/>
       </w:pPr>
@@ -378,7 +378,7 @@
         <w:pStyle w:val="ListParagraph"/>
         <w:numPr>
           <w:ilvl w:val="0"/>
-          <w:numId w:val="2"/>
+          <w:numId w:val="4"/>
         </w:numPr>
         <w:spacing w:before="40" w:after="40"/>
       </w:pPr>
@@ -398,7 +398,7 @@
         <w:pStyle w:val="ListParagraph"/>
         <w:numPr>
           <w:ilvl w:val="0"/>
-          <w:numId w:val="2"/>
+          <w:numId w:val="4"/>
         </w:numPr>
         <w:spacing w:before="40" w:after="40"/>
       </w:pPr>
@@ -418,7 +418,7 @@
         <w:pStyle w:val="ListParagraph"/>
         <w:numPr>
           <w:ilvl w:val="0"/>
-          <w:numId w:val="2"/>
+          <w:numId w:val="4"/>
         </w:numPr>
         <w:spacing w:before="40" w:after="40"/>
       </w:pPr>
@@ -443,7 +443,7 @@
         <w:pStyle w:val="ListParagraph"/>
         <w:numPr>
           <w:ilvl w:val="0"/>
-          <w:numId w:val="2"/>
+          <w:numId w:val="4"/>
         </w:numPr>
         <w:spacing w:before="40" w:after="40"/>
       </w:pPr>
@@ -468,7 +468,7 @@
         <w:pStyle w:val="ListParagraph"/>
         <w:numPr>
           <w:ilvl w:val="0"/>
-          <w:numId w:val="2"/>
+          <w:numId w:val="4"/>
         </w:numPr>
         <w:spacing w:before="40" w:after="40"/>
       </w:pPr>
@@ -493,7 +493,7 @@
         <w:pStyle w:val="ListParagraph"/>
         <w:numPr>
           <w:ilvl w:val="0"/>
-          <w:numId w:val="2"/>
+          <w:numId w:val="4"/>
         </w:numPr>
         <w:spacing w:before="40" w:after="40"/>
       </w:pPr>
@@ -526,7 +526,7 @@
         <w:pStyle w:val="ListParagraph"/>
         <w:numPr>
           <w:ilvl w:val="0"/>
-          <w:numId w:val="2"/>
+          <w:numId w:val="4"/>
         </w:numPr>
         <w:spacing w:before="40" w:after="40"/>
       </w:pPr>
@@ -551,7 +551,7 @@
         <w:pStyle w:val="ListParagraph"/>
         <w:numPr>
           <w:ilvl w:val="0"/>
-          <w:numId w:val="2"/>
+          <w:numId w:val="4"/>
         </w:numPr>
         <w:spacing w:before="40" w:after="40"/>
       </w:pPr>
@@ -596,7 +596,7 @@
         <w:pStyle w:val="ListParagraph"/>
         <w:numPr>
           <w:ilvl w:val="0"/>
-          <w:numId w:val="2"/>
+          <w:numId w:val="4"/>
         </w:numPr>
         <w:spacing w:before="40" w:after="40"/>
       </w:pPr>
@@ -618,7 +618,7 @@
         <w:pStyle w:val="ListParagraph"/>
         <w:numPr>
           <w:ilvl w:val="0"/>
-          <w:numId w:val="2"/>
+          <w:numId w:val="4"/>
         </w:numPr>
         <w:spacing w:before="40" w:after="40"/>
       </w:pPr>
@@ -631,7 +631,7 @@
         <w:pStyle w:val="ListParagraph"/>
         <w:numPr>
           <w:ilvl w:val="0"/>
-          <w:numId w:val="2"/>
+          <w:numId w:val="4"/>
         </w:numPr>
         <w:spacing w:before="40" w:after="40"/>
       </w:pPr>
@@ -644,7 +644,7 @@
         <w:pStyle w:val="ListParagraph"/>
         <w:numPr>
           <w:ilvl w:val="0"/>
-          <w:numId w:val="2"/>
+          <w:numId w:val="4"/>
         </w:numPr>
         <w:spacing w:before="40" w:after="40"/>
       </w:pPr>
@@ -657,7 +657,7 @@
         <w:pStyle w:val="ListParagraph"/>
         <w:numPr>
           <w:ilvl w:val="0"/>
-          <w:numId w:val="2"/>
+          <w:numId w:val="4"/>
         </w:numPr>
         <w:spacing w:before="40" w:after="40"/>
       </w:pPr>
@@ -684,7 +684,7 @@
         <w:pStyle w:val="ListParagraph"/>
         <w:numPr>
           <w:ilvl w:val="0"/>
-          <w:numId w:val="2"/>
+          <w:numId w:val="4"/>
         </w:numPr>
         <w:spacing w:before="40" w:after="40"/>
       </w:pPr>
@@ -697,7 +697,7 @@
         <w:pStyle w:val="ListParagraph"/>
         <w:numPr>
           <w:ilvl w:val="0"/>
-          <w:numId w:val="2"/>
+          <w:numId w:val="4"/>
         </w:numPr>
         <w:spacing w:before="40" w:after="40"/>
       </w:pPr>
@@ -710,7 +710,7 @@
         <w:pStyle w:val="ListParagraph"/>
         <w:numPr>
           <w:ilvl w:val="0"/>
-          <w:numId w:val="2"/>
+          <w:numId w:val="4"/>
         </w:numPr>
         <w:spacing w:before="40" w:after="40"/>
       </w:pPr>
@@ -723,7 +723,7 @@
         <w:pStyle w:val="ListParagraph"/>
         <w:numPr>
           <w:ilvl w:val="0"/>
-          <w:numId w:val="2"/>
+          <w:numId w:val="4"/>
         </w:numPr>
         <w:spacing w:before="40" w:after="40"/>
       </w:pPr>
@@ -744,7 +744,7 @@
         <w:pStyle w:val="ListParagraph"/>
         <w:numPr>
           <w:ilvl w:val="0"/>
-          <w:numId w:val="2"/>
+          <w:numId w:val="4"/>
         </w:numPr>
         <w:spacing w:before="40" w:after="40"/>
       </w:pPr>
@@ -757,7 +757,7 @@
         <w:pStyle w:val="ListParagraph"/>
         <w:numPr>
           <w:ilvl w:val="0"/>
-          <w:numId w:val="2"/>
+          <w:numId w:val="4"/>
         </w:numPr>
         <w:spacing w:before="40" w:after="40"/>
       </w:pPr>
@@ -787,7 +787,7 @@
         <w:pStyle w:val="ListParagraph"/>
         <w:numPr>
           <w:ilvl w:val="0"/>
-          <w:numId w:val="2"/>
+          <w:numId w:val="4"/>
         </w:numPr>
         <w:spacing w:before="40" w:after="40"/>
       </w:pPr>
@@ -800,7 +800,7 @@
         <w:pStyle w:val="ListParagraph"/>
         <w:numPr>
           <w:ilvl w:val="0"/>
-          <w:numId w:val="2"/>
+          <w:numId w:val="4"/>
         </w:numPr>
         <w:spacing w:before="40" w:after="40"/>
       </w:pPr>
@@ -825,7 +825,7 @@
         <w:pStyle w:val="ListParagraph"/>
         <w:numPr>
           <w:ilvl w:val="1"/>
-          <w:numId w:val="3"/>
+          <w:numId w:val="5"/>
         </w:numPr>
         <w:spacing w:before="30" w:after="30"/>
       </w:pPr>
@@ -842,7 +842,7 @@
         <w:pStyle w:val="ListParagraph"/>
         <w:numPr>
           <w:ilvl w:val="1"/>
-          <w:numId w:val="3"/>
+          <w:numId w:val="5"/>
         </w:numPr>
         <w:spacing w:before="30" w:after="30"/>
       </w:pPr>
@@ -871,7 +871,7 @@
         <w:pStyle w:val="ListParagraph"/>
         <w:numPr>
           <w:ilvl w:val="1"/>
-          <w:numId w:val="3"/>
+          <w:numId w:val="5"/>
         </w:numPr>
         <w:spacing w:before="30" w:after="30"/>
       </w:pPr>
@@ -888,7 +888,7 @@
         <w:pStyle w:val="ListParagraph"/>
         <w:numPr>
           <w:ilvl w:val="0"/>
-          <w:numId w:val="2"/>
+          <w:numId w:val="4"/>
         </w:numPr>
         <w:spacing w:before="40" w:after="40"/>
       </w:pPr>
@@ -901,7 +901,7 @@
         <w:pStyle w:val="ListParagraph"/>
         <w:numPr>
           <w:ilvl w:val="0"/>
-          <w:numId w:val="2"/>
+          <w:numId w:val="4"/>
         </w:numPr>
         <w:spacing w:before="40" w:after="40"/>
       </w:pPr>
@@ -914,7 +914,7 @@
         <w:pStyle w:val="ListParagraph"/>
         <w:numPr>
           <w:ilvl w:val="0"/>
-          <w:numId w:val="2"/>
+          <w:numId w:val="4"/>
         </w:numPr>
         <w:spacing w:before="40" w:after="40"/>
       </w:pPr>
@@ -944,7 +944,7 @@
         <w:pStyle w:val="ListParagraph"/>
         <w:numPr>
           <w:ilvl w:val="0"/>
-          <w:numId w:val="2"/>
+          <w:numId w:val="4"/>
         </w:numPr>
         <w:spacing w:before="40" w:after="40"/>
       </w:pPr>
@@ -969,7 +969,7 @@
         <w:pStyle w:val="ListParagraph"/>
         <w:numPr>
           <w:ilvl w:val="1"/>
-          <w:numId w:val="3"/>
+          <w:numId w:val="5"/>
         </w:numPr>
         <w:spacing w:before="30" w:after="30"/>
       </w:pPr>
@@ -986,7 +986,7 @@
         <w:pStyle w:val="ListParagraph"/>
         <w:numPr>
           <w:ilvl w:val="1"/>
-          <w:numId w:val="3"/>
+          <w:numId w:val="5"/>
         </w:numPr>
         <w:spacing w:before="30" w:after="30"/>
       </w:pPr>
@@ -1003,7 +1003,7 @@
         <w:pStyle w:val="ListParagraph"/>
         <w:numPr>
           <w:ilvl w:val="1"/>
-          <w:numId w:val="3"/>
+          <w:numId w:val="5"/>
         </w:numPr>
         <w:spacing w:before="30" w:after="30"/>
       </w:pPr>
@@ -1020,7 +1020,7 @@
         <w:pStyle w:val="ListParagraph"/>
         <w:numPr>
           <w:ilvl w:val="1"/>
-          <w:numId w:val="3"/>
+          <w:numId w:val="5"/>
         </w:numPr>
         <w:spacing w:before="30" w:after="30"/>
       </w:pPr>
@@ -1037,7 +1037,7 @@
         <w:pStyle w:val="ListParagraph"/>
         <w:numPr>
           <w:ilvl w:val="1"/>
-          <w:numId w:val="3"/>
+          <w:numId w:val="5"/>
         </w:numPr>
         <w:spacing w:before="30" w:after="30"/>
       </w:pPr>
@@ -1054,12 +1054,12 @@
         <w:pStyle w:val="ListParagraph"/>
         <w:numPr>
           <w:ilvl w:val="0"/>
-          <w:numId w:val="2"/>
+          <w:numId w:val="4"/>
         </w:numPr>
         <w:spacing w:before="40" w:after="40"/>
       </w:pPr>
       <w:r>
-        <w:t>Invited users receive a notification and must accept or decline</w:t>
+        <w:t>Existing users: invited users receive a notification and must accept or decline</w:t>
       </w:r>
     </w:p>
     <w:p>
@@ -1067,12 +1067,49 @@
         <w:pStyle w:val="ListParagraph"/>
         <w:numPr>
           <w:ilvl w:val="0"/>
-          <w:numId w:val="2"/>
+          <w:numId w:val="4"/>
         </w:numPr>
         <w:spacing w:before="40" w:after="40"/>
       </w:pPr>
       <w:r>
         <w:lastRenderedPageBreak/>
+        <w:t xml:space="preserve">Non-existing users: if an invited email has no matching account, a pending invite is </w:t>
+      </w:r>
+      <w:proofErr w:type="gramStart"/>
+      <w:r>
+        <w:t>stored</w:t>
+      </w:r>
+      <w:proofErr w:type="gramEnd"/>
+      <w:r>
+        <w:t xml:space="preserve"> and a sign-up email is sent (“[Name] has added you to a moment on </w:t>
+      </w:r>
+      <w:proofErr w:type="spellStart"/>
+      <w:r>
+        <w:t>RememberWhen</w:t>
+      </w:r>
+      <w:proofErr w:type="spellEnd"/>
+      <w:r>
+        <w:t xml:space="preserve">. Create an account to view it.”). Once they sign up, the pending invite is automatically </w:t>
+      </w:r>
+      <w:proofErr w:type="gramStart"/>
+      <w:r>
+        <w:t>surfaced</w:t>
+      </w:r>
+      <w:proofErr w:type="gramEnd"/>
+      <w:r>
+        <w:t xml:space="preserve"> and they go through the normal accept / decline flow. The pending invite is tied to the email address.</w:t>
+      </w:r>
+    </w:p>
+    <w:p>
+      <w:pPr>
+        <w:pStyle w:val="ListParagraph"/>
+        <w:numPr>
+          <w:ilvl w:val="0"/>
+          <w:numId w:val="4"/>
+        </w:numPr>
+        <w:spacing w:before="40" w:after="40"/>
+      </w:pPr>
+      <w:r>
         <w:t>No prior friendship required to invite someone to a moment</w:t>
       </w:r>
     </w:p>
@@ -1081,7 +1118,7 @@
         <w:pStyle w:val="ListParagraph"/>
         <w:numPr>
           <w:ilvl w:val="0"/>
-          <w:numId w:val="2"/>
+          <w:numId w:val="4"/>
         </w:numPr>
         <w:spacing w:before="40" w:after="40"/>
       </w:pPr>
@@ -1111,7 +1148,7 @@
         <w:pStyle w:val="ListParagraph"/>
         <w:numPr>
           <w:ilvl w:val="0"/>
-          <w:numId w:val="2"/>
+          <w:numId w:val="4"/>
         </w:numPr>
         <w:spacing w:before="40" w:after="40"/>
       </w:pPr>
@@ -1124,7 +1161,7 @@
         <w:pStyle w:val="ListParagraph"/>
         <w:numPr>
           <w:ilvl w:val="0"/>
-          <w:numId w:val="2"/>
+          <w:numId w:val="4"/>
         </w:numPr>
         <w:spacing w:before="40" w:after="40"/>
       </w:pPr>
@@ -1137,7 +1174,7 @@
         <w:pStyle w:val="ListParagraph"/>
         <w:numPr>
           <w:ilvl w:val="0"/>
-          <w:numId w:val="2"/>
+          <w:numId w:val="4"/>
         </w:numPr>
         <w:spacing w:before="40" w:after="40"/>
       </w:pPr>
@@ -1162,7 +1199,7 @@
         <w:pStyle w:val="ListParagraph"/>
         <w:numPr>
           <w:ilvl w:val="1"/>
-          <w:numId w:val="3"/>
+          <w:numId w:val="5"/>
         </w:numPr>
         <w:spacing w:before="30" w:after="30"/>
       </w:pPr>
@@ -1179,7 +1216,7 @@
         <w:pStyle w:val="ListParagraph"/>
         <w:numPr>
           <w:ilvl w:val="1"/>
-          <w:numId w:val="3"/>
+          <w:numId w:val="5"/>
         </w:numPr>
         <w:spacing w:before="30" w:after="30"/>
       </w:pPr>
@@ -1196,7 +1233,7 @@
         <w:pStyle w:val="ListParagraph"/>
         <w:numPr>
           <w:ilvl w:val="0"/>
-          <w:numId w:val="2"/>
+          <w:numId w:val="4"/>
         </w:numPr>
         <w:spacing w:before="40" w:after="40"/>
       </w:pPr>
@@ -1209,7 +1246,7 @@
         <w:pStyle w:val="ListParagraph"/>
         <w:numPr>
           <w:ilvl w:val="0"/>
-          <w:numId w:val="2"/>
+          <w:numId w:val="4"/>
         </w:numPr>
         <w:spacing w:before="40" w:after="40"/>
       </w:pPr>
@@ -1222,7 +1259,7 @@
         <w:pStyle w:val="ListParagraph"/>
         <w:numPr>
           <w:ilvl w:val="0"/>
-          <w:numId w:val="2"/>
+          <w:numId w:val="4"/>
         </w:numPr>
         <w:spacing w:before="40" w:after="40"/>
       </w:pPr>
@@ -1261,7 +1298,7 @@
         <w:pStyle w:val="ListParagraph"/>
         <w:numPr>
           <w:ilvl w:val="1"/>
-          <w:numId w:val="3"/>
+          <w:numId w:val="5"/>
         </w:numPr>
         <w:spacing w:before="30" w:after="30"/>
       </w:pPr>
@@ -1278,7 +1315,7 @@
         <w:pStyle w:val="ListParagraph"/>
         <w:numPr>
           <w:ilvl w:val="1"/>
-          <w:numId w:val="3"/>
+          <w:numId w:val="5"/>
         </w:numPr>
         <w:spacing w:before="30" w:after="30"/>
       </w:pPr>
@@ -1307,7 +1344,7 @@
         <w:pStyle w:val="ListParagraph"/>
         <w:numPr>
           <w:ilvl w:val="1"/>
-          <w:numId w:val="3"/>
+          <w:numId w:val="5"/>
         </w:numPr>
         <w:spacing w:before="30" w:after="30"/>
       </w:pPr>
@@ -1324,7 +1361,7 @@
         <w:pStyle w:val="ListParagraph"/>
         <w:numPr>
           <w:ilvl w:val="1"/>
-          <w:numId w:val="3"/>
+          <w:numId w:val="5"/>
         </w:numPr>
         <w:spacing w:before="30" w:after="30"/>
       </w:pPr>
@@ -1353,7 +1390,7 @@
         <w:pStyle w:val="ListParagraph"/>
         <w:numPr>
           <w:ilvl w:val="1"/>
-          <w:numId w:val="3"/>
+          <w:numId w:val="5"/>
         </w:numPr>
         <w:spacing w:before="30" w:after="30"/>
       </w:pPr>
@@ -1370,7 +1407,7 @@
         <w:pStyle w:val="ListParagraph"/>
         <w:numPr>
           <w:ilvl w:val="1"/>
-          <w:numId w:val="3"/>
+          <w:numId w:val="5"/>
         </w:numPr>
         <w:spacing w:before="30" w:after="30"/>
       </w:pPr>
@@ -1388,7 +1425,7 @@
         <w:pStyle w:val="ListParagraph"/>
         <w:numPr>
           <w:ilvl w:val="0"/>
-          <w:numId w:val="2"/>
+          <w:numId w:val="4"/>
         </w:numPr>
         <w:spacing w:before="40" w:after="40"/>
       </w:pPr>
@@ -1401,7 +1438,7 @@
         <w:pStyle w:val="ListParagraph"/>
         <w:numPr>
           <w:ilvl w:val="0"/>
-          <w:numId w:val="2"/>
+          <w:numId w:val="4"/>
         </w:numPr>
         <w:spacing w:before="40" w:after="40"/>
       </w:pPr>
@@ -1414,7 +1451,7 @@
         <w:pStyle w:val="ListParagraph"/>
         <w:numPr>
           <w:ilvl w:val="0"/>
-          <w:numId w:val="2"/>
+          <w:numId w:val="4"/>
         </w:numPr>
         <w:spacing w:before="40" w:after="40"/>
       </w:pPr>
@@ -1464,7 +1501,7 @@
         <w:pStyle w:val="ListParagraph"/>
         <w:numPr>
           <w:ilvl w:val="1"/>
-          <w:numId w:val="3"/>
+          <w:numId w:val="5"/>
         </w:numPr>
         <w:spacing w:before="30" w:after="30"/>
       </w:pPr>
@@ -1485,6 +1522,7 @@
           <w:b/>
           <w:bCs/>
         </w:rPr>
+        <w:lastRenderedPageBreak/>
         <w:t>Non-friend readers:</w:t>
       </w:r>
     </w:p>
@@ -1493,7 +1531,7 @@
         <w:pStyle w:val="ListParagraph"/>
         <w:numPr>
           <w:ilvl w:val="1"/>
-          <w:numId w:val="3"/>
+          <w:numId w:val="5"/>
         </w:numPr>
         <w:spacing w:before="30" w:after="30"/>
       </w:pPr>
@@ -1510,12 +1548,11 @@
         <w:pStyle w:val="ListParagraph"/>
         <w:numPr>
           <w:ilvl w:val="0"/>
-          <w:numId w:val="2"/>
+          <w:numId w:val="4"/>
         </w:numPr>
         <w:spacing w:before="40" w:after="40"/>
       </w:pPr>
       <w:r>
-        <w:lastRenderedPageBreak/>
         <w:t>At most one active link per moment at any time; issuing a new link immediately invalidates the previous one</w:t>
       </w:r>
     </w:p>
@@ -1524,7 +1561,7 @@
         <w:pStyle w:val="ListParagraph"/>
         <w:numPr>
           <w:ilvl w:val="0"/>
-          <w:numId w:val="2"/>
+          <w:numId w:val="4"/>
         </w:numPr>
         <w:spacing w:before="40" w:after="40"/>
       </w:pPr>
@@ -1537,7 +1574,7 @@
         <w:pStyle w:val="ListParagraph"/>
         <w:numPr>
           <w:ilvl w:val="0"/>
-          <w:numId w:val="2"/>
+          <w:numId w:val="4"/>
         </w:numPr>
         <w:spacing w:before="40" w:after="40"/>
       </w:pPr>
@@ -2254,7 +2291,7 @@
         <w:pStyle w:val="ListParagraph"/>
         <w:numPr>
           <w:ilvl w:val="0"/>
-          <w:numId w:val="2"/>
+          <w:numId w:val="4"/>
         </w:numPr>
         <w:spacing w:before="40" w:after="40"/>
       </w:pPr>
@@ -2267,7 +2304,7 @@
         <w:pStyle w:val="ListParagraph"/>
         <w:numPr>
           <w:ilvl w:val="0"/>
-          <w:numId w:val="2"/>
+          <w:numId w:val="4"/>
         </w:numPr>
         <w:spacing w:before="40" w:after="40"/>
       </w:pPr>
@@ -2280,7 +2317,7 @@
         <w:pStyle w:val="ListParagraph"/>
         <w:numPr>
           <w:ilvl w:val="0"/>
-          <w:numId w:val="2"/>
+          <w:numId w:val="4"/>
         </w:numPr>
         <w:spacing w:before="40" w:after="40"/>
       </w:pPr>
@@ -2293,7 +2330,7 @@
         <w:pStyle w:val="ListParagraph"/>
         <w:numPr>
           <w:ilvl w:val="0"/>
-          <w:numId w:val="2"/>
+          <w:numId w:val="4"/>
         </w:numPr>
         <w:spacing w:before="40" w:after="40"/>
       </w:pPr>
@@ -2306,7 +2343,7 @@
         <w:pStyle w:val="ListParagraph"/>
         <w:numPr>
           <w:ilvl w:val="0"/>
-          <w:numId w:val="2"/>
+          <w:numId w:val="4"/>
         </w:numPr>
         <w:spacing w:before="40" w:after="40"/>
       </w:pPr>
@@ -2336,7 +2373,7 @@
         <w:pStyle w:val="ListParagraph"/>
         <w:numPr>
           <w:ilvl w:val="0"/>
-          <w:numId w:val="2"/>
+          <w:numId w:val="4"/>
         </w:numPr>
         <w:spacing w:before="40" w:after="40"/>
       </w:pPr>
@@ -2349,7 +2386,7 @@
         <w:pStyle w:val="ListParagraph"/>
         <w:numPr>
           <w:ilvl w:val="0"/>
-          <w:numId w:val="2"/>
+          <w:numId w:val="4"/>
         </w:numPr>
         <w:spacing w:before="40" w:after="40"/>
       </w:pPr>
@@ -2362,7 +2399,7 @@
         <w:pStyle w:val="ListParagraph"/>
         <w:numPr>
           <w:ilvl w:val="0"/>
-          <w:numId w:val="2"/>
+          <w:numId w:val="4"/>
         </w:numPr>
         <w:spacing w:before="40" w:after="40"/>
       </w:pPr>
@@ -2384,7 +2421,6 @@
         <w:pStyle w:val="Heading1"/>
       </w:pPr>
       <w:r>
-        <w:lastRenderedPageBreak/>
         <w:t>3. Data Model</w:t>
       </w:r>
     </w:p>
@@ -4003,6 +4039,7 @@
                 <w:sz w:val="18"/>
                 <w:szCs w:val="18"/>
               </w:rPr>
+              <w:lastRenderedPageBreak/>
               <w:t>cover_photo_url</w:t>
             </w:r>
             <w:proofErr w:type="spellEnd"/>
@@ -4155,7 +4192,6 @@
                 <w:sz w:val="18"/>
                 <w:szCs w:val="18"/>
               </w:rPr>
-              <w:lastRenderedPageBreak/>
               <w:t>created_at</w:t>
             </w:r>
             <w:proofErr w:type="spellEnd"/>
@@ -5803,6 +5839,7 @@
                 <w:sz w:val="18"/>
                 <w:szCs w:val="18"/>
               </w:rPr>
+              <w:lastRenderedPageBreak/>
               <w:t>id</w:t>
             </w:r>
           </w:p>
@@ -5938,7 +5975,6 @@
                 <w:sz w:val="18"/>
                 <w:szCs w:val="18"/>
               </w:rPr>
-              <w:lastRenderedPageBreak/>
               <w:t>media_type</w:t>
             </w:r>
             <w:proofErr w:type="spellEnd"/>
@@ -7604,6 +7640,7 @@
                 <w:sz w:val="20"/>
                 <w:szCs w:val="20"/>
               </w:rPr>
+              <w:lastRenderedPageBreak/>
               <w:t>Field</w:t>
             </w:r>
           </w:p>
@@ -7740,7 +7777,6 @@
                 <w:sz w:val="18"/>
                 <w:szCs w:val="18"/>
               </w:rPr>
-              <w:lastRenderedPageBreak/>
               <w:t>user_id</w:t>
             </w:r>
             <w:proofErr w:type="spellEnd"/>
@@ -8441,7 +8477,7 @@
         <w:pStyle w:val="ListParagraph"/>
         <w:numPr>
           <w:ilvl w:val="0"/>
-          <w:numId w:val="2"/>
+          <w:numId w:val="4"/>
         </w:numPr>
         <w:spacing w:before="40" w:after="40"/>
       </w:pPr>
@@ -8470,7 +8506,7 @@
         <w:pStyle w:val="ListParagraph"/>
         <w:numPr>
           <w:ilvl w:val="0"/>
-          <w:numId w:val="2"/>
+          <w:numId w:val="4"/>
         </w:numPr>
         <w:spacing w:before="40" w:after="40"/>
       </w:pPr>
@@ -8496,7 +8532,7 @@
         <w:pStyle w:val="ListParagraph"/>
         <w:numPr>
           <w:ilvl w:val="0"/>
-          <w:numId w:val="2"/>
+          <w:numId w:val="4"/>
         </w:numPr>
         <w:spacing w:before="40" w:after="40"/>
       </w:pPr>
@@ -8514,7 +8550,7 @@
         <w:pStyle w:val="ListParagraph"/>
         <w:numPr>
           <w:ilvl w:val="0"/>
-          <w:numId w:val="2"/>
+          <w:numId w:val="4"/>
         </w:numPr>
         <w:spacing w:before="40" w:after="40"/>
       </w:pPr>
@@ -8559,7 +8595,7 @@
         <w:pStyle w:val="ListParagraph"/>
         <w:numPr>
           <w:ilvl w:val="0"/>
-          <w:numId w:val="2"/>
+          <w:numId w:val="4"/>
         </w:numPr>
         <w:spacing w:before="40" w:after="40"/>
       </w:pPr>
@@ -8572,7 +8608,7 @@
         <w:pStyle w:val="ListParagraph"/>
         <w:numPr>
           <w:ilvl w:val="0"/>
-          <w:numId w:val="2"/>
+          <w:numId w:val="4"/>
         </w:numPr>
         <w:spacing w:before="40" w:after="40"/>
       </w:pPr>
@@ -8585,7 +8621,7 @@
         <w:pStyle w:val="ListParagraph"/>
         <w:numPr>
           <w:ilvl w:val="0"/>
-          <w:numId w:val="2"/>
+          <w:numId w:val="4"/>
         </w:numPr>
         <w:spacing w:before="40" w:after="40"/>
       </w:pPr>
@@ -8598,7 +8634,7 @@
         <w:pStyle w:val="ListParagraph"/>
         <w:numPr>
           <w:ilvl w:val="0"/>
-          <w:numId w:val="2"/>
+          <w:numId w:val="4"/>
         </w:numPr>
         <w:spacing w:before="40" w:after="40"/>
       </w:pPr>
@@ -8623,7 +8659,6 @@
         </w:pBdr>
       </w:pPr>
       <w:r>
-        <w:lastRenderedPageBreak/>
         <w:t>Phase 3 — Friends</w:t>
       </w:r>
     </w:p>
@@ -8653,7 +8688,7 @@
         <w:pStyle w:val="ListParagraph"/>
         <w:numPr>
           <w:ilvl w:val="0"/>
-          <w:numId w:val="2"/>
+          <w:numId w:val="4"/>
         </w:numPr>
         <w:spacing w:before="40" w:after="40"/>
       </w:pPr>
@@ -8666,7 +8701,7 @@
         <w:pStyle w:val="ListParagraph"/>
         <w:numPr>
           <w:ilvl w:val="0"/>
-          <w:numId w:val="2"/>
+          <w:numId w:val="4"/>
         </w:numPr>
         <w:spacing w:before="40" w:after="40"/>
       </w:pPr>
@@ -8679,7 +8714,7 @@
         <w:pStyle w:val="ListParagraph"/>
         <w:numPr>
           <w:ilvl w:val="0"/>
-          <w:numId w:val="2"/>
+          <w:numId w:val="4"/>
         </w:numPr>
         <w:spacing w:before="40" w:after="40"/>
       </w:pPr>
@@ -8692,7 +8727,7 @@
         <w:pStyle w:val="ListParagraph"/>
         <w:numPr>
           <w:ilvl w:val="0"/>
-          <w:numId w:val="2"/>
+          <w:numId w:val="4"/>
         </w:numPr>
         <w:spacing w:before="40" w:after="40"/>
       </w:pPr>
@@ -8737,7 +8772,7 @@
         <w:pStyle w:val="ListParagraph"/>
         <w:numPr>
           <w:ilvl w:val="0"/>
-          <w:numId w:val="2"/>
+          <w:numId w:val="4"/>
         </w:numPr>
         <w:spacing w:before="40" w:after="40"/>
       </w:pPr>
@@ -8750,7 +8785,7 @@
         <w:pStyle w:val="ListParagraph"/>
         <w:numPr>
           <w:ilvl w:val="0"/>
-          <w:numId w:val="2"/>
+          <w:numId w:val="4"/>
         </w:numPr>
         <w:spacing w:before="40" w:after="40"/>
       </w:pPr>
@@ -8763,7 +8798,7 @@
         <w:pStyle w:val="ListParagraph"/>
         <w:numPr>
           <w:ilvl w:val="0"/>
-          <w:numId w:val="2"/>
+          <w:numId w:val="4"/>
         </w:numPr>
         <w:spacing w:before="40" w:after="40"/>
       </w:pPr>
@@ -8776,7 +8811,7 @@
         <w:pStyle w:val="ListParagraph"/>
         <w:numPr>
           <w:ilvl w:val="0"/>
-          <w:numId w:val="2"/>
+          <w:numId w:val="4"/>
         </w:numPr>
         <w:spacing w:before="40" w:after="40"/>
       </w:pPr>
@@ -8789,7 +8824,7 @@
         <w:pStyle w:val="ListParagraph"/>
         <w:numPr>
           <w:ilvl w:val="0"/>
-          <w:numId w:val="2"/>
+          <w:numId w:val="4"/>
         </w:numPr>
         <w:spacing w:before="40" w:after="40"/>
       </w:pPr>
@@ -8802,12 +8837,25 @@
         <w:pStyle w:val="ListParagraph"/>
         <w:numPr>
           <w:ilvl w:val="0"/>
-          <w:numId w:val="2"/>
+          <w:numId w:val="4"/>
         </w:numPr>
         <w:spacing w:before="40" w:after="40"/>
       </w:pPr>
       <w:r>
         <w:t>Moment-related notifications (invite sent, invite response)</w:t>
+      </w:r>
+    </w:p>
+    <w:p>
+      <w:pPr>
+        <w:pStyle w:val="ListParagraph"/>
+        <w:numPr>
+          <w:ilvl w:val="0"/>
+          <w:numId w:val="4"/>
+        </w:numPr>
+        <w:spacing w:before="40" w:after="40"/>
+      </w:pPr>
+      <w:r>
+        <w:t>Navigation bar — links to Home, Account, Notifications (placeholder icon), and Friends; collapses to bottom tab bar or hamburger on mobile</w:t>
       </w:r>
     </w:p>
     <w:p>
@@ -8847,7 +8895,7 @@
         <w:pStyle w:val="ListParagraph"/>
         <w:numPr>
           <w:ilvl w:val="0"/>
-          <w:numId w:val="2"/>
+          <w:numId w:val="4"/>
         </w:numPr>
         <w:spacing w:before="40" w:after="40"/>
       </w:pPr>
@@ -8860,7 +8908,7 @@
         <w:pStyle w:val="ListParagraph"/>
         <w:numPr>
           <w:ilvl w:val="0"/>
-          <w:numId w:val="2"/>
+          <w:numId w:val="4"/>
         </w:numPr>
         <w:spacing w:before="40" w:after="40"/>
       </w:pPr>
@@ -8873,7 +8921,7 @@
         <w:pStyle w:val="ListParagraph"/>
         <w:numPr>
           <w:ilvl w:val="0"/>
-          <w:numId w:val="2"/>
+          <w:numId w:val="4"/>
         </w:numPr>
         <w:spacing w:before="40" w:after="40"/>
       </w:pPr>
@@ -8886,7 +8934,7 @@
         <w:pStyle w:val="ListParagraph"/>
         <w:numPr>
           <w:ilvl w:val="0"/>
-          <w:numId w:val="2"/>
+          <w:numId w:val="4"/>
         </w:numPr>
         <w:spacing w:before="40" w:after="40"/>
       </w:pPr>
@@ -8931,7 +8979,7 @@
         <w:pStyle w:val="ListParagraph"/>
         <w:numPr>
           <w:ilvl w:val="0"/>
-          <w:numId w:val="2"/>
+          <w:numId w:val="4"/>
         </w:numPr>
         <w:spacing w:before="40" w:after="40"/>
       </w:pPr>
@@ -8944,7 +8992,7 @@
         <w:pStyle w:val="ListParagraph"/>
         <w:numPr>
           <w:ilvl w:val="0"/>
-          <w:numId w:val="2"/>
+          <w:numId w:val="4"/>
         </w:numPr>
         <w:spacing w:before="40" w:after="40"/>
       </w:pPr>
@@ -8957,7 +9005,7 @@
         <w:pStyle w:val="ListParagraph"/>
         <w:numPr>
           <w:ilvl w:val="0"/>
-          <w:numId w:val="2"/>
+          <w:numId w:val="4"/>
         </w:numPr>
         <w:spacing w:before="40" w:after="40"/>
       </w:pPr>
@@ -8970,7 +9018,7 @@
         <w:pStyle w:val="ListParagraph"/>
         <w:numPr>
           <w:ilvl w:val="0"/>
-          <w:numId w:val="2"/>
+          <w:numId w:val="4"/>
         </w:numPr>
         <w:spacing w:before="40" w:after="40"/>
       </w:pPr>
@@ -8983,6 +9031,7 @@
         <w:spacing w:before="60" w:after="60"/>
       </w:pPr>
       <w:r>
+        <w:lastRenderedPageBreak/>
         <w:t>✓ End state: full permission model implemented.</w:t>
       </w:r>
     </w:p>
@@ -8995,7 +9044,6 @@
         </w:pBdr>
       </w:pPr>
       <w:r>
-        <w:lastRenderedPageBreak/>
         <w:t>Phase 7 — Notifications</w:t>
       </w:r>
     </w:p>
@@ -9016,7 +9064,7 @@
         <w:pStyle w:val="ListParagraph"/>
         <w:numPr>
           <w:ilvl w:val="0"/>
-          <w:numId w:val="2"/>
+          <w:numId w:val="4"/>
         </w:numPr>
         <w:spacing w:before="40" w:after="40"/>
       </w:pPr>
@@ -9029,7 +9077,7 @@
         <w:pStyle w:val="ListParagraph"/>
         <w:numPr>
           <w:ilvl w:val="0"/>
-          <w:numId w:val="2"/>
+          <w:numId w:val="4"/>
         </w:numPr>
         <w:spacing w:before="40" w:after="40"/>
       </w:pPr>
@@ -9042,7 +9090,7 @@
         <w:pStyle w:val="ListParagraph"/>
         <w:numPr>
           <w:ilvl w:val="0"/>
-          <w:numId w:val="2"/>
+          <w:numId w:val="4"/>
         </w:numPr>
         <w:spacing w:before="40" w:after="40"/>
       </w:pPr>
@@ -9055,7 +9103,7 @@
         <w:pStyle w:val="ListParagraph"/>
         <w:numPr>
           <w:ilvl w:val="0"/>
-          <w:numId w:val="2"/>
+          <w:numId w:val="4"/>
         </w:numPr>
         <w:spacing w:before="40" w:after="40"/>
       </w:pPr>
@@ -9100,7 +9148,7 @@
         <w:pStyle w:val="ListParagraph"/>
         <w:numPr>
           <w:ilvl w:val="0"/>
-          <w:numId w:val="2"/>
+          <w:numId w:val="4"/>
         </w:numPr>
         <w:spacing w:before="40" w:after="40"/>
       </w:pPr>
@@ -9113,7 +9161,7 @@
         <w:pStyle w:val="ListParagraph"/>
         <w:numPr>
           <w:ilvl w:val="0"/>
-          <w:numId w:val="2"/>
+          <w:numId w:val="4"/>
         </w:numPr>
         <w:spacing w:before="40" w:after="40"/>
       </w:pPr>
@@ -9158,7 +9206,7 @@
         <w:pStyle w:val="ListParagraph"/>
         <w:numPr>
           <w:ilvl w:val="0"/>
-          <w:numId w:val="2"/>
+          <w:numId w:val="4"/>
         </w:numPr>
         <w:spacing w:before="40" w:after="40"/>
       </w:pPr>
@@ -9171,7 +9219,7 @@
         <w:pStyle w:val="ListParagraph"/>
         <w:numPr>
           <w:ilvl w:val="0"/>
-          <w:numId w:val="2"/>
+          <w:numId w:val="4"/>
         </w:numPr>
         <w:spacing w:before="40" w:after="40"/>
       </w:pPr>
@@ -9184,7 +9232,7 @@
         <w:pStyle w:val="ListParagraph"/>
         <w:numPr>
           <w:ilvl w:val="0"/>
-          <w:numId w:val="2"/>
+          <w:numId w:val="4"/>
         </w:numPr>
         <w:spacing w:before="40" w:after="40"/>
       </w:pPr>
@@ -9197,7 +9245,7 @@
         <w:pStyle w:val="ListParagraph"/>
         <w:numPr>
           <w:ilvl w:val="0"/>
-          <w:numId w:val="2"/>
+          <w:numId w:val="4"/>
         </w:numPr>
         <w:spacing w:before="40" w:after="40"/>
       </w:pPr>
@@ -9327,6 +9375,7 @@
                 <w:sz w:val="18"/>
                 <w:szCs w:val="18"/>
               </w:rPr>
+              <w:lastRenderedPageBreak/>
               <w:t>I’m building an app called [app name] — a shared memory book where users capture and revisit meaningful moments from their lives.</w:t>
             </w:r>
           </w:p>
@@ -9346,7 +9395,6 @@
                 <w:sz w:val="18"/>
                 <w:szCs w:val="18"/>
               </w:rPr>
-              <w:lastRenderedPageBreak/>
               <w:t xml:space="preserve">Stack: Next.js (App Router), </w:t>
             </w:r>
             <w:proofErr w:type="spellStart"/>
@@ -9560,7 +9608,7 @@
         <w:pStyle w:val="ListParagraph"/>
         <w:numPr>
           <w:ilvl w:val="0"/>
-          <w:numId w:val="2"/>
+          <w:numId w:val="4"/>
         </w:numPr>
         <w:spacing w:before="40" w:after="40"/>
       </w:pPr>
@@ -9618,7 +9666,7 @@
         <w:pStyle w:val="ListParagraph"/>
         <w:numPr>
           <w:ilvl w:val="0"/>
-          <w:numId w:val="2"/>
+          <w:numId w:val="4"/>
         </w:numPr>
         <w:spacing w:before="40" w:after="40"/>
       </w:pPr>
@@ -9684,7 +9732,7 @@
         <w:pStyle w:val="ListParagraph"/>
         <w:numPr>
           <w:ilvl w:val="0"/>
-          <w:numId w:val="2"/>
+          <w:numId w:val="4"/>
         </w:numPr>
         <w:spacing w:before="40" w:after="40"/>
       </w:pPr>
@@ -9763,6 +9811,89 @@
       <w:proofErr w:type="spellEnd"/>
       <w:r>
         <w:t xml:space="preserve"> tables, and the Phase 4 build order entry.</w:t>
+      </w:r>
+    </w:p>
+    <w:p>
+      <w:pPr>
+        <w:spacing w:before="60" w:after="60"/>
+      </w:pPr>
+      <w:r>
+        <w:rPr>
+          <w:b/>
+          <w:bCs/>
+        </w:rPr>
+        <w:lastRenderedPageBreak/>
+        <w:t>Key instruction to include:</w:t>
+      </w:r>
+    </w:p>
+    <w:p>
+      <w:pPr>
+        <w:pStyle w:val="ListParagraph"/>
+        <w:numPr>
+          <w:ilvl w:val="0"/>
+          <w:numId w:val="4"/>
+        </w:numPr>
+        <w:spacing w:before="40" w:after="40"/>
+      </w:pPr>
+      <w:r>
+        <w:t xml:space="preserve">“The date field in the create modal should support three modes: year only, month + year, or full date. Store as separate </w:t>
+      </w:r>
+      <w:proofErr w:type="spellStart"/>
+      <w:r>
+        <w:t>date_year</w:t>
+      </w:r>
+      <w:proofErr w:type="spellEnd"/>
+      <w:r>
+        <w:t xml:space="preserve">, </w:t>
+      </w:r>
+      <w:proofErr w:type="spellStart"/>
+      <w:r>
+        <w:t>date_month</w:t>
+      </w:r>
+      <w:proofErr w:type="spellEnd"/>
+      <w:r>
+        <w:t xml:space="preserve">, </w:t>
+      </w:r>
+      <w:proofErr w:type="spellStart"/>
+      <w:r>
+        <w:t>date_day</w:t>
+      </w:r>
+      <w:proofErr w:type="spellEnd"/>
+      <w:r>
+        <w:t xml:space="preserve"> columns. The collapsing header on the moment page should pin the moment name when scrolling. If an invited email has no matching account, store a pending invite tied to that email address and send a sign-up email; surface the invite automatically once they register. Add a navigation bar with links to Home, Account, Notifications (placeholder), and Friends; on mobile this should collapse to a bottom tab bar or hamburger menu.”</w:t>
+      </w:r>
+    </w:p>
+    <w:p/>
+    <w:p>
+      <w:pPr>
+        <w:pStyle w:val="Heading3"/>
+      </w:pPr>
+      <w:r>
+        <w:t>Phase 5 — Posts &amp; Media</w:t>
+      </w:r>
+    </w:p>
+    <w:p>
+      <w:pPr>
+        <w:spacing w:before="60" w:after="60"/>
+      </w:pPr>
+      <w:r>
+        <w:t xml:space="preserve">Paste </w:t>
+      </w:r>
+      <w:proofErr w:type="gramStart"/>
+      <w:r>
+        <w:t>in:</w:t>
+      </w:r>
+      <w:proofErr w:type="gramEnd"/>
+      <w:r>
+        <w:t xml:space="preserve"> the posts / </w:t>
+      </w:r>
+      <w:proofErr w:type="spellStart"/>
+      <w:r>
+        <w:t>post_media</w:t>
+      </w:r>
+      <w:proofErr w:type="spellEnd"/>
+      <w:r>
+        <w:t xml:space="preserve"> tables and the Phase 5 build order entry.</w:t>
       </w:r>
     </w:p>
     <w:p>
@@ -9782,70 +9913,69 @@
         <w:pStyle w:val="ListParagraph"/>
         <w:numPr>
           <w:ilvl w:val="0"/>
-          <w:numId w:val="2"/>
+          <w:numId w:val="4"/>
         </w:numPr>
         <w:spacing w:before="40" w:after="40"/>
       </w:pPr>
       <w:r>
-        <w:lastRenderedPageBreak/>
-        <w:t xml:space="preserve">“The date field in the create modal should support three modes: year only, month + year, or full date. Store as separate </w:t>
+        <w:t xml:space="preserve">“Media uploads (photos, videos, audio) go to </w:t>
       </w:r>
       <w:proofErr w:type="spellStart"/>
       <w:r>
-        <w:t>date_year</w:t>
+        <w:t>Supabase</w:t>
       </w:r>
       <w:proofErr w:type="spellEnd"/>
       <w:r>
-        <w:t xml:space="preserve">, </w:t>
+        <w:t xml:space="preserve"> Storage. A post can contain text only, media only, or both. Soft deletes on posts use a </w:t>
       </w:r>
       <w:proofErr w:type="spellStart"/>
       <w:r>
-        <w:t>date_month</w:t>
+        <w:t>deleted_at</w:t>
       </w:r>
       <w:proofErr w:type="spellEnd"/>
       <w:r>
-        <w:t xml:space="preserve">, </w:t>
+        <w:t xml:space="preserve"> column — never hard delete. Display posts in chronological order by default with a </w:t>
+      </w:r>
+      <w:proofErr w:type="gramStart"/>
+      <w:r>
+        <w:t>sort</w:t>
+      </w:r>
+      <w:proofErr w:type="gramEnd"/>
+      <w:r>
+        <w:t xml:space="preserve"> toggle.”</w:t>
+      </w:r>
+    </w:p>
+    <w:p/>
+    <w:p>
+      <w:pPr>
+        <w:pStyle w:val="Heading3"/>
+      </w:pPr>
+      <w:r>
+        <w:t>Phase 6 — Readers &amp; Invite Links</w:t>
+      </w:r>
+    </w:p>
+    <w:p>
+      <w:pPr>
+        <w:spacing w:before="60" w:after="60"/>
+      </w:pPr>
+      <w:r>
+        <w:t xml:space="preserve">Paste in: Section 2.6 (full permissions), Section 2.7 (Reader Invitations &amp; Links), the </w:t>
       </w:r>
       <w:proofErr w:type="spellStart"/>
       <w:r>
-        <w:t>date_day</w:t>
+        <w:t>invite_links</w:t>
       </w:r>
       <w:proofErr w:type="spellEnd"/>
       <w:r>
-        <w:t xml:space="preserve"> columns. The collapsing header on the moment page should pin the moment name when scrolling.”</w:t>
-      </w:r>
-    </w:p>
-    <w:p/>
-    <w:p>
-      <w:pPr>
-        <w:pStyle w:val="Heading3"/>
-      </w:pPr>
-      <w:r>
-        <w:t>Phase 5 — Posts &amp; Media</w:t>
-      </w:r>
-    </w:p>
-    <w:p>
-      <w:pPr>
-        <w:spacing w:before="60" w:after="60"/>
-      </w:pPr>
-      <w:r>
-        <w:t xml:space="preserve">Paste </w:t>
-      </w:r>
-      <w:proofErr w:type="gramStart"/>
-      <w:r>
-        <w:t>in:</w:t>
-      </w:r>
-      <w:proofErr w:type="gramEnd"/>
-      <w:r>
-        <w:t xml:space="preserve"> the posts / </w:t>
+        <w:t xml:space="preserve"> and </w:t>
       </w:r>
       <w:proofErr w:type="spellStart"/>
       <w:r>
-        <w:t>post_media</w:t>
+        <w:t>moment_members</w:t>
       </w:r>
       <w:proofErr w:type="spellEnd"/>
       <w:r>
-        <w:t xml:space="preserve"> tables and the Phase 5 build order entry.</w:t>
+        <w:t xml:space="preserve"> tables, and the Phase 6 build order entry.</w:t>
       </w:r>
     </w:p>
     <w:p>
@@ -9865,36 +9995,28 @@
         <w:pStyle w:val="ListParagraph"/>
         <w:numPr>
           <w:ilvl w:val="0"/>
-          <w:numId w:val="2"/>
+          <w:numId w:val="4"/>
         </w:numPr>
         <w:spacing w:before="40" w:after="40"/>
       </w:pPr>
       <w:r>
-        <w:t xml:space="preserve">“Media uploads (photos, videos, audio) go to </w:t>
+        <w:t xml:space="preserve">“There should be at most one active invite link per moment. Generating a new link deletes the previous row. Readers who already joined via an old link retain access — access is stored in </w:t>
       </w:r>
       <w:proofErr w:type="spellStart"/>
       <w:r>
-        <w:t>Supabase</w:t>
+        <w:t>moment_members</w:t>
       </w:r>
       <w:proofErr w:type="spellEnd"/>
       <w:r>
-        <w:t xml:space="preserve"> Storage. A post can contain text only, media only, or both. Soft deletes on posts use a </w:t>
+        <w:t xml:space="preserve">, not tied to the link. Ownership transfer updates </w:t>
       </w:r>
       <w:proofErr w:type="spellStart"/>
       <w:r>
-        <w:t>deleted_at</w:t>
+        <w:t>owner_id</w:t>
       </w:r>
       <w:proofErr w:type="spellEnd"/>
       <w:r>
-        <w:t xml:space="preserve"> column — never hard delete. Display posts in chronological order by default with a </w:t>
-      </w:r>
-      <w:proofErr w:type="gramStart"/>
-      <w:r>
-        <w:t>sort</w:t>
-      </w:r>
-      <w:proofErr w:type="gramEnd"/>
-      <w:r>
-        <w:t xml:space="preserve"> toggle.”</w:t>
+        <w:t xml:space="preserve"> on the moments table.”</w:t>
       </w:r>
     </w:p>
     <w:p/>
@@ -9903,7 +10025,7 @@
         <w:pStyle w:val="Heading3"/>
       </w:pPr>
       <w:r>
-        <w:t>Phase 6 — Readers &amp; Invite Links</w:t>
+        <w:t>Phase 7 — Notifications</w:t>
       </w:r>
     </w:p>
     <w:p>
@@ -9911,23 +10033,15 @@
         <w:spacing w:before="60" w:after="60"/>
       </w:pPr>
       <w:r>
-        <w:t xml:space="preserve">Paste in: Section 2.6 (full permissions), Section 2.7 (Reader Invitations &amp; Links), the </w:t>
+        <w:t xml:space="preserve">Paste in: Section 2.8 (Notifications), the notifications and </w:t>
       </w:r>
       <w:proofErr w:type="spellStart"/>
       <w:r>
-        <w:t>invite_links</w:t>
+        <w:t>notification_preferences</w:t>
       </w:r>
       <w:proofErr w:type="spellEnd"/>
       <w:r>
-        <w:t xml:space="preserve"> and </w:t>
-      </w:r>
-      <w:proofErr w:type="spellStart"/>
-      <w:r>
-        <w:t>moment_members</w:t>
-      </w:r>
-      <w:proofErr w:type="spellEnd"/>
-      <w:r>
-        <w:t xml:space="preserve"> tables, and the Phase 6 build order entry.</w:t>
+        <w:t xml:space="preserve"> tables, and the Phase 7 build order entry.</w:t>
       </w:r>
     </w:p>
     <w:p>
@@ -9947,28 +10061,52 @@
         <w:pStyle w:val="ListParagraph"/>
         <w:numPr>
           <w:ilvl w:val="0"/>
-          <w:numId w:val="2"/>
+          <w:numId w:val="4"/>
         </w:numPr>
         <w:spacing w:before="40" w:after="40"/>
       </w:pPr>
       <w:r>
-        <w:t xml:space="preserve">“There should be at most one active invite link per moment. Generating a new link deletes the previous row. Readers who already joined via an old link retain access — access is stored in </w:t>
+        <w:t xml:space="preserve">“Before sending any notification, check the recipient’s </w:t>
       </w:r>
       <w:proofErr w:type="spellStart"/>
       <w:r>
-        <w:t>moment_members</w:t>
+        <w:t>notification_preferences</w:t>
       </w:r>
       <w:proofErr w:type="spellEnd"/>
       <w:r>
-        <w:t xml:space="preserve">, not tied to the link. Ownership transfer updates </w:t>
+        <w:t xml:space="preserve"> row. If </w:t>
       </w:r>
       <w:proofErr w:type="spellStart"/>
       <w:r>
-        <w:t>owner_id</w:t>
+        <w:t>archived_moment_notifications</w:t>
       </w:r>
       <w:proofErr w:type="spellEnd"/>
       <w:r>
-        <w:t xml:space="preserve"> on the moments table.”</w:t>
+        <w:t xml:space="preserve"> is false, suppress notifications for archived moments. Periodic reminders should be driven by a scheduled function (</w:t>
+      </w:r>
+      <w:proofErr w:type="spellStart"/>
+      <w:r>
+        <w:t>Supabase</w:t>
+      </w:r>
+      <w:proofErr w:type="spellEnd"/>
+      <w:r>
+        <w:t xml:space="preserve"> Edge Functions or a </w:t>
+      </w:r>
+      <w:proofErr w:type="spellStart"/>
+      <w:r>
+        <w:t>cron</w:t>
+      </w:r>
+      <w:proofErr w:type="spellEnd"/>
+      <w:r>
+        <w:t xml:space="preserve"> job via </w:t>
+      </w:r>
+      <w:proofErr w:type="spellStart"/>
+      <w:r>
+        <w:t>Vercel</w:t>
+      </w:r>
+      <w:proofErr w:type="spellEnd"/>
+      <w:r>
+        <w:t>).”</w:t>
       </w:r>
     </w:p>
     <w:p/>
@@ -9977,7 +10115,7 @@
         <w:pStyle w:val="Heading3"/>
       </w:pPr>
       <w:r>
-        <w:t>Phase 7 — Notifications</w:t>
+        <w:t>Phase 8 — Pricing Page</w:t>
       </w:r>
     </w:p>
     <w:p>
@@ -9985,15 +10123,7 @@
         <w:spacing w:before="60" w:after="60"/>
       </w:pPr>
       <w:r>
-        <w:t xml:space="preserve">Paste in: Section 2.8 (Notifications), the notifications and </w:t>
-      </w:r>
-      <w:proofErr w:type="spellStart"/>
-      <w:r>
-        <w:t>notification_preferences</w:t>
-      </w:r>
-      <w:proofErr w:type="spellEnd"/>
-      <w:r>
-        <w:t xml:space="preserve"> tables, and the Phase 7 build order entry.</w:t>
+        <w:t>Paste in: Section 2.9 (Pricing &amp; Tiers) and the Phase 8 build order entry.</w:t>
       </w:r>
     </w:p>
     <w:p>
@@ -10013,52 +10143,12 @@
         <w:pStyle w:val="ListParagraph"/>
         <w:numPr>
           <w:ilvl w:val="0"/>
-          <w:numId w:val="2"/>
+          <w:numId w:val="4"/>
         </w:numPr>
         <w:spacing w:before="40" w:after="40"/>
       </w:pPr>
       <w:r>
-        <w:t xml:space="preserve">“Before sending any notification, check the recipient’s </w:t>
-      </w:r>
-      <w:proofErr w:type="spellStart"/>
-      <w:r>
-        <w:t>notification_preferences</w:t>
-      </w:r>
-      <w:proofErr w:type="spellEnd"/>
-      <w:r>
-        <w:t xml:space="preserve"> row. If </w:t>
-      </w:r>
-      <w:proofErr w:type="spellStart"/>
-      <w:r>
-        <w:t>archived_moment_notifications</w:t>
-      </w:r>
-      <w:proofErr w:type="spellEnd"/>
-      <w:r>
-        <w:t xml:space="preserve"> is false, suppress notifications for archived moments. Periodic reminders should be driven by a scheduled function (</w:t>
-      </w:r>
-      <w:proofErr w:type="spellStart"/>
-      <w:r>
-        <w:t>Supabase</w:t>
-      </w:r>
-      <w:proofErr w:type="spellEnd"/>
-      <w:r>
-        <w:t xml:space="preserve"> Edge Functions or a </w:t>
-      </w:r>
-      <w:proofErr w:type="spellStart"/>
-      <w:r>
-        <w:t>cron</w:t>
-      </w:r>
-      <w:proofErr w:type="spellEnd"/>
-      <w:r>
-        <w:t xml:space="preserve"> job via </w:t>
-      </w:r>
-      <w:proofErr w:type="spellStart"/>
-      <w:r>
-        <w:t>Vercel</w:t>
-      </w:r>
-      <w:proofErr w:type="spellEnd"/>
-      <w:r>
-        <w:t>).”</w:t>
+        <w:t>“This is a static marketing page only — no payment integration yet. Show a free tier and at least one placeholder paid tier. Keep the design consistent with the rest of the app.”</w:t>
       </w:r>
     </w:p>
     <w:p/>
@@ -10067,7 +10157,7 @@
         <w:pStyle w:val="Heading3"/>
       </w:pPr>
       <w:r>
-        <w:t>Phase 8 — Pricing Page</w:t>
+        <w:t>Phase 9 — Polish</w:t>
       </w:r>
     </w:p>
     <w:p>
@@ -10075,7 +10165,8 @@
         <w:spacing w:before="60" w:after="60"/>
       </w:pPr>
       <w:r>
-        <w:t>Paste in: Section 2.9 (Pricing &amp; Tiers) and the Phase 8 build order entry.</w:t>
+        <w:lastRenderedPageBreak/>
+        <w:t>No single paste-in — this phase is iterative. Run it as a review pass after each prior phase, and as a dedicated final pass at the end.</w:t>
       </w:r>
     </w:p>
     <w:p>
@@ -10095,54 +10186,11 @@
         <w:pStyle w:val="ListParagraph"/>
         <w:numPr>
           <w:ilvl w:val="0"/>
-          <w:numId w:val="2"/>
+          <w:numId w:val="4"/>
         </w:numPr>
         <w:spacing w:before="40" w:after="40"/>
       </w:pPr>
       <w:r>
-        <w:t>“This is a static marketing page only — no payment integration yet. Show a free tier and at least one placeholder paid tier. Keep the design consistent with the rest of the app.”</w:t>
-      </w:r>
-    </w:p>
-    <w:p/>
-    <w:p>
-      <w:pPr>
-        <w:pStyle w:val="Heading3"/>
-      </w:pPr>
-      <w:r>
-        <w:t>Phase 9 — Polish</w:t>
-      </w:r>
-    </w:p>
-    <w:p>
-      <w:pPr>
-        <w:spacing w:before="60" w:after="60"/>
-      </w:pPr>
-      <w:r>
-        <w:t>No single paste-in — this phase is iterative. Run it as a review pass after each prior phase, and as a dedicated final pass at the end.</w:t>
-      </w:r>
-    </w:p>
-    <w:p>
-      <w:pPr>
-        <w:spacing w:before="60" w:after="60"/>
-      </w:pPr>
-      <w:r>
-        <w:rPr>
-          <w:b/>
-          <w:bCs/>
-        </w:rPr>
-        <w:t>Key instruction to include:</w:t>
-      </w:r>
-    </w:p>
-    <w:p>
-      <w:pPr>
-        <w:pStyle w:val="ListParagraph"/>
-        <w:numPr>
-          <w:ilvl w:val="0"/>
-          <w:numId w:val="2"/>
-        </w:numPr>
-        <w:spacing w:before="40" w:after="40"/>
-      </w:pPr>
-      <w:r>
-        <w:lastRenderedPageBreak/>
         <w:t xml:space="preserve">“Review the current state of the app for: mobile responsiveness, loading and empty states, error handling, image optimisation, and </w:t>
       </w:r>
       <w:proofErr w:type="spellStart"/>
@@ -10176,7 +10224,7 @@
         <w:pStyle w:val="ListParagraph"/>
         <w:numPr>
           <w:ilvl w:val="0"/>
-          <w:numId w:val="2"/>
+          <w:numId w:val="4"/>
         </w:numPr>
         <w:spacing w:before="40" w:after="40"/>
       </w:pPr>
@@ -10189,7 +10237,7 @@
         <w:pStyle w:val="ListParagraph"/>
         <w:numPr>
           <w:ilvl w:val="0"/>
-          <w:numId w:val="2"/>
+          <w:numId w:val="4"/>
         </w:numPr>
         <w:spacing w:before="40" w:after="40"/>
       </w:pPr>
@@ -10202,7 +10250,7 @@
         <w:pStyle w:val="ListParagraph"/>
         <w:numPr>
           <w:ilvl w:val="0"/>
-          <w:numId w:val="2"/>
+          <w:numId w:val="4"/>
         </w:numPr>
         <w:spacing w:before="40" w:after="40"/>
       </w:pPr>
@@ -10215,7 +10263,7 @@
         <w:pStyle w:val="ListParagraph"/>
         <w:numPr>
           <w:ilvl w:val="0"/>
-          <w:numId w:val="2"/>
+          <w:numId w:val="4"/>
         </w:numPr>
         <w:spacing w:before="40" w:after="40"/>
       </w:pPr>
@@ -10228,7 +10276,7 @@
         <w:pStyle w:val="ListParagraph"/>
         <w:numPr>
           <w:ilvl w:val="0"/>
-          <w:numId w:val="2"/>
+          <w:numId w:val="4"/>
         </w:numPr>
         <w:spacing w:before="40" w:after="40"/>
       </w:pPr>
@@ -10257,7 +10305,7 @@
         <w:pStyle w:val="ListParagraph"/>
         <w:numPr>
           <w:ilvl w:val="0"/>
-          <w:numId w:val="2"/>
+          <w:numId w:val="4"/>
         </w:numPr>
         <w:spacing w:before="40" w:after="40"/>
       </w:pPr>
@@ -10299,6 +10347,7 @@
         <w:t>End of Document</w:t>
       </w:r>
     </w:p>
+    <w:p/>
     <w:sectPr>
       <w:footerReference w:type="default" r:id="rId7"/>
       <w:pgSz w:w="12240" w:h="15840"/>
@@ -10658,6 +10707,118 @@
       <w:lvlJc w:val="left"/>
     </w:lvl>
   </w:abstractNum>
+  <w:abstractNum w:abstractNumId="4" w15:restartNumberingAfterBreak="0">
+    <w:nsid w:val="6B6C68B6"/>
+    <w:multiLevelType w:val="hybridMultilevel"/>
+    <w:tmpl w:val="A4FC0218"/>
+    <w:lvl w:ilvl="0" w:tplc="D0D86A2E">
+      <w:start w:val="1"/>
+      <w:numFmt w:val="bullet"/>
+      <w:lvlText w:val="•"/>
+      <w:lvlJc w:val="left"/>
+      <w:pPr>
+        <w:ind w:left="720" w:hanging="360"/>
+      </w:pPr>
+    </w:lvl>
+    <w:lvl w:ilvl="1" w:tplc="F0E418F0">
+      <w:numFmt w:val="decimal"/>
+      <w:lvlText w:val=""/>
+      <w:lvlJc w:val="left"/>
+    </w:lvl>
+    <w:lvl w:ilvl="2" w:tplc="3348C144">
+      <w:numFmt w:val="decimal"/>
+      <w:lvlText w:val=""/>
+      <w:lvlJc w:val="left"/>
+    </w:lvl>
+    <w:lvl w:ilvl="3" w:tplc="CC6CE80E">
+      <w:numFmt w:val="decimal"/>
+      <w:lvlText w:val=""/>
+      <w:lvlJc w:val="left"/>
+    </w:lvl>
+    <w:lvl w:ilvl="4" w:tplc="F15E6514">
+      <w:numFmt w:val="decimal"/>
+      <w:lvlText w:val=""/>
+      <w:lvlJc w:val="left"/>
+    </w:lvl>
+    <w:lvl w:ilvl="5" w:tplc="373209D8">
+      <w:numFmt w:val="decimal"/>
+      <w:lvlText w:val=""/>
+      <w:lvlJc w:val="left"/>
+    </w:lvl>
+    <w:lvl w:ilvl="6" w:tplc="E73211B2">
+      <w:numFmt w:val="decimal"/>
+      <w:lvlText w:val=""/>
+      <w:lvlJc w:val="left"/>
+    </w:lvl>
+    <w:lvl w:ilvl="7" w:tplc="2EACD070">
+      <w:numFmt w:val="decimal"/>
+      <w:lvlText w:val=""/>
+      <w:lvlJc w:val="left"/>
+    </w:lvl>
+    <w:lvl w:ilvl="8" w:tplc="E74CF560">
+      <w:numFmt w:val="decimal"/>
+      <w:lvlText w:val=""/>
+      <w:lvlJc w:val="left"/>
+    </w:lvl>
+  </w:abstractNum>
+  <w:abstractNum w:abstractNumId="5" w15:restartNumberingAfterBreak="0">
+    <w:nsid w:val="6E6901D5"/>
+    <w:multiLevelType w:val="hybridMultilevel"/>
+    <w:tmpl w:val="DF9E5B0C"/>
+    <w:lvl w:ilvl="0" w:tplc="62EC6ECC">
+      <w:start w:val="1"/>
+      <w:numFmt w:val="bullet"/>
+      <w:lvlText w:val=""/>
+      <w:lvlJc w:val="left"/>
+      <w:pPr>
+        <w:ind w:left="0"/>
+      </w:pPr>
+    </w:lvl>
+    <w:lvl w:ilvl="1" w:tplc="E09AFB98">
+      <w:start w:val="1"/>
+      <w:numFmt w:val="bullet"/>
+      <w:lvlText w:val="◦"/>
+      <w:lvlJc w:val="left"/>
+      <w:pPr>
+        <w:ind w:left="1080" w:hanging="360"/>
+      </w:pPr>
+    </w:lvl>
+    <w:lvl w:ilvl="2" w:tplc="C1AEAE54">
+      <w:numFmt w:val="decimal"/>
+      <w:lvlText w:val=""/>
+      <w:lvlJc w:val="left"/>
+    </w:lvl>
+    <w:lvl w:ilvl="3" w:tplc="5BF652A8">
+      <w:numFmt w:val="decimal"/>
+      <w:lvlText w:val=""/>
+      <w:lvlJc w:val="left"/>
+    </w:lvl>
+    <w:lvl w:ilvl="4" w:tplc="73D07BCC">
+      <w:numFmt w:val="decimal"/>
+      <w:lvlText w:val=""/>
+      <w:lvlJc w:val="left"/>
+    </w:lvl>
+    <w:lvl w:ilvl="5" w:tplc="DA048D7A">
+      <w:numFmt w:val="decimal"/>
+      <w:lvlText w:val=""/>
+      <w:lvlJc w:val="left"/>
+    </w:lvl>
+    <w:lvl w:ilvl="6" w:tplc="11C04F98">
+      <w:numFmt w:val="decimal"/>
+      <w:lvlText w:val=""/>
+      <w:lvlJc w:val="left"/>
+    </w:lvl>
+    <w:lvl w:ilvl="7" w:tplc="EC6A551E">
+      <w:numFmt w:val="decimal"/>
+      <w:lvlText w:val=""/>
+      <w:lvlJc w:val="left"/>
+    </w:lvl>
+    <w:lvl w:ilvl="8" w:tplc="EB9C4F26">
+      <w:numFmt w:val="decimal"/>
+      <w:lvlText w:val=""/>
+      <w:lvlJc w:val="left"/>
+    </w:lvl>
+  </w:abstractNum>
   <w:num w:numId="1" w16cid:durableId="1941139963">
     <w:abstractNumId w:val="2"/>
     <w:lvlOverride w:ilvl="0">
@@ -10672,6 +10833,18 @@
   </w:num>
   <w:num w:numId="3" w16cid:durableId="1942714076">
     <w:abstractNumId w:val="0"/>
+    <w:lvlOverride w:ilvl="0">
+      <w:startOverride w:val="1"/>
+    </w:lvlOverride>
+  </w:num>
+  <w:num w:numId="4" w16cid:durableId="796487070">
+    <w:abstractNumId w:val="4"/>
+    <w:lvlOverride w:ilvl="0">
+      <w:startOverride w:val="1"/>
+    </w:lvlOverride>
+  </w:num>
+  <w:num w:numId="5" w16cid:durableId="309794570">
+    <w:abstractNumId w:val="5"/>
     <w:lvlOverride w:ilvl="0">
       <w:startOverride w:val="1"/>
     </w:lvlOverride>

</xml_diff>

<commit_message>
chore: update product spec docx
Co-Authored-By: Claude Sonnet 4.6 <noreply@anthropic.com>
</commit_message>
<xml_diff>
--- a/moments_product_spec.docx
+++ b/moments_product_spec.docx
@@ -21,7 +21,6 @@
       <w:pPr>
         <w:spacing w:after="120"/>
       </w:pPr>
-      <w:proofErr w:type="spellStart"/>
       <w:r>
         <w:rPr>
           <w:b/>
@@ -30,9 +29,8 @@
           <w:sz w:val="52"/>
           <w:szCs w:val="52"/>
         </w:rPr>
-        <w:t>RememberWhen</w:t>
-      </w:r>
-      <w:proofErr w:type="spellEnd"/>
+        <w:t>Remember When</w:t>
+      </w:r>
     </w:p>
     <w:p>
       <w:pPr>
@@ -159,7 +157,6 @@
             </w:tcMar>
           </w:tcPr>
           <w:p>
-            <w:proofErr w:type="spellStart"/>
             <w:r>
               <w:rPr>
                 <w:i/>
@@ -167,37 +164,7 @@
                 <w:sz w:val="20"/>
                 <w:szCs w:val="20"/>
               </w:rPr>
-              <w:t>RememberWhen</w:t>
-            </w:r>
-            <w:proofErr w:type="spellEnd"/>
-            <w:r>
-              <w:rPr>
-                <w:i/>
-                <w:iCs/>
-                <w:sz w:val="20"/>
-                <w:szCs w:val="20"/>
-              </w:rPr>
-              <w:t xml:space="preserve"> — brand name written as one word, clean and URL-friendly (e.g. </w:t>
-            </w:r>
-            <w:proofErr w:type="spellStart"/>
-            <w:r>
-              <w:rPr>
-                <w:i/>
-                <w:iCs/>
-                <w:sz w:val="20"/>
-                <w:szCs w:val="20"/>
-              </w:rPr>
-              <w:t>rememberwhen.app</w:t>
-            </w:r>
-            <w:proofErr w:type="spellEnd"/>
-            <w:r>
-              <w:rPr>
-                <w:i/>
-                <w:iCs/>
-                <w:sz w:val="20"/>
-                <w:szCs w:val="20"/>
-              </w:rPr>
-              <w:t>). Shorthand “RW” for icon and tight UI spaces. Previous shortlist: Linger, Ember, Remember When.</w:t>
+              <w:t>Remember When — the chosen app name, written as two words. Shorthand “RW” for icon and tight UI spaces. URL: remwhen.vercel.app (dev), with rememberwhen.app or remwhen.app as candidates for production. Previous shortlist: Linger, Ember, Remember When (one word).</w:t>
             </w:r>
           </w:p>
         </w:tc>
@@ -314,7 +281,7 @@
         <w:pStyle w:val="ListParagraph"/>
         <w:numPr>
           <w:ilvl w:val="0"/>
-          <w:numId w:val="4"/>
+          <w:numId w:val="12"/>
         </w:numPr>
         <w:spacing w:before="40" w:after="40"/>
       </w:pPr>
@@ -327,7 +294,7 @@
         <w:pStyle w:val="ListParagraph"/>
         <w:numPr>
           <w:ilvl w:val="0"/>
-          <w:numId w:val="4"/>
+          <w:numId w:val="12"/>
         </w:numPr>
         <w:spacing w:before="40" w:after="40"/>
       </w:pPr>
@@ -340,7 +307,7 @@
         <w:pStyle w:val="ListParagraph"/>
         <w:numPr>
           <w:ilvl w:val="0"/>
-          <w:numId w:val="4"/>
+          <w:numId w:val="12"/>
         </w:numPr>
         <w:spacing w:before="40" w:after="40"/>
       </w:pPr>
@@ -353,7 +320,7 @@
         <w:pStyle w:val="ListParagraph"/>
         <w:numPr>
           <w:ilvl w:val="0"/>
-          <w:numId w:val="4"/>
+          <w:numId w:val="12"/>
         </w:numPr>
         <w:spacing w:before="40" w:after="40"/>
       </w:pPr>
@@ -378,7 +345,7 @@
         <w:pStyle w:val="ListParagraph"/>
         <w:numPr>
           <w:ilvl w:val="0"/>
-          <w:numId w:val="4"/>
+          <w:numId w:val="12"/>
         </w:numPr>
         <w:spacing w:before="40" w:after="40"/>
       </w:pPr>
@@ -398,7 +365,7 @@
         <w:pStyle w:val="ListParagraph"/>
         <w:numPr>
           <w:ilvl w:val="0"/>
-          <w:numId w:val="4"/>
+          <w:numId w:val="12"/>
         </w:numPr>
         <w:spacing w:before="40" w:after="40"/>
       </w:pPr>
@@ -418,7 +385,7 @@
         <w:pStyle w:val="ListParagraph"/>
         <w:numPr>
           <w:ilvl w:val="0"/>
-          <w:numId w:val="4"/>
+          <w:numId w:val="12"/>
         </w:numPr>
         <w:spacing w:before="40" w:after="40"/>
       </w:pPr>
@@ -429,13 +396,8 @@
         </w:rPr>
         <w:t xml:space="preserve">Database: </w:t>
       </w:r>
-      <w:proofErr w:type="spellStart"/>
-      <w:r>
-        <w:t>Supabase</w:t>
-      </w:r>
-      <w:proofErr w:type="spellEnd"/>
-      <w:r>
-        <w:t xml:space="preserve"> (Postgres)</w:t>
+      <w:r>
+        <w:t>Supabase (Postgres)</w:t>
       </w:r>
     </w:p>
     <w:p>
@@ -443,7 +405,7 @@
         <w:pStyle w:val="ListParagraph"/>
         <w:numPr>
           <w:ilvl w:val="0"/>
-          <w:numId w:val="4"/>
+          <w:numId w:val="12"/>
         </w:numPr>
         <w:spacing w:before="40" w:after="40"/>
       </w:pPr>
@@ -454,13 +416,8 @@
         </w:rPr>
         <w:t xml:space="preserve">Auth: </w:t>
       </w:r>
-      <w:proofErr w:type="spellStart"/>
-      <w:r>
-        <w:t>Supabase</w:t>
-      </w:r>
-      <w:proofErr w:type="spellEnd"/>
-      <w:r>
-        <w:t xml:space="preserve"> Auth (sign up, login, session handling, password reset)</w:t>
+      <w:r>
+        <w:t>Supabase Auth (sign up, login, session handling, password reset)</w:t>
       </w:r>
     </w:p>
     <w:p>
@@ -468,7 +425,7 @@
         <w:pStyle w:val="ListParagraph"/>
         <w:numPr>
           <w:ilvl w:val="0"/>
-          <w:numId w:val="4"/>
+          <w:numId w:val="12"/>
         </w:numPr>
         <w:spacing w:before="40" w:after="40"/>
       </w:pPr>
@@ -479,13 +436,8 @@
         </w:rPr>
         <w:t xml:space="preserve">File storage: </w:t>
       </w:r>
-      <w:proofErr w:type="spellStart"/>
-      <w:r>
-        <w:t>Supabase</w:t>
-      </w:r>
-      <w:proofErr w:type="spellEnd"/>
-      <w:r>
-        <w:t xml:space="preserve"> Storage (photos, videos, voice recordings, profile photos)</w:t>
+      <w:r>
+        <w:t>Supabase Storage (photos, videos, voice recordings, profile photos)</w:t>
       </w:r>
     </w:p>
     <w:p>
@@ -493,7 +445,7 @@
         <w:pStyle w:val="ListParagraph"/>
         <w:numPr>
           <w:ilvl w:val="0"/>
-          <w:numId w:val="4"/>
+          <w:numId w:val="12"/>
         </w:numPr>
         <w:spacing w:before="40" w:after="40"/>
       </w:pPr>
@@ -504,21 +456,8 @@
         </w:rPr>
         <w:t xml:space="preserve">UI components: </w:t>
       </w:r>
-      <w:proofErr w:type="spellStart"/>
-      <w:r>
-        <w:t>shadcn</w:t>
-      </w:r>
-      <w:proofErr w:type="spellEnd"/>
-      <w:r>
-        <w:t>/</w:t>
-      </w:r>
-      <w:proofErr w:type="spellStart"/>
-      <w:r>
-        <w:t>ui</w:t>
-      </w:r>
-      <w:proofErr w:type="spellEnd"/>
-      <w:r>
-        <w:t xml:space="preserve"> — modern, sleek, highly customisable</w:t>
+      <w:r>
+        <w:t>shadcn/ui — modern, sleek, highly customisable</w:t>
       </w:r>
     </w:p>
     <w:p>
@@ -526,7 +465,7 @@
         <w:pStyle w:val="ListParagraph"/>
         <w:numPr>
           <w:ilvl w:val="0"/>
-          <w:numId w:val="4"/>
+          <w:numId w:val="12"/>
         </w:numPr>
         <w:spacing w:before="40" w:after="40"/>
       </w:pPr>
@@ -537,13 +476,8 @@
         </w:rPr>
         <w:t xml:space="preserve">Deployment: </w:t>
       </w:r>
-      <w:proofErr w:type="spellStart"/>
-      <w:r>
-        <w:t>Vercel</w:t>
-      </w:r>
-      <w:proofErr w:type="spellEnd"/>
-      <w:r>
-        <w:t xml:space="preserve"> (pulling from GitHub)</w:t>
+      <w:r>
+        <w:t>Vercel (pulling from GitHub)</w:t>
       </w:r>
     </w:p>
     <w:p>
@@ -551,7 +485,7 @@
         <w:pStyle w:val="ListParagraph"/>
         <w:numPr>
           <w:ilvl w:val="0"/>
-          <w:numId w:val="4"/>
+          <w:numId w:val="12"/>
         </w:numPr>
         <w:spacing w:before="40" w:after="40"/>
       </w:pPr>
@@ -582,13 +516,9 @@
           <w:bottom w:val="single" w:sz="4" w:space="4" w:color="4A90B8"/>
         </w:pBdr>
       </w:pPr>
-      <w:proofErr w:type="gramStart"/>
-      <w:r>
-        <w:t>2.1  Users</w:t>
-      </w:r>
-      <w:proofErr w:type="gramEnd"/>
-      <w:r>
-        <w:t xml:space="preserve"> &amp; Accounts</w:t>
+      <w:r>
+        <w:lastRenderedPageBreak/>
+        <w:t>2.1  Users &amp; Accounts</w:t>
       </w:r>
     </w:p>
     <w:p>
@@ -596,21 +526,12 @@
         <w:pStyle w:val="ListParagraph"/>
         <w:numPr>
           <w:ilvl w:val="0"/>
-          <w:numId w:val="4"/>
+          <w:numId w:val="12"/>
         </w:numPr>
         <w:spacing w:before="40" w:after="40"/>
       </w:pPr>
       <w:r>
-        <w:lastRenderedPageBreak/>
-        <w:t>Sign up fields: first name, last name, email, username (</w:t>
-      </w:r>
-      <w:proofErr w:type="gramStart"/>
-      <w:r>
-        <w:t>unique-enforced</w:t>
-      </w:r>
-      <w:proofErr w:type="gramEnd"/>
-      <w:r>
-        <w:t>), optional profile photo</w:t>
+        <w:t>Sign up fields: first name, last name, email, username (unique-enforced), optional profile photo</w:t>
       </w:r>
     </w:p>
     <w:p>
@@ -618,12 +539,12 @@
         <w:pStyle w:val="ListParagraph"/>
         <w:numPr>
           <w:ilvl w:val="0"/>
-          <w:numId w:val="4"/>
+          <w:numId w:val="12"/>
         </w:numPr>
         <w:spacing w:before="40" w:after="40"/>
       </w:pPr>
       <w:r>
-        <w:t>Account page: edit personal details, update profile photo, delete account</w:t>
+        <w:t>Account page and Settings / Notifications page are two separate pages — Account = who you are, Settings = how the app behaves for you</w:t>
       </w:r>
     </w:p>
     <w:p>
@@ -631,11 +552,175 @@
         <w:pStyle w:val="ListParagraph"/>
         <w:numPr>
           <w:ilvl w:val="0"/>
-          <w:numId w:val="4"/>
+          <w:numId w:val="12"/>
         </w:numPr>
         <w:spacing w:before="40" w:after="40"/>
       </w:pPr>
       <w:r>
+        <w:rPr>
+          <w:b/>
+          <w:bCs/>
+        </w:rPr>
+        <w:t>Account page — three distinct sections:</w:t>
+      </w:r>
+    </w:p>
+    <w:p>
+      <w:pPr>
+        <w:pStyle w:val="ListParagraph"/>
+        <w:numPr>
+          <w:ilvl w:val="1"/>
+          <w:numId w:val="13"/>
+        </w:numPr>
+        <w:spacing w:before="30" w:after="30"/>
+      </w:pPr>
+      <w:r>
+        <w:rPr>
+          <w:b/>
+          <w:bCs/>
+          <w:sz w:val="20"/>
+          <w:szCs w:val="20"/>
+        </w:rPr>
+        <w:t xml:space="preserve">Profile: </w:t>
+      </w:r>
+      <w:r>
+        <w:rPr>
+          <w:sz w:val="20"/>
+          <w:szCs w:val="20"/>
+        </w:rPr>
+        <w:t>first name, last name, username (real-time uniqueness check), email address (requires re-authentication to change), profile photo (upload, replace, or remove; preview shown)</w:t>
+      </w:r>
+    </w:p>
+    <w:p>
+      <w:pPr>
+        <w:pStyle w:val="ListParagraph"/>
+        <w:numPr>
+          <w:ilvl w:val="1"/>
+          <w:numId w:val="13"/>
+        </w:numPr>
+        <w:spacing w:before="30" w:after="30"/>
+      </w:pPr>
+      <w:r>
+        <w:rPr>
+          <w:b/>
+          <w:bCs/>
+          <w:sz w:val="20"/>
+          <w:szCs w:val="20"/>
+        </w:rPr>
+        <w:t xml:space="preserve">Security: </w:t>
+      </w:r>
+      <w:r>
+        <w:rPr>
+          <w:sz w:val="20"/>
+          <w:szCs w:val="20"/>
+        </w:rPr>
+        <w:t>change password (current password, new password, confirm new password)</w:t>
+      </w:r>
+    </w:p>
+    <w:p>
+      <w:pPr>
+        <w:pStyle w:val="ListParagraph"/>
+        <w:numPr>
+          <w:ilvl w:val="1"/>
+          <w:numId w:val="13"/>
+        </w:numPr>
+        <w:spacing w:before="30" w:after="30"/>
+      </w:pPr>
+      <w:r>
+        <w:rPr>
+          <w:b/>
+          <w:bCs/>
+          <w:sz w:val="20"/>
+          <w:szCs w:val="20"/>
+        </w:rPr>
+        <w:t xml:space="preserve">Danger zone: </w:t>
+      </w:r>
+      <w:r>
+        <w:rPr>
+          <w:sz w:val="20"/>
+          <w:szCs w:val="20"/>
+        </w:rPr>
+        <w:t>delete account button (visually distinct — red, outlined); triggers a confirmation modal explaining that personal data will be deleted but posts in shared moments remain attributed to the user; user must type their username to confirm before deletion proceeds</w:t>
+      </w:r>
+    </w:p>
+    <w:p>
+      <w:pPr>
+        <w:pStyle w:val="ListParagraph"/>
+        <w:numPr>
+          <w:ilvl w:val="0"/>
+          <w:numId w:val="12"/>
+        </w:numPr>
+        <w:spacing w:before="40" w:after="40"/>
+      </w:pPr>
+      <w:r>
+        <w:rPr>
+          <w:b/>
+          <w:bCs/>
+        </w:rPr>
+        <w:t>Settings / Notifications page — two distinct sections:</w:t>
+      </w:r>
+    </w:p>
+    <w:p>
+      <w:pPr>
+        <w:pStyle w:val="ListParagraph"/>
+        <w:numPr>
+          <w:ilvl w:val="1"/>
+          <w:numId w:val="13"/>
+        </w:numPr>
+        <w:spacing w:before="30" w:after="30"/>
+      </w:pPr>
+      <w:r>
+        <w:rPr>
+          <w:b/>
+          <w:bCs/>
+          <w:sz w:val="20"/>
+          <w:szCs w:val="20"/>
+        </w:rPr>
+        <w:t xml:space="preserve">Notification toggles: </w:t>
+      </w:r>
+      <w:r>
+        <w:rPr>
+          <w:sz w:val="20"/>
+          <w:szCs w:val="20"/>
+        </w:rPr>
+        <w:t>one toggle per notification type (see Section 2.8), grouped logically: Friend activity / Moment activity / Reminders</w:t>
+      </w:r>
+    </w:p>
+    <w:p>
+      <w:pPr>
+        <w:pStyle w:val="ListParagraph"/>
+        <w:numPr>
+          <w:ilvl w:val="1"/>
+          <w:numId w:val="13"/>
+        </w:numPr>
+        <w:spacing w:before="30" w:after="30"/>
+      </w:pPr>
+      <w:r>
+        <w:rPr>
+          <w:b/>
+          <w:bCs/>
+          <w:sz w:val="20"/>
+          <w:szCs w:val="20"/>
+        </w:rPr>
+        <w:t xml:space="preserve">Reminder cadence: </w:t>
+      </w:r>
+      <w:r>
+        <w:rPr>
+          <w:sz w:val="20"/>
+          <w:szCs w:val="20"/>
+        </w:rPr>
+        <w:t>separate control (radio buttons or dropdown): Weekly / Bi-weekly / Monthly / Never</w:t>
+      </w:r>
+    </w:p>
+    <w:p>
+      <w:pPr>
+        <w:pStyle w:val="ListParagraph"/>
+        <w:numPr>
+          <w:ilvl w:val="0"/>
+          <w:numId w:val="12"/>
+        </w:numPr>
+        <w:spacing w:before="40" w:after="40"/>
+      </w:pPr>
+      <w:r>
         <w:t>Deleting an account removes all personal data; posts left in shared moments remain, attributed to the user</w:t>
       </w:r>
     </w:p>
@@ -644,7 +729,7 @@
         <w:pStyle w:val="ListParagraph"/>
         <w:numPr>
           <w:ilvl w:val="0"/>
-          <w:numId w:val="4"/>
+          <w:numId w:val="12"/>
         </w:numPr>
         <w:spacing w:before="40" w:after="40"/>
       </w:pPr>
@@ -657,7 +742,7 @@
         <w:pStyle w:val="ListParagraph"/>
         <w:numPr>
           <w:ilvl w:val="0"/>
-          <w:numId w:val="4"/>
+          <w:numId w:val="12"/>
         </w:numPr>
         <w:spacing w:before="40" w:after="40"/>
       </w:pPr>
@@ -673,18 +758,16 @@
           <w:bottom w:val="single" w:sz="4" w:space="4" w:color="4A90B8"/>
         </w:pBdr>
       </w:pPr>
-      <w:proofErr w:type="gramStart"/>
       <w:r>
         <w:t>2.2  Friends</w:t>
       </w:r>
-      <w:proofErr w:type="gramEnd"/>
     </w:p>
     <w:p>
       <w:pPr>
         <w:pStyle w:val="ListParagraph"/>
         <w:numPr>
           <w:ilvl w:val="0"/>
-          <w:numId w:val="4"/>
+          <w:numId w:val="12"/>
         </w:numPr>
         <w:spacing w:before="40" w:after="40"/>
       </w:pPr>
@@ -697,7 +780,7 @@
         <w:pStyle w:val="ListParagraph"/>
         <w:numPr>
           <w:ilvl w:val="0"/>
-          <w:numId w:val="4"/>
+          <w:numId w:val="12"/>
         </w:numPr>
         <w:spacing w:before="40" w:after="40"/>
       </w:pPr>
@@ -710,7 +793,7 @@
         <w:pStyle w:val="ListParagraph"/>
         <w:numPr>
           <w:ilvl w:val="0"/>
-          <w:numId w:val="4"/>
+          <w:numId w:val="12"/>
         </w:numPr>
         <w:spacing w:before="40" w:after="40"/>
       </w:pPr>
@@ -723,20 +806,12 @@
         <w:pStyle w:val="ListParagraph"/>
         <w:numPr>
           <w:ilvl w:val="0"/>
-          <w:numId w:val="4"/>
+          <w:numId w:val="12"/>
         </w:numPr>
         <w:spacing w:before="40" w:after="40"/>
       </w:pPr>
       <w:r>
-        <w:t xml:space="preserve">Manage </w:t>
-      </w:r>
-      <w:proofErr w:type="gramStart"/>
-      <w:r>
-        <w:t>friends</w:t>
-      </w:r>
-      <w:proofErr w:type="gramEnd"/>
-      <w:r>
-        <w:t xml:space="preserve"> section: view current friends, add new friends, remove friends</w:t>
+        <w:t>Manage friends section: view current friends, add new friends, remove friends</w:t>
       </w:r>
     </w:p>
     <w:p>
@@ -744,7 +819,7 @@
         <w:pStyle w:val="ListParagraph"/>
         <w:numPr>
           <w:ilvl w:val="0"/>
-          <w:numId w:val="4"/>
+          <w:numId w:val="12"/>
         </w:numPr>
         <w:spacing w:before="40" w:after="40"/>
       </w:pPr>
@@ -757,7 +832,7 @@
         <w:pStyle w:val="ListParagraph"/>
         <w:numPr>
           <w:ilvl w:val="0"/>
-          <w:numId w:val="4"/>
+          <w:numId w:val="12"/>
         </w:numPr>
         <w:spacing w:before="40" w:after="40"/>
       </w:pPr>
@@ -773,13 +848,8 @@
           <w:bottom w:val="single" w:sz="4" w:space="4" w:color="4A90B8"/>
         </w:pBdr>
       </w:pPr>
-      <w:proofErr w:type="gramStart"/>
-      <w:r>
-        <w:t>2.3  Home</w:t>
-      </w:r>
-      <w:proofErr w:type="gramEnd"/>
-      <w:r>
-        <w:t xml:space="preserve"> Page</w:t>
+      <w:r>
+        <w:t>2.3  Home Page</w:t>
       </w:r>
     </w:p>
     <w:p>
@@ -787,7 +857,7 @@
         <w:pStyle w:val="ListParagraph"/>
         <w:numPr>
           <w:ilvl w:val="0"/>
-          <w:numId w:val="4"/>
+          <w:numId w:val="12"/>
         </w:numPr>
         <w:spacing w:before="40" w:after="40"/>
       </w:pPr>
@@ -800,7 +870,7 @@
         <w:pStyle w:val="ListParagraph"/>
         <w:numPr>
           <w:ilvl w:val="0"/>
-          <w:numId w:val="4"/>
+          <w:numId w:val="12"/>
         </w:numPr>
         <w:spacing w:before="40" w:after="40"/>
       </w:pPr>
@@ -825,7 +895,7 @@
         <w:pStyle w:val="ListParagraph"/>
         <w:numPr>
           <w:ilvl w:val="1"/>
-          <w:numId w:val="5"/>
+          <w:numId w:val="13"/>
         </w:numPr>
         <w:spacing w:before="30" w:after="30"/>
       </w:pPr>
@@ -842,7 +912,7 @@
         <w:pStyle w:val="ListParagraph"/>
         <w:numPr>
           <w:ilvl w:val="1"/>
-          <w:numId w:val="5"/>
+          <w:numId w:val="13"/>
         </w:numPr>
         <w:spacing w:before="30" w:after="30"/>
       </w:pPr>
@@ -871,7 +941,7 @@
         <w:pStyle w:val="ListParagraph"/>
         <w:numPr>
           <w:ilvl w:val="1"/>
-          <w:numId w:val="5"/>
+          <w:numId w:val="13"/>
         </w:numPr>
         <w:spacing w:before="30" w:after="30"/>
       </w:pPr>
@@ -888,7 +958,7 @@
         <w:pStyle w:val="ListParagraph"/>
         <w:numPr>
           <w:ilvl w:val="0"/>
-          <w:numId w:val="4"/>
+          <w:numId w:val="12"/>
         </w:numPr>
         <w:spacing w:before="40" w:after="40"/>
       </w:pPr>
@@ -901,7 +971,7 @@
         <w:pStyle w:val="ListParagraph"/>
         <w:numPr>
           <w:ilvl w:val="0"/>
-          <w:numId w:val="4"/>
+          <w:numId w:val="12"/>
         </w:numPr>
         <w:spacing w:before="40" w:after="40"/>
       </w:pPr>
@@ -914,11 +984,12 @@
         <w:pStyle w:val="ListParagraph"/>
         <w:numPr>
           <w:ilvl w:val="0"/>
-          <w:numId w:val="4"/>
+          <w:numId w:val="12"/>
         </w:numPr>
         <w:spacing w:before="40" w:after="40"/>
       </w:pPr>
       <w:r>
+        <w:lastRenderedPageBreak/>
         <w:t>Periodic reminder notifications prompt users to capture a moment (configurable cadence, not moment-specific)</w:t>
       </w:r>
     </w:p>
@@ -930,13 +1001,8 @@
           <w:bottom w:val="single" w:sz="4" w:space="4" w:color="4A90B8"/>
         </w:pBdr>
       </w:pPr>
-      <w:proofErr w:type="gramStart"/>
-      <w:r>
-        <w:t>2.4  Creating</w:t>
-      </w:r>
-      <w:proofErr w:type="gramEnd"/>
-      <w:r>
-        <w:t xml:space="preserve"> a Moment</w:t>
+      <w:r>
+        <w:t>2.4  Creating a Moment</w:t>
       </w:r>
     </w:p>
     <w:p>
@@ -944,7 +1010,7 @@
         <w:pStyle w:val="ListParagraph"/>
         <w:numPr>
           <w:ilvl w:val="0"/>
-          <w:numId w:val="4"/>
+          <w:numId w:val="12"/>
         </w:numPr>
         <w:spacing w:before="40" w:after="40"/>
       </w:pPr>
@@ -969,7 +1035,7 @@
         <w:pStyle w:val="ListParagraph"/>
         <w:numPr>
           <w:ilvl w:val="1"/>
-          <w:numId w:val="5"/>
+          <w:numId w:val="13"/>
         </w:numPr>
         <w:spacing w:before="30" w:after="30"/>
       </w:pPr>
@@ -986,7 +1052,7 @@
         <w:pStyle w:val="ListParagraph"/>
         <w:numPr>
           <w:ilvl w:val="1"/>
-          <w:numId w:val="5"/>
+          <w:numId w:val="13"/>
         </w:numPr>
         <w:spacing w:before="30" w:after="30"/>
       </w:pPr>
@@ -1003,7 +1069,7 @@
         <w:pStyle w:val="ListParagraph"/>
         <w:numPr>
           <w:ilvl w:val="1"/>
-          <w:numId w:val="5"/>
+          <w:numId w:val="13"/>
         </w:numPr>
         <w:spacing w:before="30" w:after="30"/>
       </w:pPr>
@@ -1020,7 +1086,7 @@
         <w:pStyle w:val="ListParagraph"/>
         <w:numPr>
           <w:ilvl w:val="1"/>
-          <w:numId w:val="5"/>
+          <w:numId w:val="13"/>
         </w:numPr>
         <w:spacing w:before="30" w:after="30"/>
       </w:pPr>
@@ -1037,7 +1103,7 @@
         <w:pStyle w:val="ListParagraph"/>
         <w:numPr>
           <w:ilvl w:val="1"/>
-          <w:numId w:val="5"/>
+          <w:numId w:val="13"/>
         </w:numPr>
         <w:spacing w:before="30" w:after="30"/>
       </w:pPr>
@@ -1054,7 +1120,7 @@
         <w:pStyle w:val="ListParagraph"/>
         <w:numPr>
           <w:ilvl w:val="0"/>
-          <w:numId w:val="4"/>
+          <w:numId w:val="12"/>
         </w:numPr>
         <w:spacing w:before="40" w:after="40"/>
       </w:pPr>
@@ -1067,37 +1133,12 @@
         <w:pStyle w:val="ListParagraph"/>
         <w:numPr>
           <w:ilvl w:val="0"/>
-          <w:numId w:val="4"/>
+          <w:numId w:val="12"/>
         </w:numPr>
         <w:spacing w:before="40" w:after="40"/>
       </w:pPr>
       <w:r>
-        <w:lastRenderedPageBreak/>
-        <w:t xml:space="preserve">Non-existing users: if an invited email has no matching account, a pending invite is </w:t>
-      </w:r>
-      <w:proofErr w:type="gramStart"/>
-      <w:r>
-        <w:t>stored</w:t>
-      </w:r>
-      <w:proofErr w:type="gramEnd"/>
-      <w:r>
-        <w:t xml:space="preserve"> and a sign-up email is sent (“[Name] has added you to a moment on </w:t>
-      </w:r>
-      <w:proofErr w:type="spellStart"/>
-      <w:r>
-        <w:t>RememberWhen</w:t>
-      </w:r>
-      <w:proofErr w:type="spellEnd"/>
-      <w:r>
-        <w:t xml:space="preserve">. Create an account to view it.”). Once they sign up, the pending invite is automatically </w:t>
-      </w:r>
-      <w:proofErr w:type="gramStart"/>
-      <w:r>
-        <w:t>surfaced</w:t>
-      </w:r>
-      <w:proofErr w:type="gramEnd"/>
-      <w:r>
-        <w:t xml:space="preserve"> and they go through the normal accept / decline flow. The pending invite is tied to the email address.</w:t>
+        <w:t>Non-existing users: if an invited email has no matching account, a pending invite is stored and a sign-up email is sent (“[Name] has added you to a moment on Remember When. Create an account to view it.”). Once they sign up, the pending invite is automatically surfaced and they go through the normal accept / decline flow. The pending invite is tied to the email address.</w:t>
       </w:r>
     </w:p>
     <w:p>
@@ -1105,7 +1146,7 @@
         <w:pStyle w:val="ListParagraph"/>
         <w:numPr>
           <w:ilvl w:val="0"/>
-          <w:numId w:val="4"/>
+          <w:numId w:val="12"/>
         </w:numPr>
         <w:spacing w:before="40" w:after="40"/>
       </w:pPr>
@@ -1118,7 +1159,7 @@
         <w:pStyle w:val="ListParagraph"/>
         <w:numPr>
           <w:ilvl w:val="0"/>
-          <w:numId w:val="4"/>
+          <w:numId w:val="12"/>
         </w:numPr>
         <w:spacing w:before="40" w:after="40"/>
       </w:pPr>
@@ -1134,13 +1175,8 @@
           <w:bottom w:val="single" w:sz="4" w:space="4" w:color="4A90B8"/>
         </w:pBdr>
       </w:pPr>
-      <w:proofErr w:type="gramStart"/>
-      <w:r>
-        <w:t>2.5  Moment</w:t>
-      </w:r>
-      <w:proofErr w:type="gramEnd"/>
-      <w:r>
-        <w:t xml:space="preserve"> Page</w:t>
+      <w:r>
+        <w:t>2.5  Moment Page</w:t>
       </w:r>
     </w:p>
     <w:p>
@@ -1148,7 +1184,7 @@
         <w:pStyle w:val="ListParagraph"/>
         <w:numPr>
           <w:ilvl w:val="0"/>
-          <w:numId w:val="4"/>
+          <w:numId w:val="12"/>
         </w:numPr>
         <w:spacing w:before="40" w:after="40"/>
       </w:pPr>
@@ -1161,12 +1197,12 @@
         <w:pStyle w:val="ListParagraph"/>
         <w:numPr>
           <w:ilvl w:val="0"/>
-          <w:numId w:val="4"/>
+          <w:numId w:val="12"/>
         </w:numPr>
         <w:spacing w:before="40" w:after="40"/>
       </w:pPr>
       <w:r>
-        <w:t>Cover photo: set by selecting from an already uploaded photo in the moment, or uploading a new one</w:t>
+        <w:t>Cover photo: editable from within the moment page only (not from the moment card). Select from already uploaded photos in the moment, or upload a new one.</w:t>
       </w:r>
     </w:p>
     <w:p>
@@ -1174,12 +1210,313 @@
         <w:pStyle w:val="ListParagraph"/>
         <w:numPr>
           <w:ilvl w:val="0"/>
-          <w:numId w:val="4"/>
+          <w:numId w:val="12"/>
         </w:numPr>
         <w:spacing w:before="40" w:after="40"/>
       </w:pPr>
       <w:r>
-        <w:t>Journal entries displayed below the header</w:t>
+        <w:rPr>
+          <w:b/>
+          <w:bCs/>
+        </w:rPr>
+        <w:t>Moment detail editing — available to owners and editors only:</w:t>
+      </w:r>
+    </w:p>
+    <w:p>
+      <w:pPr>
+        <w:pStyle w:val="ListParagraph"/>
+        <w:numPr>
+          <w:ilvl w:val="1"/>
+          <w:numId w:val="13"/>
+        </w:numPr>
+        <w:spacing w:before="30" w:after="30"/>
+      </w:pPr>
+      <w:r>
+        <w:rPr>
+          <w:sz w:val="20"/>
+          <w:szCs w:val="20"/>
+        </w:rPr>
+        <w:t>Triggered from two entry points: the [...] menu on moment cards (edit first, archive second), and an edit button / [...] menu within the moment page header</w:t>
+      </w:r>
+    </w:p>
+    <w:p>
+      <w:pPr>
+        <w:pStyle w:val="ListParagraph"/>
+        <w:numPr>
+          <w:ilvl w:val="1"/>
+          <w:numId w:val="13"/>
+        </w:numPr>
+        <w:spacing w:before="30" w:after="30"/>
+      </w:pPr>
+      <w:r>
+        <w:rPr>
+          <w:sz w:val="20"/>
+          <w:szCs w:val="20"/>
+        </w:rPr>
+        <w:t>Reuses the create moment modal, pre-populated with existing values; title changes to “Edit moment”</w:t>
+      </w:r>
+    </w:p>
+    <w:p>
+      <w:pPr>
+        <w:pStyle w:val="ListParagraph"/>
+        <w:numPr>
+          <w:ilvl w:val="1"/>
+          <w:numId w:val="13"/>
+        </w:numPr>
+        <w:spacing w:before="30" w:after="30"/>
+      </w:pPr>
+      <w:r>
+        <w:rPr>
+          <w:sz w:val="20"/>
+          <w:szCs w:val="20"/>
+        </w:rPr>
+        <w:t>Editable fields: moment name, date (including precision level), location, tags / keywords</w:t>
+      </w:r>
+    </w:p>
+    <w:p>
+      <w:pPr>
+        <w:pStyle w:val="ListParagraph"/>
+        <w:numPr>
+          <w:ilvl w:val="1"/>
+          <w:numId w:val="13"/>
+        </w:numPr>
+        <w:spacing w:before="30" w:after="30"/>
+      </w:pPr>
+      <w:r>
+        <w:rPr>
+          <w:sz w:val="20"/>
+          <w:szCs w:val="20"/>
+        </w:rPr>
+        <w:t>Saving an edit triggers a notification to all editors and readers of the moment</w:t>
+      </w:r>
+    </w:p>
+    <w:p>
+      <w:pPr>
+        <w:pStyle w:val="ListParagraph"/>
+        <w:numPr>
+          <w:ilvl w:val="0"/>
+          <w:numId w:val="12"/>
+        </w:numPr>
+        <w:spacing w:before="40" w:after="40"/>
+      </w:pPr>
+      <w:r>
+        <w:rPr>
+          <w:b/>
+          <w:bCs/>
+        </w:rPr>
+        <w:t>Manage members — dedicated section within the moment page (separate from the edit modal):</w:t>
+      </w:r>
+    </w:p>
+    <w:p>
+      <w:pPr>
+        <w:pStyle w:val="ListParagraph"/>
+        <w:numPr>
+          <w:ilvl w:val="1"/>
+          <w:numId w:val="13"/>
+        </w:numPr>
+        <w:spacing w:before="30" w:after="30"/>
+      </w:pPr>
+      <w:r>
+        <w:rPr>
+          <w:sz w:val="20"/>
+          <w:szCs w:val="20"/>
+        </w:rPr>
+        <w:t>Full manage members and invite link functionality lives on a dedicated Members page (/moments/[id]/members), not on the main moment page</w:t>
+      </w:r>
+    </w:p>
+    <w:p>
+      <w:pPr>
+        <w:pStyle w:val="ListParagraph"/>
+        <w:numPr>
+          <w:ilvl w:val="1"/>
+          <w:numId w:val="13"/>
+        </w:numPr>
+        <w:spacing w:before="30" w:after="30"/>
+      </w:pPr>
+      <w:r>
+        <w:rPr>
+          <w:sz w:val="20"/>
+          <w:szCs w:val="20"/>
+        </w:rPr>
+        <w:t>Members page contains: editor list (remove visible to owner only), reader list (remove visible to owners and editors), and invite link generator</w:t>
+      </w:r>
+    </w:p>
+    <w:p>
+      <w:pPr>
+        <w:pStyle w:val="ListParagraph"/>
+        <w:numPr>
+          <w:ilvl w:val="1"/>
+          <w:numId w:val="13"/>
+        </w:numPr>
+        <w:spacing w:before="30" w:after="30"/>
+      </w:pPr>
+      <w:r>
+        <w:rPr>
+          <w:sz w:val="20"/>
+          <w:szCs w:val="20"/>
+        </w:rPr>
+        <w:t>Removing an editor is an owner-only action; removing a reader is available to owners and editors</w:t>
+      </w:r>
+    </w:p>
+    <w:p>
+      <w:pPr>
+        <w:pStyle w:val="ListParagraph"/>
+        <w:numPr>
+          <w:ilvl w:val="0"/>
+          <w:numId w:val="12"/>
+        </w:numPr>
+        <w:spacing w:before="40" w:after="40"/>
+      </w:pPr>
+      <w:r>
+        <w:rPr>
+          <w:b/>
+          <w:bCs/>
+        </w:rPr>
+        <w:t>Main moment page layout (top to bottom):</w:t>
+      </w:r>
+    </w:p>
+    <w:p>
+      <w:pPr>
+        <w:pStyle w:val="ListParagraph"/>
+        <w:numPr>
+          <w:ilvl w:val="1"/>
+          <w:numId w:val="13"/>
+        </w:numPr>
+        <w:spacing w:before="30" w:after="30"/>
+      </w:pPr>
+      <w:r>
+        <w:rPr>
+          <w:b/>
+          <w:bCs/>
+          <w:sz w:val="20"/>
+          <w:szCs w:val="20"/>
+        </w:rPr>
+        <w:t xml:space="preserve">1. Collapsing header </w:t>
+      </w:r>
+      <w:r>
+        <w:rPr>
+          <w:sz w:val="20"/>
+          <w:szCs w:val="20"/>
+        </w:rPr>
+        <w:t>— cover photo with gradient overlay, moment name, date, location; edit [...] menu (owners and editors only)</w:t>
+      </w:r>
+    </w:p>
+    <w:p>
+      <w:pPr>
+        <w:pStyle w:val="ListParagraph"/>
+        <w:numPr>
+          <w:ilvl w:val="1"/>
+          <w:numId w:val="13"/>
+        </w:numPr>
+        <w:spacing w:before="30" w:after="30"/>
+      </w:pPr>
+      <w:r>
+        <w:rPr>
+          <w:b/>
+          <w:bCs/>
+          <w:sz w:val="20"/>
+          <w:szCs w:val="20"/>
+        </w:rPr>
+        <w:lastRenderedPageBreak/>
+        <w:t xml:space="preserve">2. Change cover photo button </w:t>
+      </w:r>
+      <w:r>
+        <w:rPr>
+          <w:sz w:val="20"/>
+          <w:szCs w:val="20"/>
+        </w:rPr>
+        <w:t>— visible to owners and editors only; not shown to readers</w:t>
+      </w:r>
+    </w:p>
+    <w:p>
+      <w:pPr>
+        <w:pStyle w:val="ListParagraph"/>
+        <w:numPr>
+          <w:ilvl w:val="1"/>
+          <w:numId w:val="13"/>
+        </w:numPr>
+        <w:spacing w:before="30" w:after="30"/>
+      </w:pPr>
+      <w:r>
+        <w:rPr>
+          <w:b/>
+          <w:bCs/>
+          <w:sz w:val="20"/>
+          <w:szCs w:val="20"/>
+        </w:rPr>
+        <w:t xml:space="preserve">3. Tags row </w:t>
+      </w:r>
+      <w:r>
+        <w:rPr>
+          <w:sz w:val="20"/>
+          <w:szCs w:val="20"/>
+        </w:rPr>
+        <w:t>— displays all tags for the moment</w:t>
+      </w:r>
+    </w:p>
+    <w:p>
+      <w:pPr>
+        <w:pStyle w:val="ListParagraph"/>
+        <w:numPr>
+          <w:ilvl w:val="1"/>
+          <w:numId w:val="13"/>
+        </w:numPr>
+        <w:spacing w:before="30" w:after="30"/>
+      </w:pPr>
+      <w:r>
+        <w:rPr>
+          <w:b/>
+          <w:bCs/>
+          <w:sz w:val="20"/>
+          <w:szCs w:val="20"/>
+        </w:rPr>
+        <w:t xml:space="preserve">4. Members row </w:t>
+      </w:r>
+      <w:r>
+        <w:rPr>
+          <w:sz w:val="20"/>
+          <w:szCs w:val="20"/>
+        </w:rPr>
+        <w:t>— compact single row. Left side: up to 5 overlapping avatar icons; if more members exist, show “+ X more” text. Hovering (desktop) or tapping (mobile) the avatars opens a popover listing all members ordered: owner first, then editors alphabetically, then readers alphabetically; each name has a small role icon (owner / editor / reader). Right side: small Invite button (icon + “Invite” label on desktop, icon only on mobile) and a Manage button linking to /moments/[id]/members</w:t>
+      </w:r>
+    </w:p>
+    <w:p>
+      <w:pPr>
+        <w:pStyle w:val="ListParagraph"/>
+        <w:numPr>
+          <w:ilvl w:val="1"/>
+          <w:numId w:val="13"/>
+        </w:numPr>
+        <w:spacing w:before="30" w:after="30"/>
+      </w:pPr>
+      <w:r>
+        <w:rPr>
+          <w:b/>
+          <w:bCs/>
+          <w:sz w:val="20"/>
+          <w:szCs w:val="20"/>
+        </w:rPr>
+        <w:t xml:space="preserve">5. Posts / Entries </w:t>
+      </w:r>
+      <w:r>
+        <w:rPr>
+          <w:sz w:val="20"/>
+          <w:szCs w:val="20"/>
+        </w:rPr>
+        <w:t>— immediately below the members row with no other content in between</w:t>
+      </w:r>
+    </w:p>
+    <w:p>
+      <w:pPr>
+        <w:pStyle w:val="ListParagraph"/>
+        <w:numPr>
+          <w:ilvl w:val="0"/>
+          <w:numId w:val="12"/>
+        </w:numPr>
+        <w:spacing w:before="40" w:after="40"/>
+      </w:pPr>
+      <w:r>
+        <w:t>Journal entries displayed immediately below the members row</w:t>
       </w:r>
     </w:p>
     <w:p>
@@ -1199,7 +1536,7 @@
         <w:pStyle w:val="ListParagraph"/>
         <w:numPr>
           <w:ilvl w:val="1"/>
-          <w:numId w:val="5"/>
+          <w:numId w:val="13"/>
         </w:numPr>
         <w:spacing w:before="30" w:after="30"/>
       </w:pPr>
@@ -1216,7 +1553,7 @@
         <w:pStyle w:val="ListParagraph"/>
         <w:numPr>
           <w:ilvl w:val="1"/>
-          <w:numId w:val="5"/>
+          <w:numId w:val="13"/>
         </w:numPr>
         <w:spacing w:before="30" w:after="30"/>
       </w:pPr>
@@ -1233,7 +1570,7 @@
         <w:pStyle w:val="ListParagraph"/>
         <w:numPr>
           <w:ilvl w:val="0"/>
-          <w:numId w:val="4"/>
+          <w:numId w:val="12"/>
         </w:numPr>
         <w:spacing w:before="40" w:after="40"/>
       </w:pPr>
@@ -1246,7 +1583,7 @@
         <w:pStyle w:val="ListParagraph"/>
         <w:numPr>
           <w:ilvl w:val="0"/>
-          <w:numId w:val="4"/>
+          <w:numId w:val="12"/>
         </w:numPr>
         <w:spacing w:before="40" w:after="40"/>
       </w:pPr>
@@ -1259,7 +1596,7 @@
         <w:pStyle w:val="ListParagraph"/>
         <w:numPr>
           <w:ilvl w:val="0"/>
-          <w:numId w:val="4"/>
+          <w:numId w:val="12"/>
         </w:numPr>
         <w:spacing w:before="40" w:after="40"/>
       </w:pPr>
@@ -1275,11 +1612,9 @@
           <w:bottom w:val="single" w:sz="4" w:space="4" w:color="4A90B8"/>
         </w:pBdr>
       </w:pPr>
-      <w:proofErr w:type="gramStart"/>
       <w:r>
         <w:t>2.6  Permissions</w:t>
       </w:r>
-      <w:proofErr w:type="gramEnd"/>
     </w:p>
     <w:p>
       <w:pPr>
@@ -1298,7 +1633,7 @@
         <w:pStyle w:val="ListParagraph"/>
         <w:numPr>
           <w:ilvl w:val="1"/>
-          <w:numId w:val="5"/>
+          <w:numId w:val="13"/>
         </w:numPr>
         <w:spacing w:before="30" w:after="30"/>
       </w:pPr>
@@ -1307,7 +1642,7 @@
           <w:sz w:val="20"/>
           <w:szCs w:val="20"/>
         </w:rPr>
-        <w:t>Full control: edit moment, manage editors and readers, transfer ownership</w:t>
+        <w:t>Full control: edit moment details, manage editors (including removing editors) and readers, transfer ownership</w:t>
       </w:r>
     </w:p>
     <w:p>
@@ -1315,7 +1650,7 @@
         <w:pStyle w:val="ListParagraph"/>
         <w:numPr>
           <w:ilvl w:val="1"/>
-          <w:numId w:val="5"/>
+          <w:numId w:val="13"/>
         </w:numPr>
         <w:spacing w:before="30" w:after="30"/>
       </w:pPr>
@@ -1344,7 +1679,7 @@
         <w:pStyle w:val="ListParagraph"/>
         <w:numPr>
           <w:ilvl w:val="1"/>
-          <w:numId w:val="5"/>
+          <w:numId w:val="13"/>
         </w:numPr>
         <w:spacing w:before="30" w:after="30"/>
       </w:pPr>
@@ -1353,7 +1688,7 @@
           <w:sz w:val="20"/>
           <w:szCs w:val="20"/>
         </w:rPr>
-        <w:t>Can post, edit moment details and tags, invite and remove readers, delete own and others’ posts</w:t>
+        <w:t>Can post, edit moment details and tags, invite and remove readers, delete own and others’ posts. Cannot remove editors (owner only).</w:t>
       </w:r>
     </w:p>
     <w:p>
@@ -1361,7 +1696,7 @@
         <w:pStyle w:val="ListParagraph"/>
         <w:numPr>
           <w:ilvl w:val="1"/>
-          <w:numId w:val="5"/>
+          <w:numId w:val="13"/>
         </w:numPr>
         <w:spacing w:before="30" w:after="30"/>
       </w:pPr>
@@ -1390,7 +1725,7 @@
         <w:pStyle w:val="ListParagraph"/>
         <w:numPr>
           <w:ilvl w:val="1"/>
-          <w:numId w:val="5"/>
+          <w:numId w:val="13"/>
         </w:numPr>
         <w:spacing w:before="30" w:after="30"/>
       </w:pPr>
@@ -1407,7 +1742,7 @@
         <w:pStyle w:val="ListParagraph"/>
         <w:numPr>
           <w:ilvl w:val="1"/>
-          <w:numId w:val="5"/>
+          <w:numId w:val="13"/>
         </w:numPr>
         <w:spacing w:before="30" w:after="30"/>
       </w:pPr>
@@ -1425,7 +1760,7 @@
         <w:pStyle w:val="ListParagraph"/>
         <w:numPr>
           <w:ilvl w:val="0"/>
-          <w:numId w:val="4"/>
+          <w:numId w:val="12"/>
         </w:numPr>
         <w:spacing w:before="40" w:after="40"/>
       </w:pPr>
@@ -1438,7 +1773,7 @@
         <w:pStyle w:val="ListParagraph"/>
         <w:numPr>
           <w:ilvl w:val="0"/>
-          <w:numId w:val="4"/>
+          <w:numId w:val="12"/>
         </w:numPr>
         <w:spacing w:before="40" w:after="40"/>
       </w:pPr>
@@ -1451,20 +1786,12 @@
         <w:pStyle w:val="ListParagraph"/>
         <w:numPr>
           <w:ilvl w:val="0"/>
-          <w:numId w:val="4"/>
+          <w:numId w:val="12"/>
         </w:numPr>
         <w:spacing w:before="40" w:after="40"/>
       </w:pPr>
       <w:r>
-        <w:t>Notifications for archived moments are disabled by default, re-</w:t>
-      </w:r>
-      <w:proofErr w:type="spellStart"/>
-      <w:r>
-        <w:t>enableable</w:t>
-      </w:r>
-      <w:proofErr w:type="spellEnd"/>
-      <w:r>
-        <w:t xml:space="preserve"> per user</w:t>
+        <w:t>Notifications for archived moments are disabled by default, re-enableable per user</w:t>
       </w:r>
     </w:p>
     <w:p/>
@@ -1475,13 +1802,8 @@
           <w:bottom w:val="single" w:sz="4" w:space="4" w:color="4A90B8"/>
         </w:pBdr>
       </w:pPr>
-      <w:proofErr w:type="gramStart"/>
-      <w:r>
-        <w:t>2.7  Reader</w:t>
-      </w:r>
-      <w:proofErr w:type="gramEnd"/>
-      <w:r>
-        <w:t xml:space="preserve"> Invitations &amp; Links</w:t>
+      <w:r>
+        <w:t>2.7  Reader Invitations &amp; Links</w:t>
       </w:r>
     </w:p>
     <w:p>
@@ -1501,7 +1823,7 @@
         <w:pStyle w:val="ListParagraph"/>
         <w:numPr>
           <w:ilvl w:val="1"/>
-          <w:numId w:val="5"/>
+          <w:numId w:val="13"/>
         </w:numPr>
         <w:spacing w:before="30" w:after="30"/>
       </w:pPr>
@@ -1522,7 +1844,6 @@
           <w:b/>
           <w:bCs/>
         </w:rPr>
-        <w:lastRenderedPageBreak/>
         <w:t>Non-friend readers:</w:t>
       </w:r>
     </w:p>
@@ -1531,7 +1852,7 @@
         <w:pStyle w:val="ListParagraph"/>
         <w:numPr>
           <w:ilvl w:val="1"/>
-          <w:numId w:val="5"/>
+          <w:numId w:val="13"/>
         </w:numPr>
         <w:spacing w:before="30" w:after="30"/>
       </w:pPr>
@@ -1548,7 +1869,7 @@
         <w:pStyle w:val="ListParagraph"/>
         <w:numPr>
           <w:ilvl w:val="0"/>
-          <w:numId w:val="4"/>
+          <w:numId w:val="12"/>
         </w:numPr>
         <w:spacing w:before="40" w:after="40"/>
       </w:pPr>
@@ -1561,11 +1882,12 @@
         <w:pStyle w:val="ListParagraph"/>
         <w:numPr>
           <w:ilvl w:val="0"/>
-          <w:numId w:val="4"/>
+          <w:numId w:val="12"/>
         </w:numPr>
         <w:spacing w:before="40" w:after="40"/>
       </w:pPr>
       <w:r>
+        <w:lastRenderedPageBreak/>
         <w:t>Readers who joined via an expired or invalidated link retain their access</w:t>
       </w:r>
     </w:p>
@@ -1574,7 +1896,7 @@
         <w:pStyle w:val="ListParagraph"/>
         <w:numPr>
           <w:ilvl w:val="0"/>
-          <w:numId w:val="4"/>
+          <w:numId w:val="12"/>
         </w:numPr>
         <w:spacing w:before="40" w:after="40"/>
       </w:pPr>
@@ -1590,11 +1912,9 @@
           <w:bottom w:val="single" w:sz="4" w:space="4" w:color="4A90B8"/>
         </w:pBdr>
       </w:pPr>
-      <w:proofErr w:type="gramStart"/>
       <w:r>
         <w:t>2.8  Notifications</w:t>
       </w:r>
-      <w:proofErr w:type="gramEnd"/>
     </w:p>
     <w:p>
       <w:pPr>
@@ -1910,23 +2230,7 @@
                 <w:sz w:val="20"/>
                 <w:szCs w:val="20"/>
               </w:rPr>
-              <w:t xml:space="preserve">Moment </w:t>
-            </w:r>
-            <w:proofErr w:type="gramStart"/>
-            <w:r>
-              <w:rPr>
-                <w:sz w:val="20"/>
-                <w:szCs w:val="20"/>
-              </w:rPr>
-              <w:t>invite</w:t>
-            </w:r>
-            <w:proofErr w:type="gramEnd"/>
-            <w:r>
-              <w:rPr>
-                <w:sz w:val="20"/>
-                <w:szCs w:val="20"/>
-              </w:rPr>
-              <w:t xml:space="preserve"> accepted or declined</w:t>
+              <w:t>Moment invite accepted or declined</w:t>
             </w:r>
           </w:p>
         </w:tc>
@@ -2277,13 +2581,8 @@
           <w:bottom w:val="single" w:sz="4" w:space="4" w:color="4A90B8"/>
         </w:pBdr>
       </w:pPr>
-      <w:proofErr w:type="gramStart"/>
-      <w:r>
-        <w:t>2.9  Pricing</w:t>
-      </w:r>
-      <w:proofErr w:type="gramEnd"/>
-      <w:r>
-        <w:t xml:space="preserve"> &amp; Tiers</w:t>
+      <w:r>
+        <w:t>2.9  Pricing &amp; Tiers</w:t>
       </w:r>
     </w:p>
     <w:p>
@@ -2291,7 +2590,7 @@
         <w:pStyle w:val="ListParagraph"/>
         <w:numPr>
           <w:ilvl w:val="0"/>
-          <w:numId w:val="4"/>
+          <w:numId w:val="12"/>
         </w:numPr>
         <w:spacing w:before="40" w:after="40"/>
       </w:pPr>
@@ -2304,7 +2603,7 @@
         <w:pStyle w:val="ListParagraph"/>
         <w:numPr>
           <w:ilvl w:val="0"/>
-          <w:numId w:val="4"/>
+          <w:numId w:val="12"/>
         </w:numPr>
         <w:spacing w:before="40" w:after="40"/>
       </w:pPr>
@@ -2317,7 +2616,7 @@
         <w:pStyle w:val="ListParagraph"/>
         <w:numPr>
           <w:ilvl w:val="0"/>
-          <w:numId w:val="4"/>
+          <w:numId w:val="12"/>
         </w:numPr>
         <w:spacing w:before="40" w:after="40"/>
       </w:pPr>
@@ -2330,7 +2629,7 @@
         <w:pStyle w:val="ListParagraph"/>
         <w:numPr>
           <w:ilvl w:val="0"/>
-          <w:numId w:val="4"/>
+          <w:numId w:val="12"/>
         </w:numPr>
         <w:spacing w:before="40" w:after="40"/>
       </w:pPr>
@@ -2343,7 +2642,7 @@
         <w:pStyle w:val="ListParagraph"/>
         <w:numPr>
           <w:ilvl w:val="0"/>
-          <w:numId w:val="4"/>
+          <w:numId w:val="12"/>
         </w:numPr>
         <w:spacing w:before="40" w:after="40"/>
       </w:pPr>
@@ -2359,13 +2658,8 @@
           <w:bottom w:val="single" w:sz="4" w:space="4" w:color="4A90B8"/>
         </w:pBdr>
       </w:pPr>
-      <w:proofErr w:type="gramStart"/>
-      <w:r>
-        <w:t>2.10  Future</w:t>
-      </w:r>
-      <w:proofErr w:type="gramEnd"/>
-      <w:r>
-        <w:t xml:space="preserve"> Layers (Out of Scope Now)</w:t>
+      <w:r>
+        <w:t>2.10  Future Layers (Out of Scope Now)</w:t>
       </w:r>
     </w:p>
     <w:p>
@@ -2373,7 +2667,7 @@
         <w:pStyle w:val="ListParagraph"/>
         <w:numPr>
           <w:ilvl w:val="0"/>
-          <w:numId w:val="4"/>
+          <w:numId w:val="12"/>
         </w:numPr>
         <w:spacing w:before="40" w:after="40"/>
       </w:pPr>
@@ -2386,7 +2680,7 @@
         <w:pStyle w:val="ListParagraph"/>
         <w:numPr>
           <w:ilvl w:val="0"/>
-          <w:numId w:val="4"/>
+          <w:numId w:val="12"/>
         </w:numPr>
         <w:spacing w:before="40" w:after="40"/>
       </w:pPr>
@@ -2399,7 +2693,7 @@
         <w:pStyle w:val="ListParagraph"/>
         <w:numPr>
           <w:ilvl w:val="0"/>
-          <w:numId w:val="4"/>
+          <w:numId w:val="12"/>
         </w:numPr>
         <w:spacing w:before="40" w:after="40"/>
       </w:pPr>
@@ -2429,23 +2723,8 @@
         <w:spacing w:before="60" w:after="60"/>
       </w:pPr>
       <w:r>
-        <w:t xml:space="preserve">All tables live in </w:t>
-      </w:r>
-      <w:proofErr w:type="spellStart"/>
-      <w:r>
-        <w:t>Supabase</w:t>
-      </w:r>
-      <w:proofErr w:type="spellEnd"/>
-      <w:r>
-        <w:t xml:space="preserve"> (Postgres). Arrows (→) denote foreign key references. Soft deletes use a </w:t>
-      </w:r>
-      <w:proofErr w:type="spellStart"/>
-      <w:r>
-        <w:t>deleted_at</w:t>
-      </w:r>
-      <w:proofErr w:type="spellEnd"/>
-      <w:r>
-        <w:t xml:space="preserve"> timestamp; a null value means the record is active.</w:t>
+        <w:lastRenderedPageBreak/>
+        <w:t>All tables live in Supabase (Postgres). Arrows (→) denote foreign key references. Soft deletes use a deleted_at timestamp; a null value means the record is active.</w:t>
       </w:r>
     </w:p>
     <w:p/>
@@ -2637,7 +2916,6 @@
             </w:tcMar>
           </w:tcPr>
           <w:p>
-            <w:proofErr w:type="spellStart"/>
             <w:r>
               <w:rPr>
                 <w:rFonts w:ascii="Courier New" w:eastAsia="Courier New" w:hAnsi="Courier New" w:cs="Courier New"/>
@@ -2649,7 +2927,6 @@
               </w:rPr>
               <w:t>first_name</w:t>
             </w:r>
-            <w:proofErr w:type="spellEnd"/>
           </w:p>
         </w:tc>
         <w:tc>
@@ -2697,7 +2974,6 @@
             </w:tcMar>
           </w:tcPr>
           <w:p>
-            <w:proofErr w:type="spellStart"/>
             <w:r>
               <w:rPr>
                 <w:rFonts w:ascii="Courier New" w:eastAsia="Courier New" w:hAnsi="Courier New" w:cs="Courier New"/>
@@ -2709,7 +2985,6 @@
               </w:rPr>
               <w:t>last_name</w:t>
             </w:r>
-            <w:proofErr w:type="spellEnd"/>
           </w:p>
         </w:tc>
         <w:tc>
@@ -2889,7 +3164,6 @@
             </w:tcMar>
           </w:tcPr>
           <w:p>
-            <w:proofErr w:type="spellStart"/>
             <w:r>
               <w:rPr>
                 <w:rFonts w:ascii="Courier New" w:eastAsia="Courier New" w:hAnsi="Courier New" w:cs="Courier New"/>
@@ -2901,7 +3175,6 @@
               </w:rPr>
               <w:t>profile_photo_url</w:t>
             </w:r>
-            <w:proofErr w:type="spellEnd"/>
           </w:p>
         </w:tc>
         <w:tc>
@@ -2927,23 +3200,7 @@
                 <w:sz w:val="18"/>
                 <w:szCs w:val="18"/>
               </w:rPr>
-              <w:t xml:space="preserve">Stored in </w:t>
-            </w:r>
-            <w:proofErr w:type="spellStart"/>
-            <w:r>
-              <w:rPr>
-                <w:sz w:val="18"/>
-                <w:szCs w:val="18"/>
-              </w:rPr>
-              <w:t>Supabase</w:t>
-            </w:r>
-            <w:proofErr w:type="spellEnd"/>
-            <w:r>
-              <w:rPr>
-                <w:sz w:val="18"/>
-                <w:szCs w:val="18"/>
-              </w:rPr>
-              <w:t xml:space="preserve"> Storage</w:t>
+              <w:t>Stored in Supabase Storage</w:t>
             </w:r>
           </w:p>
         </w:tc>
@@ -2973,7 +3230,6 @@
             </w:tcMar>
           </w:tcPr>
           <w:p>
-            <w:proofErr w:type="spellStart"/>
             <w:r>
               <w:rPr>
                 <w:rFonts w:ascii="Courier New" w:eastAsia="Courier New" w:hAnsi="Courier New" w:cs="Courier New"/>
@@ -2985,7 +3241,6 @@
               </w:rPr>
               <w:t>created_at</w:t>
             </w:r>
-            <w:proofErr w:type="spellEnd"/>
           </w:p>
         </w:tc>
         <w:tc>
@@ -3198,7 +3453,6 @@
             </w:tcMar>
           </w:tcPr>
           <w:p>
-            <w:proofErr w:type="spellStart"/>
             <w:r>
               <w:rPr>
                 <w:rFonts w:ascii="Courier New" w:eastAsia="Courier New" w:hAnsi="Courier New" w:cs="Courier New"/>
@@ -3210,7 +3464,6 @@
               </w:rPr>
               <w:t>requester_id</w:t>
             </w:r>
-            <w:proofErr w:type="spellEnd"/>
           </w:p>
         </w:tc>
         <w:tc>
@@ -3266,7 +3519,6 @@
             </w:tcMar>
           </w:tcPr>
           <w:p>
-            <w:proofErr w:type="spellStart"/>
             <w:r>
               <w:rPr>
                 <w:rFonts w:ascii="Courier New" w:eastAsia="Courier New" w:hAnsi="Courier New" w:cs="Courier New"/>
@@ -3278,7 +3530,6 @@
               </w:rPr>
               <w:t>recipient_id</w:t>
             </w:r>
-            <w:proofErr w:type="spellEnd"/>
           </w:p>
         </w:tc>
         <w:tc>
@@ -3400,7 +3651,6 @@
             </w:tcMar>
           </w:tcPr>
           <w:p>
-            <w:proofErr w:type="spellStart"/>
             <w:r>
               <w:rPr>
                 <w:rFonts w:ascii="Courier New" w:eastAsia="Courier New" w:hAnsi="Courier New" w:cs="Courier New"/>
@@ -3412,7 +3662,6 @@
               </w:rPr>
               <w:t>created_at</w:t>
             </w:r>
-            <w:proofErr w:type="spellEnd"/>
           </w:p>
         </w:tc>
         <w:tc>
@@ -3460,7 +3709,6 @@
             </w:tcMar>
           </w:tcPr>
           <w:p>
-            <w:proofErr w:type="spellStart"/>
             <w:r>
               <w:rPr>
                 <w:rFonts w:ascii="Courier New" w:eastAsia="Courier New" w:hAnsi="Courier New" w:cs="Courier New"/>
@@ -3472,7 +3720,6 @@
               </w:rPr>
               <w:t>deleted_at</w:t>
             </w:r>
-            <w:proofErr w:type="spellEnd"/>
           </w:p>
         </w:tc>
         <w:tc>
@@ -3759,7 +4006,6 @@
             </w:tcMar>
           </w:tcPr>
           <w:p>
-            <w:proofErr w:type="spellStart"/>
             <w:r>
               <w:rPr>
                 <w:rFonts w:ascii="Courier New" w:eastAsia="Courier New" w:hAnsi="Courier New" w:cs="Courier New"/>
@@ -3771,7 +4017,6 @@
               </w:rPr>
               <w:t>date_year</w:t>
             </w:r>
-            <w:proofErr w:type="spellEnd"/>
           </w:p>
         </w:tc>
         <w:tc>
@@ -3827,7 +4072,6 @@
             </w:tcMar>
           </w:tcPr>
           <w:p>
-            <w:proofErr w:type="spellStart"/>
             <w:r>
               <w:rPr>
                 <w:rFonts w:ascii="Courier New" w:eastAsia="Courier New" w:hAnsi="Courier New" w:cs="Courier New"/>
@@ -3839,7 +4083,6 @@
               </w:rPr>
               <w:t>date_month</w:t>
             </w:r>
-            <w:proofErr w:type="spellEnd"/>
           </w:p>
         </w:tc>
         <w:tc>
@@ -3895,7 +4138,6 @@
             </w:tcMar>
           </w:tcPr>
           <w:p>
-            <w:proofErr w:type="spellStart"/>
             <w:r>
               <w:rPr>
                 <w:rFonts w:ascii="Courier New" w:eastAsia="Courier New" w:hAnsi="Courier New" w:cs="Courier New"/>
@@ -3907,7 +4149,6 @@
               </w:rPr>
               <w:t>date_day</w:t>
             </w:r>
-            <w:proofErr w:type="spellEnd"/>
           </w:p>
         </w:tc>
         <w:tc>
@@ -4029,7 +4270,6 @@
             </w:tcMar>
           </w:tcPr>
           <w:p>
-            <w:proofErr w:type="spellStart"/>
             <w:r>
               <w:rPr>
                 <w:rFonts w:ascii="Courier New" w:eastAsia="Courier New" w:hAnsi="Courier New" w:cs="Courier New"/>
@@ -4039,10 +4279,8 @@
                 <w:sz w:val="18"/>
                 <w:szCs w:val="18"/>
               </w:rPr>
-              <w:lastRenderedPageBreak/>
               <w:t>cover_photo_url</w:t>
             </w:r>
-            <w:proofErr w:type="spellEnd"/>
           </w:p>
         </w:tc>
         <w:tc>
@@ -4068,23 +4306,7 @@
                 <w:sz w:val="18"/>
                 <w:szCs w:val="18"/>
               </w:rPr>
-              <w:t xml:space="preserve">Nullable, references a </w:t>
-            </w:r>
-            <w:proofErr w:type="spellStart"/>
-            <w:r>
-              <w:rPr>
-                <w:sz w:val="18"/>
-                <w:szCs w:val="18"/>
-              </w:rPr>
-              <w:t>Supabase</w:t>
-            </w:r>
-            <w:proofErr w:type="spellEnd"/>
-            <w:r>
-              <w:rPr>
-                <w:sz w:val="18"/>
-                <w:szCs w:val="18"/>
-              </w:rPr>
-              <w:t xml:space="preserve"> Storage file</w:t>
+              <w:t>Nullable, references a Supabase Storage file</w:t>
             </w:r>
           </w:p>
         </w:tc>
@@ -4114,7 +4336,6 @@
             </w:tcMar>
           </w:tcPr>
           <w:p>
-            <w:proofErr w:type="spellStart"/>
             <w:r>
               <w:rPr>
                 <w:rFonts w:ascii="Courier New" w:eastAsia="Courier New" w:hAnsi="Courier New" w:cs="Courier New"/>
@@ -4126,7 +4347,6 @@
               </w:rPr>
               <w:t>owner_id</w:t>
             </w:r>
-            <w:proofErr w:type="spellEnd"/>
           </w:p>
         </w:tc>
         <w:tc>
@@ -4182,7 +4402,6 @@
             </w:tcMar>
           </w:tcPr>
           <w:p>
-            <w:proofErr w:type="spellStart"/>
             <w:r>
               <w:rPr>
                 <w:rFonts w:ascii="Courier New" w:eastAsia="Courier New" w:hAnsi="Courier New" w:cs="Courier New"/>
@@ -4194,7 +4413,6 @@
               </w:rPr>
               <w:t>created_at</w:t>
             </w:r>
-            <w:proofErr w:type="spellEnd"/>
           </w:p>
         </w:tc>
         <w:tc>
@@ -4223,11 +4441,10 @@
       <w:pPr>
         <w:pStyle w:val="Heading3"/>
       </w:pPr>
-      <w:proofErr w:type="spellStart"/>
-      <w:r>
+      <w:r>
+        <w:lastRenderedPageBreak/>
         <w:t>moment_members</w:t>
       </w:r>
-      <w:proofErr w:type="spellEnd"/>
     </w:p>
     <w:tbl>
       <w:tblPr>
@@ -4409,7 +4626,6 @@
             </w:tcMar>
           </w:tcPr>
           <w:p>
-            <w:proofErr w:type="spellStart"/>
             <w:r>
               <w:rPr>
                 <w:rFonts w:ascii="Courier New" w:eastAsia="Courier New" w:hAnsi="Courier New" w:cs="Courier New"/>
@@ -4421,7 +4637,6 @@
               </w:rPr>
               <w:t>moment_id</w:t>
             </w:r>
-            <w:proofErr w:type="spellEnd"/>
           </w:p>
         </w:tc>
         <w:tc>
@@ -4477,7 +4692,6 @@
             </w:tcMar>
           </w:tcPr>
           <w:p>
-            <w:proofErr w:type="spellStart"/>
             <w:r>
               <w:rPr>
                 <w:rFonts w:ascii="Courier New" w:eastAsia="Courier New" w:hAnsi="Courier New" w:cs="Courier New"/>
@@ -4489,7 +4703,6 @@
               </w:rPr>
               <w:t>user_id</w:t>
             </w:r>
-            <w:proofErr w:type="spellEnd"/>
           </w:p>
         </w:tc>
         <w:tc>
@@ -4677,7 +4890,6 @@
             </w:tcMar>
           </w:tcPr>
           <w:p>
-            <w:proofErr w:type="spellStart"/>
             <w:r>
               <w:rPr>
                 <w:rFonts w:ascii="Courier New" w:eastAsia="Courier New" w:hAnsi="Courier New" w:cs="Courier New"/>
@@ -4689,7 +4901,6 @@
               </w:rPr>
               <w:t>invited_by</w:t>
             </w:r>
-            <w:proofErr w:type="spellEnd"/>
           </w:p>
         </w:tc>
         <w:tc>
@@ -4745,7 +4956,6 @@
             </w:tcMar>
           </w:tcPr>
           <w:p>
-            <w:proofErr w:type="spellStart"/>
             <w:r>
               <w:rPr>
                 <w:rFonts w:ascii="Courier New" w:eastAsia="Courier New" w:hAnsi="Courier New" w:cs="Courier New"/>
@@ -4757,7 +4967,6 @@
               </w:rPr>
               <w:t>created_at</w:t>
             </w:r>
-            <w:proofErr w:type="spellEnd"/>
           </w:p>
         </w:tc>
         <w:tc>
@@ -4786,11 +4995,9 @@
       <w:pPr>
         <w:pStyle w:val="Heading3"/>
       </w:pPr>
-      <w:proofErr w:type="spellStart"/>
       <w:r>
         <w:t>moment_tags</w:t>
       </w:r>
-      <w:proofErr w:type="spellEnd"/>
     </w:p>
     <w:tbl>
       <w:tblPr>
@@ -4972,7 +5179,6 @@
             </w:tcMar>
           </w:tcPr>
           <w:p>
-            <w:proofErr w:type="spellStart"/>
             <w:r>
               <w:rPr>
                 <w:rFonts w:ascii="Courier New" w:eastAsia="Courier New" w:hAnsi="Courier New" w:cs="Courier New"/>
@@ -4984,7 +5190,6 @@
               </w:rPr>
               <w:t>moment_id</w:t>
             </w:r>
-            <w:proofErr w:type="spellEnd"/>
           </w:p>
         </w:tc>
         <w:tc>
@@ -5106,7 +5311,6 @@
             </w:tcMar>
           </w:tcPr>
           <w:p>
-            <w:proofErr w:type="spellStart"/>
             <w:r>
               <w:rPr>
                 <w:rFonts w:ascii="Courier New" w:eastAsia="Courier New" w:hAnsi="Courier New" w:cs="Courier New"/>
@@ -5118,7 +5322,6 @@
               </w:rPr>
               <w:t>created_by</w:t>
             </w:r>
-            <w:proofErr w:type="spellEnd"/>
           </w:p>
         </w:tc>
         <w:tc>
@@ -5174,7 +5377,6 @@
             </w:tcMar>
           </w:tcPr>
           <w:p>
-            <w:proofErr w:type="spellStart"/>
             <w:r>
               <w:rPr>
                 <w:rFonts w:ascii="Courier New" w:eastAsia="Courier New" w:hAnsi="Courier New" w:cs="Courier New"/>
@@ -5186,7 +5388,6 @@
               </w:rPr>
               <w:t>created_at</w:t>
             </w:r>
-            <w:proofErr w:type="spellEnd"/>
           </w:p>
         </w:tc>
         <w:tc>
@@ -5399,7 +5600,6 @@
             </w:tcMar>
           </w:tcPr>
           <w:p>
-            <w:proofErr w:type="spellStart"/>
             <w:r>
               <w:rPr>
                 <w:rFonts w:ascii="Courier New" w:eastAsia="Courier New" w:hAnsi="Courier New" w:cs="Courier New"/>
@@ -5411,7 +5611,6 @@
               </w:rPr>
               <w:t>moment_id</w:t>
             </w:r>
-            <w:proofErr w:type="spellEnd"/>
           </w:p>
         </w:tc>
         <w:tc>
@@ -5467,7 +5666,6 @@
             </w:tcMar>
           </w:tcPr>
           <w:p>
-            <w:proofErr w:type="spellStart"/>
             <w:r>
               <w:rPr>
                 <w:rFonts w:ascii="Courier New" w:eastAsia="Courier New" w:hAnsi="Courier New" w:cs="Courier New"/>
@@ -5479,7 +5677,6 @@
               </w:rPr>
               <w:t>author_id</w:t>
             </w:r>
-            <w:proofErr w:type="spellEnd"/>
           </w:p>
         </w:tc>
         <w:tc>
@@ -5601,7 +5798,6 @@
             </w:tcMar>
           </w:tcPr>
           <w:p>
-            <w:proofErr w:type="spellStart"/>
             <w:r>
               <w:rPr>
                 <w:rFonts w:ascii="Courier New" w:eastAsia="Courier New" w:hAnsi="Courier New" w:cs="Courier New"/>
@@ -5613,7 +5809,6 @@
               </w:rPr>
               <w:t>created_at</w:t>
             </w:r>
-            <w:proofErr w:type="spellEnd"/>
           </w:p>
         </w:tc>
         <w:tc>
@@ -5661,7 +5856,6 @@
             </w:tcMar>
           </w:tcPr>
           <w:p>
-            <w:proofErr w:type="spellStart"/>
             <w:r>
               <w:rPr>
                 <w:rFonts w:ascii="Courier New" w:eastAsia="Courier New" w:hAnsi="Courier New" w:cs="Courier New"/>
@@ -5673,7 +5867,6 @@
               </w:rPr>
               <w:t>deleted_at</w:t>
             </w:r>
-            <w:proofErr w:type="spellEnd"/>
           </w:p>
         </w:tc>
         <w:tc>
@@ -5700,6 +5893,72 @@
                 <w:szCs w:val="18"/>
               </w:rPr>
               <w:t>Soft delete</w:t>
+            </w:r>
+          </w:p>
+        </w:tc>
+      </w:tr>
+      <w:tr>
+        <w:tblPrEx>
+          <w:tblCellMar>
+            <w:top w:w="0" w:type="dxa"/>
+            <w:bottom w:w="0" w:type="dxa"/>
+          </w:tblCellMar>
+        </w:tblPrEx>
+        <w:tc>
+          <w:tcPr>
+            <w:tcW w:w="2800" w:type="dxa"/>
+            <w:tcBorders>
+              <w:top w:val="single" w:sz="1" w:space="0" w:color="CCCCCC"/>
+              <w:left w:val="single" w:sz="1" w:space="0" w:color="CCCCCC"/>
+              <w:bottom w:val="single" w:sz="1" w:space="0" w:color="CCCCCC"/>
+              <w:right w:val="single" w:sz="1" w:space="0" w:color="CCCCCC"/>
+            </w:tcBorders>
+            <w:shd w:val="clear" w:color="auto" w:fill="FFFFFF"/>
+            <w:tcMar>
+              <w:top w:w="80" w:type="dxa"/>
+              <w:left w:w="120" w:type="dxa"/>
+              <w:bottom w:w="80" w:type="dxa"/>
+              <w:right w:w="120" w:type="dxa"/>
+            </w:tcMar>
+          </w:tcPr>
+          <w:p>
+            <w:r>
+              <w:rPr>
+                <w:rFonts w:ascii="Courier New" w:eastAsia="Courier New" w:hAnsi="Courier New" w:cs="Courier New"/>
+                <w:b/>
+                <w:bCs/>
+                <w:color w:val="4A90B8"/>
+                <w:sz w:val="18"/>
+                <w:szCs w:val="18"/>
+              </w:rPr>
+              <w:t>edited_at</w:t>
+            </w:r>
+          </w:p>
+        </w:tc>
+        <w:tc>
+          <w:tcPr>
+            <w:tcW w:w="6560" w:type="dxa"/>
+            <w:tcBorders>
+              <w:top w:val="single" w:sz="1" w:space="0" w:color="CCCCCC"/>
+              <w:left w:val="single" w:sz="1" w:space="0" w:color="CCCCCC"/>
+              <w:bottom w:val="single" w:sz="1" w:space="0" w:color="CCCCCC"/>
+              <w:right w:val="single" w:sz="1" w:space="0" w:color="CCCCCC"/>
+            </w:tcBorders>
+            <w:shd w:val="clear" w:color="auto" w:fill="FFFFFF"/>
+            <w:tcMar>
+              <w:top w:w="80" w:type="dxa"/>
+              <w:left w:w="120" w:type="dxa"/>
+              <w:bottom w:w="80" w:type="dxa"/>
+              <w:right w:w="120" w:type="dxa"/>
+            </w:tcMar>
+          </w:tcPr>
+          <w:p>
+            <w:r>
+              <w:rPr>
+                <w:sz w:val="18"/>
+                <w:szCs w:val="18"/>
+              </w:rPr>
+              <w:t>Nullable timestamp. Null = never edited. Updated on every save. No edit history stored — only the current version is kept.</w:t>
             </w:r>
           </w:p>
         </w:tc>
@@ -5710,11 +5969,9 @@
       <w:pPr>
         <w:pStyle w:val="Heading3"/>
       </w:pPr>
-      <w:proofErr w:type="spellStart"/>
       <w:r>
         <w:t>post_media</w:t>
       </w:r>
-      <w:proofErr w:type="spellEnd"/>
     </w:p>
     <w:tbl>
       <w:tblPr>
@@ -5839,7 +6096,6 @@
                 <w:sz w:val="18"/>
                 <w:szCs w:val="18"/>
               </w:rPr>
-              <w:lastRenderedPageBreak/>
               <w:t>id</w:t>
             </w:r>
           </w:p>
@@ -5897,7 +6153,6 @@
             </w:tcMar>
           </w:tcPr>
           <w:p>
-            <w:proofErr w:type="spellStart"/>
             <w:r>
               <w:rPr>
                 <w:rFonts w:ascii="Courier New" w:eastAsia="Courier New" w:hAnsi="Courier New" w:cs="Courier New"/>
@@ -5909,7 +6164,6 @@
               </w:rPr>
               <w:t>post_id</w:t>
             </w:r>
-            <w:proofErr w:type="spellEnd"/>
           </w:p>
         </w:tc>
         <w:tc>
@@ -5965,7 +6219,6 @@
             </w:tcMar>
           </w:tcPr>
           <w:p>
-            <w:proofErr w:type="spellStart"/>
             <w:r>
               <w:rPr>
                 <w:rFonts w:ascii="Courier New" w:eastAsia="Courier New" w:hAnsi="Courier New" w:cs="Courier New"/>
@@ -5977,7 +6230,6 @@
               </w:rPr>
               <w:t>media_type</w:t>
             </w:r>
-            <w:proofErr w:type="spellEnd"/>
           </w:p>
         </w:tc>
         <w:tc>
@@ -6033,7 +6285,6 @@
             </w:tcMar>
           </w:tcPr>
           <w:p>
-            <w:proofErr w:type="spellStart"/>
             <w:r>
               <w:rPr>
                 <w:rFonts w:ascii="Courier New" w:eastAsia="Courier New" w:hAnsi="Courier New" w:cs="Courier New"/>
@@ -6043,9 +6294,9 @@
                 <w:sz w:val="18"/>
                 <w:szCs w:val="18"/>
               </w:rPr>
+              <w:lastRenderedPageBreak/>
               <w:t>storage_url</w:t>
             </w:r>
-            <w:proofErr w:type="spellEnd"/>
           </w:p>
         </w:tc>
         <w:tc>
@@ -6066,21 +6317,12 @@
             </w:tcMar>
           </w:tcPr>
           <w:p>
-            <w:proofErr w:type="spellStart"/>
-            <w:r>
-              <w:rPr>
-                <w:sz w:val="18"/>
-                <w:szCs w:val="18"/>
-              </w:rPr>
-              <w:t>Supabase</w:t>
-            </w:r>
-            <w:proofErr w:type="spellEnd"/>
-            <w:r>
-              <w:rPr>
-                <w:sz w:val="18"/>
-                <w:szCs w:val="18"/>
-              </w:rPr>
-              <w:t xml:space="preserve"> Storage URL</w:t>
+            <w:r>
+              <w:rPr>
+                <w:sz w:val="18"/>
+                <w:szCs w:val="18"/>
+              </w:rPr>
+              <w:t>Supabase Storage URL</w:t>
             </w:r>
           </w:p>
         </w:tc>
@@ -6110,7 +6352,6 @@
             </w:tcMar>
           </w:tcPr>
           <w:p>
-            <w:proofErr w:type="spellStart"/>
             <w:r>
               <w:rPr>
                 <w:rFonts w:ascii="Courier New" w:eastAsia="Courier New" w:hAnsi="Courier New" w:cs="Courier New"/>
@@ -6122,7 +6363,6 @@
               </w:rPr>
               <w:t>created_at</w:t>
             </w:r>
-            <w:proofErr w:type="spellEnd"/>
           </w:p>
         </w:tc>
         <w:tc>
@@ -6151,11 +6391,9 @@
       <w:pPr>
         <w:pStyle w:val="Heading3"/>
       </w:pPr>
-      <w:proofErr w:type="spellStart"/>
       <w:r>
         <w:t>moment_archive</w:t>
       </w:r>
-      <w:proofErr w:type="spellEnd"/>
     </w:p>
     <w:tbl>
       <w:tblPr>
@@ -6337,7 +6575,6 @@
             </w:tcMar>
           </w:tcPr>
           <w:p>
-            <w:proofErr w:type="spellStart"/>
             <w:r>
               <w:rPr>
                 <w:rFonts w:ascii="Courier New" w:eastAsia="Courier New" w:hAnsi="Courier New" w:cs="Courier New"/>
@@ -6349,7 +6586,6 @@
               </w:rPr>
               <w:t>moment_id</w:t>
             </w:r>
-            <w:proofErr w:type="spellEnd"/>
           </w:p>
         </w:tc>
         <w:tc>
@@ -6405,7 +6641,6 @@
             </w:tcMar>
           </w:tcPr>
           <w:p>
-            <w:proofErr w:type="spellStart"/>
             <w:r>
               <w:rPr>
                 <w:rFonts w:ascii="Courier New" w:eastAsia="Courier New" w:hAnsi="Courier New" w:cs="Courier New"/>
@@ -6417,7 +6652,6 @@
               </w:rPr>
               <w:t>user_id</w:t>
             </w:r>
-            <w:proofErr w:type="spellEnd"/>
           </w:p>
         </w:tc>
         <w:tc>
@@ -6473,7 +6707,6 @@
             </w:tcMar>
           </w:tcPr>
           <w:p>
-            <w:proofErr w:type="spellStart"/>
             <w:r>
               <w:rPr>
                 <w:rFonts w:ascii="Courier New" w:eastAsia="Courier New" w:hAnsi="Courier New" w:cs="Courier New"/>
@@ -6485,7 +6718,6 @@
               </w:rPr>
               <w:t>archived_at</w:t>
             </w:r>
-            <w:proofErr w:type="spellEnd"/>
           </w:p>
         </w:tc>
         <w:tc>
@@ -6522,11 +6754,9 @@
       <w:pPr>
         <w:pStyle w:val="Heading3"/>
       </w:pPr>
-      <w:proofErr w:type="spellStart"/>
       <w:r>
         <w:t>invite_links</w:t>
       </w:r>
-      <w:proofErr w:type="spellEnd"/>
     </w:p>
     <w:tbl>
       <w:tblPr>
@@ -6708,7 +6938,6 @@
             </w:tcMar>
           </w:tcPr>
           <w:p>
-            <w:proofErr w:type="spellStart"/>
             <w:r>
               <w:rPr>
                 <w:rFonts w:ascii="Courier New" w:eastAsia="Courier New" w:hAnsi="Courier New" w:cs="Courier New"/>
@@ -6720,7 +6949,6 @@
               </w:rPr>
               <w:t>moment_id</w:t>
             </w:r>
-            <w:proofErr w:type="spellEnd"/>
           </w:p>
         </w:tc>
         <w:tc>
@@ -6776,7 +7004,6 @@
             </w:tcMar>
           </w:tcPr>
           <w:p>
-            <w:proofErr w:type="spellStart"/>
             <w:r>
               <w:rPr>
                 <w:rFonts w:ascii="Courier New" w:eastAsia="Courier New" w:hAnsi="Courier New" w:cs="Courier New"/>
@@ -6788,7 +7015,6 @@
               </w:rPr>
               <w:t>created_by</w:t>
             </w:r>
-            <w:proofErr w:type="spellEnd"/>
           </w:p>
         </w:tc>
         <w:tc>
@@ -6910,7 +7136,6 @@
             </w:tcMar>
           </w:tcPr>
           <w:p>
-            <w:proofErr w:type="spellStart"/>
             <w:r>
               <w:rPr>
                 <w:rFonts w:ascii="Courier New" w:eastAsia="Courier New" w:hAnsi="Courier New" w:cs="Courier New"/>
@@ -6922,7 +7147,6 @@
               </w:rPr>
               <w:t>expires_at</w:t>
             </w:r>
-            <w:proofErr w:type="spellEnd"/>
           </w:p>
         </w:tc>
         <w:tc>
@@ -6978,7 +7202,6 @@
             </w:tcMar>
           </w:tcPr>
           <w:p>
-            <w:proofErr w:type="spellStart"/>
             <w:r>
               <w:rPr>
                 <w:rFonts w:ascii="Courier New" w:eastAsia="Courier New" w:hAnsi="Courier New" w:cs="Courier New"/>
@@ -6990,7 +7213,6 @@
               </w:rPr>
               <w:t>created_at</w:t>
             </w:r>
-            <w:proofErr w:type="spellEnd"/>
           </w:p>
         </w:tc>
         <w:tc>
@@ -7203,7 +7425,6 @@
             </w:tcMar>
           </w:tcPr>
           <w:p>
-            <w:proofErr w:type="spellStart"/>
             <w:r>
               <w:rPr>
                 <w:rFonts w:ascii="Courier New" w:eastAsia="Courier New" w:hAnsi="Courier New" w:cs="Courier New"/>
@@ -7215,7 +7436,6 @@
               </w:rPr>
               <w:t>user_id</w:t>
             </w:r>
-            <w:proofErr w:type="spellEnd"/>
           </w:p>
         </w:tc>
         <w:tc>
@@ -7337,7 +7557,6 @@
             </w:tcMar>
           </w:tcPr>
           <w:p>
-            <w:proofErr w:type="spellStart"/>
             <w:r>
               <w:rPr>
                 <w:rFonts w:ascii="Courier New" w:eastAsia="Courier New" w:hAnsi="Courier New" w:cs="Courier New"/>
@@ -7349,7 +7568,6 @@
               </w:rPr>
               <w:t>related_moment_id</w:t>
             </w:r>
-            <w:proofErr w:type="spellEnd"/>
           </w:p>
         </w:tc>
         <w:tc>
@@ -7405,7 +7623,6 @@
             </w:tcMar>
           </w:tcPr>
           <w:p>
-            <w:proofErr w:type="spellStart"/>
             <w:r>
               <w:rPr>
                 <w:rFonts w:ascii="Courier New" w:eastAsia="Courier New" w:hAnsi="Courier New" w:cs="Courier New"/>
@@ -7417,7 +7634,6 @@
               </w:rPr>
               <w:t>related_user_id</w:t>
             </w:r>
-            <w:proofErr w:type="spellEnd"/>
           </w:p>
         </w:tc>
         <w:tc>
@@ -7539,7 +7755,6 @@
             </w:tcMar>
           </w:tcPr>
           <w:p>
-            <w:proofErr w:type="spellStart"/>
             <w:r>
               <w:rPr>
                 <w:rFonts w:ascii="Courier New" w:eastAsia="Courier New" w:hAnsi="Courier New" w:cs="Courier New"/>
@@ -7551,7 +7766,6 @@
               </w:rPr>
               <w:t>created_at</w:t>
             </w:r>
-            <w:proofErr w:type="spellEnd"/>
           </w:p>
         </w:tc>
         <w:tc>
@@ -7580,11 +7794,9 @@
       <w:pPr>
         <w:pStyle w:val="Heading3"/>
       </w:pPr>
-      <w:proofErr w:type="spellStart"/>
       <w:r>
         <w:t>notification_preferences</w:t>
       </w:r>
-      <w:proofErr w:type="spellEnd"/>
     </w:p>
     <w:tbl>
       <w:tblPr>
@@ -7640,7 +7852,6 @@
                 <w:sz w:val="20"/>
                 <w:szCs w:val="20"/>
               </w:rPr>
-              <w:lastRenderedPageBreak/>
               <w:t>Field</w:t>
             </w:r>
           </w:p>
@@ -7767,7 +7978,6 @@
             </w:tcMar>
           </w:tcPr>
           <w:p>
-            <w:proofErr w:type="spellStart"/>
             <w:r>
               <w:rPr>
                 <w:rFonts w:ascii="Courier New" w:eastAsia="Courier New" w:hAnsi="Courier New" w:cs="Courier New"/>
@@ -7779,7 +7989,6 @@
               </w:rPr>
               <w:t>user_id</w:t>
             </w:r>
-            <w:proofErr w:type="spellEnd"/>
           </w:p>
         </w:tc>
         <w:tc>
@@ -7835,7 +8044,6 @@
             </w:tcMar>
           </w:tcPr>
           <w:p>
-            <w:proofErr w:type="spellStart"/>
             <w:r>
               <w:rPr>
                 <w:rFonts w:ascii="Courier New" w:eastAsia="Courier New" w:hAnsi="Courier New" w:cs="Courier New"/>
@@ -7845,9 +8053,9 @@
                 <w:sz w:val="18"/>
                 <w:szCs w:val="18"/>
               </w:rPr>
+              <w:lastRenderedPageBreak/>
               <w:t>friend_request_received</w:t>
             </w:r>
-            <w:proofErr w:type="spellEnd"/>
           </w:p>
         </w:tc>
         <w:tc>
@@ -7903,7 +8111,6 @@
             </w:tcMar>
           </w:tcPr>
           <w:p>
-            <w:proofErr w:type="spellStart"/>
             <w:r>
               <w:rPr>
                 <w:rFonts w:ascii="Courier New" w:eastAsia="Courier New" w:hAnsi="Courier New" w:cs="Courier New"/>
@@ -7915,7 +8122,6 @@
               </w:rPr>
               <w:t>friend_request_accepted</w:t>
             </w:r>
-            <w:proofErr w:type="spellEnd"/>
           </w:p>
         </w:tc>
         <w:tc>
@@ -7971,7 +8177,6 @@
             </w:tcMar>
           </w:tcPr>
           <w:p>
-            <w:proofErr w:type="spellStart"/>
             <w:r>
               <w:rPr>
                 <w:rFonts w:ascii="Courier New" w:eastAsia="Courier New" w:hAnsi="Courier New" w:cs="Courier New"/>
@@ -7983,7 +8188,6 @@
               </w:rPr>
               <w:t>moment_invite</w:t>
             </w:r>
-            <w:proofErr w:type="spellEnd"/>
           </w:p>
         </w:tc>
         <w:tc>
@@ -8039,7 +8243,6 @@
             </w:tcMar>
           </w:tcPr>
           <w:p>
-            <w:proofErr w:type="spellStart"/>
             <w:r>
               <w:rPr>
                 <w:rFonts w:ascii="Courier New" w:eastAsia="Courier New" w:hAnsi="Courier New" w:cs="Courier New"/>
@@ -8051,7 +8254,6 @@
               </w:rPr>
               <w:t>moment_invite_response</w:t>
             </w:r>
-            <w:proofErr w:type="spellEnd"/>
           </w:p>
         </w:tc>
         <w:tc>
@@ -8107,7 +8309,6 @@
             </w:tcMar>
           </w:tcPr>
           <w:p>
-            <w:proofErr w:type="spellStart"/>
             <w:r>
               <w:rPr>
                 <w:rFonts w:ascii="Courier New" w:eastAsia="Courier New" w:hAnsi="Courier New" w:cs="Courier New"/>
@@ -8119,7 +8320,6 @@
               </w:rPr>
               <w:t>new_post</w:t>
             </w:r>
-            <w:proofErr w:type="spellEnd"/>
           </w:p>
         </w:tc>
         <w:tc>
@@ -8175,7 +8375,6 @@
             </w:tcMar>
           </w:tcPr>
           <w:p>
-            <w:proofErr w:type="spellStart"/>
             <w:r>
               <w:rPr>
                 <w:rFonts w:ascii="Courier New" w:eastAsia="Courier New" w:hAnsi="Courier New" w:cs="Courier New"/>
@@ -8187,7 +8386,6 @@
               </w:rPr>
               <w:t>member_left</w:t>
             </w:r>
-            <w:proofErr w:type="spellEnd"/>
           </w:p>
         </w:tc>
         <w:tc>
@@ -8243,7 +8441,6 @@
             </w:tcMar>
           </w:tcPr>
           <w:p>
-            <w:proofErr w:type="spellStart"/>
             <w:r>
               <w:rPr>
                 <w:rFonts w:ascii="Courier New" w:eastAsia="Courier New" w:hAnsi="Courier New" w:cs="Courier New"/>
@@ -8255,7 +8452,6 @@
               </w:rPr>
               <w:t>ownership_transferred</w:t>
             </w:r>
-            <w:proofErr w:type="spellEnd"/>
           </w:p>
         </w:tc>
         <w:tc>
@@ -8311,7 +8507,6 @@
             </w:tcMar>
           </w:tcPr>
           <w:p>
-            <w:proofErr w:type="spellStart"/>
             <w:r>
               <w:rPr>
                 <w:rFonts w:ascii="Courier New" w:eastAsia="Courier New" w:hAnsi="Courier New" w:cs="Courier New"/>
@@ -8323,7 +8518,6 @@
               </w:rPr>
               <w:t>archived_moment_notifications</w:t>
             </w:r>
-            <w:proofErr w:type="spellEnd"/>
           </w:p>
         </w:tc>
         <w:tc>
@@ -8379,7 +8573,6 @@
             </w:tcMar>
           </w:tcPr>
           <w:p>
-            <w:proofErr w:type="spellStart"/>
             <w:r>
               <w:rPr>
                 <w:rFonts w:ascii="Courier New" w:eastAsia="Courier New" w:hAnsi="Courier New" w:cs="Courier New"/>
@@ -8391,7 +8584,6 @@
               </w:rPr>
               <w:t>reminder_cadence</w:t>
             </w:r>
-            <w:proofErr w:type="spellEnd"/>
           </w:p>
         </w:tc>
         <w:tc>
@@ -8477,28 +8669,12 @@
         <w:pStyle w:val="ListParagraph"/>
         <w:numPr>
           <w:ilvl w:val="0"/>
-          <w:numId w:val="4"/>
+          <w:numId w:val="12"/>
         </w:numPr>
         <w:spacing w:before="40" w:after="40"/>
       </w:pPr>
       <w:r>
-        <w:t xml:space="preserve">Next.js project setup, </w:t>
-      </w:r>
-      <w:proofErr w:type="spellStart"/>
-      <w:r>
-        <w:t>Supabase</w:t>
-      </w:r>
-      <w:proofErr w:type="spellEnd"/>
-      <w:r>
-        <w:t xml:space="preserve"> connection, GitHub repo, </w:t>
-      </w:r>
-      <w:proofErr w:type="spellStart"/>
-      <w:r>
-        <w:t>Vercel</w:t>
-      </w:r>
-      <w:proofErr w:type="spellEnd"/>
-      <w:r>
-        <w:t xml:space="preserve"> deployment pipeline</w:t>
+        <w:t>Next.js project setup, Supabase connection, GitHub repo, Vercel deployment pipeline</w:t>
       </w:r>
     </w:p>
     <w:p>
@@ -8506,25 +8682,12 @@
         <w:pStyle w:val="ListParagraph"/>
         <w:numPr>
           <w:ilvl w:val="0"/>
-          <w:numId w:val="4"/>
+          <w:numId w:val="12"/>
         </w:numPr>
         <w:spacing w:before="40" w:after="40"/>
       </w:pPr>
-      <w:proofErr w:type="spellStart"/>
-      <w:r>
-        <w:t>Supabase</w:t>
-      </w:r>
-      <w:proofErr w:type="spellEnd"/>
-      <w:r>
-        <w:t xml:space="preserve"> schema — all tables </w:t>
-      </w:r>
-      <w:proofErr w:type="gramStart"/>
-      <w:r>
-        <w:t>created,</w:t>
-      </w:r>
-      <w:proofErr w:type="gramEnd"/>
-      <w:r>
-        <w:t xml:space="preserve"> relationships and indexes in place</w:t>
+      <w:r>
+        <w:t>Supabase schema — all tables created, relationships and indexes in place</w:t>
       </w:r>
     </w:p>
     <w:p>
@@ -8532,17 +8695,12 @@
         <w:pStyle w:val="ListParagraph"/>
         <w:numPr>
           <w:ilvl w:val="0"/>
-          <w:numId w:val="4"/>
+          <w:numId w:val="12"/>
         </w:numPr>
         <w:spacing w:before="40" w:after="40"/>
       </w:pPr>
-      <w:proofErr w:type="spellStart"/>
-      <w:r>
-        <w:t>Supabase</w:t>
-      </w:r>
-      <w:proofErr w:type="spellEnd"/>
-      <w:r>
-        <w:t xml:space="preserve"> Auth — sign up, log in, log out, session handling, forgot password / password reset</w:t>
+      <w:r>
+        <w:t>Supabase Auth — sign up, log in, log out, session handling, forgot password / password reset</w:t>
       </w:r>
     </w:p>
     <w:p>
@@ -8550,7 +8708,7 @@
         <w:pStyle w:val="ListParagraph"/>
         <w:numPr>
           <w:ilvl w:val="0"/>
-          <w:numId w:val="4"/>
+          <w:numId w:val="12"/>
         </w:numPr>
         <w:spacing w:before="40" w:after="40"/>
       </w:pPr>
@@ -8595,12 +8753,12 @@
         <w:pStyle w:val="ListParagraph"/>
         <w:numPr>
           <w:ilvl w:val="0"/>
-          <w:numId w:val="4"/>
+          <w:numId w:val="12"/>
         </w:numPr>
         <w:spacing w:before="40" w:after="40"/>
       </w:pPr>
       <w:r>
-        <w:t>Account page — edit personal details, upload profile photo</w:t>
+        <w:t>Account page — three sections: Profile (name, username, email, profile photo), Security (change password), Danger zone (delete account with confirmation modal requiring username re-entry)</w:t>
       </w:r>
     </w:p>
     <w:p>
@@ -8608,12 +8766,12 @@
         <w:pStyle w:val="ListParagraph"/>
         <w:numPr>
           <w:ilvl w:val="0"/>
-          <w:numId w:val="4"/>
+          <w:numId w:val="12"/>
         </w:numPr>
         <w:spacing w:before="40" w:after="40"/>
       </w:pPr>
       <w:r>
-        <w:t>Username uniqueness check</w:t>
+        <w:t>Settings / Notifications page — two sections: notification toggles (grouped by Friend activity / Moment activity / Reminders) and reminder cadence control (Weekly / Bi-weekly / Monthly / Never). UI only in this phase — no notifications firing yet.</w:t>
       </w:r>
     </w:p>
     <w:p>
@@ -8621,12 +8779,12 @@
         <w:pStyle w:val="ListParagraph"/>
         <w:numPr>
           <w:ilvl w:val="0"/>
-          <w:numId w:val="4"/>
+          <w:numId w:val="12"/>
         </w:numPr>
         <w:spacing w:before="40" w:after="40"/>
       </w:pPr>
       <w:r>
-        <w:t>Delete account flow</w:t>
+        <w:t>Username uniqueness check — real-time, on both sign-up and account edit</w:t>
       </w:r>
     </w:p>
     <w:p>
@@ -8634,12 +8792,39 @@
         <w:pStyle w:val="ListParagraph"/>
         <w:numPr>
           <w:ilvl w:val="0"/>
-          <w:numId w:val="4"/>
+          <w:numId w:val="12"/>
         </w:numPr>
         <w:spacing w:before="40" w:after="40"/>
       </w:pPr>
       <w:r>
-        <w:t>Notification preferences page (UI only, no notifications firing yet)</w:t>
+        <w:t>Profile photo upload to Supabase Storage; preview shown; option to remove existing photo</w:t>
+      </w:r>
+    </w:p>
+    <w:p>
+      <w:pPr>
+        <w:pStyle w:val="ListParagraph"/>
+        <w:numPr>
+          <w:ilvl w:val="0"/>
+          <w:numId w:val="12"/>
+        </w:numPr>
+        <w:spacing w:before="40" w:after="40"/>
+      </w:pPr>
+      <w:r>
+        <w:lastRenderedPageBreak/>
+        <w:t>Delete account flow — red outlined button in Danger zone; confirmation modal; user must type their username to confirm; hard deletes personal data, leaves shared moment posts attributed to user</w:t>
+      </w:r>
+    </w:p>
+    <w:p>
+      <w:pPr>
+        <w:pStyle w:val="ListParagraph"/>
+        <w:numPr>
+          <w:ilvl w:val="0"/>
+          <w:numId w:val="12"/>
+        </w:numPr>
+        <w:spacing w:before="40" w:after="40"/>
+      </w:pPr>
+      <w:r>
+        <w:t>Settings / Notifications page — UI scaffolding only; notification logic wired in Phase 7</w:t>
       </w:r>
     </w:p>
     <w:p>
@@ -8666,21 +8851,12 @@
       <w:pPr>
         <w:spacing w:before="60" w:after="60"/>
       </w:pPr>
-      <w:proofErr w:type="gramStart"/>
       <w:r>
         <w:rPr>
           <w:i/>
           <w:iCs/>
         </w:rPr>
-        <w:t>The social layer,</w:t>
-      </w:r>
-      <w:proofErr w:type="gramEnd"/>
-      <w:r>
-        <w:rPr>
-          <w:i/>
-          <w:iCs/>
-        </w:rPr>
-        <w:t xml:space="preserve"> kept deliberately simple.</w:t>
+        <w:t>The social layer, kept deliberately simple.</w:t>
       </w:r>
     </w:p>
     <w:p>
@@ -8688,7 +8864,7 @@
         <w:pStyle w:val="ListParagraph"/>
         <w:numPr>
           <w:ilvl w:val="0"/>
-          <w:numId w:val="4"/>
+          <w:numId w:val="12"/>
         </w:numPr>
         <w:spacing w:before="40" w:after="40"/>
       </w:pPr>
@@ -8701,7 +8877,7 @@
         <w:pStyle w:val="ListParagraph"/>
         <w:numPr>
           <w:ilvl w:val="0"/>
-          <w:numId w:val="4"/>
+          <w:numId w:val="12"/>
         </w:numPr>
         <w:spacing w:before="40" w:after="40"/>
       </w:pPr>
@@ -8714,7 +8890,7 @@
         <w:pStyle w:val="ListParagraph"/>
         <w:numPr>
           <w:ilvl w:val="0"/>
-          <w:numId w:val="4"/>
+          <w:numId w:val="12"/>
         </w:numPr>
         <w:spacing w:before="40" w:after="40"/>
       </w:pPr>
@@ -8727,7 +8903,7 @@
         <w:pStyle w:val="ListParagraph"/>
         <w:numPr>
           <w:ilvl w:val="0"/>
-          <w:numId w:val="4"/>
+          <w:numId w:val="12"/>
         </w:numPr>
         <w:spacing w:before="40" w:after="40"/>
       </w:pPr>
@@ -8772,7 +8948,7 @@
         <w:pStyle w:val="ListParagraph"/>
         <w:numPr>
           <w:ilvl w:val="0"/>
-          <w:numId w:val="4"/>
+          <w:numId w:val="12"/>
         </w:numPr>
         <w:spacing w:before="40" w:after="40"/>
       </w:pPr>
@@ -8785,7 +8961,7 @@
         <w:pStyle w:val="ListParagraph"/>
         <w:numPr>
           <w:ilvl w:val="0"/>
-          <w:numId w:val="4"/>
+          <w:numId w:val="12"/>
         </w:numPr>
         <w:spacing w:before="40" w:after="40"/>
       </w:pPr>
@@ -8798,12 +8974,12 @@
         <w:pStyle w:val="ListParagraph"/>
         <w:numPr>
           <w:ilvl w:val="0"/>
-          <w:numId w:val="4"/>
+          <w:numId w:val="12"/>
         </w:numPr>
         <w:spacing w:before="40" w:after="40"/>
       </w:pPr>
       <w:r>
-        <w:t>Moment page — collapsing header, cover photo</w:t>
+        <w:t>Moment page — collapsing header, cover photo, edit button / [...] menu in header</w:t>
       </w:r>
     </w:p>
     <w:p>
@@ -8811,11 +8987,63 @@
         <w:pStyle w:val="ListParagraph"/>
         <w:numPr>
           <w:ilvl w:val="0"/>
-          <w:numId w:val="4"/>
+          <w:numId w:val="12"/>
         </w:numPr>
         <w:spacing w:before="40" w:after="40"/>
       </w:pPr>
       <w:r>
+        <w:t>Moment card [...] menu — edit option (first) and archive option (second); [...] menu visible on hover</w:t>
+      </w:r>
+    </w:p>
+    <w:p>
+      <w:pPr>
+        <w:pStyle w:val="ListParagraph"/>
+        <w:numPr>
+          <w:ilvl w:val="0"/>
+          <w:numId w:val="12"/>
+        </w:numPr>
+        <w:spacing w:before="40" w:after="40"/>
+      </w:pPr>
+      <w:r>
+        <w:t>Edit moment modal — reuses create modal pre-populated; editable fields: name, date (including precision), location, tags; saves trigger notification to all editors and readers</w:t>
+      </w:r>
+    </w:p>
+    <w:p>
+      <w:pPr>
+        <w:pStyle w:val="ListParagraph"/>
+        <w:numPr>
+          <w:ilvl w:val="0"/>
+          <w:numId w:val="12"/>
+        </w:numPr>
+        <w:spacing w:before="40" w:after="40"/>
+      </w:pPr>
+      <w:r>
+        <w:t>Members row on moment page — compact avatar stack (up to 5, + X more), hover/tap popover with full member list and role icons, Invite button, Manage button linking to members page</w:t>
+      </w:r>
+    </w:p>
+    <w:p>
+      <w:pPr>
+        <w:pStyle w:val="ListParagraph"/>
+        <w:numPr>
+          <w:ilvl w:val="0"/>
+          <w:numId w:val="12"/>
+        </w:numPr>
+        <w:spacing w:before="40" w:after="40"/>
+      </w:pPr>
+      <w:r>
+        <w:t>Dedicated Members page (/moments/[id]/members) — editor list (remove owner-only), reader list (remove owners and editors), invite link generator</w:t>
+      </w:r>
+    </w:p>
+    <w:p>
+      <w:pPr>
+        <w:pStyle w:val="ListParagraph"/>
+        <w:numPr>
+          <w:ilvl w:val="0"/>
+          <w:numId w:val="12"/>
+        </w:numPr>
+        <w:spacing w:before="40" w:after="40"/>
+      </w:pPr>
+      <w:r>
         <w:t>Invite editors (by username or email), accept / decline flow</w:t>
       </w:r>
     </w:p>
@@ -8824,7 +9052,7 @@
         <w:pStyle w:val="ListParagraph"/>
         <w:numPr>
           <w:ilvl w:val="0"/>
-          <w:numId w:val="4"/>
+          <w:numId w:val="12"/>
         </w:numPr>
         <w:spacing w:before="40" w:after="40"/>
       </w:pPr>
@@ -8837,7 +9065,7 @@
         <w:pStyle w:val="ListParagraph"/>
         <w:numPr>
           <w:ilvl w:val="0"/>
-          <w:numId w:val="4"/>
+          <w:numId w:val="12"/>
         </w:numPr>
         <w:spacing w:before="40" w:after="40"/>
       </w:pPr>
@@ -8850,7 +9078,7 @@
         <w:pStyle w:val="ListParagraph"/>
         <w:numPr>
           <w:ilvl w:val="0"/>
-          <w:numId w:val="4"/>
+          <w:numId w:val="12"/>
         </w:numPr>
         <w:spacing w:before="40" w:after="40"/>
       </w:pPr>
@@ -8895,7 +9123,7 @@
         <w:pStyle w:val="ListParagraph"/>
         <w:numPr>
           <w:ilvl w:val="0"/>
-          <w:numId w:val="4"/>
+          <w:numId w:val="12"/>
         </w:numPr>
         <w:spacing w:before="40" w:after="40"/>
       </w:pPr>
@@ -8908,7 +9136,7 @@
         <w:pStyle w:val="ListParagraph"/>
         <w:numPr>
           <w:ilvl w:val="0"/>
-          <w:numId w:val="4"/>
+          <w:numId w:val="12"/>
         </w:numPr>
         <w:spacing w:before="40" w:after="40"/>
       </w:pPr>
@@ -8921,11 +9149,12 @@
         <w:pStyle w:val="ListParagraph"/>
         <w:numPr>
           <w:ilvl w:val="0"/>
-          <w:numId w:val="4"/>
+          <w:numId w:val="12"/>
         </w:numPr>
         <w:spacing w:before="40" w:after="40"/>
       </w:pPr>
       <w:r>
+        <w:lastRenderedPageBreak/>
         <w:t>Post soft delete</w:t>
       </w:r>
     </w:p>
@@ -8934,7 +9163,20 @@
         <w:pStyle w:val="ListParagraph"/>
         <w:numPr>
           <w:ilvl w:val="0"/>
-          <w:numId w:val="4"/>
+          <w:numId w:val="12"/>
+        </w:numPr>
+        <w:spacing w:before="40" w:after="40"/>
+      </w:pPr>
+      <w:r>
+        <w:t>Post editing — authors can edit their own posts (text and media); edited_at timestamp recorded; “Edited” label shown on post; editing does not trigger notifications</w:t>
+      </w:r>
+    </w:p>
+    <w:p>
+      <w:pPr>
+        <w:pStyle w:val="ListParagraph"/>
+        <w:numPr>
+          <w:ilvl w:val="0"/>
+          <w:numId w:val="12"/>
         </w:numPr>
         <w:spacing w:before="40" w:after="40"/>
       </w:pPr>
@@ -8979,7 +9221,7 @@
         <w:pStyle w:val="ListParagraph"/>
         <w:numPr>
           <w:ilvl w:val="0"/>
-          <w:numId w:val="4"/>
+          <w:numId w:val="12"/>
         </w:numPr>
         <w:spacing w:before="40" w:after="40"/>
       </w:pPr>
@@ -8992,7 +9234,7 @@
         <w:pStyle w:val="ListParagraph"/>
         <w:numPr>
           <w:ilvl w:val="0"/>
-          <w:numId w:val="4"/>
+          <w:numId w:val="12"/>
         </w:numPr>
         <w:spacing w:before="40" w:after="40"/>
       </w:pPr>
@@ -9005,7 +9247,7 @@
         <w:pStyle w:val="ListParagraph"/>
         <w:numPr>
           <w:ilvl w:val="0"/>
-          <w:numId w:val="4"/>
+          <w:numId w:val="12"/>
         </w:numPr>
         <w:spacing w:before="40" w:after="40"/>
       </w:pPr>
@@ -9018,7 +9260,7 @@
         <w:pStyle w:val="ListParagraph"/>
         <w:numPr>
           <w:ilvl w:val="0"/>
-          <w:numId w:val="4"/>
+          <w:numId w:val="12"/>
         </w:numPr>
         <w:spacing w:before="40" w:after="40"/>
       </w:pPr>
@@ -9031,7 +9273,6 @@
         <w:spacing w:before="60" w:after="60"/>
       </w:pPr>
       <w:r>
-        <w:lastRenderedPageBreak/>
         <w:t>✓ End state: full permission model implemented.</w:t>
       </w:r>
     </w:p>
@@ -9064,7 +9305,7 @@
         <w:pStyle w:val="ListParagraph"/>
         <w:numPr>
           <w:ilvl w:val="0"/>
-          <w:numId w:val="4"/>
+          <w:numId w:val="12"/>
         </w:numPr>
         <w:spacing w:before="40" w:after="40"/>
       </w:pPr>
@@ -9077,7 +9318,7 @@
         <w:pStyle w:val="ListParagraph"/>
         <w:numPr>
           <w:ilvl w:val="0"/>
-          <w:numId w:val="4"/>
+          <w:numId w:val="12"/>
         </w:numPr>
         <w:spacing w:before="40" w:after="40"/>
       </w:pPr>
@@ -9090,7 +9331,7 @@
         <w:pStyle w:val="ListParagraph"/>
         <w:numPr>
           <w:ilvl w:val="0"/>
-          <w:numId w:val="4"/>
+          <w:numId w:val="12"/>
         </w:numPr>
         <w:spacing w:before="40" w:after="40"/>
       </w:pPr>
@@ -9103,7 +9344,7 @@
         <w:pStyle w:val="ListParagraph"/>
         <w:numPr>
           <w:ilvl w:val="0"/>
-          <w:numId w:val="4"/>
+          <w:numId w:val="12"/>
         </w:numPr>
         <w:spacing w:before="40" w:after="40"/>
       </w:pPr>
@@ -9148,7 +9389,7 @@
         <w:pStyle w:val="ListParagraph"/>
         <w:numPr>
           <w:ilvl w:val="0"/>
-          <w:numId w:val="4"/>
+          <w:numId w:val="12"/>
         </w:numPr>
         <w:spacing w:before="40" w:after="40"/>
       </w:pPr>
@@ -9161,7 +9402,7 @@
         <w:pStyle w:val="ListParagraph"/>
         <w:numPr>
           <w:ilvl w:val="0"/>
-          <w:numId w:val="4"/>
+          <w:numId w:val="12"/>
         </w:numPr>
         <w:spacing w:before="40" w:after="40"/>
       </w:pPr>
@@ -9206,7 +9447,7 @@
         <w:pStyle w:val="ListParagraph"/>
         <w:numPr>
           <w:ilvl w:val="0"/>
-          <w:numId w:val="4"/>
+          <w:numId w:val="12"/>
         </w:numPr>
         <w:spacing w:before="40" w:after="40"/>
       </w:pPr>
@@ -9219,7 +9460,7 @@
         <w:pStyle w:val="ListParagraph"/>
         <w:numPr>
           <w:ilvl w:val="0"/>
-          <w:numId w:val="4"/>
+          <w:numId w:val="12"/>
         </w:numPr>
         <w:spacing w:before="40" w:after="40"/>
       </w:pPr>
@@ -9232,7 +9473,7 @@
         <w:pStyle w:val="ListParagraph"/>
         <w:numPr>
           <w:ilvl w:val="0"/>
-          <w:numId w:val="4"/>
+          <w:numId w:val="12"/>
         </w:numPr>
         <w:spacing w:before="40" w:after="40"/>
       </w:pPr>
@@ -9245,20 +9486,12 @@
         <w:pStyle w:val="ListParagraph"/>
         <w:numPr>
           <w:ilvl w:val="0"/>
-          <w:numId w:val="4"/>
+          <w:numId w:val="12"/>
         </w:numPr>
         <w:spacing w:before="40" w:after="40"/>
       </w:pPr>
       <w:r>
-        <w:t xml:space="preserve">Security audit — row level security in </w:t>
-      </w:r>
-      <w:proofErr w:type="spellStart"/>
-      <w:r>
-        <w:t>Supabase</w:t>
-      </w:r>
-      <w:proofErr w:type="spellEnd"/>
-      <w:r>
-        <w:t>, API route protection</w:t>
+        <w:t>Security audit — row level security in Supabase, API route protection</w:t>
       </w:r>
     </w:p>
     <w:p>
@@ -9266,6 +9499,7 @@
         <w:spacing w:before="60" w:after="60"/>
       </w:pPr>
       <w:r>
+        <w:lastRenderedPageBreak/>
         <w:t>✓ End state: production-ready, polished, and safe.</w:t>
       </w:r>
     </w:p>
@@ -9302,13 +9536,8 @@
           <w:bottom w:val="single" w:sz="4" w:space="4" w:color="4A90B8"/>
         </w:pBdr>
       </w:pPr>
-      <w:proofErr w:type="gramStart"/>
-      <w:r>
-        <w:t>5.1  How</w:t>
-      </w:r>
-      <w:proofErr w:type="gramEnd"/>
-      <w:r>
-        <w:t xml:space="preserve"> to Start Each Phase</w:t>
+      <w:r>
+        <w:t>5.1  How to Start Each Phase</w:t>
       </w:r>
     </w:p>
     <w:p>
@@ -9375,8 +9604,7 @@
                 <w:sz w:val="18"/>
                 <w:szCs w:val="18"/>
               </w:rPr>
-              <w:lastRenderedPageBreak/>
-              <w:t>I’m building an app called [app name] — a shared memory book where users capture and revisit meaningful moments from their lives.</w:t>
+              <w:t>I’m building an app called Remember When — a shared memory book where users capture and revisit meaningful moments from their lives.</w:t>
             </w:r>
           </w:p>
           <w:p>
@@ -9395,87 +9623,7 @@
                 <w:sz w:val="18"/>
                 <w:szCs w:val="18"/>
               </w:rPr>
-              <w:t xml:space="preserve">Stack: Next.js (App Router), </w:t>
-            </w:r>
-            <w:proofErr w:type="spellStart"/>
-            <w:r>
-              <w:rPr>
-                <w:rFonts w:ascii="Courier New" w:eastAsia="Courier New" w:hAnsi="Courier New" w:cs="Courier New"/>
-                <w:color w:val="A8D8EA"/>
-                <w:sz w:val="18"/>
-                <w:szCs w:val="18"/>
-              </w:rPr>
-              <w:t>Supabase</w:t>
-            </w:r>
-            <w:proofErr w:type="spellEnd"/>
-            <w:r>
-              <w:rPr>
-                <w:rFonts w:ascii="Courier New" w:eastAsia="Courier New" w:hAnsi="Courier New" w:cs="Courier New"/>
-                <w:color w:val="A8D8EA"/>
-                <w:sz w:val="18"/>
-                <w:szCs w:val="18"/>
-              </w:rPr>
-              <w:t xml:space="preserve"> (Postgres + Auth + Storage), </w:t>
-            </w:r>
-            <w:proofErr w:type="spellStart"/>
-            <w:r>
-              <w:rPr>
-                <w:rFonts w:ascii="Courier New" w:eastAsia="Courier New" w:hAnsi="Courier New" w:cs="Courier New"/>
-                <w:color w:val="A8D8EA"/>
-                <w:sz w:val="18"/>
-                <w:szCs w:val="18"/>
-              </w:rPr>
-              <w:t>shadcn</w:t>
-            </w:r>
-            <w:proofErr w:type="spellEnd"/>
-            <w:r>
-              <w:rPr>
-                <w:rFonts w:ascii="Courier New" w:eastAsia="Courier New" w:hAnsi="Courier New" w:cs="Courier New"/>
-                <w:color w:val="A8D8EA"/>
-                <w:sz w:val="18"/>
-                <w:szCs w:val="18"/>
-              </w:rPr>
-              <w:t>/</w:t>
-            </w:r>
-            <w:proofErr w:type="spellStart"/>
-            <w:r>
-              <w:rPr>
-                <w:rFonts w:ascii="Courier New" w:eastAsia="Courier New" w:hAnsi="Courier New" w:cs="Courier New"/>
-                <w:color w:val="A8D8EA"/>
-                <w:sz w:val="18"/>
-                <w:szCs w:val="18"/>
-              </w:rPr>
-              <w:t>ui</w:t>
-            </w:r>
-            <w:proofErr w:type="spellEnd"/>
-            <w:r>
-              <w:rPr>
-                <w:rFonts w:ascii="Courier New" w:eastAsia="Courier New" w:hAnsi="Courier New" w:cs="Courier New"/>
-                <w:color w:val="A8D8EA"/>
-                <w:sz w:val="18"/>
-                <w:szCs w:val="18"/>
-              </w:rPr>
-              <w:t xml:space="preserve">, deployed on </w:t>
-            </w:r>
-            <w:proofErr w:type="spellStart"/>
-            <w:r>
-              <w:rPr>
-                <w:rFonts w:ascii="Courier New" w:eastAsia="Courier New" w:hAnsi="Courier New" w:cs="Courier New"/>
-                <w:color w:val="A8D8EA"/>
-                <w:sz w:val="18"/>
-                <w:szCs w:val="18"/>
-              </w:rPr>
-              <w:t>Vercel</w:t>
-            </w:r>
-            <w:proofErr w:type="spellEnd"/>
-            <w:r>
-              <w:rPr>
-                <w:rFonts w:ascii="Courier New" w:eastAsia="Courier New" w:hAnsi="Courier New" w:cs="Courier New"/>
-                <w:color w:val="A8D8EA"/>
-                <w:sz w:val="18"/>
-                <w:szCs w:val="18"/>
-              </w:rPr>
-              <w:t>.</w:t>
+              <w:t>Stack: Next.js (App Router), Supabase (Postgres + Auth + Storage), shadcn/ui, deployed on Vercel.</w:t>
             </w:r>
           </w:p>
           <w:p>
@@ -9557,13 +9705,8 @@
           <w:bottom w:val="single" w:sz="4" w:space="4" w:color="4A90B8"/>
         </w:pBdr>
       </w:pPr>
-      <w:proofErr w:type="gramStart"/>
-      <w:r>
-        <w:t>5.2  Phase</w:t>
-      </w:r>
-      <w:proofErr w:type="gramEnd"/>
-      <w:r>
-        <w:t>-by-Phase Prompting Guide</w:t>
+      <w:r>
+        <w:t>5.2  Phase-by-Phase Prompting Guide</w:t>
       </w:r>
     </w:p>
     <w:p/>
@@ -9580,15 +9723,7 @@
         <w:spacing w:before="60" w:after="60"/>
       </w:pPr>
       <w:r>
-        <w:t xml:space="preserve">Paste </w:t>
-      </w:r>
-      <w:proofErr w:type="gramStart"/>
-      <w:r>
-        <w:t>in:</w:t>
-      </w:r>
-      <w:proofErr w:type="gramEnd"/>
-      <w:r>
-        <w:t xml:space="preserve"> the full stack section, the data model (all tables), and the Phase 1 build order entry.</w:t>
+        <w:t>Paste in: the full stack section, the data model (all tables), and the Phase 1 build order entry.</w:t>
       </w:r>
     </w:p>
     <w:p>
@@ -9608,28 +9743,12 @@
         <w:pStyle w:val="ListParagraph"/>
         <w:numPr>
           <w:ilvl w:val="0"/>
-          <w:numId w:val="4"/>
+          <w:numId w:val="12"/>
         </w:numPr>
         <w:spacing w:before="40" w:after="40"/>
       </w:pPr>
       <w:r>
-        <w:t xml:space="preserve">“Set up the </w:t>
-      </w:r>
-      <w:proofErr w:type="spellStart"/>
-      <w:r>
-        <w:t>Supabase</w:t>
-      </w:r>
-      <w:proofErr w:type="spellEnd"/>
-      <w:r>
-        <w:t xml:space="preserve"> schema with all tables. Apply row level security policies so users can only access their own data. Set up </w:t>
-      </w:r>
-      <w:proofErr w:type="spellStart"/>
-      <w:r>
-        <w:t>Supabase</w:t>
-      </w:r>
-      <w:proofErr w:type="spellEnd"/>
-      <w:r>
-        <w:t xml:space="preserve"> Auth including forgot password / reset. Scaffold the Next.js app with placeholder routes for: home (/), moment detail (/moments/[id]), and account (/account).”</w:t>
+        <w:t>“Set up the Supabase schema with all tables. Apply row level security policies so users can only access their own data. Set up Supabase Auth including forgot password / reset. Scaffold the Next.js app with placeholder routes for: home (/), moment detail (/moments/[id]), and account (/account).”</w:t>
       </w:r>
     </w:p>
     <w:p/>
@@ -9666,36 +9785,39 @@
         <w:pStyle w:val="ListParagraph"/>
         <w:numPr>
           <w:ilvl w:val="0"/>
-          <w:numId w:val="4"/>
+          <w:numId w:val="12"/>
         </w:numPr>
         <w:spacing w:before="40" w:after="40"/>
       </w:pPr>
       <w:r>
-        <w:t xml:space="preserve">“Use </w:t>
-      </w:r>
-      <w:proofErr w:type="spellStart"/>
-      <w:r>
-        <w:t>shadcn</w:t>
-      </w:r>
-      <w:proofErr w:type="spellEnd"/>
-      <w:r>
-        <w:t>/</w:t>
-      </w:r>
-      <w:proofErr w:type="spellStart"/>
-      <w:r>
-        <w:t>ui</w:t>
-      </w:r>
-      <w:proofErr w:type="spellEnd"/>
-      <w:r>
-        <w:t xml:space="preserve"> components throughout. Profile photo upload should go to </w:t>
-      </w:r>
-      <w:proofErr w:type="spellStart"/>
-      <w:r>
-        <w:t>Supabase</w:t>
-      </w:r>
-      <w:proofErr w:type="spellEnd"/>
-      <w:r>
-        <w:t xml:space="preserve"> Storage. Username uniqueness should be checked in real time on the sign-up form.”</w:t>
+        <w:lastRenderedPageBreak/>
+        <w:t>“Use shadcn/ui components throughout. Profile photo upload should go to Supabase Storage. Username uniqueness should be checked in real time on both the sign-up form and the account edit form.”</w:t>
+      </w:r>
+    </w:p>
+    <w:p>
+      <w:pPr>
+        <w:pStyle w:val="ListParagraph"/>
+        <w:numPr>
+          <w:ilvl w:val="0"/>
+          <w:numId w:val="12"/>
+        </w:numPr>
+        <w:spacing w:before="40" w:after="40"/>
+      </w:pPr>
+      <w:r>
+        <w:t>“The Account page (/account) must have three clearly separated sections. (1) Profile: editable fields for first name, last name, username (real-time uniqueness check as the user types), and email address. Email changes require the user to re-authenticate before saving — this is a Supabase Auth requirement. Profile photo: show the current photo with options to upload a new one, replace the existing one, or remove it entirely; store in Supabase Storage. (2) Security: a change password form with three fields — current password, new password, confirm new password. Validate that new and confirm match before submitting. (3) Danger zone: visually distinct section with a red outlined delete account button. Clicking it opens a confirmation modal that clearly states personal data will be permanently deleted but posts in shared moments will remain attributed to the user. The user must type their exact username into a text field in the modal before the delete button becomes active. On confirmation, hard delete all personal data from the users table and sign the user out.”</w:t>
+      </w:r>
+    </w:p>
+    <w:p>
+      <w:pPr>
+        <w:pStyle w:val="ListParagraph"/>
+        <w:numPr>
+          <w:ilvl w:val="0"/>
+          <w:numId w:val="12"/>
+        </w:numPr>
+        <w:spacing w:before="40" w:after="40"/>
+      </w:pPr>
+      <w:r>
+        <w:t>“The Settings / Notifications page (/settings) is a separate page from Account. It must have two sections. (1) Notification toggles: one on/off toggle per notification type, grouped under three headings — Friend activity (friend request received, friend request accepted), Moment activity (moment invite / mention, moment invite accepted or declined, new post added, someone leaves a moment, ownership transferred, archived moment notifications), and Reminders. Each toggle reads from and writes to the notification_preferences table for the current user. Default values are as specified in Section 2.8 of the spec. (2) Reminder cadence: a separate control (radio buttons or a select dropdown) for Weekly / Bi-weekly / Monthly / Never. In this phase, scaffold the full UI and wire up the preference saving to the database — the actual notification sending logic is implemented in Phase 7.”</w:t>
       </w:r>
     </w:p>
     <w:p/>
@@ -9732,44 +9854,12 @@
         <w:pStyle w:val="ListParagraph"/>
         <w:numPr>
           <w:ilvl w:val="0"/>
-          <w:numId w:val="4"/>
+          <w:numId w:val="12"/>
         </w:numPr>
         <w:spacing w:before="40" w:after="40"/>
       </w:pPr>
       <w:r>
-        <w:t xml:space="preserve">“Search should query </w:t>
-      </w:r>
-      <w:proofErr w:type="spellStart"/>
-      <w:r>
-        <w:t>first_name</w:t>
-      </w:r>
-      <w:proofErr w:type="spellEnd"/>
-      <w:r>
-        <w:t xml:space="preserve">, </w:t>
-      </w:r>
-      <w:proofErr w:type="spellStart"/>
-      <w:r>
-        <w:t>last_name</w:t>
-      </w:r>
-      <w:proofErr w:type="spellEnd"/>
-      <w:r>
-        <w:t xml:space="preserve">, and username. Friend requests create a row in friendships with status ‘pending’. Accepting updates status to ‘accepted’. Removing a </w:t>
-      </w:r>
-      <w:proofErr w:type="gramStart"/>
-      <w:r>
-        <w:t>friend sets</w:t>
-      </w:r>
-      <w:proofErr w:type="gramEnd"/>
-      <w:r>
-        <w:t xml:space="preserve"> </w:t>
-      </w:r>
-      <w:proofErr w:type="spellStart"/>
-      <w:r>
-        <w:t>deleted_at</w:t>
-      </w:r>
-      <w:proofErr w:type="spellEnd"/>
-      <w:r>
-        <w:t xml:space="preserve"> rather than deleting the row.”</w:t>
+        <w:t>“Search should query first_name, last_name, and username. Friend requests create a row in friendships with status ‘pending’. Accepting updates status to ‘accepted’. Removing a friend sets deleted_at rather than deleting the row.”</w:t>
       </w:r>
     </w:p>
     <w:p/>
@@ -9786,114 +9876,7 @@
         <w:spacing w:before="60" w:after="60"/>
       </w:pPr>
       <w:r>
-        <w:t xml:space="preserve">Paste in: Sections 2.3, 2.4, 2.5, 2.6 (partial — owner/editor roles only), the moments / </w:t>
-      </w:r>
-      <w:proofErr w:type="spellStart"/>
-      <w:r>
-        <w:t>moment_members</w:t>
-      </w:r>
-      <w:proofErr w:type="spellEnd"/>
-      <w:r>
-        <w:t xml:space="preserve"> / </w:t>
-      </w:r>
-      <w:proofErr w:type="spellStart"/>
-      <w:r>
-        <w:t>moment_tags</w:t>
-      </w:r>
-      <w:proofErr w:type="spellEnd"/>
-      <w:r>
-        <w:t xml:space="preserve"> / </w:t>
-      </w:r>
-      <w:proofErr w:type="spellStart"/>
-      <w:r>
-        <w:t>moment_archive</w:t>
-      </w:r>
-      <w:proofErr w:type="spellEnd"/>
-      <w:r>
-        <w:t xml:space="preserve"> tables, and the Phase 4 build order entry.</w:t>
-      </w:r>
-    </w:p>
-    <w:p>
-      <w:pPr>
-        <w:spacing w:before="60" w:after="60"/>
-      </w:pPr>
-      <w:r>
-        <w:rPr>
-          <w:b/>
-          <w:bCs/>
-        </w:rPr>
-        <w:lastRenderedPageBreak/>
-        <w:t>Key instruction to include:</w:t>
-      </w:r>
-    </w:p>
-    <w:p>
-      <w:pPr>
-        <w:pStyle w:val="ListParagraph"/>
-        <w:numPr>
-          <w:ilvl w:val="0"/>
-          <w:numId w:val="4"/>
-        </w:numPr>
-        <w:spacing w:before="40" w:after="40"/>
-      </w:pPr>
-      <w:r>
-        <w:t xml:space="preserve">“The date field in the create modal should support three modes: year only, month + year, or full date. Store as separate </w:t>
-      </w:r>
-      <w:proofErr w:type="spellStart"/>
-      <w:r>
-        <w:t>date_year</w:t>
-      </w:r>
-      <w:proofErr w:type="spellEnd"/>
-      <w:r>
-        <w:t xml:space="preserve">, </w:t>
-      </w:r>
-      <w:proofErr w:type="spellStart"/>
-      <w:r>
-        <w:t>date_month</w:t>
-      </w:r>
-      <w:proofErr w:type="spellEnd"/>
-      <w:r>
-        <w:t xml:space="preserve">, </w:t>
-      </w:r>
-      <w:proofErr w:type="spellStart"/>
-      <w:r>
-        <w:t>date_day</w:t>
-      </w:r>
-      <w:proofErr w:type="spellEnd"/>
-      <w:r>
-        <w:t xml:space="preserve"> columns. The collapsing header on the moment page should pin the moment name when scrolling. If an invited email has no matching account, store a pending invite tied to that email address and send a sign-up email; surface the invite automatically once they register. Add a navigation bar with links to Home, Account, Notifications (placeholder), and Friends; on mobile this should collapse to a bottom tab bar or hamburger menu.”</w:t>
-      </w:r>
-    </w:p>
-    <w:p/>
-    <w:p>
-      <w:pPr>
-        <w:pStyle w:val="Heading3"/>
-      </w:pPr>
-      <w:r>
-        <w:t>Phase 5 — Posts &amp; Media</w:t>
-      </w:r>
-    </w:p>
-    <w:p>
-      <w:pPr>
-        <w:spacing w:before="60" w:after="60"/>
-      </w:pPr>
-      <w:r>
-        <w:t xml:space="preserve">Paste </w:t>
-      </w:r>
-      <w:proofErr w:type="gramStart"/>
-      <w:r>
-        <w:t>in:</w:t>
-      </w:r>
-      <w:proofErr w:type="gramEnd"/>
-      <w:r>
-        <w:t xml:space="preserve"> the posts / </w:t>
-      </w:r>
-      <w:proofErr w:type="spellStart"/>
-      <w:r>
-        <w:t>post_media</w:t>
-      </w:r>
-      <w:proofErr w:type="spellEnd"/>
-      <w:r>
-        <w:t xml:space="preserve"> tables and the Phase 5 build order entry.</w:t>
+        <w:t>Paste in: Sections 2.3, 2.4, 2.5, 2.6 (partial — owner/editor roles only), the moments / moment_members / moment_tags / moment_archive tables, and the Phase 4 build order entry.</w:t>
       </w:r>
     </w:p>
     <w:p>
@@ -9913,36 +9896,39 @@
         <w:pStyle w:val="ListParagraph"/>
         <w:numPr>
           <w:ilvl w:val="0"/>
-          <w:numId w:val="4"/>
+          <w:numId w:val="12"/>
         </w:numPr>
         <w:spacing w:before="40" w:after="40"/>
       </w:pPr>
       <w:r>
-        <w:t xml:space="preserve">“Media uploads (photos, videos, audio) go to </w:t>
-      </w:r>
-      <w:proofErr w:type="spellStart"/>
-      <w:r>
-        <w:t>Supabase</w:t>
-      </w:r>
-      <w:proofErr w:type="spellEnd"/>
-      <w:r>
-        <w:t xml:space="preserve"> Storage. A post can contain text only, media only, or both. Soft deletes on posts use a </w:t>
-      </w:r>
-      <w:proofErr w:type="spellStart"/>
-      <w:r>
-        <w:t>deleted_at</w:t>
-      </w:r>
-      <w:proofErr w:type="spellEnd"/>
-      <w:r>
-        <w:t xml:space="preserve"> column — never hard delete. Display posts in chronological order by default with a </w:t>
-      </w:r>
-      <w:proofErr w:type="gramStart"/>
-      <w:r>
-        <w:t>sort</w:t>
-      </w:r>
-      <w:proofErr w:type="gramEnd"/>
-      <w:r>
-        <w:t xml:space="preserve"> toggle.”</w:t>
+        <w:t>“The date field in the create modal should support three modes: year only, month + year, or full date. Store as separate date_year, date_month, date_day columns. The collapsing header on the moment page should pin the moment name when scrolling. If an invited email has no matching account, store a pending invite tied to that email address and send a sign-up email; surface the invite automatically once they register. Add a navigation bar with links to Home, Account, Notifications (placeholder), and Friends; on mobile this should collapse to a bottom tab bar or hamburger menu.”</w:t>
+      </w:r>
+    </w:p>
+    <w:p>
+      <w:pPr>
+        <w:pStyle w:val="ListParagraph"/>
+        <w:numPr>
+          <w:ilvl w:val="0"/>
+          <w:numId w:val="12"/>
+        </w:numPr>
+        <w:spacing w:before="40" w:after="40"/>
+      </w:pPr>
+      <w:r>
+        <w:lastRenderedPageBreak/>
+        <w:t>“Implement moment detail editing as follows. (1) Moment cards on the home page must show a [...] menu icon in the top right corner, visible on hover. The menu contains two options in this order: Edit moment (first), Archive (second). Only owners and editors see the Edit option — readers see Archive only. (2) The moment page header must also have an edit button or [...] menu allowing owners and editors to edit moment details from within the moment. (3) Both entry points open the same Edit moment modal, which reuses the create moment modal UI pre-populated with existing values. The modal title changes to “Edit moment” and the submit button reads “Save changes”. Editable fields: moment name (required), date including precision level (year only / month + year / full date), location, tags / keywords. Cover photo is NOT editable from this modal — it is only editable from within the moment page itself. (4) On save, update the relevant columns in the moments and moment_tags tables. Send a notification to all editors and readers of the moment that details have been updated.”</w:t>
+      </w:r>
+    </w:p>
+    <w:p>
+      <w:pPr>
+        <w:pStyle w:val="ListParagraph"/>
+        <w:numPr>
+          <w:ilvl w:val="0"/>
+          <w:numId w:val="12"/>
+        </w:numPr>
+        <w:spacing w:before="40" w:after="40"/>
+      </w:pPr>
+      <w:r>
+        <w:t>“Redesign the main moment page layout so posts appear as high up as possible. The correct top-to-bottom order is: (1) collapsing header with cover photo and gradient overlay, (2) Change cover photo button (owners and editors only — hidden from readers), (3) tags row, (4) members row, (5) posts / entries immediately below with no other content in between. The members row must be a compact single row: left side shows up to 5 overlapping avatar icons followed by ‘+ X more’ text if additional members exist; hovering on desktop or tapping on mobile opens a popover listing all members in order: owner first, then editors alphabetically, then readers alphabetically, each with a small role icon. Right side of the same row has two buttons: a small Invite button (icon + ‘Invite’ label on desktop, icon only on mobile) and a Manage button linking to /moments/[id]/members. The full manage members and invite link functionality must be moved to a dedicated Members page at /moments/[id]/members. This page contains: editor list (remove button visible to owner only), reader list (remove button visible to owners and editors), and the invite link generator with expiry options.”</w:t>
       </w:r>
     </w:p>
     <w:p/>
@@ -9951,7 +9937,7 @@
         <w:pStyle w:val="Heading3"/>
       </w:pPr>
       <w:r>
-        <w:t>Phase 6 — Readers &amp; Invite Links</w:t>
+        <w:t>Phase 5 — Posts &amp; Media</w:t>
       </w:r>
     </w:p>
     <w:p>
@@ -9959,23 +9945,7 @@
         <w:spacing w:before="60" w:after="60"/>
       </w:pPr>
       <w:r>
-        <w:t xml:space="preserve">Paste in: Section 2.6 (full permissions), Section 2.7 (Reader Invitations &amp; Links), the </w:t>
-      </w:r>
-      <w:proofErr w:type="spellStart"/>
-      <w:r>
-        <w:t>invite_links</w:t>
-      </w:r>
-      <w:proofErr w:type="spellEnd"/>
-      <w:r>
-        <w:t xml:space="preserve"> and </w:t>
-      </w:r>
-      <w:proofErr w:type="spellStart"/>
-      <w:r>
-        <w:t>moment_members</w:t>
-      </w:r>
-      <w:proofErr w:type="spellEnd"/>
-      <w:r>
-        <w:t xml:space="preserve"> tables, and the Phase 6 build order entry.</w:t>
+        <w:t>Paste in: the posts / post_media tables and the Phase 5 build order entry.</w:t>
       </w:r>
     </w:p>
     <w:p>
@@ -9995,28 +9965,25 @@
         <w:pStyle w:val="ListParagraph"/>
         <w:numPr>
           <w:ilvl w:val="0"/>
-          <w:numId w:val="4"/>
+          <w:numId w:val="12"/>
         </w:numPr>
         <w:spacing w:before="40" w:after="40"/>
       </w:pPr>
       <w:r>
-        <w:t xml:space="preserve">“There should be at most one active invite link per moment. Generating a new link deletes the previous row. Readers who already joined via an old link retain access — access is stored in </w:t>
-      </w:r>
-      <w:proofErr w:type="spellStart"/>
-      <w:r>
-        <w:t>moment_members</w:t>
-      </w:r>
-      <w:proofErr w:type="spellEnd"/>
-      <w:r>
-        <w:t xml:space="preserve">, not tied to the link. Ownership transfer updates </w:t>
-      </w:r>
-      <w:proofErr w:type="spellStart"/>
-      <w:r>
-        <w:t>owner_id</w:t>
-      </w:r>
-      <w:proofErr w:type="spellEnd"/>
-      <w:r>
-        <w:t xml:space="preserve"> on the moments table.”</w:t>
+        <w:t>“Media uploads (photos, videos, audio) go to Supabase Storage. A post can contain text only, media only, or both. Soft deletes on posts use a deleted_at column — never hard delete. Display posts in chronological order by default with a sort toggle.”</w:t>
+      </w:r>
+    </w:p>
+    <w:p>
+      <w:pPr>
+        <w:pStyle w:val="ListParagraph"/>
+        <w:numPr>
+          <w:ilvl w:val="0"/>
+          <w:numId w:val="12"/>
+        </w:numPr>
+        <w:spacing w:before="40" w:after="40"/>
+      </w:pPr>
+      <w:r>
+        <w:t>“Implement post editing with the following rules: (1) Only the original author of a post can edit it — no other editors or the moment owner can edit another user’s post. (2) Both text content and attached media are editable. When editing media, the author can add new items or remove existing ones; removing a media item should soft-delete its row in post_media (add a deleted_at column to post_media if not already present) and remove the file from Supabase Storage. (3) A post must always have at least one of: text content or at least one media item — prevent saving if both would be empty and show a validation message. (4) Add an edited_at nullable timestamp column to the posts table; set it to the current timestamp on every save. No edit history is stored — only the current version is kept. (5) UI: show a small pencil icon on each post, visible only to that post’s author. Clicking it opens the post creation modal pre-populated with existing content and media. The modal should clearly indicate the user is editing, not creating. (6) On each post, if edited_at is not null, display a subtle ‘Edited’ label alongside the edited_at timestamp so other users can see the post was modified. (7) Editing a post must not trigger a new post notification to other moment members.”</w:t>
       </w:r>
     </w:p>
     <w:p/>
@@ -10025,7 +9992,7 @@
         <w:pStyle w:val="Heading3"/>
       </w:pPr>
       <w:r>
-        <w:t>Phase 7 — Notifications</w:t>
+        <w:t>Phase 6 — Readers &amp; Invite Links</w:t>
       </w:r>
     </w:p>
     <w:p>
@@ -10033,15 +10000,7 @@
         <w:spacing w:before="60" w:after="60"/>
       </w:pPr>
       <w:r>
-        <w:t xml:space="preserve">Paste in: Section 2.8 (Notifications), the notifications and </w:t>
-      </w:r>
-      <w:proofErr w:type="spellStart"/>
-      <w:r>
-        <w:t>notification_preferences</w:t>
-      </w:r>
-      <w:proofErr w:type="spellEnd"/>
-      <w:r>
-        <w:t xml:space="preserve"> tables, and the Phase 7 build order entry.</w:t>
+        <w:t>Paste in: Section 2.6 (full permissions), Section 2.7 (Reader Invitations &amp; Links), the invite_links and moment_members tables, and the Phase 6 build order entry.</w:t>
       </w:r>
     </w:p>
     <w:p>
@@ -10061,52 +10020,12 @@
         <w:pStyle w:val="ListParagraph"/>
         <w:numPr>
           <w:ilvl w:val="0"/>
-          <w:numId w:val="4"/>
+          <w:numId w:val="12"/>
         </w:numPr>
         <w:spacing w:before="40" w:after="40"/>
       </w:pPr>
       <w:r>
-        <w:t xml:space="preserve">“Before sending any notification, check the recipient’s </w:t>
-      </w:r>
-      <w:proofErr w:type="spellStart"/>
-      <w:r>
-        <w:t>notification_preferences</w:t>
-      </w:r>
-      <w:proofErr w:type="spellEnd"/>
-      <w:r>
-        <w:t xml:space="preserve"> row. If </w:t>
-      </w:r>
-      <w:proofErr w:type="spellStart"/>
-      <w:r>
-        <w:t>archived_moment_notifications</w:t>
-      </w:r>
-      <w:proofErr w:type="spellEnd"/>
-      <w:r>
-        <w:t xml:space="preserve"> is false, suppress notifications for archived moments. Periodic reminders should be driven by a scheduled function (</w:t>
-      </w:r>
-      <w:proofErr w:type="spellStart"/>
-      <w:r>
-        <w:t>Supabase</w:t>
-      </w:r>
-      <w:proofErr w:type="spellEnd"/>
-      <w:r>
-        <w:t xml:space="preserve"> Edge Functions or a </w:t>
-      </w:r>
-      <w:proofErr w:type="spellStart"/>
-      <w:r>
-        <w:t>cron</w:t>
-      </w:r>
-      <w:proofErr w:type="spellEnd"/>
-      <w:r>
-        <w:t xml:space="preserve"> job via </w:t>
-      </w:r>
-      <w:proofErr w:type="spellStart"/>
-      <w:r>
-        <w:t>Vercel</w:t>
-      </w:r>
-      <w:proofErr w:type="spellEnd"/>
-      <w:r>
-        <w:t>).”</w:t>
+        <w:t>“There should be at most one active invite link per moment. Generating a new link deletes the previous row. Readers who already joined via an old link retain access — access is stored in moment_members, not tied to the link. Ownership transfer updates owner_id on the moments table.”</w:t>
       </w:r>
     </w:p>
     <w:p/>
@@ -10115,7 +10034,7 @@
         <w:pStyle w:val="Heading3"/>
       </w:pPr>
       <w:r>
-        <w:t>Phase 8 — Pricing Page</w:t>
+        <w:t>Phase 7 — Notifications</w:t>
       </w:r>
     </w:p>
     <w:p>
@@ -10123,7 +10042,7 @@
         <w:spacing w:before="60" w:after="60"/>
       </w:pPr>
       <w:r>
-        <w:t>Paste in: Section 2.9 (Pricing &amp; Tiers) and the Phase 8 build order entry.</w:t>
+        <w:t>Paste in: Section 2.8 (Notifications), the notifications and notification_preferences tables, and the Phase 7 build order entry.</w:t>
       </w:r>
     </w:p>
     <w:p>
@@ -10143,12 +10062,12 @@
         <w:pStyle w:val="ListParagraph"/>
         <w:numPr>
           <w:ilvl w:val="0"/>
-          <w:numId w:val="4"/>
+          <w:numId w:val="12"/>
         </w:numPr>
         <w:spacing w:before="40" w:after="40"/>
       </w:pPr>
       <w:r>
-        <w:t>“This is a static marketing page only — no payment integration yet. Show a free tier and at least one placeholder paid tier. Keep the design consistent with the rest of the app.”</w:t>
+        <w:t>“Before sending any notification, check the recipient’s notification_preferences row. If archived_moment_notifications is false, suppress notifications for archived moments. Periodic reminders should be driven by a scheduled function (Supabase Edge Functions or a cron job via Vercel).”</w:t>
       </w:r>
     </w:p>
     <w:p/>
@@ -10157,7 +10076,7 @@
         <w:pStyle w:val="Heading3"/>
       </w:pPr>
       <w:r>
-        <w:t>Phase 9 — Polish</w:t>
+        <w:t>Phase 8 — Pricing Page</w:t>
       </w:r>
     </w:p>
     <w:p>
@@ -10165,8 +10084,7 @@
         <w:spacing w:before="60" w:after="60"/>
       </w:pPr>
       <w:r>
-        <w:lastRenderedPageBreak/>
-        <w:t>No single paste-in — this phase is iterative. Run it as a review pass after each prior phase, and as a dedicated final pass at the end.</w:t>
+        <w:t>Paste in: Section 2.9 (Pricing &amp; Tiers) and the Phase 8 build order entry.</w:t>
       </w:r>
     </w:p>
     <w:p>
@@ -10186,20 +10104,54 @@
         <w:pStyle w:val="ListParagraph"/>
         <w:numPr>
           <w:ilvl w:val="0"/>
-          <w:numId w:val="4"/>
+          <w:numId w:val="12"/>
         </w:numPr>
         <w:spacing w:before="40" w:after="40"/>
       </w:pPr>
       <w:r>
-        <w:t xml:space="preserve">“Review the current state of the app for: mobile responsiveness, loading and empty states, error handling, image optimisation, and </w:t>
-      </w:r>
-      <w:proofErr w:type="spellStart"/>
-      <w:r>
-        <w:t>Supabase</w:t>
-      </w:r>
-      <w:proofErr w:type="spellEnd"/>
-      <w:r>
-        <w:t xml:space="preserve"> row level security coverage. Identify and fix any gaps.”</w:t>
+        <w:t>“This is a static marketing page only — no payment integration yet. Show a free tier and at least one placeholder paid tier. Keep the design consistent with the rest of the app.”</w:t>
+      </w:r>
+    </w:p>
+    <w:p/>
+    <w:p>
+      <w:pPr>
+        <w:pStyle w:val="Heading3"/>
+      </w:pPr>
+      <w:r>
+        <w:t>Phase 9 — Polish</w:t>
+      </w:r>
+    </w:p>
+    <w:p>
+      <w:pPr>
+        <w:spacing w:before="60" w:after="60"/>
+      </w:pPr>
+      <w:r>
+        <w:t>No single paste-in — this phase is iterative. Run it as a review pass after each prior phase, and as a dedicated final pass at the end.</w:t>
+      </w:r>
+    </w:p>
+    <w:p>
+      <w:pPr>
+        <w:spacing w:before="60" w:after="60"/>
+      </w:pPr>
+      <w:r>
+        <w:rPr>
+          <w:b/>
+          <w:bCs/>
+        </w:rPr>
+        <w:t>Key instruction to include:</w:t>
+      </w:r>
+    </w:p>
+    <w:p>
+      <w:pPr>
+        <w:pStyle w:val="ListParagraph"/>
+        <w:numPr>
+          <w:ilvl w:val="0"/>
+          <w:numId w:val="12"/>
+        </w:numPr>
+        <w:spacing w:before="40" w:after="40"/>
+      </w:pPr>
+      <w:r>
+        <w:t>“Review the current state of the app for: mobile responsiveness, loading and empty states, error handling, image optimisation, and Supabase row level security coverage. Identify and fix any gaps.”</w:t>
       </w:r>
     </w:p>
     <w:p/>
@@ -10210,13 +10162,8 @@
           <w:bottom w:val="single" w:sz="4" w:space="4" w:color="4A90B8"/>
         </w:pBdr>
       </w:pPr>
-      <w:proofErr w:type="gramStart"/>
-      <w:r>
-        <w:t>5.3  General</w:t>
-      </w:r>
-      <w:proofErr w:type="gramEnd"/>
-      <w:r>
-        <w:t xml:space="preserve"> Tips for Working with Claude Code</w:t>
+      <w:r>
+        <w:t>5.3  General Tips for Working with Claude Code</w:t>
       </w:r>
     </w:p>
     <w:p>
@@ -10224,7 +10171,7 @@
         <w:pStyle w:val="ListParagraph"/>
         <w:numPr>
           <w:ilvl w:val="0"/>
-          <w:numId w:val="4"/>
+          <w:numId w:val="12"/>
         </w:numPr>
         <w:spacing w:before="40" w:after="40"/>
       </w:pPr>
@@ -10237,7 +10184,7 @@
         <w:pStyle w:val="ListParagraph"/>
         <w:numPr>
           <w:ilvl w:val="0"/>
-          <w:numId w:val="4"/>
+          <w:numId w:val="12"/>
         </w:numPr>
         <w:spacing w:before="40" w:after="40"/>
       </w:pPr>
@@ -10250,7 +10197,7 @@
         <w:pStyle w:val="ListParagraph"/>
         <w:numPr>
           <w:ilvl w:val="0"/>
-          <w:numId w:val="4"/>
+          <w:numId w:val="12"/>
         </w:numPr>
         <w:spacing w:before="40" w:after="40"/>
       </w:pPr>
@@ -10263,7 +10210,7 @@
         <w:pStyle w:val="ListParagraph"/>
         <w:numPr>
           <w:ilvl w:val="0"/>
-          <w:numId w:val="4"/>
+          <w:numId w:val="12"/>
         </w:numPr>
         <w:spacing w:before="40" w:after="40"/>
       </w:pPr>
@@ -10276,28 +10223,13 @@
         <w:pStyle w:val="ListParagraph"/>
         <w:numPr>
           <w:ilvl w:val="0"/>
-          <w:numId w:val="4"/>
+          <w:numId w:val="12"/>
         </w:numPr>
         <w:spacing w:before="40" w:after="40"/>
       </w:pPr>
       <w:r>
-        <w:t xml:space="preserve">For UI, tell Claude Code to use </w:t>
-      </w:r>
-      <w:proofErr w:type="spellStart"/>
-      <w:r>
-        <w:t>shadcn</w:t>
-      </w:r>
-      <w:proofErr w:type="spellEnd"/>
-      <w:r>
-        <w:t>/</w:t>
-      </w:r>
-      <w:proofErr w:type="spellStart"/>
-      <w:r>
-        <w:t>ui</w:t>
-      </w:r>
-      <w:proofErr w:type="spellEnd"/>
-      <w:r>
-        <w:t xml:space="preserve"> components and reference the design principle: calm, intimate, unhurried</w:t>
+        <w:lastRenderedPageBreak/>
+        <w:t>For UI, tell Claude Code to use shadcn/ui components and reference the design principle: calm, intimate, unhurried</w:t>
       </w:r>
     </w:p>
     <w:p>
@@ -10305,20 +10237,12 @@
         <w:pStyle w:val="ListParagraph"/>
         <w:numPr>
           <w:ilvl w:val="0"/>
-          <w:numId w:val="4"/>
+          <w:numId w:val="12"/>
         </w:numPr>
         <w:spacing w:before="40" w:after="40"/>
       </w:pPr>
       <w:r>
-        <w:t xml:space="preserve">Commit to GitHub at the end of each phase so </w:t>
-      </w:r>
-      <w:proofErr w:type="spellStart"/>
-      <w:r>
-        <w:t>Vercel</w:t>
-      </w:r>
-      <w:proofErr w:type="spellEnd"/>
-      <w:r>
-        <w:t xml:space="preserve"> produces a clean deployment to review</w:t>
+        <w:t>Commit to GitHub at the end of each phase so Vercel produces a clean deployment to review</w:t>
       </w:r>
     </w:p>
     <w:p/>
@@ -10384,51 +10308,29 @@
     <w:pPr>
       <w:jc w:val="center"/>
     </w:pPr>
-    <w:proofErr w:type="spellStart"/>
-    <w:proofErr w:type="gramStart"/>
     <w:r>
       <w:rPr>
         <w:color w:val="999999"/>
         <w:sz w:val="16"/>
         <w:szCs w:val="16"/>
       </w:rPr>
-      <w:t>RememberWhen</w:t>
+      <w:t>Remember</w:t>
     </w:r>
-    <w:proofErr w:type="spellEnd"/>
     <w:r>
       <w:rPr>
         <w:color w:val="999999"/>
         <w:sz w:val="16"/>
         <w:szCs w:val="16"/>
       </w:rPr>
-      <w:t xml:space="preserve">  —</w:t>
+      <w:t xml:space="preserve"> </w:t>
     </w:r>
-    <w:proofErr w:type="gramEnd"/>
     <w:r>
       <w:rPr>
         <w:color w:val="999999"/>
         <w:sz w:val="16"/>
         <w:szCs w:val="16"/>
       </w:rPr>
-      <w:t xml:space="preserve">  Product </w:t>
-    </w:r>
-    <w:proofErr w:type="gramStart"/>
-    <w:r>
-      <w:rPr>
-        <w:color w:val="999999"/>
-        <w:sz w:val="16"/>
-        <w:szCs w:val="16"/>
-      </w:rPr>
-      <w:t>Specification  —</w:t>
-    </w:r>
-    <w:proofErr w:type="gramEnd"/>
-    <w:r>
-      <w:rPr>
-        <w:color w:val="999999"/>
-        <w:sz w:val="16"/>
-        <w:szCs w:val="16"/>
-      </w:rPr>
-      <w:t xml:space="preserve">  Confidential</w:t>
+      <w:t>When  —  Product Specification  —  Confidential</w:t>
     </w:r>
   </w:p>
 </w:ftr>
@@ -10456,6 +10358,64 @@
 <file path=word/numbering.xml><?xml version="1.0" encoding="utf-8"?>
 <w:numbering xmlns:wpc="http://schemas.microsoft.com/office/word/2010/wordprocessingCanvas" xmlns:cx="http://schemas.microsoft.com/office/drawing/2014/chartex" xmlns:cx1="http://schemas.microsoft.com/office/drawing/2015/9/8/chartex" xmlns:cx2="http://schemas.microsoft.com/office/drawing/2015/10/21/chartex" xmlns:cx3="http://schemas.microsoft.com/office/drawing/2016/5/9/chartex" xmlns:cx4="http://schemas.microsoft.com/office/drawing/2016/5/10/chartex" xmlns:cx5="http://schemas.microsoft.com/office/drawing/2016/5/11/chartex" xmlns:cx6="http://schemas.microsoft.com/office/drawing/2016/5/12/chartex" xmlns:cx7="http://schemas.microsoft.com/office/drawing/2016/5/13/chartex" xmlns:cx8="http://schemas.microsoft.com/office/drawing/2016/5/14/chartex" xmlns:mc="http://schemas.openxmlformats.org/markup-compatibility/2006" xmlns:aink="http://schemas.microsoft.com/office/drawing/2016/ink" xmlns:am3d="http://schemas.microsoft.com/office/drawing/2017/model3d" xmlns:o="urn:schemas-microsoft-com:office:office" xmlns:oel="http://schemas.microsoft.com/office/2019/extlst" xmlns:r="http://schemas.openxmlformats.org/officeDocument/2006/relationships" xmlns:m="http://schemas.openxmlformats.org/officeDocument/2006/math" xmlns:v="urn:schemas-microsoft-com:vml" xmlns:wp14="http://schemas.microsoft.com/office/word/2010/wordprocessingDrawing" xmlns:wp="http://schemas.openxmlformats.org/drawingml/2006/wordprocessingDrawing" xmlns:w10="urn:schemas-microsoft-com:office:word" xmlns:w="http://schemas.openxmlformats.org/wordprocessingml/2006/main" xmlns:w14="http://schemas.microsoft.com/office/word/2010/wordml" xmlns:w15="http://schemas.microsoft.com/office/word/2012/wordml" xmlns:w16cex="http://schemas.microsoft.com/office/word/2018/wordml/cex" xmlns:w16cid="http://schemas.microsoft.com/office/word/2016/wordml/cid" xmlns:w16="http://schemas.microsoft.com/office/word/2018/wordml" xmlns:w16du="http://schemas.microsoft.com/office/word/2023/wordml/word16du" xmlns:w16sdtdh="http://schemas.microsoft.com/office/word/2020/wordml/sdtdatahash" xmlns:w16sdtfl="http://schemas.microsoft.com/office/word/2024/wordml/sdtformatlock" xmlns:w16se="http://schemas.microsoft.com/office/word/2015/wordml/symex" xmlns:wpg="http://schemas.microsoft.com/office/word/2010/wordprocessingGroup" xmlns:wpi="http://schemas.microsoft.com/office/word/2010/wordprocessingInk" xmlns:wne="http://schemas.microsoft.com/office/word/2006/wordml" xmlns:wps="http://schemas.microsoft.com/office/word/2010/wordprocessingShape" mc:Ignorable="w14 w15 w16se w16cid w16 w16cex w16sdtdh w16sdtfl w16du wp14">
   <w:abstractNum w:abstractNumId="0" w15:restartNumberingAfterBreak="0">
+    <w:nsid w:val="0BC072DA"/>
+    <w:multiLevelType w:val="hybridMultilevel"/>
+    <w:tmpl w:val="DB96A286"/>
+    <w:lvl w:ilvl="0" w:tplc="6668088A">
+      <w:start w:val="1"/>
+      <w:numFmt w:val="bullet"/>
+      <w:lvlText w:val=""/>
+      <w:lvlJc w:val="left"/>
+      <w:pPr>
+        <w:ind w:left="0"/>
+      </w:pPr>
+    </w:lvl>
+    <w:lvl w:ilvl="1" w:tplc="EEF48E44">
+      <w:start w:val="1"/>
+      <w:numFmt w:val="bullet"/>
+      <w:lvlText w:val="◦"/>
+      <w:lvlJc w:val="left"/>
+      <w:pPr>
+        <w:ind w:left="1080" w:hanging="360"/>
+      </w:pPr>
+    </w:lvl>
+    <w:lvl w:ilvl="2" w:tplc="6C7A046C">
+      <w:numFmt w:val="decimal"/>
+      <w:lvlText w:val=""/>
+      <w:lvlJc w:val="left"/>
+    </w:lvl>
+    <w:lvl w:ilvl="3" w:tplc="F1F62B08">
+      <w:numFmt w:val="decimal"/>
+      <w:lvlText w:val=""/>
+      <w:lvlJc w:val="left"/>
+    </w:lvl>
+    <w:lvl w:ilvl="4" w:tplc="3A88CB1A">
+      <w:numFmt w:val="decimal"/>
+      <w:lvlText w:val=""/>
+      <w:lvlJc w:val="left"/>
+    </w:lvl>
+    <w:lvl w:ilvl="5" w:tplc="1B669ACC">
+      <w:numFmt w:val="decimal"/>
+      <w:lvlText w:val=""/>
+      <w:lvlJc w:val="left"/>
+    </w:lvl>
+    <w:lvl w:ilvl="6" w:tplc="128E535C">
+      <w:numFmt w:val="decimal"/>
+      <w:lvlText w:val=""/>
+      <w:lvlJc w:val="left"/>
+    </w:lvl>
+    <w:lvl w:ilvl="7" w:tplc="68261168">
+      <w:numFmt w:val="decimal"/>
+      <w:lvlText w:val=""/>
+      <w:lvlJc w:val="left"/>
+    </w:lvl>
+    <w:lvl w:ilvl="8" w:tplc="10945CC6">
+      <w:numFmt w:val="decimal"/>
+      <w:lvlText w:val=""/>
+      <w:lvlJc w:val="left"/>
+    </w:lvl>
+  </w:abstractNum>
+  <w:abstractNum w:abstractNumId="1" w15:restartNumberingAfterBreak="0">
     <w:nsid w:val="29100C86"/>
     <w:multiLevelType w:val="hybridMultilevel"/>
     <w:tmpl w:val="4A587B48"/>
@@ -10513,7 +10473,7 @@
       <w:lvlJc w:val="left"/>
     </w:lvl>
   </w:abstractNum>
-  <w:abstractNum w:abstractNumId="1" w15:restartNumberingAfterBreak="0">
+  <w:abstractNum w:abstractNumId="2" w15:restartNumberingAfterBreak="0">
     <w:nsid w:val="31275264"/>
     <w:multiLevelType w:val="hybridMultilevel"/>
     <w:tmpl w:val="141232A8"/>
@@ -10567,7 +10527,7 @@
       <w:lvlJc w:val="left"/>
     </w:lvl>
   </w:abstractNum>
-  <w:abstractNum w:abstractNumId="2" w15:restartNumberingAfterBreak="0">
+  <w:abstractNum w:abstractNumId="3" w15:restartNumberingAfterBreak="0">
     <w:nsid w:val="33AF03F1"/>
     <w:multiLevelType w:val="hybridMultilevel"/>
     <w:tmpl w:val="EE12D8B0"/>
@@ -10653,7 +10613,177 @@
       </w:pPr>
     </w:lvl>
   </w:abstractNum>
-  <w:abstractNum w:abstractNumId="3" w15:restartNumberingAfterBreak="0">
+  <w:abstractNum w:abstractNumId="4" w15:restartNumberingAfterBreak="0">
+    <w:nsid w:val="3B026C82"/>
+    <w:multiLevelType w:val="hybridMultilevel"/>
+    <w:tmpl w:val="112654D0"/>
+    <w:lvl w:ilvl="0" w:tplc="FFCA889C">
+      <w:start w:val="1"/>
+      <w:numFmt w:val="bullet"/>
+      <w:lvlText w:val=""/>
+      <w:lvlJc w:val="left"/>
+      <w:pPr>
+        <w:ind w:left="0"/>
+      </w:pPr>
+    </w:lvl>
+    <w:lvl w:ilvl="1" w:tplc="54DCD8DA">
+      <w:start w:val="1"/>
+      <w:numFmt w:val="bullet"/>
+      <w:lvlText w:val="◦"/>
+      <w:lvlJc w:val="left"/>
+      <w:pPr>
+        <w:ind w:left="1080" w:hanging="360"/>
+      </w:pPr>
+    </w:lvl>
+    <w:lvl w:ilvl="2" w:tplc="B8F4F622">
+      <w:numFmt w:val="decimal"/>
+      <w:lvlText w:val=""/>
+      <w:lvlJc w:val="left"/>
+    </w:lvl>
+    <w:lvl w:ilvl="3" w:tplc="242C038A">
+      <w:numFmt w:val="decimal"/>
+      <w:lvlText w:val=""/>
+      <w:lvlJc w:val="left"/>
+    </w:lvl>
+    <w:lvl w:ilvl="4" w:tplc="3B2440E6">
+      <w:numFmt w:val="decimal"/>
+      <w:lvlText w:val=""/>
+      <w:lvlJc w:val="left"/>
+    </w:lvl>
+    <w:lvl w:ilvl="5" w:tplc="1CDA485A">
+      <w:numFmt w:val="decimal"/>
+      <w:lvlText w:val=""/>
+      <w:lvlJc w:val="left"/>
+    </w:lvl>
+    <w:lvl w:ilvl="6" w:tplc="17EABA38">
+      <w:numFmt w:val="decimal"/>
+      <w:lvlText w:val=""/>
+      <w:lvlJc w:val="left"/>
+    </w:lvl>
+    <w:lvl w:ilvl="7" w:tplc="A7E20EF2">
+      <w:numFmt w:val="decimal"/>
+      <w:lvlText w:val=""/>
+      <w:lvlJc w:val="left"/>
+    </w:lvl>
+    <w:lvl w:ilvl="8" w:tplc="D0AE3CF6">
+      <w:numFmt w:val="decimal"/>
+      <w:lvlText w:val=""/>
+      <w:lvlJc w:val="left"/>
+    </w:lvl>
+  </w:abstractNum>
+  <w:abstractNum w:abstractNumId="5" w15:restartNumberingAfterBreak="0">
+    <w:nsid w:val="3F543D56"/>
+    <w:multiLevelType w:val="hybridMultilevel"/>
+    <w:tmpl w:val="92D20DE8"/>
+    <w:lvl w:ilvl="0" w:tplc="EAB014A0">
+      <w:start w:val="1"/>
+      <w:numFmt w:val="bullet"/>
+      <w:lvlText w:val=""/>
+      <w:lvlJc w:val="left"/>
+      <w:pPr>
+        <w:ind w:left="0"/>
+      </w:pPr>
+    </w:lvl>
+    <w:lvl w:ilvl="1" w:tplc="7D00D636">
+      <w:start w:val="1"/>
+      <w:numFmt w:val="bullet"/>
+      <w:lvlText w:val="◦"/>
+      <w:lvlJc w:val="left"/>
+      <w:pPr>
+        <w:ind w:left="1080" w:hanging="360"/>
+      </w:pPr>
+    </w:lvl>
+    <w:lvl w:ilvl="2" w:tplc="71C63D5C">
+      <w:numFmt w:val="decimal"/>
+      <w:lvlText w:val=""/>
+      <w:lvlJc w:val="left"/>
+    </w:lvl>
+    <w:lvl w:ilvl="3" w:tplc="829AE480">
+      <w:numFmt w:val="decimal"/>
+      <w:lvlText w:val=""/>
+      <w:lvlJc w:val="left"/>
+    </w:lvl>
+    <w:lvl w:ilvl="4" w:tplc="C5E801FA">
+      <w:numFmt w:val="decimal"/>
+      <w:lvlText w:val=""/>
+      <w:lvlJc w:val="left"/>
+    </w:lvl>
+    <w:lvl w:ilvl="5" w:tplc="42E6DF0E">
+      <w:numFmt w:val="decimal"/>
+      <w:lvlText w:val=""/>
+      <w:lvlJc w:val="left"/>
+    </w:lvl>
+    <w:lvl w:ilvl="6" w:tplc="B682251C">
+      <w:numFmt w:val="decimal"/>
+      <w:lvlText w:val=""/>
+      <w:lvlJc w:val="left"/>
+    </w:lvl>
+    <w:lvl w:ilvl="7" w:tplc="1BA03448">
+      <w:numFmt w:val="decimal"/>
+      <w:lvlText w:val=""/>
+      <w:lvlJc w:val="left"/>
+    </w:lvl>
+    <w:lvl w:ilvl="8" w:tplc="3DB6FADA">
+      <w:numFmt w:val="decimal"/>
+      <w:lvlText w:val=""/>
+      <w:lvlJc w:val="left"/>
+    </w:lvl>
+  </w:abstractNum>
+  <w:abstractNum w:abstractNumId="6" w15:restartNumberingAfterBreak="0">
+    <w:nsid w:val="484844FC"/>
+    <w:multiLevelType w:val="hybridMultilevel"/>
+    <w:tmpl w:val="58DEC63C"/>
+    <w:lvl w:ilvl="0" w:tplc="81ECD7C4">
+      <w:start w:val="1"/>
+      <w:numFmt w:val="bullet"/>
+      <w:lvlText w:val="•"/>
+      <w:lvlJc w:val="left"/>
+      <w:pPr>
+        <w:ind w:left="720" w:hanging="360"/>
+      </w:pPr>
+    </w:lvl>
+    <w:lvl w:ilvl="1" w:tplc="03D8C7F8">
+      <w:numFmt w:val="decimal"/>
+      <w:lvlText w:val=""/>
+      <w:lvlJc w:val="left"/>
+    </w:lvl>
+    <w:lvl w:ilvl="2" w:tplc="2A42A9AC">
+      <w:numFmt w:val="decimal"/>
+      <w:lvlText w:val=""/>
+      <w:lvlJc w:val="left"/>
+    </w:lvl>
+    <w:lvl w:ilvl="3" w:tplc="C10A4632">
+      <w:numFmt w:val="decimal"/>
+      <w:lvlText w:val=""/>
+      <w:lvlJc w:val="left"/>
+    </w:lvl>
+    <w:lvl w:ilvl="4" w:tplc="4CD27442">
+      <w:numFmt w:val="decimal"/>
+      <w:lvlText w:val=""/>
+      <w:lvlJc w:val="left"/>
+    </w:lvl>
+    <w:lvl w:ilvl="5" w:tplc="71D2056A">
+      <w:numFmt w:val="decimal"/>
+      <w:lvlText w:val=""/>
+      <w:lvlJc w:val="left"/>
+    </w:lvl>
+    <w:lvl w:ilvl="6" w:tplc="310055AA">
+      <w:numFmt w:val="decimal"/>
+      <w:lvlText w:val=""/>
+      <w:lvlJc w:val="left"/>
+    </w:lvl>
+    <w:lvl w:ilvl="7" w:tplc="BFAEF5A4">
+      <w:numFmt w:val="decimal"/>
+      <w:lvlText w:val=""/>
+      <w:lvlJc w:val="left"/>
+    </w:lvl>
+    <w:lvl w:ilvl="8" w:tplc="39CA50CE">
+      <w:numFmt w:val="decimal"/>
+      <w:lvlText w:val=""/>
+      <w:lvlJc w:val="left"/>
+    </w:lvl>
+  </w:abstractNum>
+  <w:abstractNum w:abstractNumId="7" w15:restartNumberingAfterBreak="0">
     <w:nsid w:val="4AC24016"/>
     <w:multiLevelType w:val="hybridMultilevel"/>
     <w:tmpl w:val="A790CBE2"/>
@@ -10707,7 +10837,61 @@
       <w:lvlJc w:val="left"/>
     </w:lvl>
   </w:abstractNum>
-  <w:abstractNum w:abstractNumId="4" w15:restartNumberingAfterBreak="0">
+  <w:abstractNum w:abstractNumId="8" w15:restartNumberingAfterBreak="0">
+    <w:nsid w:val="54214526"/>
+    <w:multiLevelType w:val="hybridMultilevel"/>
+    <w:tmpl w:val="04E04A02"/>
+    <w:lvl w:ilvl="0" w:tplc="AED6E526">
+      <w:start w:val="1"/>
+      <w:numFmt w:val="bullet"/>
+      <w:lvlText w:val="•"/>
+      <w:lvlJc w:val="left"/>
+      <w:pPr>
+        <w:ind w:left="720" w:hanging="360"/>
+      </w:pPr>
+    </w:lvl>
+    <w:lvl w:ilvl="1" w:tplc="84509920">
+      <w:numFmt w:val="decimal"/>
+      <w:lvlText w:val=""/>
+      <w:lvlJc w:val="left"/>
+    </w:lvl>
+    <w:lvl w:ilvl="2" w:tplc="FBAC782C">
+      <w:numFmt w:val="decimal"/>
+      <w:lvlText w:val=""/>
+      <w:lvlJc w:val="left"/>
+    </w:lvl>
+    <w:lvl w:ilvl="3" w:tplc="9A368D14">
+      <w:numFmt w:val="decimal"/>
+      <w:lvlText w:val=""/>
+      <w:lvlJc w:val="left"/>
+    </w:lvl>
+    <w:lvl w:ilvl="4" w:tplc="BD8425C4">
+      <w:numFmt w:val="decimal"/>
+      <w:lvlText w:val=""/>
+      <w:lvlJc w:val="left"/>
+    </w:lvl>
+    <w:lvl w:ilvl="5" w:tplc="2920FCB2">
+      <w:numFmt w:val="decimal"/>
+      <w:lvlText w:val=""/>
+      <w:lvlJc w:val="left"/>
+    </w:lvl>
+    <w:lvl w:ilvl="6" w:tplc="FD42525E">
+      <w:numFmt w:val="decimal"/>
+      <w:lvlText w:val=""/>
+      <w:lvlJc w:val="left"/>
+    </w:lvl>
+    <w:lvl w:ilvl="7" w:tplc="482E983A">
+      <w:numFmt w:val="decimal"/>
+      <w:lvlText w:val=""/>
+      <w:lvlJc w:val="left"/>
+    </w:lvl>
+    <w:lvl w:ilvl="8" w:tplc="73F63C2C">
+      <w:numFmt w:val="decimal"/>
+      <w:lvlText w:val=""/>
+      <w:lvlJc w:val="left"/>
+    </w:lvl>
+  </w:abstractNum>
+  <w:abstractNum w:abstractNumId="9" w15:restartNumberingAfterBreak="0">
     <w:nsid w:val="6B6C68B6"/>
     <w:multiLevelType w:val="hybridMultilevel"/>
     <w:tmpl w:val="A4FC0218"/>
@@ -10761,7 +10945,65 @@
       <w:lvlJc w:val="left"/>
     </w:lvl>
   </w:abstractNum>
-  <w:abstractNum w:abstractNumId="5" w15:restartNumberingAfterBreak="0">
+  <w:abstractNum w:abstractNumId="10" w15:restartNumberingAfterBreak="0">
+    <w:nsid w:val="6BD21823"/>
+    <w:multiLevelType w:val="hybridMultilevel"/>
+    <w:tmpl w:val="4FCEF8C2"/>
+    <w:lvl w:ilvl="0" w:tplc="D76A85AE">
+      <w:start w:val="1"/>
+      <w:numFmt w:val="bullet"/>
+      <w:lvlText w:val=""/>
+      <w:lvlJc w:val="left"/>
+      <w:pPr>
+        <w:ind w:left="0"/>
+      </w:pPr>
+    </w:lvl>
+    <w:lvl w:ilvl="1" w:tplc="CC56A148">
+      <w:start w:val="1"/>
+      <w:numFmt w:val="bullet"/>
+      <w:lvlText w:val="◦"/>
+      <w:lvlJc w:val="left"/>
+      <w:pPr>
+        <w:ind w:left="1080" w:hanging="360"/>
+      </w:pPr>
+    </w:lvl>
+    <w:lvl w:ilvl="2" w:tplc="AE1A8DFA">
+      <w:numFmt w:val="decimal"/>
+      <w:lvlText w:val=""/>
+      <w:lvlJc w:val="left"/>
+    </w:lvl>
+    <w:lvl w:ilvl="3" w:tplc="38D47D3C">
+      <w:numFmt w:val="decimal"/>
+      <w:lvlText w:val=""/>
+      <w:lvlJc w:val="left"/>
+    </w:lvl>
+    <w:lvl w:ilvl="4" w:tplc="E22C4EC8">
+      <w:numFmt w:val="decimal"/>
+      <w:lvlText w:val=""/>
+      <w:lvlJc w:val="left"/>
+    </w:lvl>
+    <w:lvl w:ilvl="5" w:tplc="DD24473A">
+      <w:numFmt w:val="decimal"/>
+      <w:lvlText w:val=""/>
+      <w:lvlJc w:val="left"/>
+    </w:lvl>
+    <w:lvl w:ilvl="6" w:tplc="0E3463A0">
+      <w:numFmt w:val="decimal"/>
+      <w:lvlText w:val=""/>
+      <w:lvlJc w:val="left"/>
+    </w:lvl>
+    <w:lvl w:ilvl="7" w:tplc="46FEFFF2">
+      <w:numFmt w:val="decimal"/>
+      <w:lvlText w:val=""/>
+      <w:lvlJc w:val="left"/>
+    </w:lvl>
+    <w:lvl w:ilvl="8" w:tplc="914EBF18">
+      <w:numFmt w:val="decimal"/>
+      <w:lvlText w:val=""/>
+      <w:lvlJc w:val="left"/>
+    </w:lvl>
+  </w:abstractNum>
+  <w:abstractNum w:abstractNumId="11" w15:restartNumberingAfterBreak="0">
     <w:nsid w:val="6E6901D5"/>
     <w:multiLevelType w:val="hybridMultilevel"/>
     <w:tmpl w:val="DF9E5B0C"/>
@@ -10819,32 +11061,188 @@
       <w:lvlJc w:val="left"/>
     </w:lvl>
   </w:abstractNum>
+  <w:abstractNum w:abstractNumId="12" w15:restartNumberingAfterBreak="0">
+    <w:nsid w:val="7116229D"/>
+    <w:multiLevelType w:val="hybridMultilevel"/>
+    <w:tmpl w:val="549C3508"/>
+    <w:lvl w:ilvl="0" w:tplc="C0AE4EEE">
+      <w:start w:val="1"/>
+      <w:numFmt w:val="bullet"/>
+      <w:lvlText w:val="•"/>
+      <w:lvlJc w:val="left"/>
+      <w:pPr>
+        <w:ind w:left="720" w:hanging="360"/>
+      </w:pPr>
+    </w:lvl>
+    <w:lvl w:ilvl="1" w:tplc="9342BF16">
+      <w:numFmt w:val="decimal"/>
+      <w:lvlText w:val=""/>
+      <w:lvlJc w:val="left"/>
+    </w:lvl>
+    <w:lvl w:ilvl="2" w:tplc="3460C81E">
+      <w:numFmt w:val="decimal"/>
+      <w:lvlText w:val=""/>
+      <w:lvlJc w:val="left"/>
+    </w:lvl>
+    <w:lvl w:ilvl="3" w:tplc="AB6605D2">
+      <w:numFmt w:val="decimal"/>
+      <w:lvlText w:val=""/>
+      <w:lvlJc w:val="left"/>
+    </w:lvl>
+    <w:lvl w:ilvl="4" w:tplc="8C448CEE">
+      <w:numFmt w:val="decimal"/>
+      <w:lvlText w:val=""/>
+      <w:lvlJc w:val="left"/>
+    </w:lvl>
+    <w:lvl w:ilvl="5" w:tplc="3006B19E">
+      <w:numFmt w:val="decimal"/>
+      <w:lvlText w:val=""/>
+      <w:lvlJc w:val="left"/>
+    </w:lvl>
+    <w:lvl w:ilvl="6" w:tplc="B016A8A4">
+      <w:numFmt w:val="decimal"/>
+      <w:lvlText w:val=""/>
+      <w:lvlJc w:val="left"/>
+    </w:lvl>
+    <w:lvl w:ilvl="7" w:tplc="33F820EC">
+      <w:numFmt w:val="decimal"/>
+      <w:lvlText w:val=""/>
+      <w:lvlJc w:val="left"/>
+    </w:lvl>
+    <w:lvl w:ilvl="8" w:tplc="55C24DA8">
+      <w:numFmt w:val="decimal"/>
+      <w:lvlText w:val=""/>
+      <w:lvlJc w:val="left"/>
+    </w:lvl>
+  </w:abstractNum>
+  <w:abstractNum w:abstractNumId="13" w15:restartNumberingAfterBreak="0">
+    <w:nsid w:val="72805935"/>
+    <w:multiLevelType w:val="hybridMultilevel"/>
+    <w:tmpl w:val="11DCA6A0"/>
+    <w:lvl w:ilvl="0" w:tplc="B14ADDAE">
+      <w:start w:val="1"/>
+      <w:numFmt w:val="bullet"/>
+      <w:lvlText w:val="•"/>
+      <w:lvlJc w:val="left"/>
+      <w:pPr>
+        <w:ind w:left="720" w:hanging="360"/>
+      </w:pPr>
+    </w:lvl>
+    <w:lvl w:ilvl="1" w:tplc="DDD61A1E">
+      <w:numFmt w:val="decimal"/>
+      <w:lvlText w:val=""/>
+      <w:lvlJc w:val="left"/>
+    </w:lvl>
+    <w:lvl w:ilvl="2" w:tplc="79BA33FA">
+      <w:numFmt w:val="decimal"/>
+      <w:lvlText w:val=""/>
+      <w:lvlJc w:val="left"/>
+    </w:lvl>
+    <w:lvl w:ilvl="3" w:tplc="769A8050">
+      <w:numFmt w:val="decimal"/>
+      <w:lvlText w:val=""/>
+      <w:lvlJc w:val="left"/>
+    </w:lvl>
+    <w:lvl w:ilvl="4" w:tplc="ED403D80">
+      <w:numFmt w:val="decimal"/>
+      <w:lvlText w:val=""/>
+      <w:lvlJc w:val="left"/>
+    </w:lvl>
+    <w:lvl w:ilvl="5" w:tplc="E4120E56">
+      <w:numFmt w:val="decimal"/>
+      <w:lvlText w:val=""/>
+      <w:lvlJc w:val="left"/>
+    </w:lvl>
+    <w:lvl w:ilvl="6" w:tplc="528C31A6">
+      <w:numFmt w:val="decimal"/>
+      <w:lvlText w:val=""/>
+      <w:lvlJc w:val="left"/>
+    </w:lvl>
+    <w:lvl w:ilvl="7" w:tplc="209A1B74">
+      <w:numFmt w:val="decimal"/>
+      <w:lvlText w:val=""/>
+      <w:lvlJc w:val="left"/>
+    </w:lvl>
+    <w:lvl w:ilvl="8" w:tplc="7CBA7300">
+      <w:numFmt w:val="decimal"/>
+      <w:lvlText w:val=""/>
+      <w:lvlJc w:val="left"/>
+    </w:lvl>
+  </w:abstractNum>
   <w:num w:numId="1" w16cid:durableId="1941139963">
+    <w:abstractNumId w:val="3"/>
+    <w:lvlOverride w:ilvl="0">
+      <w:startOverride w:val="1"/>
+    </w:lvlOverride>
+  </w:num>
+  <w:num w:numId="2" w16cid:durableId="618073579">
     <w:abstractNumId w:val="2"/>
     <w:lvlOverride w:ilvl="0">
       <w:startOverride w:val="1"/>
     </w:lvlOverride>
   </w:num>
-  <w:num w:numId="2" w16cid:durableId="618073579">
+  <w:num w:numId="3" w16cid:durableId="1942714076">
     <w:abstractNumId w:val="1"/>
     <w:lvlOverride w:ilvl="0">
       <w:startOverride w:val="1"/>
     </w:lvlOverride>
   </w:num>
-  <w:num w:numId="3" w16cid:durableId="1942714076">
+  <w:num w:numId="4" w16cid:durableId="796487070">
+    <w:abstractNumId w:val="9"/>
+    <w:lvlOverride w:ilvl="0">
+      <w:startOverride w:val="1"/>
+    </w:lvlOverride>
+  </w:num>
+  <w:num w:numId="5" w16cid:durableId="309794570">
+    <w:abstractNumId w:val="11"/>
+    <w:lvlOverride w:ilvl="0">
+      <w:startOverride w:val="1"/>
+    </w:lvlOverride>
+  </w:num>
+  <w:num w:numId="6" w16cid:durableId="479662805">
+    <w:abstractNumId w:val="12"/>
+    <w:lvlOverride w:ilvl="0">
+      <w:startOverride w:val="1"/>
+    </w:lvlOverride>
+  </w:num>
+  <w:num w:numId="7" w16cid:durableId="1507860073">
+    <w:abstractNumId w:val="5"/>
+    <w:lvlOverride w:ilvl="0">
+      <w:startOverride w:val="1"/>
+    </w:lvlOverride>
+  </w:num>
+  <w:num w:numId="8" w16cid:durableId="501435535">
+    <w:abstractNumId w:val="6"/>
+    <w:lvlOverride w:ilvl="0">
+      <w:startOverride w:val="1"/>
+    </w:lvlOverride>
+  </w:num>
+  <w:num w:numId="9" w16cid:durableId="55016373">
+    <w:abstractNumId w:val="10"/>
+    <w:lvlOverride w:ilvl="0">
+      <w:startOverride w:val="1"/>
+    </w:lvlOverride>
+  </w:num>
+  <w:num w:numId="10" w16cid:durableId="2063093652">
+    <w:abstractNumId w:val="8"/>
+    <w:lvlOverride w:ilvl="0">
+      <w:startOverride w:val="1"/>
+    </w:lvlOverride>
+  </w:num>
+  <w:num w:numId="11" w16cid:durableId="643968915">
     <w:abstractNumId w:val="0"/>
     <w:lvlOverride w:ilvl="0">
       <w:startOverride w:val="1"/>
     </w:lvlOverride>
   </w:num>
-  <w:num w:numId="4" w16cid:durableId="796487070">
-    <w:abstractNumId w:val="4"/>
+  <w:num w:numId="12" w16cid:durableId="1319573209">
+    <w:abstractNumId w:val="13"/>
     <w:lvlOverride w:ilvl="0">
       <w:startOverride w:val="1"/>
     </w:lvlOverride>
   </w:num>
-  <w:num w:numId="5" w16cid:durableId="309794570">
-    <w:abstractNumId w:val="5"/>
+  <w:num w:numId="13" w16cid:durableId="388379880">
+    <w:abstractNumId w:val="4"/>
     <w:lvlOverride w:ilvl="0">
       <w:startOverride w:val="1"/>
     </w:lvlOverride>
@@ -11425,6 +11823,48 @@
       <w:szCs w:val="20"/>
     </w:rPr>
   </w:style>
+  <w:style w:type="paragraph" w:styleId="Header">
+    <w:name w:val="header"/>
+    <w:basedOn w:val="Normal"/>
+    <w:link w:val="HeaderChar"/>
+    <w:uiPriority w:val="99"/>
+    <w:unhideWhenUsed/>
+    <w:rsid w:val="000A0E38"/>
+    <w:pPr>
+      <w:tabs>
+        <w:tab w:val="center" w:pos="4513"/>
+        <w:tab w:val="right" w:pos="9026"/>
+      </w:tabs>
+    </w:pPr>
+  </w:style>
+  <w:style w:type="character" w:customStyle="1" w:styleId="HeaderChar">
+    <w:name w:val="Header Char"/>
+    <w:basedOn w:val="DefaultParagraphFont"/>
+    <w:link w:val="Header"/>
+    <w:uiPriority w:val="99"/>
+    <w:rsid w:val="000A0E38"/>
+  </w:style>
+  <w:style w:type="paragraph" w:styleId="Footer">
+    <w:name w:val="footer"/>
+    <w:basedOn w:val="Normal"/>
+    <w:link w:val="FooterChar"/>
+    <w:uiPriority w:val="99"/>
+    <w:unhideWhenUsed/>
+    <w:rsid w:val="000A0E38"/>
+    <w:pPr>
+      <w:tabs>
+        <w:tab w:val="center" w:pos="4513"/>
+        <w:tab w:val="right" w:pos="9026"/>
+      </w:tabs>
+    </w:pPr>
+  </w:style>
+  <w:style w:type="character" w:customStyle="1" w:styleId="FooterChar">
+    <w:name w:val="Footer Char"/>
+    <w:basedOn w:val="DefaultParagraphFont"/>
+    <w:link w:val="Footer"/>
+    <w:uiPriority w:val="99"/>
+    <w:rsid w:val="000A0E38"/>
+  </w:style>
 </w:styles>
 </file>
 

</xml_diff>

<commit_message>
fix: move invite-confirm and complete-profile into app/auth/ for correct URLs
Route groups like (auth) do not add a path segment to the URL, so pages placed
inside (auth)/invite-confirm resolved to /invite-confirm rather than the
/auth/invite-confirm that redirectTo was pointing to. Moving both pages into
the real app/auth/ directory so the URLs match.

Co-Authored-By: Claude Sonnet 4.6 <noreply@anthropic.com>
</commit_message>
<xml_diff>
--- a/moments_product_spec.docx
+++ b/moments_product_spec.docx
@@ -281,7 +281,7 @@
         <w:pStyle w:val="ListParagraph"/>
         <w:numPr>
           <w:ilvl w:val="0"/>
-          <w:numId w:val="12"/>
+          <w:numId w:val="14"/>
         </w:numPr>
         <w:spacing w:before="40" w:after="40"/>
       </w:pPr>
@@ -294,7 +294,7 @@
         <w:pStyle w:val="ListParagraph"/>
         <w:numPr>
           <w:ilvl w:val="0"/>
-          <w:numId w:val="12"/>
+          <w:numId w:val="14"/>
         </w:numPr>
         <w:spacing w:before="40" w:after="40"/>
       </w:pPr>
@@ -307,7 +307,7 @@
         <w:pStyle w:val="ListParagraph"/>
         <w:numPr>
           <w:ilvl w:val="0"/>
-          <w:numId w:val="12"/>
+          <w:numId w:val="14"/>
         </w:numPr>
         <w:spacing w:before="40" w:after="40"/>
       </w:pPr>
@@ -320,7 +320,7 @@
         <w:pStyle w:val="ListParagraph"/>
         <w:numPr>
           <w:ilvl w:val="0"/>
-          <w:numId w:val="12"/>
+          <w:numId w:val="14"/>
         </w:numPr>
         <w:spacing w:before="40" w:after="40"/>
       </w:pPr>
@@ -345,7 +345,7 @@
         <w:pStyle w:val="ListParagraph"/>
         <w:numPr>
           <w:ilvl w:val="0"/>
-          <w:numId w:val="12"/>
+          <w:numId w:val="14"/>
         </w:numPr>
         <w:spacing w:before="40" w:after="40"/>
       </w:pPr>
@@ -365,7 +365,7 @@
         <w:pStyle w:val="ListParagraph"/>
         <w:numPr>
           <w:ilvl w:val="0"/>
-          <w:numId w:val="12"/>
+          <w:numId w:val="14"/>
         </w:numPr>
         <w:spacing w:before="40" w:after="40"/>
       </w:pPr>
@@ -385,7 +385,7 @@
         <w:pStyle w:val="ListParagraph"/>
         <w:numPr>
           <w:ilvl w:val="0"/>
-          <w:numId w:val="12"/>
+          <w:numId w:val="14"/>
         </w:numPr>
         <w:spacing w:before="40" w:after="40"/>
       </w:pPr>
@@ -405,7 +405,7 @@
         <w:pStyle w:val="ListParagraph"/>
         <w:numPr>
           <w:ilvl w:val="0"/>
-          <w:numId w:val="12"/>
+          <w:numId w:val="14"/>
         </w:numPr>
         <w:spacing w:before="40" w:after="40"/>
       </w:pPr>
@@ -425,7 +425,7 @@
         <w:pStyle w:val="ListParagraph"/>
         <w:numPr>
           <w:ilvl w:val="0"/>
-          <w:numId w:val="12"/>
+          <w:numId w:val="14"/>
         </w:numPr>
         <w:spacing w:before="40" w:after="40"/>
       </w:pPr>
@@ -445,7 +445,7 @@
         <w:pStyle w:val="ListParagraph"/>
         <w:numPr>
           <w:ilvl w:val="0"/>
-          <w:numId w:val="12"/>
+          <w:numId w:val="14"/>
         </w:numPr>
         <w:spacing w:before="40" w:after="40"/>
       </w:pPr>
@@ -465,7 +465,7 @@
         <w:pStyle w:val="ListParagraph"/>
         <w:numPr>
           <w:ilvl w:val="0"/>
-          <w:numId w:val="12"/>
+          <w:numId w:val="14"/>
         </w:numPr>
         <w:spacing w:before="40" w:after="40"/>
       </w:pPr>
@@ -485,7 +485,7 @@
         <w:pStyle w:val="ListParagraph"/>
         <w:numPr>
           <w:ilvl w:val="0"/>
-          <w:numId w:val="12"/>
+          <w:numId w:val="14"/>
         </w:numPr>
         <w:spacing w:before="40" w:after="40"/>
       </w:pPr>
@@ -526,7 +526,7 @@
         <w:pStyle w:val="ListParagraph"/>
         <w:numPr>
           <w:ilvl w:val="0"/>
-          <w:numId w:val="12"/>
+          <w:numId w:val="14"/>
         </w:numPr>
         <w:spacing w:before="40" w:after="40"/>
       </w:pPr>
@@ -539,7 +539,7 @@
         <w:pStyle w:val="ListParagraph"/>
         <w:numPr>
           <w:ilvl w:val="0"/>
-          <w:numId w:val="12"/>
+          <w:numId w:val="14"/>
         </w:numPr>
         <w:spacing w:before="40" w:after="40"/>
       </w:pPr>
@@ -552,7 +552,7 @@
         <w:pStyle w:val="ListParagraph"/>
         <w:numPr>
           <w:ilvl w:val="0"/>
-          <w:numId w:val="12"/>
+          <w:numId w:val="14"/>
         </w:numPr>
         <w:spacing w:before="40" w:after="40"/>
       </w:pPr>
@@ -569,7 +569,7 @@
         <w:pStyle w:val="ListParagraph"/>
         <w:numPr>
           <w:ilvl w:val="1"/>
-          <w:numId w:val="13"/>
+          <w:numId w:val="15"/>
         </w:numPr>
         <w:spacing w:before="30" w:after="30"/>
       </w:pPr>
@@ -595,7 +595,7 @@
         <w:pStyle w:val="ListParagraph"/>
         <w:numPr>
           <w:ilvl w:val="1"/>
-          <w:numId w:val="13"/>
+          <w:numId w:val="15"/>
         </w:numPr>
         <w:spacing w:before="30" w:after="30"/>
       </w:pPr>
@@ -621,7 +621,7 @@
         <w:pStyle w:val="ListParagraph"/>
         <w:numPr>
           <w:ilvl w:val="1"/>
-          <w:numId w:val="13"/>
+          <w:numId w:val="15"/>
         </w:numPr>
         <w:spacing w:before="30" w:after="30"/>
       </w:pPr>
@@ -647,7 +647,7 @@
         <w:pStyle w:val="ListParagraph"/>
         <w:numPr>
           <w:ilvl w:val="0"/>
-          <w:numId w:val="12"/>
+          <w:numId w:val="14"/>
         </w:numPr>
         <w:spacing w:before="40" w:after="40"/>
       </w:pPr>
@@ -664,7 +664,7 @@
         <w:pStyle w:val="ListParagraph"/>
         <w:numPr>
           <w:ilvl w:val="1"/>
-          <w:numId w:val="13"/>
+          <w:numId w:val="15"/>
         </w:numPr>
         <w:spacing w:before="30" w:after="30"/>
       </w:pPr>
@@ -690,7 +690,7 @@
         <w:pStyle w:val="ListParagraph"/>
         <w:numPr>
           <w:ilvl w:val="1"/>
-          <w:numId w:val="13"/>
+          <w:numId w:val="15"/>
         </w:numPr>
         <w:spacing w:before="30" w:after="30"/>
       </w:pPr>
@@ -716,7 +716,7 @@
         <w:pStyle w:val="ListParagraph"/>
         <w:numPr>
           <w:ilvl w:val="0"/>
-          <w:numId w:val="12"/>
+          <w:numId w:val="14"/>
         </w:numPr>
         <w:spacing w:before="40" w:after="40"/>
       </w:pPr>
@@ -729,7 +729,7 @@
         <w:pStyle w:val="ListParagraph"/>
         <w:numPr>
           <w:ilvl w:val="0"/>
-          <w:numId w:val="12"/>
+          <w:numId w:val="14"/>
         </w:numPr>
         <w:spacing w:before="40" w:after="40"/>
       </w:pPr>
@@ -742,7 +742,7 @@
         <w:pStyle w:val="ListParagraph"/>
         <w:numPr>
           <w:ilvl w:val="0"/>
-          <w:numId w:val="12"/>
+          <w:numId w:val="14"/>
         </w:numPr>
         <w:spacing w:before="40" w:after="40"/>
       </w:pPr>
@@ -767,7 +767,7 @@
         <w:pStyle w:val="ListParagraph"/>
         <w:numPr>
           <w:ilvl w:val="0"/>
-          <w:numId w:val="12"/>
+          <w:numId w:val="14"/>
         </w:numPr>
         <w:spacing w:before="40" w:after="40"/>
       </w:pPr>
@@ -780,7 +780,7 @@
         <w:pStyle w:val="ListParagraph"/>
         <w:numPr>
           <w:ilvl w:val="0"/>
-          <w:numId w:val="12"/>
+          <w:numId w:val="14"/>
         </w:numPr>
         <w:spacing w:before="40" w:after="40"/>
       </w:pPr>
@@ -793,7 +793,7 @@
         <w:pStyle w:val="ListParagraph"/>
         <w:numPr>
           <w:ilvl w:val="0"/>
-          <w:numId w:val="12"/>
+          <w:numId w:val="14"/>
         </w:numPr>
         <w:spacing w:before="40" w:after="40"/>
       </w:pPr>
@@ -806,7 +806,7 @@
         <w:pStyle w:val="ListParagraph"/>
         <w:numPr>
           <w:ilvl w:val="0"/>
-          <w:numId w:val="12"/>
+          <w:numId w:val="14"/>
         </w:numPr>
         <w:spacing w:before="40" w:after="40"/>
       </w:pPr>
@@ -819,7 +819,7 @@
         <w:pStyle w:val="ListParagraph"/>
         <w:numPr>
           <w:ilvl w:val="0"/>
-          <w:numId w:val="12"/>
+          <w:numId w:val="14"/>
         </w:numPr>
         <w:spacing w:before="40" w:after="40"/>
       </w:pPr>
@@ -832,7 +832,7 @@
         <w:pStyle w:val="ListParagraph"/>
         <w:numPr>
           <w:ilvl w:val="0"/>
-          <w:numId w:val="12"/>
+          <w:numId w:val="14"/>
         </w:numPr>
         <w:spacing w:before="40" w:after="40"/>
       </w:pPr>
@@ -857,7 +857,7 @@
         <w:pStyle w:val="ListParagraph"/>
         <w:numPr>
           <w:ilvl w:val="0"/>
-          <w:numId w:val="12"/>
+          <w:numId w:val="14"/>
         </w:numPr>
         <w:spacing w:before="40" w:after="40"/>
       </w:pPr>
@@ -870,7 +870,7 @@
         <w:pStyle w:val="ListParagraph"/>
         <w:numPr>
           <w:ilvl w:val="0"/>
-          <w:numId w:val="12"/>
+          <w:numId w:val="14"/>
         </w:numPr>
         <w:spacing w:before="40" w:after="40"/>
       </w:pPr>
@@ -895,7 +895,7 @@
         <w:pStyle w:val="ListParagraph"/>
         <w:numPr>
           <w:ilvl w:val="1"/>
-          <w:numId w:val="13"/>
+          <w:numId w:val="15"/>
         </w:numPr>
         <w:spacing w:before="30" w:after="30"/>
       </w:pPr>
@@ -912,7 +912,7 @@
         <w:pStyle w:val="ListParagraph"/>
         <w:numPr>
           <w:ilvl w:val="1"/>
-          <w:numId w:val="13"/>
+          <w:numId w:val="15"/>
         </w:numPr>
         <w:spacing w:before="30" w:after="30"/>
       </w:pPr>
@@ -941,7 +941,7 @@
         <w:pStyle w:val="ListParagraph"/>
         <w:numPr>
           <w:ilvl w:val="1"/>
-          <w:numId w:val="13"/>
+          <w:numId w:val="15"/>
         </w:numPr>
         <w:spacing w:before="30" w:after="30"/>
       </w:pPr>
@@ -958,7 +958,7 @@
         <w:pStyle w:val="ListParagraph"/>
         <w:numPr>
           <w:ilvl w:val="0"/>
-          <w:numId w:val="12"/>
+          <w:numId w:val="14"/>
         </w:numPr>
         <w:spacing w:before="40" w:after="40"/>
       </w:pPr>
@@ -971,7 +971,7 @@
         <w:pStyle w:val="ListParagraph"/>
         <w:numPr>
           <w:ilvl w:val="0"/>
-          <w:numId w:val="12"/>
+          <w:numId w:val="14"/>
         </w:numPr>
         <w:spacing w:before="40" w:after="40"/>
       </w:pPr>
@@ -984,7 +984,7 @@
         <w:pStyle w:val="ListParagraph"/>
         <w:numPr>
           <w:ilvl w:val="0"/>
-          <w:numId w:val="12"/>
+          <w:numId w:val="14"/>
         </w:numPr>
         <w:spacing w:before="40" w:after="40"/>
       </w:pPr>
@@ -1010,7 +1010,7 @@
         <w:pStyle w:val="ListParagraph"/>
         <w:numPr>
           <w:ilvl w:val="0"/>
-          <w:numId w:val="12"/>
+          <w:numId w:val="14"/>
         </w:numPr>
         <w:spacing w:before="40" w:after="40"/>
       </w:pPr>
@@ -1035,7 +1035,7 @@
         <w:pStyle w:val="ListParagraph"/>
         <w:numPr>
           <w:ilvl w:val="1"/>
-          <w:numId w:val="13"/>
+          <w:numId w:val="15"/>
         </w:numPr>
         <w:spacing w:before="30" w:after="30"/>
       </w:pPr>
@@ -1052,7 +1052,7 @@
         <w:pStyle w:val="ListParagraph"/>
         <w:numPr>
           <w:ilvl w:val="1"/>
-          <w:numId w:val="13"/>
+          <w:numId w:val="15"/>
         </w:numPr>
         <w:spacing w:before="30" w:after="30"/>
       </w:pPr>
@@ -1069,7 +1069,7 @@
         <w:pStyle w:val="ListParagraph"/>
         <w:numPr>
           <w:ilvl w:val="1"/>
-          <w:numId w:val="13"/>
+          <w:numId w:val="15"/>
         </w:numPr>
         <w:spacing w:before="30" w:after="30"/>
       </w:pPr>
@@ -1086,7 +1086,7 @@
         <w:pStyle w:val="ListParagraph"/>
         <w:numPr>
           <w:ilvl w:val="1"/>
-          <w:numId w:val="13"/>
+          <w:numId w:val="15"/>
         </w:numPr>
         <w:spacing w:before="30" w:after="30"/>
       </w:pPr>
@@ -1103,7 +1103,7 @@
         <w:pStyle w:val="ListParagraph"/>
         <w:numPr>
           <w:ilvl w:val="1"/>
-          <w:numId w:val="13"/>
+          <w:numId w:val="15"/>
         </w:numPr>
         <w:spacing w:before="30" w:after="30"/>
       </w:pPr>
@@ -1120,12 +1120,184 @@
         <w:pStyle w:val="ListParagraph"/>
         <w:numPr>
           <w:ilvl w:val="0"/>
-          <w:numId w:val="12"/>
+          <w:numId w:val="14"/>
         </w:numPr>
         <w:spacing w:before="40" w:after="40"/>
       </w:pPr>
       <w:r>
-        <w:t>Existing users: invited users receive a notification and must accept or decline</w:t>
+        <w:t>Invite modal flow — available from both the moment page Invite button and the Members page Invite button:</w:t>
+      </w:r>
+    </w:p>
+    <w:p>
+      <w:pPr>
+        <w:pStyle w:val="ListParagraph"/>
+        <w:numPr>
+          <w:ilvl w:val="1"/>
+          <w:numId w:val="15"/>
+        </w:numPr>
+        <w:spacing w:before="30" w:after="30"/>
+      </w:pPr>
+      <w:r>
+        <w:rPr>
+          <w:sz w:val="20"/>
+          <w:szCs w:val="20"/>
+        </w:rPr>
+        <w:t>Step 1 — Role selection: inviter chooses Editor or Reader</w:t>
+      </w:r>
+    </w:p>
+    <w:p>
+      <w:pPr>
+        <w:pStyle w:val="ListParagraph"/>
+        <w:numPr>
+          <w:ilvl w:val="1"/>
+          <w:numId w:val="15"/>
+        </w:numPr>
+        <w:spacing w:before="30" w:after="30"/>
+      </w:pPr>
+      <w:r>
+        <w:rPr>
+          <w:sz w:val="20"/>
+          <w:szCs w:val="20"/>
+        </w:rPr>
+        <w:t>Step 2 — Lookup method: inviter selects Username or Email, then fills in the field</w:t>
+      </w:r>
+    </w:p>
+    <w:p>
+      <w:pPr>
+        <w:pStyle w:val="ListParagraph"/>
+        <w:numPr>
+          <w:ilvl w:val="1"/>
+          <w:numId w:val="15"/>
+        </w:numPr>
+        <w:spacing w:before="30" w:after="30"/>
+      </w:pPr>
+      <w:r>
+        <w:rPr>
+          <w:sz w:val="20"/>
+          <w:szCs w:val="20"/>
+        </w:rPr>
+        <w:t>Step 3 — System checks and outcomes:</w:t>
+      </w:r>
+    </w:p>
+    <w:p>
+      <w:pPr>
+        <w:pStyle w:val="ListParagraph"/>
+        <w:numPr>
+          <w:ilvl w:val="1"/>
+          <w:numId w:val="15"/>
+        </w:numPr>
+        <w:spacing w:before="30" w:after="30"/>
+      </w:pPr>
+      <w:r>
+        <w:rPr>
+          <w:b/>
+          <w:bCs/>
+          <w:sz w:val="20"/>
+          <w:szCs w:val="20"/>
+        </w:rPr>
+        <w:t xml:space="preserve">Username — not found: </w:t>
+      </w:r>
+      <w:r>
+        <w:rPr>
+          <w:sz w:val="20"/>
+          <w:szCs w:val="20"/>
+        </w:rPr>
+        <w:t>red error message — “No account found with that username. Try a different username or invite by email instead.” Nothing is sent.</w:t>
+      </w:r>
+    </w:p>
+    <w:p>
+      <w:pPr>
+        <w:pStyle w:val="ListParagraph"/>
+        <w:numPr>
+          <w:ilvl w:val="1"/>
+          <w:numId w:val="15"/>
+        </w:numPr>
+        <w:spacing w:before="30" w:after="30"/>
+      </w:pPr>
+      <w:r>
+        <w:rPr>
+          <w:b/>
+          <w:bCs/>
+          <w:sz w:val="20"/>
+          <w:szCs w:val="20"/>
+        </w:rPr>
+        <w:t xml:space="preserve">Username — found: </w:t>
+      </w:r>
+      <w:r>
+        <w:rPr>
+          <w:sz w:val="20"/>
+          <w:szCs w:val="20"/>
+        </w:rPr>
+        <w:t>in-app notification sent to that user stating “[username] ([full name]) invited you as [Editor / Reader] on moment [moment name]”. Green message to inviter: “Invite successfully sent to @[username].” Modal stays open with field cleared.</w:t>
+      </w:r>
+    </w:p>
+    <w:p>
+      <w:pPr>
+        <w:pStyle w:val="ListParagraph"/>
+        <w:numPr>
+          <w:ilvl w:val="1"/>
+          <w:numId w:val="15"/>
+        </w:numPr>
+        <w:spacing w:before="30" w:after="30"/>
+      </w:pPr>
+      <w:r>
+        <w:rPr>
+          <w:b/>
+          <w:bCs/>
+          <w:sz w:val="20"/>
+          <w:szCs w:val="20"/>
+        </w:rPr>
+        <w:t xml:space="preserve">Email — registered user found: </w:t>
+      </w:r>
+      <w:r>
+        <w:rPr>
+          <w:sz w:val="20"/>
+          <w:szCs w:val="20"/>
+        </w:rPr>
+        <w:t>in-app notification sent. Green message to inviter: “Invite successfully sent to @[username].” Modal stays open with field cleared.</w:t>
+      </w:r>
+    </w:p>
+    <w:p>
+      <w:pPr>
+        <w:pStyle w:val="ListParagraph"/>
+        <w:numPr>
+          <w:ilvl w:val="1"/>
+          <w:numId w:val="15"/>
+        </w:numPr>
+        <w:spacing w:before="30" w:after="30"/>
+      </w:pPr>
+      <w:r>
+        <w:rPr>
+          <w:b/>
+          <w:bCs/>
+          <w:sz w:val="20"/>
+          <w:szCs w:val="20"/>
+        </w:rPr>
+        <w:t xml:space="preserve">Email — unregistered user: </w:t>
+      </w:r>
+      <w:r>
+        <w:rPr>
+          <w:sz w:val="20"/>
+          <w:szCs w:val="20"/>
+        </w:rPr>
+        <w:t>pending invite stored in moment_members (status: pending, tied to the invited email, role stored). Sign-up email sent: “[username] ([full name]) invited you as [Editor / Reader] on a moment on Remember When. Create an account to accept or decline.” with a link to the sign-up page with email pre-filled. Amber info message to inviter: “No account found with that email. We’ve sent them an invite to join Remember When and accept your invitation.” Modal stays open with field cleared.</w:t>
+      </w:r>
+    </w:p>
+    <w:p>
+      <w:pPr>
+        <w:pStyle w:val="ListParagraph"/>
+        <w:numPr>
+          <w:ilvl w:val="1"/>
+          <w:numId w:val="15"/>
+        </w:numPr>
+        <w:spacing w:before="30" w:after="30"/>
+      </w:pPr>
+      <w:r>
+        <w:rPr>
+          <w:sz w:val="20"/>
+          <w:szCs w:val="20"/>
+        </w:rPr>
+        <w:t>After email confirmation and first login, unregistered users land on the home page with a banner directing them to their notifications where the pending invite awaits accept / decline</w:t>
       </w:r>
     </w:p>
     <w:p>
@@ -1133,12 +1305,12 @@
         <w:pStyle w:val="ListParagraph"/>
         <w:numPr>
           <w:ilvl w:val="0"/>
-          <w:numId w:val="12"/>
+          <w:numId w:val="14"/>
         </w:numPr>
         <w:spacing w:before="40" w:after="40"/>
       </w:pPr>
       <w:r>
-        <w:t>Non-existing users: if an invited email has no matching account, a pending invite is stored and a sign-up email is sent (“[Name] has added you to a moment on Remember When. Create an account to view it.”). Once they sign up, the pending invite is automatically surfaced and they go through the normal accept / decline flow. The pending invite is tied to the email address.</w:t>
+        <w:t>Invite notifications state the inviter’s username and full name, the role being offered (Editor or Reader), and the moment name — so recipients know exactly what they are accepting or declining</w:t>
       </w:r>
     </w:p>
     <w:p>
@@ -1146,12 +1318,12 @@
         <w:pStyle w:val="ListParagraph"/>
         <w:numPr>
           <w:ilvl w:val="0"/>
-          <w:numId w:val="12"/>
+          <w:numId w:val="14"/>
         </w:numPr>
         <w:spacing w:before="40" w:after="40"/>
       </w:pPr>
       <w:r>
-        <w:t>No prior friendship required to invite someone to a moment</w:t>
+        <w:t>Only owners and editors can send invites</w:t>
       </w:r>
     </w:p>
     <w:p>
@@ -1159,7 +1331,7 @@
         <w:pStyle w:val="ListParagraph"/>
         <w:numPr>
           <w:ilvl w:val="0"/>
-          <w:numId w:val="12"/>
+          <w:numId w:val="14"/>
         </w:numPr>
         <w:spacing w:before="40" w:after="40"/>
       </w:pPr>
@@ -1184,7 +1356,7 @@
         <w:pStyle w:val="ListParagraph"/>
         <w:numPr>
           <w:ilvl w:val="0"/>
-          <w:numId w:val="12"/>
+          <w:numId w:val="14"/>
         </w:numPr>
         <w:spacing w:before="40" w:after="40"/>
       </w:pPr>
@@ -1197,7 +1369,7 @@
         <w:pStyle w:val="ListParagraph"/>
         <w:numPr>
           <w:ilvl w:val="0"/>
-          <w:numId w:val="12"/>
+          <w:numId w:val="14"/>
         </w:numPr>
         <w:spacing w:before="40" w:after="40"/>
       </w:pPr>
@@ -1210,7 +1382,7 @@
         <w:pStyle w:val="ListParagraph"/>
         <w:numPr>
           <w:ilvl w:val="0"/>
-          <w:numId w:val="12"/>
+          <w:numId w:val="14"/>
         </w:numPr>
         <w:spacing w:before="40" w:after="40"/>
       </w:pPr>
@@ -1227,7 +1399,7 @@
         <w:pStyle w:val="ListParagraph"/>
         <w:numPr>
           <w:ilvl w:val="1"/>
-          <w:numId w:val="13"/>
+          <w:numId w:val="15"/>
         </w:numPr>
         <w:spacing w:before="30" w:after="30"/>
       </w:pPr>
@@ -1236,6 +1408,7 @@
           <w:sz w:val="20"/>
           <w:szCs w:val="20"/>
         </w:rPr>
+        <w:lastRenderedPageBreak/>
         <w:t>Triggered from two entry points: the [...] menu on moment cards (edit first, archive second), and an edit button / [...] menu within the moment page header</w:t>
       </w:r>
     </w:p>
@@ -1244,7 +1417,7 @@
         <w:pStyle w:val="ListParagraph"/>
         <w:numPr>
           <w:ilvl w:val="1"/>
-          <w:numId w:val="13"/>
+          <w:numId w:val="15"/>
         </w:numPr>
         <w:spacing w:before="30" w:after="30"/>
       </w:pPr>
@@ -1261,7 +1434,7 @@
         <w:pStyle w:val="ListParagraph"/>
         <w:numPr>
           <w:ilvl w:val="1"/>
-          <w:numId w:val="13"/>
+          <w:numId w:val="15"/>
         </w:numPr>
         <w:spacing w:before="30" w:after="30"/>
       </w:pPr>
@@ -1278,7 +1451,7 @@
         <w:pStyle w:val="ListParagraph"/>
         <w:numPr>
           <w:ilvl w:val="1"/>
-          <w:numId w:val="13"/>
+          <w:numId w:val="15"/>
         </w:numPr>
         <w:spacing w:before="30" w:after="30"/>
       </w:pPr>
@@ -1295,7 +1468,7 @@
         <w:pStyle w:val="ListParagraph"/>
         <w:numPr>
           <w:ilvl w:val="0"/>
-          <w:numId w:val="12"/>
+          <w:numId w:val="14"/>
         </w:numPr>
         <w:spacing w:before="40" w:after="40"/>
       </w:pPr>
@@ -1312,7 +1485,7 @@
         <w:pStyle w:val="ListParagraph"/>
         <w:numPr>
           <w:ilvl w:val="1"/>
-          <w:numId w:val="13"/>
+          <w:numId w:val="15"/>
         </w:numPr>
         <w:spacing w:before="30" w:after="30"/>
       </w:pPr>
@@ -1321,7 +1494,7 @@
           <w:sz w:val="20"/>
           <w:szCs w:val="20"/>
         </w:rPr>
-        <w:t>Full manage members and invite link functionality lives on a dedicated Members page (/moments/[id]/members), not on the main moment page</w:t>
+        <w:t>Moment Settings page (/moments/[id]/members) — replaces the old Members page. Accessed via a settings/gear icon Manage button from the moment page. Page title: “Moment Settings”. Contains four sections top to bottom:</w:t>
       </w:r>
     </w:p>
     <w:p>
@@ -1329,16 +1502,25 @@
         <w:pStyle w:val="ListParagraph"/>
         <w:numPr>
           <w:ilvl w:val="1"/>
-          <w:numId w:val="13"/>
+          <w:numId w:val="15"/>
         </w:numPr>
         <w:spacing w:before="30" w:after="30"/>
       </w:pPr>
+      <w:r>
+        <w:rPr>
+          <w:b/>
+          <w:bCs/>
+          <w:sz w:val="20"/>
+          <w:szCs w:val="20"/>
+        </w:rPr>
+        <w:t xml:space="preserve">Section 1 — Manage Members: </w:t>
+      </w:r>
       <w:r>
         <w:rPr>
           <w:sz w:val="20"/>
           <w:szCs w:val="20"/>
         </w:rPr>
-        <w:t>Members page contains: editor list (remove visible to owner only), reader list (remove visible to owners and editors), and invite link generator</w:t>
+        <w:t>lists all moment members in order: owner first, then editors alphabetically, then readers alphabetically. Each member row shows their avatar, name, and role. Owner sees an edit icon on every row (except their own) allowing them to change a member’s role (editor ↔ reader) or remove them from the moment. Role changes trigger a notification to the affected user. Removing a member is immediate with a confirmation prompt.</w:t>
       </w:r>
     </w:p>
     <w:p>
@@ -1346,7 +1528,85 @@
         <w:pStyle w:val="ListParagraph"/>
         <w:numPr>
           <w:ilvl w:val="1"/>
-          <w:numId w:val="13"/>
+          <w:numId w:val="15"/>
+        </w:numPr>
+        <w:spacing w:before="30" w:after="30"/>
+      </w:pPr>
+      <w:r>
+        <w:rPr>
+          <w:b/>
+          <w:bCs/>
+          <w:sz w:val="20"/>
+          <w:szCs w:val="20"/>
+        </w:rPr>
+        <w:t xml:space="preserve">Section 2 — Invite Link: </w:t>
+      </w:r>
+      <w:r>
+        <w:rPr>
+          <w:sz w:val="20"/>
+          <w:szCs w:val="20"/>
+        </w:rPr>
+        <w:t>invite link generator with expiry options (1 week / 1 month / 3 months / 6 months / 1 year / never). Unchanged from previous implementation.</w:t>
+      </w:r>
+    </w:p>
+    <w:p>
+      <w:pPr>
+        <w:pStyle w:val="ListParagraph"/>
+        <w:numPr>
+          <w:ilvl w:val="1"/>
+          <w:numId w:val="15"/>
+        </w:numPr>
+        <w:spacing w:before="30" w:after="30"/>
+      </w:pPr>
+      <w:r>
+        <w:rPr>
+          <w:b/>
+          <w:bCs/>
+          <w:sz w:val="20"/>
+          <w:szCs w:val="20"/>
+        </w:rPr>
+        <w:t xml:space="preserve">Section 3 — Transfer Ownership (owner only): </w:t>
+      </w:r>
+      <w:r>
+        <w:rPr>
+          <w:sz w:val="20"/>
+          <w:szCs w:val="20"/>
+        </w:rPr>
+        <w:t>dropdown listing only current editors (not readers). If no editors exist, shows a message: “You must promote a reader to editor before you can transfer ownership.” On selecting an editor and clicking transfer, a confirmation modal appears: “Are you sure you want to transfer ownership to [name]? This can only be reversed by the new owner.” On confirmation, owner_id is updated on the moments table and both users are notified.</w:t>
+      </w:r>
+    </w:p>
+    <w:p>
+      <w:pPr>
+        <w:pStyle w:val="ListParagraph"/>
+        <w:numPr>
+          <w:ilvl w:val="1"/>
+          <w:numId w:val="15"/>
+        </w:numPr>
+        <w:spacing w:before="30" w:after="30"/>
+      </w:pPr>
+      <w:r>
+        <w:rPr>
+          <w:b/>
+          <w:bCs/>
+          <w:sz w:val="20"/>
+          <w:szCs w:val="20"/>
+        </w:rPr>
+        <w:t xml:space="preserve">Section 4 — Leave Moment (all members, danger zone styling): </w:t>
+      </w:r>
+      <w:r>
+        <w:rPr>
+          <w:sz w:val="20"/>
+          <w:szCs w:val="20"/>
+        </w:rPr>
+        <w:t>red outlined Leave moment button. For editors and readers: clicking opens a modal asking whether to delete their posts or leave them for others to see. For owners: two paths depending on membership composition. Path A — editors exist: owner must (1) transfer ownership (handled in Section 3 above), then (2) choose post fate; both steps are mandatory and enforced in this order. Path B — only owner and readers exist: owner sees a message explaining they cannot leave without either (a) promoting a reader to editor and then transferring ownership, or (b) leaving and deleting the entire moment for everyone. If they choose option (b), a confirmation modal warns that all moment data will be permanently deleted and all members will be notified. On confirmation, moment is hard deleted and all members receive a notification.</w:t>
+      </w:r>
+    </w:p>
+    <w:p>
+      <w:pPr>
+        <w:pStyle w:val="ListParagraph"/>
+        <w:numPr>
+          <w:ilvl w:val="1"/>
+          <w:numId w:val="15"/>
         </w:numPr>
         <w:spacing w:before="30" w:after="30"/>
       </w:pPr>
@@ -1363,7 +1623,7 @@
         <w:pStyle w:val="ListParagraph"/>
         <w:numPr>
           <w:ilvl w:val="0"/>
-          <w:numId w:val="12"/>
+          <w:numId w:val="14"/>
         </w:numPr>
         <w:spacing w:before="40" w:after="40"/>
       </w:pPr>
@@ -1380,7 +1640,7 @@
         <w:pStyle w:val="ListParagraph"/>
         <w:numPr>
           <w:ilvl w:val="1"/>
-          <w:numId w:val="13"/>
+          <w:numId w:val="15"/>
         </w:numPr>
         <w:spacing w:before="30" w:after="30"/>
       </w:pPr>
@@ -1406,7 +1666,7 @@
         <w:pStyle w:val="ListParagraph"/>
         <w:numPr>
           <w:ilvl w:val="1"/>
-          <w:numId w:val="13"/>
+          <w:numId w:val="15"/>
         </w:numPr>
         <w:spacing w:before="30" w:after="30"/>
       </w:pPr>
@@ -1417,7 +1677,6 @@
           <w:sz w:val="20"/>
           <w:szCs w:val="20"/>
         </w:rPr>
-        <w:lastRenderedPageBreak/>
         <w:t xml:space="preserve">2. Change cover photo button </w:t>
       </w:r>
       <w:r>
@@ -1433,7 +1692,7 @@
         <w:pStyle w:val="ListParagraph"/>
         <w:numPr>
           <w:ilvl w:val="1"/>
-          <w:numId w:val="13"/>
+          <w:numId w:val="15"/>
         </w:numPr>
         <w:spacing w:before="30" w:after="30"/>
       </w:pPr>
@@ -1459,7 +1718,7 @@
         <w:pStyle w:val="ListParagraph"/>
         <w:numPr>
           <w:ilvl w:val="1"/>
-          <w:numId w:val="13"/>
+          <w:numId w:val="15"/>
         </w:numPr>
         <w:spacing w:before="30" w:after="30"/>
       </w:pPr>
@@ -1477,7 +1736,7 @@
           <w:sz w:val="20"/>
           <w:szCs w:val="20"/>
         </w:rPr>
-        <w:t>— compact single row. Left side: up to 5 overlapping avatar icons; if more members exist, show “+ X more” text. Hovering (desktop) or tapping (mobile) the avatars opens a popover listing all members ordered: owner first, then editors alphabetically, then readers alphabetically; each name has a small role icon (owner / editor / reader). Right side: small Invite button (icon + “Invite” label on desktop, icon only on mobile) and a Manage button linking to /moments/[id]/members</w:t>
+        <w:t>— compact single row. Left side: up to 5 overlapping avatar icons; if more members exist, show “+ X more” text. Hovering (desktop) or tapping (mobile) the avatars opens a popover listing all members ordered: owner first, then editors alphabetically, then readers alphabetically; each name has a small role icon (owner / editor / reader). Right side: small Invite button (icon + “Invite” label on desktop, icon only on mobile) and a Manage button with a settings/gear icon linking to /moments/[id]/members (Moment Settings page)</w:t>
       </w:r>
     </w:p>
     <w:p>
@@ -1485,7 +1744,7 @@
         <w:pStyle w:val="ListParagraph"/>
         <w:numPr>
           <w:ilvl w:val="1"/>
-          <w:numId w:val="13"/>
+          <w:numId w:val="15"/>
         </w:numPr>
         <w:spacing w:before="30" w:after="30"/>
       </w:pPr>
@@ -1511,7 +1770,7 @@
         <w:pStyle w:val="ListParagraph"/>
         <w:numPr>
           <w:ilvl w:val="0"/>
-          <w:numId w:val="12"/>
+          <w:numId w:val="14"/>
         </w:numPr>
         <w:spacing w:before="40" w:after="40"/>
       </w:pPr>
@@ -1536,7 +1795,7 @@
         <w:pStyle w:val="ListParagraph"/>
         <w:numPr>
           <w:ilvl w:val="1"/>
-          <w:numId w:val="13"/>
+          <w:numId w:val="15"/>
         </w:numPr>
         <w:spacing w:before="30" w:after="30"/>
       </w:pPr>
@@ -1545,6 +1804,7 @@
           <w:sz w:val="20"/>
           <w:szCs w:val="20"/>
         </w:rPr>
+        <w:lastRenderedPageBreak/>
         <w:t>Sort: ascending or descending by date posted</w:t>
       </w:r>
     </w:p>
@@ -1553,7 +1813,7 @@
         <w:pStyle w:val="ListParagraph"/>
         <w:numPr>
           <w:ilvl w:val="1"/>
-          <w:numId w:val="13"/>
+          <w:numId w:val="15"/>
         </w:numPr>
         <w:spacing w:before="30" w:after="30"/>
       </w:pPr>
@@ -1570,7 +1830,7 @@
         <w:pStyle w:val="ListParagraph"/>
         <w:numPr>
           <w:ilvl w:val="0"/>
-          <w:numId w:val="12"/>
+          <w:numId w:val="14"/>
         </w:numPr>
         <w:spacing w:before="40" w:after="40"/>
       </w:pPr>
@@ -1583,7 +1843,7 @@
         <w:pStyle w:val="ListParagraph"/>
         <w:numPr>
           <w:ilvl w:val="0"/>
-          <w:numId w:val="12"/>
+          <w:numId w:val="14"/>
         </w:numPr>
         <w:spacing w:before="40" w:after="40"/>
       </w:pPr>
@@ -1596,7 +1856,7 @@
         <w:pStyle w:val="ListParagraph"/>
         <w:numPr>
           <w:ilvl w:val="0"/>
-          <w:numId w:val="12"/>
+          <w:numId w:val="14"/>
         </w:numPr>
         <w:spacing w:before="40" w:after="40"/>
       </w:pPr>
@@ -1633,7 +1893,7 @@
         <w:pStyle w:val="ListParagraph"/>
         <w:numPr>
           <w:ilvl w:val="1"/>
-          <w:numId w:val="13"/>
+          <w:numId w:val="15"/>
         </w:numPr>
         <w:spacing w:before="30" w:after="30"/>
       </w:pPr>
@@ -1642,7 +1902,7 @@
           <w:sz w:val="20"/>
           <w:szCs w:val="20"/>
         </w:rPr>
-        <w:t>Full control: edit moment details, manage editors (including removing editors) and readers, transfer ownership</w:t>
+        <w:t>Full control: edit moment details, manage all members (change roles, remove editors and readers), transfer ownership, leave moment</w:t>
       </w:r>
     </w:p>
     <w:p>
@@ -1650,7 +1910,7 @@
         <w:pStyle w:val="ListParagraph"/>
         <w:numPr>
           <w:ilvl w:val="1"/>
-          <w:numId w:val="13"/>
+          <w:numId w:val="15"/>
         </w:numPr>
         <w:spacing w:before="30" w:after="30"/>
       </w:pPr>
@@ -1659,7 +1919,24 @@
           <w:sz w:val="20"/>
           <w:szCs w:val="20"/>
         </w:rPr>
-        <w:t>Must transfer ownership before leaving a moment</w:t>
+        <w:t>Leaving requires transferring ownership to an editor first (mandatory). If no editors exist, owner must either promote a reader to editor first, or leave and delete the entire moment for all members</w:t>
+      </w:r>
+    </w:p>
+    <w:p>
+      <w:pPr>
+        <w:pStyle w:val="ListParagraph"/>
+        <w:numPr>
+          <w:ilvl w:val="1"/>
+          <w:numId w:val="15"/>
+        </w:numPr>
+        <w:spacing w:before="30" w:after="30"/>
+      </w:pPr>
+      <w:r>
+        <w:rPr>
+          <w:sz w:val="20"/>
+          <w:szCs w:val="20"/>
+        </w:rPr>
+        <w:t>Ownership can only be transferred to an editor, not a reader. Transfer updates owner_id on the moments table and notifies both parties.</w:t>
       </w:r>
     </w:p>
     <w:p>
@@ -1679,7 +1956,7 @@
         <w:pStyle w:val="ListParagraph"/>
         <w:numPr>
           <w:ilvl w:val="1"/>
-          <w:numId w:val="13"/>
+          <w:numId w:val="15"/>
         </w:numPr>
         <w:spacing w:before="30" w:after="30"/>
       </w:pPr>
@@ -1696,7 +1973,7 @@
         <w:pStyle w:val="ListParagraph"/>
         <w:numPr>
           <w:ilvl w:val="1"/>
-          <w:numId w:val="13"/>
+          <w:numId w:val="15"/>
         </w:numPr>
         <w:spacing w:before="30" w:after="30"/>
       </w:pPr>
@@ -1725,7 +2002,7 @@
         <w:pStyle w:val="ListParagraph"/>
         <w:numPr>
           <w:ilvl w:val="1"/>
-          <w:numId w:val="13"/>
+          <w:numId w:val="15"/>
         </w:numPr>
         <w:spacing w:before="30" w:after="30"/>
       </w:pPr>
@@ -1742,7 +2019,7 @@
         <w:pStyle w:val="ListParagraph"/>
         <w:numPr>
           <w:ilvl w:val="1"/>
-          <w:numId w:val="13"/>
+          <w:numId w:val="15"/>
         </w:numPr>
         <w:spacing w:before="30" w:after="30"/>
       </w:pPr>
@@ -1760,7 +2037,7 @@
         <w:pStyle w:val="ListParagraph"/>
         <w:numPr>
           <w:ilvl w:val="0"/>
-          <w:numId w:val="12"/>
+          <w:numId w:val="14"/>
         </w:numPr>
         <w:spacing w:before="40" w:after="40"/>
       </w:pPr>
@@ -1773,7 +2050,7 @@
         <w:pStyle w:val="ListParagraph"/>
         <w:numPr>
           <w:ilvl w:val="0"/>
-          <w:numId w:val="12"/>
+          <w:numId w:val="14"/>
         </w:numPr>
         <w:spacing w:before="40" w:after="40"/>
       </w:pPr>
@@ -1786,7 +2063,7 @@
         <w:pStyle w:val="ListParagraph"/>
         <w:numPr>
           <w:ilvl w:val="0"/>
-          <w:numId w:val="12"/>
+          <w:numId w:val="14"/>
         </w:numPr>
         <w:spacing w:before="40" w:after="40"/>
       </w:pPr>
@@ -1803,7 +2080,7 @@
         </w:pBdr>
       </w:pPr>
       <w:r>
-        <w:t>2.7  Reader Invitations &amp; Links</w:t>
+        <w:t>2.7  Invitations &amp; Links</w:t>
       </w:r>
     </w:p>
     <w:p>
@@ -1815,7 +2092,7 @@
           <w:b/>
           <w:bCs/>
         </w:rPr>
-        <w:t>Friend readers:</w:t>
+        <w:t>Direct invites (editors and readers):</w:t>
       </w:r>
     </w:p>
     <w:p>
@@ -1823,7 +2100,7 @@
         <w:pStyle w:val="ListParagraph"/>
         <w:numPr>
           <w:ilvl w:val="1"/>
-          <w:numId w:val="13"/>
+          <w:numId w:val="15"/>
         </w:numPr>
         <w:spacing w:before="30" w:after="30"/>
       </w:pPr>
@@ -1832,7 +2109,58 @@
           <w:sz w:val="20"/>
           <w:szCs w:val="20"/>
         </w:rPr>
-        <w:t>Invited directly by username or email, no expiry, must accept or decline</w:t>
+        <w:t>Sent by username or email; no prior friendship required; full invite modal flow as described in Section 2.4</w:t>
+      </w:r>
+    </w:p>
+    <w:p>
+      <w:pPr>
+        <w:pStyle w:val="ListParagraph"/>
+        <w:numPr>
+          <w:ilvl w:val="1"/>
+          <w:numId w:val="15"/>
+        </w:numPr>
+        <w:spacing w:before="30" w:after="30"/>
+      </w:pPr>
+      <w:r>
+        <w:rPr>
+          <w:sz w:val="20"/>
+          <w:szCs w:val="20"/>
+        </w:rPr>
+        <w:t>Registered users: receive an in-app notification only (no email). Notification states: “[username] ([full name]) invited you as [Editor / Reader] on moment [moment name]”</w:t>
+      </w:r>
+    </w:p>
+    <w:p>
+      <w:pPr>
+        <w:pStyle w:val="ListParagraph"/>
+        <w:numPr>
+          <w:ilvl w:val="1"/>
+          <w:numId w:val="15"/>
+        </w:numPr>
+        <w:spacing w:before="30" w:after="30"/>
+      </w:pPr>
+      <w:r>
+        <w:rPr>
+          <w:sz w:val="20"/>
+          <w:szCs w:val="20"/>
+        </w:rPr>
+        <w:t>Unregistered users: receive a sign-up email stating “[username] ([full name]) invited you as [Editor / Reader] on a moment on Remember When. Create an account to accept or decline.” with a link to the sign-up page with their email pre-filled. After email confirmation and first login they land on the home page with a banner directing them to their notifications where the pending invite awaits</w:t>
+      </w:r>
+    </w:p>
+    <w:p>
+      <w:pPr>
+        <w:pStyle w:val="ListParagraph"/>
+        <w:numPr>
+          <w:ilvl w:val="1"/>
+          <w:numId w:val="15"/>
+        </w:numPr>
+        <w:spacing w:before="30" w:after="30"/>
+      </w:pPr>
+      <w:r>
+        <w:rPr>
+          <w:sz w:val="20"/>
+          <w:szCs w:val="20"/>
+        </w:rPr>
+        <w:t>All invites (registered and unregistered) must be accepted or declined; no expiry on direct invites</w:t>
       </w:r>
     </w:p>
     <w:p>
@@ -1844,7 +2172,7 @@
           <w:b/>
           <w:bCs/>
         </w:rPr>
-        <w:t>Non-friend readers:</w:t>
+        <w:t>Shareable reader links (non-friend readers):</w:t>
       </w:r>
     </w:p>
     <w:p>
@@ -1852,7 +2180,7 @@
         <w:pStyle w:val="ListParagraph"/>
         <w:numPr>
           <w:ilvl w:val="1"/>
-          <w:numId w:val="13"/>
+          <w:numId w:val="15"/>
         </w:numPr>
         <w:spacing w:before="30" w:after="30"/>
       </w:pPr>
@@ -1861,7 +2189,7 @@
           <w:sz w:val="20"/>
           <w:szCs w:val="20"/>
         </w:rPr>
-        <w:t>Invited via a shareable link with a chosen expiry: 1 week / 1 month / 3 months / 6 months / 1 year / never</w:t>
+        <w:t>Generated from the Members page with a chosen expiry: 1 week / 1 month / 3 months / 6 months / 1 year / never</w:t>
       </w:r>
     </w:p>
     <w:p>
@@ -1869,11 +2197,12 @@
         <w:pStyle w:val="ListParagraph"/>
         <w:numPr>
           <w:ilvl w:val="0"/>
-          <w:numId w:val="12"/>
+          <w:numId w:val="14"/>
         </w:numPr>
         <w:spacing w:before="40" w:after="40"/>
       </w:pPr>
       <w:r>
+        <w:lastRenderedPageBreak/>
         <w:t>At most one active link per moment at any time; issuing a new link immediately invalidates the previous one</w:t>
       </w:r>
     </w:p>
@@ -1882,12 +2211,11 @@
         <w:pStyle w:val="ListParagraph"/>
         <w:numPr>
           <w:ilvl w:val="0"/>
-          <w:numId w:val="12"/>
+          <w:numId w:val="14"/>
         </w:numPr>
         <w:spacing w:before="40" w:after="40"/>
       </w:pPr>
       <w:r>
-        <w:lastRenderedPageBreak/>
         <w:t>Readers who joined via an expired or invalidated link retain their access</w:t>
       </w:r>
     </w:p>
@@ -1896,7 +2224,7 @@
         <w:pStyle w:val="ListParagraph"/>
         <w:numPr>
           <w:ilvl w:val="0"/>
-          <w:numId w:val="12"/>
+          <w:numId w:val="14"/>
         </w:numPr>
         <w:spacing w:before="40" w:after="40"/>
       </w:pPr>
@@ -2590,7 +2918,7 @@
         <w:pStyle w:val="ListParagraph"/>
         <w:numPr>
           <w:ilvl w:val="0"/>
-          <w:numId w:val="12"/>
+          <w:numId w:val="14"/>
         </w:numPr>
         <w:spacing w:before="40" w:after="40"/>
       </w:pPr>
@@ -2603,7 +2931,7 @@
         <w:pStyle w:val="ListParagraph"/>
         <w:numPr>
           <w:ilvl w:val="0"/>
-          <w:numId w:val="12"/>
+          <w:numId w:val="14"/>
         </w:numPr>
         <w:spacing w:before="40" w:after="40"/>
       </w:pPr>
@@ -2616,7 +2944,7 @@
         <w:pStyle w:val="ListParagraph"/>
         <w:numPr>
           <w:ilvl w:val="0"/>
-          <w:numId w:val="12"/>
+          <w:numId w:val="14"/>
         </w:numPr>
         <w:spacing w:before="40" w:after="40"/>
       </w:pPr>
@@ -2629,7 +2957,7 @@
         <w:pStyle w:val="ListParagraph"/>
         <w:numPr>
           <w:ilvl w:val="0"/>
-          <w:numId w:val="12"/>
+          <w:numId w:val="14"/>
         </w:numPr>
         <w:spacing w:before="40" w:after="40"/>
       </w:pPr>
@@ -2642,7 +2970,7 @@
         <w:pStyle w:val="ListParagraph"/>
         <w:numPr>
           <w:ilvl w:val="0"/>
-          <w:numId w:val="12"/>
+          <w:numId w:val="14"/>
         </w:numPr>
         <w:spacing w:before="40" w:after="40"/>
       </w:pPr>
@@ -2667,7 +2995,7 @@
         <w:pStyle w:val="ListParagraph"/>
         <w:numPr>
           <w:ilvl w:val="0"/>
-          <w:numId w:val="12"/>
+          <w:numId w:val="14"/>
         </w:numPr>
         <w:spacing w:before="40" w:after="40"/>
       </w:pPr>
@@ -2680,7 +3008,7 @@
         <w:pStyle w:val="ListParagraph"/>
         <w:numPr>
           <w:ilvl w:val="0"/>
-          <w:numId w:val="12"/>
+          <w:numId w:val="14"/>
         </w:numPr>
         <w:spacing w:before="40" w:after="40"/>
       </w:pPr>
@@ -2693,7 +3021,7 @@
         <w:pStyle w:val="ListParagraph"/>
         <w:numPr>
           <w:ilvl w:val="0"/>
-          <w:numId w:val="12"/>
+          <w:numId w:val="14"/>
         </w:numPr>
         <w:spacing w:before="40" w:after="40"/>
       </w:pPr>
@@ -2715,6 +3043,7 @@
         <w:pStyle w:val="Heading1"/>
       </w:pPr>
       <w:r>
+        <w:lastRenderedPageBreak/>
         <w:t>3. Data Model</w:t>
       </w:r>
     </w:p>
@@ -2723,7 +3052,6 @@
         <w:spacing w:before="60" w:after="60"/>
       </w:pPr>
       <w:r>
-        <w:lastRenderedPageBreak/>
         <w:t>All tables live in Supabase (Postgres). Arrows (→) denote foreign key references. Soft deletes use a deleted_at timestamp; a null value means the record is active.</w:t>
       </w:r>
     </w:p>
@@ -4411,6 +4739,7 @@
                 <w:sz w:val="18"/>
                 <w:szCs w:val="18"/>
               </w:rPr>
+              <w:lastRenderedPageBreak/>
               <w:t>created_at</w:t>
             </w:r>
           </w:p>
@@ -4442,7 +4771,6 @@
         <w:pStyle w:val="Heading3"/>
       </w:pPr>
       <w:r>
-        <w:lastRenderedPageBreak/>
         <w:t>moment_members</w:t>
       </w:r>
     </w:p>
@@ -4965,6 +5293,72 @@
                 <w:sz w:val="18"/>
                 <w:szCs w:val="18"/>
               </w:rPr>
+              <w:t>invited_email</w:t>
+            </w:r>
+          </w:p>
+        </w:tc>
+        <w:tc>
+          <w:tcPr>
+            <w:tcW w:w="6560" w:type="dxa"/>
+            <w:tcBorders>
+              <w:top w:val="single" w:sz="1" w:space="0" w:color="CCCCCC"/>
+              <w:left w:val="single" w:sz="1" w:space="0" w:color="CCCCCC"/>
+              <w:bottom w:val="single" w:sz="1" w:space="0" w:color="CCCCCC"/>
+              <w:right w:val="single" w:sz="1" w:space="0" w:color="CCCCCC"/>
+            </w:tcBorders>
+            <w:shd w:val="clear" w:color="auto" w:fill="FFFFFF"/>
+            <w:tcMar>
+              <w:top w:w="80" w:type="dxa"/>
+              <w:left w:w="120" w:type="dxa"/>
+              <w:bottom w:w="80" w:type="dxa"/>
+              <w:right w:w="120" w:type="dxa"/>
+            </w:tcMar>
+          </w:tcPr>
+          <w:p>
+            <w:r>
+              <w:rPr>
+                <w:sz w:val="18"/>
+                <w:szCs w:val="18"/>
+              </w:rPr>
+              <w:t>Nullable. Populated only for unregistered invitees. Used to match the pending invite when they sign up. Set to null once user_id is resolved.</w:t>
+            </w:r>
+          </w:p>
+        </w:tc>
+      </w:tr>
+      <w:tr>
+        <w:tblPrEx>
+          <w:tblCellMar>
+            <w:top w:w="0" w:type="dxa"/>
+            <w:bottom w:w="0" w:type="dxa"/>
+          </w:tblCellMar>
+        </w:tblPrEx>
+        <w:tc>
+          <w:tcPr>
+            <w:tcW w:w="2800" w:type="dxa"/>
+            <w:tcBorders>
+              <w:top w:val="single" w:sz="1" w:space="0" w:color="CCCCCC"/>
+              <w:left w:val="single" w:sz="1" w:space="0" w:color="CCCCCC"/>
+              <w:bottom w:val="single" w:sz="1" w:space="0" w:color="CCCCCC"/>
+              <w:right w:val="single" w:sz="1" w:space="0" w:color="CCCCCC"/>
+            </w:tcBorders>
+            <w:shd w:val="clear" w:color="auto" w:fill="F5F5F5"/>
+            <w:tcMar>
+              <w:top w:w="80" w:type="dxa"/>
+              <w:left w:w="120" w:type="dxa"/>
+              <w:bottom w:w="80" w:type="dxa"/>
+              <w:right w:w="120" w:type="dxa"/>
+            </w:tcMar>
+          </w:tcPr>
+          <w:p>
+            <w:r>
+              <w:rPr>
+                <w:rFonts w:ascii="Courier New" w:eastAsia="Courier New" w:hAnsi="Courier New" w:cs="Courier New"/>
+                <w:b/>
+                <w:bCs/>
+                <w:color w:val="4A90B8"/>
+                <w:sz w:val="18"/>
+                <w:szCs w:val="18"/>
+              </w:rPr>
               <w:t>created_at</w:t>
             </w:r>
           </w:p>
@@ -6027,6 +6421,7 @@
                 <w:sz w:val="20"/>
                 <w:szCs w:val="20"/>
               </w:rPr>
+              <w:lastRenderedPageBreak/>
               <w:t>Field</w:t>
             </w:r>
           </w:p>
@@ -6294,7 +6689,6 @@
                 <w:sz w:val="18"/>
                 <w:szCs w:val="18"/>
               </w:rPr>
-              <w:lastRenderedPageBreak/>
               <w:t>storage_url</w:t>
             </w:r>
           </w:p>
@@ -7795,6 +8189,7 @@
         <w:pStyle w:val="Heading3"/>
       </w:pPr>
       <w:r>
+        <w:lastRenderedPageBreak/>
         <w:t>notification_preferences</w:t>
       </w:r>
     </w:p>
@@ -8053,7 +8448,6 @@
                 <w:sz w:val="18"/>
                 <w:szCs w:val="18"/>
               </w:rPr>
-              <w:lastRenderedPageBreak/>
               <w:t>friend_request_received</w:t>
             </w:r>
           </w:p>
@@ -8669,7 +9063,7 @@
         <w:pStyle w:val="ListParagraph"/>
         <w:numPr>
           <w:ilvl w:val="0"/>
-          <w:numId w:val="12"/>
+          <w:numId w:val="14"/>
         </w:numPr>
         <w:spacing w:before="40" w:after="40"/>
       </w:pPr>
@@ -8682,7 +9076,7 @@
         <w:pStyle w:val="ListParagraph"/>
         <w:numPr>
           <w:ilvl w:val="0"/>
-          <w:numId w:val="12"/>
+          <w:numId w:val="14"/>
         </w:numPr>
         <w:spacing w:before="40" w:after="40"/>
       </w:pPr>
@@ -8695,7 +9089,7 @@
         <w:pStyle w:val="ListParagraph"/>
         <w:numPr>
           <w:ilvl w:val="0"/>
-          <w:numId w:val="12"/>
+          <w:numId w:val="14"/>
         </w:numPr>
         <w:spacing w:before="40" w:after="40"/>
       </w:pPr>
@@ -8708,7 +9102,7 @@
         <w:pStyle w:val="ListParagraph"/>
         <w:numPr>
           <w:ilvl w:val="0"/>
-          <w:numId w:val="12"/>
+          <w:numId w:val="14"/>
         </w:numPr>
         <w:spacing w:before="40" w:after="40"/>
       </w:pPr>
@@ -8753,7 +9147,7 @@
         <w:pStyle w:val="ListParagraph"/>
         <w:numPr>
           <w:ilvl w:val="0"/>
-          <w:numId w:val="12"/>
+          <w:numId w:val="14"/>
         </w:numPr>
         <w:spacing w:before="40" w:after="40"/>
       </w:pPr>
@@ -8766,11 +9160,12 @@
         <w:pStyle w:val="ListParagraph"/>
         <w:numPr>
           <w:ilvl w:val="0"/>
-          <w:numId w:val="12"/>
+          <w:numId w:val="14"/>
         </w:numPr>
         <w:spacing w:before="40" w:after="40"/>
       </w:pPr>
       <w:r>
+        <w:lastRenderedPageBreak/>
         <w:t>Settings / Notifications page — two sections: notification toggles (grouped by Friend activity / Moment activity / Reminders) and reminder cadence control (Weekly / Bi-weekly / Monthly / Never). UI only in this phase — no notifications firing yet.</w:t>
       </w:r>
     </w:p>
@@ -8779,7 +9174,7 @@
         <w:pStyle w:val="ListParagraph"/>
         <w:numPr>
           <w:ilvl w:val="0"/>
-          <w:numId w:val="12"/>
+          <w:numId w:val="14"/>
         </w:numPr>
         <w:spacing w:before="40" w:after="40"/>
       </w:pPr>
@@ -8792,7 +9187,7 @@
         <w:pStyle w:val="ListParagraph"/>
         <w:numPr>
           <w:ilvl w:val="0"/>
-          <w:numId w:val="12"/>
+          <w:numId w:val="14"/>
         </w:numPr>
         <w:spacing w:before="40" w:after="40"/>
       </w:pPr>
@@ -8805,12 +9200,11 @@
         <w:pStyle w:val="ListParagraph"/>
         <w:numPr>
           <w:ilvl w:val="0"/>
-          <w:numId w:val="12"/>
+          <w:numId w:val="14"/>
         </w:numPr>
         <w:spacing w:before="40" w:after="40"/>
       </w:pPr>
       <w:r>
-        <w:lastRenderedPageBreak/>
         <w:t>Delete account flow — red outlined button in Danger zone; confirmation modal; user must type their username to confirm; hard deletes personal data, leaves shared moment posts attributed to user</w:t>
       </w:r>
     </w:p>
@@ -8819,7 +9213,7 @@
         <w:pStyle w:val="ListParagraph"/>
         <w:numPr>
           <w:ilvl w:val="0"/>
-          <w:numId w:val="12"/>
+          <w:numId w:val="14"/>
         </w:numPr>
         <w:spacing w:before="40" w:after="40"/>
       </w:pPr>
@@ -8864,7 +9258,7 @@
         <w:pStyle w:val="ListParagraph"/>
         <w:numPr>
           <w:ilvl w:val="0"/>
-          <w:numId w:val="12"/>
+          <w:numId w:val="14"/>
         </w:numPr>
         <w:spacing w:before="40" w:after="40"/>
       </w:pPr>
@@ -8877,7 +9271,7 @@
         <w:pStyle w:val="ListParagraph"/>
         <w:numPr>
           <w:ilvl w:val="0"/>
-          <w:numId w:val="12"/>
+          <w:numId w:val="14"/>
         </w:numPr>
         <w:spacing w:before="40" w:after="40"/>
       </w:pPr>
@@ -8890,7 +9284,7 @@
         <w:pStyle w:val="ListParagraph"/>
         <w:numPr>
           <w:ilvl w:val="0"/>
-          <w:numId w:val="12"/>
+          <w:numId w:val="14"/>
         </w:numPr>
         <w:spacing w:before="40" w:after="40"/>
       </w:pPr>
@@ -8903,7 +9297,7 @@
         <w:pStyle w:val="ListParagraph"/>
         <w:numPr>
           <w:ilvl w:val="0"/>
-          <w:numId w:val="12"/>
+          <w:numId w:val="14"/>
         </w:numPr>
         <w:spacing w:before="40" w:after="40"/>
       </w:pPr>
@@ -8948,7 +9342,7 @@
         <w:pStyle w:val="ListParagraph"/>
         <w:numPr>
           <w:ilvl w:val="0"/>
-          <w:numId w:val="12"/>
+          <w:numId w:val="14"/>
         </w:numPr>
         <w:spacing w:before="40" w:after="40"/>
       </w:pPr>
@@ -8961,7 +9355,7 @@
         <w:pStyle w:val="ListParagraph"/>
         <w:numPr>
           <w:ilvl w:val="0"/>
-          <w:numId w:val="12"/>
+          <w:numId w:val="14"/>
         </w:numPr>
         <w:spacing w:before="40" w:after="40"/>
       </w:pPr>
@@ -8974,7 +9368,7 @@
         <w:pStyle w:val="ListParagraph"/>
         <w:numPr>
           <w:ilvl w:val="0"/>
-          <w:numId w:val="12"/>
+          <w:numId w:val="14"/>
         </w:numPr>
         <w:spacing w:before="40" w:after="40"/>
       </w:pPr>
@@ -8987,7 +9381,7 @@
         <w:pStyle w:val="ListParagraph"/>
         <w:numPr>
           <w:ilvl w:val="0"/>
-          <w:numId w:val="12"/>
+          <w:numId w:val="14"/>
         </w:numPr>
         <w:spacing w:before="40" w:after="40"/>
       </w:pPr>
@@ -9000,7 +9394,7 @@
         <w:pStyle w:val="ListParagraph"/>
         <w:numPr>
           <w:ilvl w:val="0"/>
-          <w:numId w:val="12"/>
+          <w:numId w:val="14"/>
         </w:numPr>
         <w:spacing w:before="40" w:after="40"/>
       </w:pPr>
@@ -9013,7 +9407,7 @@
         <w:pStyle w:val="ListParagraph"/>
         <w:numPr>
           <w:ilvl w:val="0"/>
-          <w:numId w:val="12"/>
+          <w:numId w:val="14"/>
         </w:numPr>
         <w:spacing w:before="40" w:after="40"/>
       </w:pPr>
@@ -9026,7 +9420,7 @@
         <w:pStyle w:val="ListParagraph"/>
         <w:numPr>
           <w:ilvl w:val="0"/>
-          <w:numId w:val="12"/>
+          <w:numId w:val="14"/>
         </w:numPr>
         <w:spacing w:before="40" w:after="40"/>
       </w:pPr>
@@ -9039,7 +9433,7 @@
         <w:pStyle w:val="ListParagraph"/>
         <w:numPr>
           <w:ilvl w:val="0"/>
-          <w:numId w:val="12"/>
+          <w:numId w:val="14"/>
         </w:numPr>
         <w:spacing w:before="40" w:after="40"/>
       </w:pPr>
@@ -9052,7 +9446,7 @@
         <w:pStyle w:val="ListParagraph"/>
         <w:numPr>
           <w:ilvl w:val="0"/>
-          <w:numId w:val="12"/>
+          <w:numId w:val="14"/>
         </w:numPr>
         <w:spacing w:before="40" w:after="40"/>
       </w:pPr>
@@ -9065,7 +9459,7 @@
         <w:pStyle w:val="ListParagraph"/>
         <w:numPr>
           <w:ilvl w:val="0"/>
-          <w:numId w:val="12"/>
+          <w:numId w:val="14"/>
         </w:numPr>
         <w:spacing w:before="40" w:after="40"/>
       </w:pPr>
@@ -9078,7 +9472,7 @@
         <w:pStyle w:val="ListParagraph"/>
         <w:numPr>
           <w:ilvl w:val="0"/>
-          <w:numId w:val="12"/>
+          <w:numId w:val="14"/>
         </w:numPr>
         <w:spacing w:before="40" w:after="40"/>
       </w:pPr>
@@ -9103,6 +9497,7 @@
         </w:pBdr>
       </w:pPr>
       <w:r>
+        <w:lastRenderedPageBreak/>
         <w:t>Phase 5 — Posts &amp; Media</w:t>
       </w:r>
     </w:p>
@@ -9123,7 +9518,7 @@
         <w:pStyle w:val="ListParagraph"/>
         <w:numPr>
           <w:ilvl w:val="0"/>
-          <w:numId w:val="12"/>
+          <w:numId w:val="14"/>
         </w:numPr>
         <w:spacing w:before="40" w:after="40"/>
       </w:pPr>
@@ -9136,7 +9531,7 @@
         <w:pStyle w:val="ListParagraph"/>
         <w:numPr>
           <w:ilvl w:val="0"/>
-          <w:numId w:val="12"/>
+          <w:numId w:val="14"/>
         </w:numPr>
         <w:spacing w:before="40" w:after="40"/>
       </w:pPr>
@@ -9149,12 +9544,11 @@
         <w:pStyle w:val="ListParagraph"/>
         <w:numPr>
           <w:ilvl w:val="0"/>
-          <w:numId w:val="12"/>
+          <w:numId w:val="14"/>
         </w:numPr>
         <w:spacing w:before="40" w:after="40"/>
       </w:pPr>
       <w:r>
-        <w:lastRenderedPageBreak/>
         <w:t>Post soft delete</w:t>
       </w:r>
     </w:p>
@@ -9163,7 +9557,7 @@
         <w:pStyle w:val="ListParagraph"/>
         <w:numPr>
           <w:ilvl w:val="0"/>
-          <w:numId w:val="12"/>
+          <w:numId w:val="14"/>
         </w:numPr>
         <w:spacing w:before="40" w:after="40"/>
       </w:pPr>
@@ -9176,7 +9570,7 @@
         <w:pStyle w:val="ListParagraph"/>
         <w:numPr>
           <w:ilvl w:val="0"/>
-          <w:numId w:val="12"/>
+          <w:numId w:val="14"/>
         </w:numPr>
         <w:spacing w:before="40" w:after="40"/>
       </w:pPr>
@@ -9201,19 +9595,7 @@
         </w:pBdr>
       </w:pPr>
       <w:r>
-        <w:t>Phase 6 — Readers &amp; Invite Links</w:t>
-      </w:r>
-    </w:p>
-    <w:p>
-      <w:pPr>
-        <w:spacing w:before="60" w:after="60"/>
-      </w:pPr>
-      <w:r>
-        <w:rPr>
-          <w:i/>
-          <w:iCs/>
-        </w:rPr>
-        <w:t>The secondary permission layer.</w:t>
+        <w:t>Phase 6 — Moment Settings, Leave &amp; Ownership</w:t>
       </w:r>
     </w:p>
     <w:p>
@@ -9221,7 +9603,7 @@
         <w:pStyle w:val="ListParagraph"/>
         <w:numPr>
           <w:ilvl w:val="0"/>
-          <w:numId w:val="12"/>
+          <w:numId w:val="14"/>
         </w:numPr>
         <w:spacing w:before="40" w:after="40"/>
       </w:pPr>
@@ -9234,7 +9616,7 @@
         <w:pStyle w:val="ListParagraph"/>
         <w:numPr>
           <w:ilvl w:val="0"/>
-          <w:numId w:val="12"/>
+          <w:numId w:val="14"/>
         </w:numPr>
         <w:spacing w:before="40" w:after="40"/>
       </w:pPr>
@@ -9247,7 +9629,7 @@
         <w:pStyle w:val="ListParagraph"/>
         <w:numPr>
           <w:ilvl w:val="0"/>
-          <w:numId w:val="12"/>
+          <w:numId w:val="14"/>
         </w:numPr>
         <w:spacing w:before="40" w:after="40"/>
       </w:pPr>
@@ -9260,12 +9642,12 @@
         <w:pStyle w:val="ListParagraph"/>
         <w:numPr>
           <w:ilvl w:val="0"/>
-          <w:numId w:val="12"/>
+          <w:numId w:val="14"/>
         </w:numPr>
         <w:spacing w:before="40" w:after="40"/>
       </w:pPr>
       <w:r>
-        <w:t>Leave moment flow — keep or delete posts, ownership transfer</w:t>
+        <w:t>Moment Settings page (/moments/[id]/members) — Manage Members (all members listed, owner edit/remove controls), Invite Link, Transfer Ownership (owner only, editors only eligible), Leave Moment (all members, danger zone; owner paths: transfer+leave or delete entire moment)</w:t>
       </w:r>
     </w:p>
     <w:p>
@@ -9305,7 +9687,7 @@
         <w:pStyle w:val="ListParagraph"/>
         <w:numPr>
           <w:ilvl w:val="0"/>
-          <w:numId w:val="12"/>
+          <w:numId w:val="14"/>
         </w:numPr>
         <w:spacing w:before="40" w:after="40"/>
       </w:pPr>
@@ -9318,7 +9700,7 @@
         <w:pStyle w:val="ListParagraph"/>
         <w:numPr>
           <w:ilvl w:val="0"/>
-          <w:numId w:val="12"/>
+          <w:numId w:val="14"/>
         </w:numPr>
         <w:spacing w:before="40" w:after="40"/>
       </w:pPr>
@@ -9331,7 +9713,7 @@
         <w:pStyle w:val="ListParagraph"/>
         <w:numPr>
           <w:ilvl w:val="0"/>
-          <w:numId w:val="12"/>
+          <w:numId w:val="14"/>
         </w:numPr>
         <w:spacing w:before="40" w:after="40"/>
       </w:pPr>
@@ -9344,7 +9726,7 @@
         <w:pStyle w:val="ListParagraph"/>
         <w:numPr>
           <w:ilvl w:val="0"/>
-          <w:numId w:val="12"/>
+          <w:numId w:val="14"/>
         </w:numPr>
         <w:spacing w:before="40" w:after="40"/>
       </w:pPr>
@@ -9389,7 +9771,7 @@
         <w:pStyle w:val="ListParagraph"/>
         <w:numPr>
           <w:ilvl w:val="0"/>
-          <w:numId w:val="12"/>
+          <w:numId w:val="14"/>
         </w:numPr>
         <w:spacing w:before="40" w:after="40"/>
       </w:pPr>
@@ -9402,7 +9784,7 @@
         <w:pStyle w:val="ListParagraph"/>
         <w:numPr>
           <w:ilvl w:val="0"/>
-          <w:numId w:val="12"/>
+          <w:numId w:val="14"/>
         </w:numPr>
         <w:spacing w:before="40" w:after="40"/>
       </w:pPr>
@@ -9439,6 +9821,7 @@
           <w:i/>
           <w:iCs/>
         </w:rPr>
+        <w:lastRenderedPageBreak/>
         <w:t>The difference between a working app and a good one. Revisit after each phase, not just at the end.</w:t>
       </w:r>
     </w:p>
@@ -9447,7 +9830,7 @@
         <w:pStyle w:val="ListParagraph"/>
         <w:numPr>
           <w:ilvl w:val="0"/>
-          <w:numId w:val="12"/>
+          <w:numId w:val="14"/>
         </w:numPr>
         <w:spacing w:before="40" w:after="40"/>
       </w:pPr>
@@ -9460,7 +9843,7 @@
         <w:pStyle w:val="ListParagraph"/>
         <w:numPr>
           <w:ilvl w:val="0"/>
-          <w:numId w:val="12"/>
+          <w:numId w:val="14"/>
         </w:numPr>
         <w:spacing w:before="40" w:after="40"/>
       </w:pPr>
@@ -9473,7 +9856,7 @@
         <w:pStyle w:val="ListParagraph"/>
         <w:numPr>
           <w:ilvl w:val="0"/>
-          <w:numId w:val="12"/>
+          <w:numId w:val="14"/>
         </w:numPr>
         <w:spacing w:before="40" w:after="40"/>
       </w:pPr>
@@ -9486,7 +9869,7 @@
         <w:pStyle w:val="ListParagraph"/>
         <w:numPr>
           <w:ilvl w:val="0"/>
-          <w:numId w:val="12"/>
+          <w:numId w:val="14"/>
         </w:numPr>
         <w:spacing w:before="40" w:after="40"/>
       </w:pPr>
@@ -9499,7 +9882,6 @@
         <w:spacing w:before="60" w:after="60"/>
       </w:pPr>
       <w:r>
-        <w:lastRenderedPageBreak/>
         <w:t>✓ End state: production-ready, polished, and safe.</w:t>
       </w:r>
     </w:p>
@@ -9743,12 +10125,16 @@
         <w:pStyle w:val="ListParagraph"/>
         <w:numPr>
           <w:ilvl w:val="0"/>
-          <w:numId w:val="12"/>
+          <w:numId w:val="14"/>
         </w:numPr>
         <w:spacing w:before="40" w:after="40"/>
       </w:pPr>
       <w:r>
-        <w:t>“Set up the Supabase schema with all tables. Apply row level security policies so users can only access their own data. Set up Supabase Auth including forgot password / reset. Scaffold the Next.js app with placeholder routes for: home (/), moment detail (/moments/[id]), and account (/account).”</w:t>
+        <w:t xml:space="preserve">“Set up the Supabase schema with all tables. Apply row level security policies so users can only access their own data. Set up Supabase Auth including forgot password / reset. </w:t>
+      </w:r>
+      <w:r>
+        <w:lastRenderedPageBreak/>
+        <w:t>Scaffold the Next.js app with placeholder routes for: home (/), moment detail (/moments/[id]), and account (/account).”</w:t>
       </w:r>
     </w:p>
     <w:p/>
@@ -9785,12 +10171,11 @@
         <w:pStyle w:val="ListParagraph"/>
         <w:numPr>
           <w:ilvl w:val="0"/>
-          <w:numId w:val="12"/>
+          <w:numId w:val="14"/>
         </w:numPr>
         <w:spacing w:before="40" w:after="40"/>
       </w:pPr>
       <w:r>
-        <w:lastRenderedPageBreak/>
         <w:t>“Use shadcn/ui components throughout. Profile photo upload should go to Supabase Storage. Username uniqueness should be checked in real time on both the sign-up form and the account edit form.”</w:t>
       </w:r>
     </w:p>
@@ -9799,7 +10184,7 @@
         <w:pStyle w:val="ListParagraph"/>
         <w:numPr>
           <w:ilvl w:val="0"/>
-          <w:numId w:val="12"/>
+          <w:numId w:val="14"/>
         </w:numPr>
         <w:spacing w:before="40" w:after="40"/>
       </w:pPr>
@@ -9812,7 +10197,7 @@
         <w:pStyle w:val="ListParagraph"/>
         <w:numPr>
           <w:ilvl w:val="0"/>
-          <w:numId w:val="12"/>
+          <w:numId w:val="14"/>
         </w:numPr>
         <w:spacing w:before="40" w:after="40"/>
       </w:pPr>
@@ -9854,7 +10239,7 @@
         <w:pStyle w:val="ListParagraph"/>
         <w:numPr>
           <w:ilvl w:val="0"/>
-          <w:numId w:val="12"/>
+          <w:numId w:val="14"/>
         </w:numPr>
         <w:spacing w:before="40" w:after="40"/>
       </w:pPr>
@@ -9896,11 +10281,12 @@
         <w:pStyle w:val="ListParagraph"/>
         <w:numPr>
           <w:ilvl w:val="0"/>
-          <w:numId w:val="12"/>
+          <w:numId w:val="14"/>
         </w:numPr>
         <w:spacing w:before="40" w:after="40"/>
       </w:pPr>
       <w:r>
+        <w:lastRenderedPageBreak/>
         <w:t>“The date field in the create modal should support three modes: year only, month + year, or full date. Store as separate date_year, date_month, date_day columns. The collapsing header on the moment page should pin the moment name when scrolling. If an invited email has no matching account, store a pending invite tied to that email address and send a sign-up email; surface the invite automatically once they register. Add a navigation bar with links to Home, Account, Notifications (placeholder), and Friends; on mobile this should collapse to a bottom tab bar or hamburger menu.”</w:t>
       </w:r>
     </w:p>
@@ -9909,12 +10295,11 @@
         <w:pStyle w:val="ListParagraph"/>
         <w:numPr>
           <w:ilvl w:val="0"/>
-          <w:numId w:val="12"/>
+          <w:numId w:val="14"/>
         </w:numPr>
         <w:spacing w:before="40" w:after="40"/>
       </w:pPr>
       <w:r>
-        <w:lastRenderedPageBreak/>
         <w:t>“Implement moment detail editing as follows. (1) Moment cards on the home page must show a [...] menu icon in the top right corner, visible on hover. The menu contains two options in this order: Edit moment (first), Archive (second). Only owners and editors see the Edit option — readers see Archive only. (2) The moment page header must also have an edit button or [...] menu allowing owners and editors to edit moment details from within the moment. (3) Both entry points open the same Edit moment modal, which reuses the create moment modal UI pre-populated with existing values. The modal title changes to “Edit moment” and the submit button reads “Save changes”. Editable fields: moment name (required), date including precision level (year only / month + year / full date), location, tags / keywords. Cover photo is NOT editable from this modal — it is only editable from within the moment page itself. (4) On save, update the relevant columns in the moments and moment_tags tables. Send a notification to all editors and readers of the moment that details have been updated.”</w:t>
       </w:r>
     </w:p>
@@ -9923,7 +10308,7 @@
         <w:pStyle w:val="ListParagraph"/>
         <w:numPr>
           <w:ilvl w:val="0"/>
-          <w:numId w:val="12"/>
+          <w:numId w:val="14"/>
         </w:numPr>
         <w:spacing w:before="40" w:after="40"/>
       </w:pPr>
@@ -9965,7 +10350,7 @@
         <w:pStyle w:val="ListParagraph"/>
         <w:numPr>
           <w:ilvl w:val="0"/>
-          <w:numId w:val="12"/>
+          <w:numId w:val="14"/>
         </w:numPr>
         <w:spacing w:before="40" w:after="40"/>
       </w:pPr>
@@ -9978,12 +10363,16 @@
         <w:pStyle w:val="ListParagraph"/>
         <w:numPr>
           <w:ilvl w:val="0"/>
-          <w:numId w:val="12"/>
+          <w:numId w:val="14"/>
         </w:numPr>
         <w:spacing w:before="40" w:after="40"/>
       </w:pPr>
       <w:r>
-        <w:t>“Implement post editing with the following rules: (1) Only the original author of a post can edit it — no other editors or the moment owner can edit another user’s post. (2) Both text content and attached media are editable. When editing media, the author can add new items or remove existing ones; removing a media item should soft-delete its row in post_media (add a deleted_at column to post_media if not already present) and remove the file from Supabase Storage. (3) A post must always have at least one of: text content or at least one media item — prevent saving if both would be empty and show a validation message. (4) Add an edited_at nullable timestamp column to the posts table; set it to the current timestamp on every save. No edit history is stored — only the current version is kept. (5) UI: show a small pencil icon on each post, visible only to that post’s author. Clicking it opens the post creation modal pre-populated with existing content and media. The modal should clearly indicate the user is editing, not creating. (6) On each post, if edited_at is not null, display a subtle ‘Edited’ label alongside the edited_at timestamp so other users can see the post was modified. (7) Editing a post must not trigger a new post notification to other moment members.”</w:t>
+        <w:t xml:space="preserve">“Implement post editing with the following rules: (1) Only the original author of a post can edit it — no other editors or the moment owner can edit another user’s post. (2) Both text content and attached media are editable. When editing media, the author can add new items or remove existing ones; removing a media item should soft-delete its row in post_media (add a deleted_at column to post_media if not already present) and remove the file from Supabase Storage. (3) A post must always have at least one of: text content or at least one media item — prevent saving if both would be empty and show a </w:t>
+      </w:r>
+      <w:r>
+        <w:lastRenderedPageBreak/>
+        <w:t>validation message. (4) Add an edited_at nullable timestamp column to the posts table; set it to the current timestamp on every save. No edit history is stored — only the current version is kept. (5) UI: show a small pencil icon on each post, visible only to that post’s author. Clicking it opens the post creation modal pre-populated with existing content and media. The modal should clearly indicate the user is editing, not creating. (6) On each post, if edited_at is not null, display a subtle ‘Edited’ label alongside the edited_at timestamp so other users can see the post was modified. (7) Editing a post must not trigger a new post notification to other moment members.”</w:t>
       </w:r>
     </w:p>
     <w:p/>
@@ -9992,7 +10381,7 @@
         <w:pStyle w:val="Heading3"/>
       </w:pPr>
       <w:r>
-        <w:t>Phase 6 — Readers &amp; Invite Links</w:t>
+        <w:t>Phase 6 — Moment Settings, Leave &amp; Ownership</w:t>
       </w:r>
     </w:p>
     <w:p>
@@ -10000,7 +10389,102 @@
         <w:spacing w:before="60" w:after="60"/>
       </w:pPr>
       <w:r>
-        <w:t>Paste in: Section 2.6 (full permissions), Section 2.7 (Reader Invitations &amp; Links), the invite_links and moment_members tables, and the Phase 6 build order entry.</w:t>
+        <w:t>Paste in: Section 2.5 (Moment Settings page spec), Section 2.6 (full permissions), Section 2.7 (Invitations &amp; Links), the invite_links and moment_members tables, and the Phase 6 build order entry.</w:t>
+      </w:r>
+    </w:p>
+    <w:p>
+      <w:pPr>
+        <w:spacing w:before="60" w:after="60"/>
+      </w:pPr>
+      <w:r>
+        <w:rPr>
+          <w:b/>
+          <w:bCs/>
+        </w:rPr>
+        <w:t>Key instructions to include:</w:t>
+      </w:r>
+    </w:p>
+    <w:p>
+      <w:pPr>
+        <w:pStyle w:val="ListParagraph"/>
+        <w:numPr>
+          <w:ilvl w:val="0"/>
+          <w:numId w:val="14"/>
+        </w:numPr>
+        <w:spacing w:before="40" w:after="40"/>
+      </w:pPr>
+      <w:r>
+        <w:t>“Rename the existing Members page to Moment Settings. Replace the Manage button icon on the moment page with a settings/gear icon. The page title should read ‘Moment Settings’. The page has four sections: (1) Manage Members, (2) Invite Link, (3) Transfer Ownership, (4) Leave Moment. Full spec for each section is in Section 2.5 of the product spec.”</w:t>
+      </w:r>
+    </w:p>
+    <w:p>
+      <w:pPr>
+        <w:pStyle w:val="ListParagraph"/>
+        <w:numPr>
+          <w:ilvl w:val="0"/>
+          <w:numId w:val="14"/>
+        </w:numPr>
+        <w:spacing w:before="40" w:after="40"/>
+      </w:pPr>
+      <w:r>
+        <w:t>“Manage Members section: list all members in order (owner, then editors alphabetically, then readers alphabetically). Each row shows avatar, name, and role. Owner sees an edit icon on all rows except their own, opening a small menu to change role (editor ↔ reader) or remove the member. Role changes must trigger an in-app notification to the affected user. Removal requires a confirmation prompt and is immediate.”</w:t>
+      </w:r>
+    </w:p>
+    <w:p>
+      <w:pPr>
+        <w:pStyle w:val="ListParagraph"/>
+        <w:numPr>
+          <w:ilvl w:val="0"/>
+          <w:numId w:val="14"/>
+        </w:numPr>
+        <w:spacing w:before="40" w:after="40"/>
+      </w:pPr>
+      <w:r>
+        <w:t>“Transfer Ownership section (owner only): show a dropdown populated only with current editors. If no editors exist, hide the dropdown and show a message: ‘You must promote a reader to editor before you can transfer ownership.’ On selecting an editor and submitting, show a confirmation modal: ‘Are you sure you want to transfer ownership to [name]? This action can only be reversed by the new owner.’ On confirmation, update owner_id on the moments table and send in-app notifications to both the previous and new owner.”</w:t>
+      </w:r>
+    </w:p>
+    <w:p>
+      <w:pPr>
+        <w:pStyle w:val="ListParagraph"/>
+        <w:numPr>
+          <w:ilvl w:val="0"/>
+          <w:numId w:val="14"/>
+        </w:numPr>
+        <w:spacing w:before="40" w:after="40"/>
+      </w:pPr>
+      <w:r>
+        <w:t>“Leave Moment section (all members, danger zone styling with red outlined button): For editors and readers, clicking opens a modal asking: ‘What would you like to do with your posts?’ with two options — delete them or leave them for others to see. For owners, behaviour depends on membership: (A) if editors exist, the owner must first use the Transfer Ownership section above, then return to Leave Moment and choose post fate — enforce this order and show clear guidance; (B) if only readers exist (no editors), show a message: ‘You cannot leave this moment without an editor to transfer ownership to. You can promote a reader to editor and then transfer ownership, or delete this moment for everyone.’ Provide a Delete moment button. Clicking it shows a confirmation modal warning that all data will be permanently deleted and all members will be notified. On confirmation, hard delete the moment and send a notification to all members.”</w:t>
+      </w:r>
+    </w:p>
+    <w:p>
+      <w:pPr>
+        <w:pStyle w:val="ListParagraph"/>
+        <w:numPr>
+          <w:ilvl w:val="0"/>
+          <w:numId w:val="14"/>
+        </w:numPr>
+        <w:spacing w:before="40" w:after="40"/>
+      </w:pPr>
+      <w:r>
+        <w:t>“There should be at most one active invite link per moment. Generating a new link deletes the previous row. Readers who already joined via an old link retain access — access is stored in moment_members, not tied to the link.”</w:t>
+      </w:r>
+    </w:p>
+    <w:p/>
+    <w:p>
+      <w:pPr>
+        <w:pStyle w:val="Heading3"/>
+      </w:pPr>
+      <w:r>
+        <w:t>Phase 7 — Notifications</w:t>
+      </w:r>
+    </w:p>
+    <w:p>
+      <w:pPr>
+        <w:spacing w:before="60" w:after="60"/>
+      </w:pPr>
+      <w:r>
+        <w:lastRenderedPageBreak/>
+        <w:t>Paste in: Section 2.8 (Notifications), the notifications and notification_preferences tables, and the Phase 7 build order entry.</w:t>
       </w:r>
     </w:p>
     <w:p>
@@ -10020,12 +10504,12 @@
         <w:pStyle w:val="ListParagraph"/>
         <w:numPr>
           <w:ilvl w:val="0"/>
-          <w:numId w:val="12"/>
+          <w:numId w:val="14"/>
         </w:numPr>
         <w:spacing w:before="40" w:after="40"/>
       </w:pPr>
       <w:r>
-        <w:t>“There should be at most one active invite link per moment. Generating a new link deletes the previous row. Readers who already joined via an old link retain access — access is stored in moment_members, not tied to the link. Ownership transfer updates owner_id on the moments table.”</w:t>
+        <w:t>“Before sending any notification, check the recipient’s notification_preferences row. If archived_moment_notifications is false, suppress notifications for archived moments. Periodic reminders should be driven by a scheduled function (Supabase Edge Functions or a cron job via Vercel).”</w:t>
       </w:r>
     </w:p>
     <w:p/>
@@ -10034,7 +10518,7 @@
         <w:pStyle w:val="Heading3"/>
       </w:pPr>
       <w:r>
-        <w:t>Phase 7 — Notifications</w:t>
+        <w:t>Phase 8 — Pricing Page</w:t>
       </w:r>
     </w:p>
     <w:p>
@@ -10042,7 +10526,7 @@
         <w:spacing w:before="60" w:after="60"/>
       </w:pPr>
       <w:r>
-        <w:t>Paste in: Section 2.8 (Notifications), the notifications and notification_preferences tables, and the Phase 7 build order entry.</w:t>
+        <w:t>Paste in: Section 2.9 (Pricing &amp; Tiers) and the Phase 8 build order entry.</w:t>
       </w:r>
     </w:p>
     <w:p>
@@ -10062,12 +10546,12 @@
         <w:pStyle w:val="ListParagraph"/>
         <w:numPr>
           <w:ilvl w:val="0"/>
-          <w:numId w:val="12"/>
+          <w:numId w:val="14"/>
         </w:numPr>
         <w:spacing w:before="40" w:after="40"/>
       </w:pPr>
       <w:r>
-        <w:t>“Before sending any notification, check the recipient’s notification_preferences row. If archived_moment_notifications is false, suppress notifications for archived moments. Periodic reminders should be driven by a scheduled function (Supabase Edge Functions or a cron job via Vercel).”</w:t>
+        <w:t>“This is a static marketing page only — no payment integration yet. Show a free tier and at least one placeholder paid tier. Keep the design consistent with the rest of the app.”</w:t>
       </w:r>
     </w:p>
     <w:p/>
@@ -10076,7 +10560,7 @@
         <w:pStyle w:val="Heading3"/>
       </w:pPr>
       <w:r>
-        <w:t>Phase 8 — Pricing Page</w:t>
+        <w:t>Phase 9 — Polish</w:t>
       </w:r>
     </w:p>
     <w:p>
@@ -10084,7 +10568,7 @@
         <w:spacing w:before="60" w:after="60"/>
       </w:pPr>
       <w:r>
-        <w:t>Paste in: Section 2.9 (Pricing &amp; Tiers) and the Phase 8 build order entry.</w:t>
+        <w:t>No single paste-in — this phase is iterative. Run it as a review pass after each prior phase, and as a dedicated final pass at the end.</w:t>
       </w:r>
     </w:p>
     <w:p>
@@ -10104,49 +10588,7 @@
         <w:pStyle w:val="ListParagraph"/>
         <w:numPr>
           <w:ilvl w:val="0"/>
-          <w:numId w:val="12"/>
-        </w:numPr>
-        <w:spacing w:before="40" w:after="40"/>
-      </w:pPr>
-      <w:r>
-        <w:t>“This is a static marketing page only — no payment integration yet. Show a free tier and at least one placeholder paid tier. Keep the design consistent with the rest of the app.”</w:t>
-      </w:r>
-    </w:p>
-    <w:p/>
-    <w:p>
-      <w:pPr>
-        <w:pStyle w:val="Heading3"/>
-      </w:pPr>
-      <w:r>
-        <w:t>Phase 9 — Polish</w:t>
-      </w:r>
-    </w:p>
-    <w:p>
-      <w:pPr>
-        <w:spacing w:before="60" w:after="60"/>
-      </w:pPr>
-      <w:r>
-        <w:t>No single paste-in — this phase is iterative. Run it as a review pass after each prior phase, and as a dedicated final pass at the end.</w:t>
-      </w:r>
-    </w:p>
-    <w:p>
-      <w:pPr>
-        <w:spacing w:before="60" w:after="60"/>
-      </w:pPr>
-      <w:r>
-        <w:rPr>
-          <w:b/>
-          <w:bCs/>
-        </w:rPr>
-        <w:t>Key instruction to include:</w:t>
-      </w:r>
-    </w:p>
-    <w:p>
-      <w:pPr>
-        <w:pStyle w:val="ListParagraph"/>
-        <w:numPr>
-          <w:ilvl w:val="0"/>
-          <w:numId w:val="12"/>
+          <w:numId w:val="14"/>
         </w:numPr>
         <w:spacing w:before="40" w:after="40"/>
       </w:pPr>
@@ -10171,7 +10613,7 @@
         <w:pStyle w:val="ListParagraph"/>
         <w:numPr>
           <w:ilvl w:val="0"/>
-          <w:numId w:val="12"/>
+          <w:numId w:val="14"/>
         </w:numPr>
         <w:spacing w:before="40" w:after="40"/>
       </w:pPr>
@@ -10184,7 +10626,7 @@
         <w:pStyle w:val="ListParagraph"/>
         <w:numPr>
           <w:ilvl w:val="0"/>
-          <w:numId w:val="12"/>
+          <w:numId w:val="14"/>
         </w:numPr>
         <w:spacing w:before="40" w:after="40"/>
       </w:pPr>
@@ -10197,7 +10639,7 @@
         <w:pStyle w:val="ListParagraph"/>
         <w:numPr>
           <w:ilvl w:val="0"/>
-          <w:numId w:val="12"/>
+          <w:numId w:val="14"/>
         </w:numPr>
         <w:spacing w:before="40" w:after="40"/>
       </w:pPr>
@@ -10210,7 +10652,7 @@
         <w:pStyle w:val="ListParagraph"/>
         <w:numPr>
           <w:ilvl w:val="0"/>
-          <w:numId w:val="12"/>
+          <w:numId w:val="14"/>
         </w:numPr>
         <w:spacing w:before="40" w:after="40"/>
       </w:pPr>
@@ -10223,12 +10665,11 @@
         <w:pStyle w:val="ListParagraph"/>
         <w:numPr>
           <w:ilvl w:val="0"/>
-          <w:numId w:val="12"/>
+          <w:numId w:val="14"/>
         </w:numPr>
         <w:spacing w:before="40" w:after="40"/>
       </w:pPr>
       <w:r>
-        <w:lastRenderedPageBreak/>
         <w:t>For UI, tell Claude Code to use shadcn/ui components and reference the design principle: calm, intimate, unhurried</w:t>
       </w:r>
     </w:p>
@@ -10237,7 +10678,7 @@
         <w:pStyle w:val="ListParagraph"/>
         <w:numPr>
           <w:ilvl w:val="0"/>
-          <w:numId w:val="12"/>
+          <w:numId w:val="14"/>
         </w:numPr>
         <w:spacing w:before="40" w:after="40"/>
       </w:pPr>
@@ -10416,6 +10857,60 @@
     </w:lvl>
   </w:abstractNum>
   <w:abstractNum w:abstractNumId="1" w15:restartNumberingAfterBreak="0">
+    <w:nsid w:val="285B5999"/>
+    <w:multiLevelType w:val="hybridMultilevel"/>
+    <w:tmpl w:val="F4483162"/>
+    <w:lvl w:ilvl="0" w:tplc="C5D4DCEE">
+      <w:start w:val="1"/>
+      <w:numFmt w:val="bullet"/>
+      <w:lvlText w:val="•"/>
+      <w:lvlJc w:val="left"/>
+      <w:pPr>
+        <w:ind w:left="720" w:hanging="360"/>
+      </w:pPr>
+    </w:lvl>
+    <w:lvl w:ilvl="1" w:tplc="30EE9FEA">
+      <w:numFmt w:val="decimal"/>
+      <w:lvlText w:val=""/>
+      <w:lvlJc w:val="left"/>
+    </w:lvl>
+    <w:lvl w:ilvl="2" w:tplc="7A965AAC">
+      <w:numFmt w:val="decimal"/>
+      <w:lvlText w:val=""/>
+      <w:lvlJc w:val="left"/>
+    </w:lvl>
+    <w:lvl w:ilvl="3" w:tplc="031EF942">
+      <w:numFmt w:val="decimal"/>
+      <w:lvlText w:val=""/>
+      <w:lvlJc w:val="left"/>
+    </w:lvl>
+    <w:lvl w:ilvl="4" w:tplc="11869D2E">
+      <w:numFmt w:val="decimal"/>
+      <w:lvlText w:val=""/>
+      <w:lvlJc w:val="left"/>
+    </w:lvl>
+    <w:lvl w:ilvl="5" w:tplc="705CD9D0">
+      <w:numFmt w:val="decimal"/>
+      <w:lvlText w:val=""/>
+      <w:lvlJc w:val="left"/>
+    </w:lvl>
+    <w:lvl w:ilvl="6" w:tplc="822E9620">
+      <w:numFmt w:val="decimal"/>
+      <w:lvlText w:val=""/>
+      <w:lvlJc w:val="left"/>
+    </w:lvl>
+    <w:lvl w:ilvl="7" w:tplc="D01C43BE">
+      <w:numFmt w:val="decimal"/>
+      <w:lvlText w:val=""/>
+      <w:lvlJc w:val="left"/>
+    </w:lvl>
+    <w:lvl w:ilvl="8" w:tplc="1B2CB226">
+      <w:numFmt w:val="decimal"/>
+      <w:lvlText w:val=""/>
+      <w:lvlJc w:val="left"/>
+    </w:lvl>
+  </w:abstractNum>
+  <w:abstractNum w:abstractNumId="2" w15:restartNumberingAfterBreak="0">
     <w:nsid w:val="29100C86"/>
     <w:multiLevelType w:val="hybridMultilevel"/>
     <w:tmpl w:val="4A587B48"/>
@@ -10473,7 +10968,7 @@
       <w:lvlJc w:val="left"/>
     </w:lvl>
   </w:abstractNum>
-  <w:abstractNum w:abstractNumId="2" w15:restartNumberingAfterBreak="0">
+  <w:abstractNum w:abstractNumId="3" w15:restartNumberingAfterBreak="0">
     <w:nsid w:val="31275264"/>
     <w:multiLevelType w:val="hybridMultilevel"/>
     <w:tmpl w:val="141232A8"/>
@@ -10527,7 +11022,7 @@
       <w:lvlJc w:val="left"/>
     </w:lvl>
   </w:abstractNum>
-  <w:abstractNum w:abstractNumId="3" w15:restartNumberingAfterBreak="0">
+  <w:abstractNum w:abstractNumId="4" w15:restartNumberingAfterBreak="0">
     <w:nsid w:val="33AF03F1"/>
     <w:multiLevelType w:val="hybridMultilevel"/>
     <w:tmpl w:val="EE12D8B0"/>
@@ -10613,7 +11108,65 @@
       </w:pPr>
     </w:lvl>
   </w:abstractNum>
-  <w:abstractNum w:abstractNumId="4" w15:restartNumberingAfterBreak="0">
+  <w:abstractNum w:abstractNumId="5" w15:restartNumberingAfterBreak="0">
+    <w:nsid w:val="378E1003"/>
+    <w:multiLevelType w:val="hybridMultilevel"/>
+    <w:tmpl w:val="D786D432"/>
+    <w:lvl w:ilvl="0" w:tplc="31BA3070">
+      <w:start w:val="1"/>
+      <w:numFmt w:val="bullet"/>
+      <w:lvlText w:val=""/>
+      <w:lvlJc w:val="left"/>
+      <w:pPr>
+        <w:ind w:left="0"/>
+      </w:pPr>
+    </w:lvl>
+    <w:lvl w:ilvl="1" w:tplc="9A124A66">
+      <w:start w:val="1"/>
+      <w:numFmt w:val="bullet"/>
+      <w:lvlText w:val="◦"/>
+      <w:lvlJc w:val="left"/>
+      <w:pPr>
+        <w:ind w:left="1080" w:hanging="360"/>
+      </w:pPr>
+    </w:lvl>
+    <w:lvl w:ilvl="2" w:tplc="8E02819C">
+      <w:numFmt w:val="decimal"/>
+      <w:lvlText w:val=""/>
+      <w:lvlJc w:val="left"/>
+    </w:lvl>
+    <w:lvl w:ilvl="3" w:tplc="9F3C66F8">
+      <w:numFmt w:val="decimal"/>
+      <w:lvlText w:val=""/>
+      <w:lvlJc w:val="left"/>
+    </w:lvl>
+    <w:lvl w:ilvl="4" w:tplc="D80A9D46">
+      <w:numFmt w:val="decimal"/>
+      <w:lvlText w:val=""/>
+      <w:lvlJc w:val="left"/>
+    </w:lvl>
+    <w:lvl w:ilvl="5" w:tplc="0E8E9BF0">
+      <w:numFmt w:val="decimal"/>
+      <w:lvlText w:val=""/>
+      <w:lvlJc w:val="left"/>
+    </w:lvl>
+    <w:lvl w:ilvl="6" w:tplc="B22CBB2E">
+      <w:numFmt w:val="decimal"/>
+      <w:lvlText w:val=""/>
+      <w:lvlJc w:val="left"/>
+    </w:lvl>
+    <w:lvl w:ilvl="7" w:tplc="6318F644">
+      <w:numFmt w:val="decimal"/>
+      <w:lvlText w:val=""/>
+      <w:lvlJc w:val="left"/>
+    </w:lvl>
+    <w:lvl w:ilvl="8" w:tplc="529CB910">
+      <w:numFmt w:val="decimal"/>
+      <w:lvlText w:val=""/>
+      <w:lvlJc w:val="left"/>
+    </w:lvl>
+  </w:abstractNum>
+  <w:abstractNum w:abstractNumId="6" w15:restartNumberingAfterBreak="0">
     <w:nsid w:val="3B026C82"/>
     <w:multiLevelType w:val="hybridMultilevel"/>
     <w:tmpl w:val="112654D0"/>
@@ -10671,7 +11224,7 @@
       <w:lvlJc w:val="left"/>
     </w:lvl>
   </w:abstractNum>
-  <w:abstractNum w:abstractNumId="5" w15:restartNumberingAfterBreak="0">
+  <w:abstractNum w:abstractNumId="7" w15:restartNumberingAfterBreak="0">
     <w:nsid w:val="3F543D56"/>
     <w:multiLevelType w:val="hybridMultilevel"/>
     <w:tmpl w:val="92D20DE8"/>
@@ -10729,7 +11282,7 @@
       <w:lvlJc w:val="left"/>
     </w:lvl>
   </w:abstractNum>
-  <w:abstractNum w:abstractNumId="6" w15:restartNumberingAfterBreak="0">
+  <w:abstractNum w:abstractNumId="8" w15:restartNumberingAfterBreak="0">
     <w:nsid w:val="484844FC"/>
     <w:multiLevelType w:val="hybridMultilevel"/>
     <w:tmpl w:val="58DEC63C"/>
@@ -10783,7 +11336,7 @@
       <w:lvlJc w:val="left"/>
     </w:lvl>
   </w:abstractNum>
-  <w:abstractNum w:abstractNumId="7" w15:restartNumberingAfterBreak="0">
+  <w:abstractNum w:abstractNumId="9" w15:restartNumberingAfterBreak="0">
     <w:nsid w:val="4AC24016"/>
     <w:multiLevelType w:val="hybridMultilevel"/>
     <w:tmpl w:val="A790CBE2"/>
@@ -10837,7 +11390,7 @@
       <w:lvlJc w:val="left"/>
     </w:lvl>
   </w:abstractNum>
-  <w:abstractNum w:abstractNumId="8" w15:restartNumberingAfterBreak="0">
+  <w:abstractNum w:abstractNumId="10" w15:restartNumberingAfterBreak="0">
     <w:nsid w:val="54214526"/>
     <w:multiLevelType w:val="hybridMultilevel"/>
     <w:tmpl w:val="04E04A02"/>
@@ -10891,7 +11444,7 @@
       <w:lvlJc w:val="left"/>
     </w:lvl>
   </w:abstractNum>
-  <w:abstractNum w:abstractNumId="9" w15:restartNumberingAfterBreak="0">
+  <w:abstractNum w:abstractNumId="11" w15:restartNumberingAfterBreak="0">
     <w:nsid w:val="6B6C68B6"/>
     <w:multiLevelType w:val="hybridMultilevel"/>
     <w:tmpl w:val="A4FC0218"/>
@@ -10945,7 +11498,7 @@
       <w:lvlJc w:val="left"/>
     </w:lvl>
   </w:abstractNum>
-  <w:abstractNum w:abstractNumId="10" w15:restartNumberingAfterBreak="0">
+  <w:abstractNum w:abstractNumId="12" w15:restartNumberingAfterBreak="0">
     <w:nsid w:val="6BD21823"/>
     <w:multiLevelType w:val="hybridMultilevel"/>
     <w:tmpl w:val="4FCEF8C2"/>
@@ -11003,7 +11556,7 @@
       <w:lvlJc w:val="left"/>
     </w:lvl>
   </w:abstractNum>
-  <w:abstractNum w:abstractNumId="11" w15:restartNumberingAfterBreak="0">
+  <w:abstractNum w:abstractNumId="13" w15:restartNumberingAfterBreak="0">
     <w:nsid w:val="6E6901D5"/>
     <w:multiLevelType w:val="hybridMultilevel"/>
     <w:tmpl w:val="DF9E5B0C"/>
@@ -11061,7 +11614,7 @@
       <w:lvlJc w:val="left"/>
     </w:lvl>
   </w:abstractNum>
-  <w:abstractNum w:abstractNumId="12" w15:restartNumberingAfterBreak="0">
+  <w:abstractNum w:abstractNumId="14" w15:restartNumberingAfterBreak="0">
     <w:nsid w:val="7116229D"/>
     <w:multiLevelType w:val="hybridMultilevel"/>
     <w:tmpl w:val="549C3508"/>
@@ -11115,7 +11668,7 @@
       <w:lvlJc w:val="left"/>
     </w:lvl>
   </w:abstractNum>
-  <w:abstractNum w:abstractNumId="13" w15:restartNumberingAfterBreak="0">
+  <w:abstractNum w:abstractNumId="15" w15:restartNumberingAfterBreak="0">
     <w:nsid w:val="72805935"/>
     <w:multiLevelType w:val="hybridMultilevel"/>
     <w:tmpl w:val="11DCA6A0"/>
@@ -11170,61 +11723,61 @@
     </w:lvl>
   </w:abstractNum>
   <w:num w:numId="1" w16cid:durableId="1941139963">
+    <w:abstractNumId w:val="4"/>
+    <w:lvlOverride w:ilvl="0">
+      <w:startOverride w:val="1"/>
+    </w:lvlOverride>
+  </w:num>
+  <w:num w:numId="2" w16cid:durableId="618073579">
     <w:abstractNumId w:val="3"/>
     <w:lvlOverride w:ilvl="0">
       <w:startOverride w:val="1"/>
     </w:lvlOverride>
   </w:num>
-  <w:num w:numId="2" w16cid:durableId="618073579">
+  <w:num w:numId="3" w16cid:durableId="1942714076">
     <w:abstractNumId w:val="2"/>
     <w:lvlOverride w:ilvl="0">
       <w:startOverride w:val="1"/>
     </w:lvlOverride>
   </w:num>
-  <w:num w:numId="3" w16cid:durableId="1942714076">
-    <w:abstractNumId w:val="1"/>
-    <w:lvlOverride w:ilvl="0">
-      <w:startOverride w:val="1"/>
-    </w:lvlOverride>
-  </w:num>
   <w:num w:numId="4" w16cid:durableId="796487070">
-    <w:abstractNumId w:val="9"/>
+    <w:abstractNumId w:val="11"/>
     <w:lvlOverride w:ilvl="0">
       <w:startOverride w:val="1"/>
     </w:lvlOverride>
   </w:num>
   <w:num w:numId="5" w16cid:durableId="309794570">
-    <w:abstractNumId w:val="11"/>
+    <w:abstractNumId w:val="13"/>
     <w:lvlOverride w:ilvl="0">
       <w:startOverride w:val="1"/>
     </w:lvlOverride>
   </w:num>
   <w:num w:numId="6" w16cid:durableId="479662805">
+    <w:abstractNumId w:val="14"/>
+    <w:lvlOverride w:ilvl="0">
+      <w:startOverride w:val="1"/>
+    </w:lvlOverride>
+  </w:num>
+  <w:num w:numId="7" w16cid:durableId="1507860073">
+    <w:abstractNumId w:val="7"/>
+    <w:lvlOverride w:ilvl="0">
+      <w:startOverride w:val="1"/>
+    </w:lvlOverride>
+  </w:num>
+  <w:num w:numId="8" w16cid:durableId="501435535">
+    <w:abstractNumId w:val="8"/>
+    <w:lvlOverride w:ilvl="0">
+      <w:startOverride w:val="1"/>
+    </w:lvlOverride>
+  </w:num>
+  <w:num w:numId="9" w16cid:durableId="55016373">
     <w:abstractNumId w:val="12"/>
     <w:lvlOverride w:ilvl="0">
       <w:startOverride w:val="1"/>
     </w:lvlOverride>
   </w:num>
-  <w:num w:numId="7" w16cid:durableId="1507860073">
-    <w:abstractNumId w:val="5"/>
-    <w:lvlOverride w:ilvl="0">
-      <w:startOverride w:val="1"/>
-    </w:lvlOverride>
-  </w:num>
-  <w:num w:numId="8" w16cid:durableId="501435535">
-    <w:abstractNumId w:val="6"/>
-    <w:lvlOverride w:ilvl="0">
-      <w:startOverride w:val="1"/>
-    </w:lvlOverride>
-  </w:num>
-  <w:num w:numId="9" w16cid:durableId="55016373">
+  <w:num w:numId="10" w16cid:durableId="2063093652">
     <w:abstractNumId w:val="10"/>
-    <w:lvlOverride w:ilvl="0">
-      <w:startOverride w:val="1"/>
-    </w:lvlOverride>
-  </w:num>
-  <w:num w:numId="10" w16cid:durableId="2063093652">
-    <w:abstractNumId w:val="8"/>
     <w:lvlOverride w:ilvl="0">
       <w:startOverride w:val="1"/>
     </w:lvlOverride>
@@ -11236,13 +11789,25 @@
     </w:lvlOverride>
   </w:num>
   <w:num w:numId="12" w16cid:durableId="1319573209">
-    <w:abstractNumId w:val="13"/>
+    <w:abstractNumId w:val="15"/>
     <w:lvlOverride w:ilvl="0">
       <w:startOverride w:val="1"/>
     </w:lvlOverride>
   </w:num>
   <w:num w:numId="13" w16cid:durableId="388379880">
-    <w:abstractNumId w:val="4"/>
+    <w:abstractNumId w:val="6"/>
+    <w:lvlOverride w:ilvl="0">
+      <w:startOverride w:val="1"/>
+    </w:lvlOverride>
+  </w:num>
+  <w:num w:numId="14" w16cid:durableId="1259564595">
+    <w:abstractNumId w:val="1"/>
+    <w:lvlOverride w:ilvl="0">
+      <w:startOverride w:val="1"/>
+    </w:lvlOverride>
+  </w:num>
+  <w:num w:numId="15" w16cid:durableId="1335065698">
+    <w:abstractNumId w:val="5"/>
     <w:lvlOverride w:ilvl="0">
       <w:startOverride w:val="1"/>
     </w:lvlOverride>

</xml_diff>

<commit_message>
fix: build error in check-availability + minor UI tweaks
- Fix: replace nonexistent getUserByEmail (not in GoTrueAdminApi v2)
  with listUsers(perPage:1, filter) + exact email match check
- Home: standardise search bar, sort, and new moment button to h-10
- Landing: update CTA copy to "Get started for free"
- Add moments_product_spec.docx to repo

Co-Authored-By: Claude Sonnet 4.6 <noreply@anthropic.com>
</commit_message>
<xml_diff>
--- a/moments_product_spec.docx
+++ b/moments_product_spec.docx
@@ -281,7 +281,7 @@
         <w:pStyle w:val="ListParagraph"/>
         <w:numPr>
           <w:ilvl w:val="0"/>
-          <w:numId w:val="14"/>
+          <w:numId w:val="18"/>
         </w:numPr>
         <w:spacing w:before="40" w:after="40"/>
       </w:pPr>
@@ -294,7 +294,7 @@
         <w:pStyle w:val="ListParagraph"/>
         <w:numPr>
           <w:ilvl w:val="0"/>
-          <w:numId w:val="14"/>
+          <w:numId w:val="18"/>
         </w:numPr>
         <w:spacing w:before="40" w:after="40"/>
       </w:pPr>
@@ -307,7 +307,7 @@
         <w:pStyle w:val="ListParagraph"/>
         <w:numPr>
           <w:ilvl w:val="0"/>
-          <w:numId w:val="14"/>
+          <w:numId w:val="18"/>
         </w:numPr>
         <w:spacing w:before="40" w:after="40"/>
       </w:pPr>
@@ -320,7 +320,7 @@
         <w:pStyle w:val="ListParagraph"/>
         <w:numPr>
           <w:ilvl w:val="0"/>
-          <w:numId w:val="14"/>
+          <w:numId w:val="18"/>
         </w:numPr>
         <w:spacing w:before="40" w:after="40"/>
       </w:pPr>
@@ -345,7 +345,7 @@
         <w:pStyle w:val="ListParagraph"/>
         <w:numPr>
           <w:ilvl w:val="0"/>
-          <w:numId w:val="14"/>
+          <w:numId w:val="18"/>
         </w:numPr>
         <w:spacing w:before="40" w:after="40"/>
       </w:pPr>
@@ -365,7 +365,7 @@
         <w:pStyle w:val="ListParagraph"/>
         <w:numPr>
           <w:ilvl w:val="0"/>
-          <w:numId w:val="14"/>
+          <w:numId w:val="18"/>
         </w:numPr>
         <w:spacing w:before="40" w:after="40"/>
       </w:pPr>
@@ -385,7 +385,7 @@
         <w:pStyle w:val="ListParagraph"/>
         <w:numPr>
           <w:ilvl w:val="0"/>
-          <w:numId w:val="14"/>
+          <w:numId w:val="18"/>
         </w:numPr>
         <w:spacing w:before="40" w:after="40"/>
       </w:pPr>
@@ -405,7 +405,7 @@
         <w:pStyle w:val="ListParagraph"/>
         <w:numPr>
           <w:ilvl w:val="0"/>
-          <w:numId w:val="14"/>
+          <w:numId w:val="18"/>
         </w:numPr>
         <w:spacing w:before="40" w:after="40"/>
       </w:pPr>
@@ -425,7 +425,7 @@
         <w:pStyle w:val="ListParagraph"/>
         <w:numPr>
           <w:ilvl w:val="0"/>
-          <w:numId w:val="14"/>
+          <w:numId w:val="18"/>
         </w:numPr>
         <w:spacing w:before="40" w:after="40"/>
       </w:pPr>
@@ -445,7 +445,7 @@
         <w:pStyle w:val="ListParagraph"/>
         <w:numPr>
           <w:ilvl w:val="0"/>
-          <w:numId w:val="14"/>
+          <w:numId w:val="18"/>
         </w:numPr>
         <w:spacing w:before="40" w:after="40"/>
       </w:pPr>
@@ -465,7 +465,7 @@
         <w:pStyle w:val="ListParagraph"/>
         <w:numPr>
           <w:ilvl w:val="0"/>
-          <w:numId w:val="14"/>
+          <w:numId w:val="18"/>
         </w:numPr>
         <w:spacing w:before="40" w:after="40"/>
       </w:pPr>
@@ -485,7 +485,7 @@
         <w:pStyle w:val="ListParagraph"/>
         <w:numPr>
           <w:ilvl w:val="0"/>
-          <w:numId w:val="14"/>
+          <w:numId w:val="18"/>
         </w:numPr>
         <w:spacing w:before="40" w:after="40"/>
       </w:pPr>
@@ -526,12 +526,12 @@
         <w:pStyle w:val="ListParagraph"/>
         <w:numPr>
           <w:ilvl w:val="0"/>
-          <w:numId w:val="14"/>
+          <w:numId w:val="18"/>
         </w:numPr>
         <w:spacing w:before="40" w:after="40"/>
       </w:pPr>
       <w:r>
-        <w:t>Sign up fields: first name, last name, email, username (unique-enforced), optional profile photo</w:t>
+        <w:t>Sign up fields: first name, last name, email, username (unique-enforced), password. Profile photo is uploaded later via the Account page.</w:t>
       </w:r>
     </w:p>
     <w:p>
@@ -539,7 +539,7 @@
         <w:pStyle w:val="ListParagraph"/>
         <w:numPr>
           <w:ilvl w:val="0"/>
-          <w:numId w:val="14"/>
+          <w:numId w:val="18"/>
         </w:numPr>
         <w:spacing w:before="40" w:after="40"/>
       </w:pPr>
@@ -552,7 +552,7 @@
         <w:pStyle w:val="ListParagraph"/>
         <w:numPr>
           <w:ilvl w:val="0"/>
-          <w:numId w:val="14"/>
+          <w:numId w:val="18"/>
         </w:numPr>
         <w:spacing w:before="40" w:after="40"/>
       </w:pPr>
@@ -569,7 +569,7 @@
         <w:pStyle w:val="ListParagraph"/>
         <w:numPr>
           <w:ilvl w:val="1"/>
-          <w:numId w:val="15"/>
+          <w:numId w:val="19"/>
         </w:numPr>
         <w:spacing w:before="30" w:after="30"/>
       </w:pPr>
@@ -595,7 +595,7 @@
         <w:pStyle w:val="ListParagraph"/>
         <w:numPr>
           <w:ilvl w:val="1"/>
-          <w:numId w:val="15"/>
+          <w:numId w:val="19"/>
         </w:numPr>
         <w:spacing w:before="30" w:after="30"/>
       </w:pPr>
@@ -621,7 +621,7 @@
         <w:pStyle w:val="ListParagraph"/>
         <w:numPr>
           <w:ilvl w:val="1"/>
-          <w:numId w:val="15"/>
+          <w:numId w:val="19"/>
         </w:numPr>
         <w:spacing w:before="30" w:after="30"/>
       </w:pPr>
@@ -647,7 +647,7 @@
         <w:pStyle w:val="ListParagraph"/>
         <w:numPr>
           <w:ilvl w:val="0"/>
-          <w:numId w:val="14"/>
+          <w:numId w:val="18"/>
         </w:numPr>
         <w:spacing w:before="40" w:after="40"/>
       </w:pPr>
@@ -664,7 +664,7 @@
         <w:pStyle w:val="ListParagraph"/>
         <w:numPr>
           <w:ilvl w:val="1"/>
-          <w:numId w:val="15"/>
+          <w:numId w:val="19"/>
         </w:numPr>
         <w:spacing w:before="30" w:after="30"/>
       </w:pPr>
@@ -690,7 +690,7 @@
         <w:pStyle w:val="ListParagraph"/>
         <w:numPr>
           <w:ilvl w:val="1"/>
-          <w:numId w:val="15"/>
+          <w:numId w:val="19"/>
         </w:numPr>
         <w:spacing w:before="30" w:after="30"/>
       </w:pPr>
@@ -716,7 +716,7 @@
         <w:pStyle w:val="ListParagraph"/>
         <w:numPr>
           <w:ilvl w:val="0"/>
-          <w:numId w:val="14"/>
+          <w:numId w:val="18"/>
         </w:numPr>
         <w:spacing w:before="40" w:after="40"/>
       </w:pPr>
@@ -729,7 +729,7 @@
         <w:pStyle w:val="ListParagraph"/>
         <w:numPr>
           <w:ilvl w:val="0"/>
-          <w:numId w:val="14"/>
+          <w:numId w:val="18"/>
         </w:numPr>
         <w:spacing w:before="40" w:after="40"/>
       </w:pPr>
@@ -742,7 +742,7 @@
         <w:pStyle w:val="ListParagraph"/>
         <w:numPr>
           <w:ilvl w:val="0"/>
-          <w:numId w:val="14"/>
+          <w:numId w:val="18"/>
         </w:numPr>
         <w:spacing w:before="40" w:after="40"/>
       </w:pPr>
@@ -767,7 +767,7 @@
         <w:pStyle w:val="ListParagraph"/>
         <w:numPr>
           <w:ilvl w:val="0"/>
-          <w:numId w:val="14"/>
+          <w:numId w:val="18"/>
         </w:numPr>
         <w:spacing w:before="40" w:after="40"/>
       </w:pPr>
@@ -780,7 +780,7 @@
         <w:pStyle w:val="ListParagraph"/>
         <w:numPr>
           <w:ilvl w:val="0"/>
-          <w:numId w:val="14"/>
+          <w:numId w:val="18"/>
         </w:numPr>
         <w:spacing w:before="40" w:after="40"/>
       </w:pPr>
@@ -793,7 +793,7 @@
         <w:pStyle w:val="ListParagraph"/>
         <w:numPr>
           <w:ilvl w:val="0"/>
-          <w:numId w:val="14"/>
+          <w:numId w:val="18"/>
         </w:numPr>
         <w:spacing w:before="40" w:after="40"/>
       </w:pPr>
@@ -806,7 +806,7 @@
         <w:pStyle w:val="ListParagraph"/>
         <w:numPr>
           <w:ilvl w:val="0"/>
-          <w:numId w:val="14"/>
+          <w:numId w:val="18"/>
         </w:numPr>
         <w:spacing w:before="40" w:after="40"/>
       </w:pPr>
@@ -819,7 +819,7 @@
         <w:pStyle w:val="ListParagraph"/>
         <w:numPr>
           <w:ilvl w:val="0"/>
-          <w:numId w:val="14"/>
+          <w:numId w:val="18"/>
         </w:numPr>
         <w:spacing w:before="40" w:after="40"/>
       </w:pPr>
@@ -832,7 +832,7 @@
         <w:pStyle w:val="ListParagraph"/>
         <w:numPr>
           <w:ilvl w:val="0"/>
-          <w:numId w:val="14"/>
+          <w:numId w:val="18"/>
         </w:numPr>
         <w:spacing w:before="40" w:after="40"/>
       </w:pPr>
@@ -857,7 +857,7 @@
         <w:pStyle w:val="ListParagraph"/>
         <w:numPr>
           <w:ilvl w:val="0"/>
-          <w:numId w:val="14"/>
+          <w:numId w:val="18"/>
         </w:numPr>
         <w:spacing w:before="40" w:after="40"/>
       </w:pPr>
@@ -870,7 +870,7 @@
         <w:pStyle w:val="ListParagraph"/>
         <w:numPr>
           <w:ilvl w:val="0"/>
-          <w:numId w:val="14"/>
+          <w:numId w:val="18"/>
         </w:numPr>
         <w:spacing w:before="40" w:after="40"/>
       </w:pPr>
@@ -895,7 +895,7 @@
         <w:pStyle w:val="ListParagraph"/>
         <w:numPr>
           <w:ilvl w:val="1"/>
-          <w:numId w:val="15"/>
+          <w:numId w:val="19"/>
         </w:numPr>
         <w:spacing w:before="30" w:after="30"/>
       </w:pPr>
@@ -904,7 +904,7 @@
           <w:sz w:val="20"/>
           <w:szCs w:val="20"/>
         </w:rPr>
-        <w:t>Chronologically ascending or descending</w:t>
+        <w:t>Newest first (default) or Oldest first</w:t>
       </w:r>
     </w:p>
     <w:p>
@@ -912,7 +912,7 @@
         <w:pStyle w:val="ListParagraph"/>
         <w:numPr>
           <w:ilvl w:val="1"/>
-          <w:numId w:val="15"/>
+          <w:numId w:val="19"/>
         </w:numPr>
         <w:spacing w:before="30" w:after="30"/>
       </w:pPr>
@@ -933,7 +933,7 @@
           <w:b/>
           <w:bCs/>
         </w:rPr>
-        <w:t>Filter options:</w:t>
+        <w:t>Search / filter:</w:t>
       </w:r>
     </w:p>
     <w:p>
@@ -941,7 +941,7 @@
         <w:pStyle w:val="ListParagraph"/>
         <w:numPr>
           <w:ilvl w:val="1"/>
-          <w:numId w:val="15"/>
+          <w:numId w:val="19"/>
         </w:numPr>
         <w:spacing w:before="30" w:after="30"/>
       </w:pPr>
@@ -950,7 +950,7 @@
           <w:sz w:val="20"/>
           <w:szCs w:val="20"/>
         </w:rPr>
-        <w:t>By date, location, people involved, keywords / tags</w:t>
+        <w:t>Single unified search box (client-side), matching across moment name, location, tags, and member first/last names simultaneously. Discrete filter controls (date range, people picker, location filter) are a future enhancement.</w:t>
       </w:r>
     </w:p>
     <w:p>
@@ -958,11 +958,12 @@
         <w:pStyle w:val="ListParagraph"/>
         <w:numPr>
           <w:ilvl w:val="0"/>
-          <w:numId w:val="14"/>
+          <w:numId w:val="18"/>
         </w:numPr>
         <w:spacing w:before="40" w:after="40"/>
       </w:pPr>
       <w:r>
+        <w:lastRenderedPageBreak/>
         <w:t>Tags are freeform (max 20 characters per tag), added by originator at creation or edit, editable by all editors after creation</w:t>
       </w:r>
     </w:p>
@@ -971,7 +972,7 @@
         <w:pStyle w:val="ListParagraph"/>
         <w:numPr>
           <w:ilvl w:val="0"/>
-          <w:numId w:val="14"/>
+          <w:numId w:val="18"/>
         </w:numPr>
         <w:spacing w:before="40" w:after="40"/>
       </w:pPr>
@@ -984,12 +985,11 @@
         <w:pStyle w:val="ListParagraph"/>
         <w:numPr>
           <w:ilvl w:val="0"/>
-          <w:numId w:val="14"/>
+          <w:numId w:val="18"/>
         </w:numPr>
         <w:spacing w:before="40" w:after="40"/>
       </w:pPr>
       <w:r>
-        <w:lastRenderedPageBreak/>
         <w:t>Periodic reminder notifications prompt users to capture a moment (configurable cadence, not moment-specific)</w:t>
       </w:r>
     </w:p>
@@ -1010,7 +1010,7 @@
         <w:pStyle w:val="ListParagraph"/>
         <w:numPr>
           <w:ilvl w:val="0"/>
-          <w:numId w:val="14"/>
+          <w:numId w:val="18"/>
         </w:numPr>
         <w:spacing w:before="40" w:after="40"/>
       </w:pPr>
@@ -1035,7 +1035,7 @@
         <w:pStyle w:val="ListParagraph"/>
         <w:numPr>
           <w:ilvl w:val="1"/>
-          <w:numId w:val="15"/>
+          <w:numId w:val="19"/>
         </w:numPr>
         <w:spacing w:before="30" w:after="30"/>
       </w:pPr>
@@ -1052,7 +1052,7 @@
         <w:pStyle w:val="ListParagraph"/>
         <w:numPr>
           <w:ilvl w:val="1"/>
-          <w:numId w:val="15"/>
+          <w:numId w:val="19"/>
         </w:numPr>
         <w:spacing w:before="30" w:after="30"/>
       </w:pPr>
@@ -1069,7 +1069,7 @@
         <w:pStyle w:val="ListParagraph"/>
         <w:numPr>
           <w:ilvl w:val="1"/>
-          <w:numId w:val="15"/>
+          <w:numId w:val="19"/>
         </w:numPr>
         <w:spacing w:before="30" w:after="30"/>
       </w:pPr>
@@ -1086,7 +1086,7 @@
         <w:pStyle w:val="ListParagraph"/>
         <w:numPr>
           <w:ilvl w:val="1"/>
-          <w:numId w:val="15"/>
+          <w:numId w:val="19"/>
         </w:numPr>
         <w:spacing w:before="30" w:after="30"/>
       </w:pPr>
@@ -1095,7 +1095,7 @@
           <w:sz w:val="20"/>
           <w:szCs w:val="20"/>
         </w:rPr>
-        <w:t>People involved — optional, invite by username or email</w:t>
+        <w:t>People involved — optional. Search by name or username (debounced, real-time results); type an email address to invite by email. Each added person appears as a chip with an inline Editor / Reader role toggle; default role is Editor. Role can be changed per person before the moment is created.</w:t>
       </w:r>
     </w:p>
     <w:p>
@@ -1103,7 +1103,7 @@
         <w:pStyle w:val="ListParagraph"/>
         <w:numPr>
           <w:ilvl w:val="1"/>
-          <w:numId w:val="15"/>
+          <w:numId w:val="19"/>
         </w:numPr>
         <w:spacing w:before="30" w:after="30"/>
       </w:pPr>
@@ -1120,12 +1120,12 @@
         <w:pStyle w:val="ListParagraph"/>
         <w:numPr>
           <w:ilvl w:val="0"/>
-          <w:numId w:val="14"/>
+          <w:numId w:val="18"/>
         </w:numPr>
         <w:spacing w:before="40" w:after="40"/>
       </w:pPr>
       <w:r>
-        <w:t>Invite modal flow — available from both the moment page Invite button and the Members page Invite button:</w:t>
+        <w:t>Standalone Invite flow (from moment page Invite button and Moment Settings Invite button) — two steps:</w:t>
       </w:r>
     </w:p>
     <w:p>
@@ -1133,7 +1133,7 @@
         <w:pStyle w:val="ListParagraph"/>
         <w:numPr>
           <w:ilvl w:val="1"/>
-          <w:numId w:val="15"/>
+          <w:numId w:val="19"/>
         </w:numPr>
         <w:spacing w:before="30" w:after="30"/>
       </w:pPr>
@@ -1142,7 +1142,7 @@
           <w:sz w:val="20"/>
           <w:szCs w:val="20"/>
         </w:rPr>
-        <w:t>Step 1 — Role selection: inviter chooses Editor or Reader</w:t>
+        <w:t>Step 1 — Role selection: inviter chooses Editor or Reader. Owners can invite as either; editors can only invite as Reader.</w:t>
       </w:r>
     </w:p>
     <w:p>
@@ -1150,7 +1150,7 @@
         <w:pStyle w:val="ListParagraph"/>
         <w:numPr>
           <w:ilvl w:val="1"/>
-          <w:numId w:val="15"/>
+          <w:numId w:val="19"/>
         </w:numPr>
         <w:spacing w:before="30" w:after="30"/>
       </w:pPr>
@@ -1167,7 +1167,7 @@
         <w:pStyle w:val="ListParagraph"/>
         <w:numPr>
           <w:ilvl w:val="1"/>
-          <w:numId w:val="15"/>
+          <w:numId w:val="19"/>
         </w:numPr>
         <w:spacing w:before="30" w:after="30"/>
       </w:pPr>
@@ -1184,7 +1184,7 @@
         <w:pStyle w:val="ListParagraph"/>
         <w:numPr>
           <w:ilvl w:val="1"/>
-          <w:numId w:val="15"/>
+          <w:numId w:val="19"/>
         </w:numPr>
         <w:spacing w:before="30" w:after="30"/>
       </w:pPr>
@@ -1210,7 +1210,7 @@
         <w:pStyle w:val="ListParagraph"/>
         <w:numPr>
           <w:ilvl w:val="1"/>
-          <w:numId w:val="15"/>
+          <w:numId w:val="19"/>
         </w:numPr>
         <w:spacing w:before="30" w:after="30"/>
       </w:pPr>
@@ -1236,7 +1236,7 @@
         <w:pStyle w:val="ListParagraph"/>
         <w:numPr>
           <w:ilvl w:val="1"/>
-          <w:numId w:val="15"/>
+          <w:numId w:val="19"/>
         </w:numPr>
         <w:spacing w:before="30" w:after="30"/>
       </w:pPr>
@@ -1262,7 +1262,7 @@
         <w:pStyle w:val="ListParagraph"/>
         <w:numPr>
           <w:ilvl w:val="1"/>
-          <w:numId w:val="15"/>
+          <w:numId w:val="19"/>
         </w:numPr>
         <w:spacing w:before="30" w:after="30"/>
       </w:pPr>
@@ -1288,7 +1288,7 @@
         <w:pStyle w:val="ListParagraph"/>
         <w:numPr>
           <w:ilvl w:val="1"/>
-          <w:numId w:val="15"/>
+          <w:numId w:val="19"/>
         </w:numPr>
         <w:spacing w:before="30" w:after="30"/>
       </w:pPr>
@@ -1305,7 +1305,7 @@
         <w:pStyle w:val="ListParagraph"/>
         <w:numPr>
           <w:ilvl w:val="0"/>
-          <w:numId w:val="14"/>
+          <w:numId w:val="18"/>
         </w:numPr>
         <w:spacing w:before="40" w:after="40"/>
       </w:pPr>
@@ -1318,7 +1318,7 @@
         <w:pStyle w:val="ListParagraph"/>
         <w:numPr>
           <w:ilvl w:val="0"/>
-          <w:numId w:val="14"/>
+          <w:numId w:val="18"/>
         </w:numPr>
         <w:spacing w:before="40" w:after="40"/>
       </w:pPr>
@@ -1331,7 +1331,7 @@
         <w:pStyle w:val="ListParagraph"/>
         <w:numPr>
           <w:ilvl w:val="0"/>
-          <w:numId w:val="14"/>
+          <w:numId w:val="18"/>
         </w:numPr>
         <w:spacing w:before="40" w:after="40"/>
       </w:pPr>
@@ -1356,11 +1356,12 @@
         <w:pStyle w:val="ListParagraph"/>
         <w:numPr>
           <w:ilvl w:val="0"/>
-          <w:numId w:val="14"/>
+          <w:numId w:val="18"/>
         </w:numPr>
         <w:spacing w:before="40" w:after="40"/>
       </w:pPr>
       <w:r>
+        <w:lastRenderedPageBreak/>
         <w:t>Collapsing header: full view on open (name, date, location, people involved, cover photo); collapses to moment name only when scrolling</w:t>
       </w:r>
     </w:p>
@@ -1369,7 +1370,7 @@
         <w:pStyle w:val="ListParagraph"/>
         <w:numPr>
           <w:ilvl w:val="0"/>
-          <w:numId w:val="14"/>
+          <w:numId w:val="18"/>
         </w:numPr>
         <w:spacing w:before="40" w:after="40"/>
       </w:pPr>
@@ -1382,7 +1383,7 @@
         <w:pStyle w:val="ListParagraph"/>
         <w:numPr>
           <w:ilvl w:val="0"/>
-          <w:numId w:val="14"/>
+          <w:numId w:val="18"/>
         </w:numPr>
         <w:spacing w:before="40" w:after="40"/>
       </w:pPr>
@@ -1399,7 +1400,7 @@
         <w:pStyle w:val="ListParagraph"/>
         <w:numPr>
           <w:ilvl w:val="1"/>
-          <w:numId w:val="15"/>
+          <w:numId w:val="19"/>
         </w:numPr>
         <w:spacing w:before="30" w:after="30"/>
       </w:pPr>
@@ -1408,7 +1409,6 @@
           <w:sz w:val="20"/>
           <w:szCs w:val="20"/>
         </w:rPr>
-        <w:lastRenderedPageBreak/>
         <w:t>Triggered from two entry points: the [...] menu on moment cards (edit first, archive second), and an edit button / [...] menu within the moment page header</w:t>
       </w:r>
     </w:p>
@@ -1417,7 +1417,7 @@
         <w:pStyle w:val="ListParagraph"/>
         <w:numPr>
           <w:ilvl w:val="1"/>
-          <w:numId w:val="15"/>
+          <w:numId w:val="19"/>
         </w:numPr>
         <w:spacing w:before="30" w:after="30"/>
       </w:pPr>
@@ -1434,7 +1434,7 @@
         <w:pStyle w:val="ListParagraph"/>
         <w:numPr>
           <w:ilvl w:val="1"/>
-          <w:numId w:val="15"/>
+          <w:numId w:val="19"/>
         </w:numPr>
         <w:spacing w:before="30" w:after="30"/>
       </w:pPr>
@@ -1451,7 +1451,7 @@
         <w:pStyle w:val="ListParagraph"/>
         <w:numPr>
           <w:ilvl w:val="1"/>
-          <w:numId w:val="15"/>
+          <w:numId w:val="19"/>
         </w:numPr>
         <w:spacing w:before="30" w:after="30"/>
       </w:pPr>
@@ -1468,7 +1468,7 @@
         <w:pStyle w:val="ListParagraph"/>
         <w:numPr>
           <w:ilvl w:val="0"/>
-          <w:numId w:val="14"/>
+          <w:numId w:val="18"/>
         </w:numPr>
         <w:spacing w:before="40" w:after="40"/>
       </w:pPr>
@@ -1485,7 +1485,7 @@
         <w:pStyle w:val="ListParagraph"/>
         <w:numPr>
           <w:ilvl w:val="1"/>
-          <w:numId w:val="15"/>
+          <w:numId w:val="19"/>
         </w:numPr>
         <w:spacing w:before="30" w:after="30"/>
       </w:pPr>
@@ -1502,7 +1502,7 @@
         <w:pStyle w:val="ListParagraph"/>
         <w:numPr>
           <w:ilvl w:val="1"/>
-          <w:numId w:val="15"/>
+          <w:numId w:val="19"/>
         </w:numPr>
         <w:spacing w:before="30" w:after="30"/>
       </w:pPr>
@@ -1528,7 +1528,7 @@
         <w:pStyle w:val="ListParagraph"/>
         <w:numPr>
           <w:ilvl w:val="1"/>
-          <w:numId w:val="15"/>
+          <w:numId w:val="19"/>
         </w:numPr>
         <w:spacing w:before="30" w:after="30"/>
       </w:pPr>
@@ -1554,7 +1554,7 @@
         <w:pStyle w:val="ListParagraph"/>
         <w:numPr>
           <w:ilvl w:val="1"/>
-          <w:numId w:val="15"/>
+          <w:numId w:val="19"/>
         </w:numPr>
         <w:spacing w:before="30" w:after="30"/>
       </w:pPr>
@@ -1580,7 +1580,7 @@
         <w:pStyle w:val="ListParagraph"/>
         <w:numPr>
           <w:ilvl w:val="1"/>
-          <w:numId w:val="15"/>
+          <w:numId w:val="19"/>
         </w:numPr>
         <w:spacing w:before="30" w:after="30"/>
       </w:pPr>
@@ -1606,7 +1606,7 @@
         <w:pStyle w:val="ListParagraph"/>
         <w:numPr>
           <w:ilvl w:val="1"/>
-          <w:numId w:val="15"/>
+          <w:numId w:val="19"/>
         </w:numPr>
         <w:spacing w:before="30" w:after="30"/>
       </w:pPr>
@@ -1623,7 +1623,7 @@
         <w:pStyle w:val="ListParagraph"/>
         <w:numPr>
           <w:ilvl w:val="0"/>
-          <w:numId w:val="14"/>
+          <w:numId w:val="18"/>
         </w:numPr>
         <w:spacing w:before="40" w:after="40"/>
       </w:pPr>
@@ -1640,7 +1640,7 @@
         <w:pStyle w:val="ListParagraph"/>
         <w:numPr>
           <w:ilvl w:val="1"/>
-          <w:numId w:val="15"/>
+          <w:numId w:val="19"/>
         </w:numPr>
         <w:spacing w:before="30" w:after="30"/>
       </w:pPr>
@@ -1666,7 +1666,7 @@
         <w:pStyle w:val="ListParagraph"/>
         <w:numPr>
           <w:ilvl w:val="1"/>
-          <w:numId w:val="15"/>
+          <w:numId w:val="19"/>
         </w:numPr>
         <w:spacing w:before="30" w:after="30"/>
       </w:pPr>
@@ -1692,7 +1692,7 @@
         <w:pStyle w:val="ListParagraph"/>
         <w:numPr>
           <w:ilvl w:val="1"/>
-          <w:numId w:val="15"/>
+          <w:numId w:val="19"/>
         </w:numPr>
         <w:spacing w:before="30" w:after="30"/>
       </w:pPr>
@@ -1718,7 +1718,7 @@
         <w:pStyle w:val="ListParagraph"/>
         <w:numPr>
           <w:ilvl w:val="1"/>
-          <w:numId w:val="15"/>
+          <w:numId w:val="19"/>
         </w:numPr>
         <w:spacing w:before="30" w:after="30"/>
       </w:pPr>
@@ -1736,7 +1736,15 @@
           <w:sz w:val="20"/>
           <w:szCs w:val="20"/>
         </w:rPr>
-        <w:t>— compact single row. Left side: up to 5 overlapping avatar icons; if more members exist, show “+ X more” text. Hovering (desktop) or tapping (mobile) the avatars opens a popover listing all members ordered: owner first, then editors alphabetically, then readers alphabetically; each name has a small role icon (owner / editor / reader). Right side: small Invite button (icon + “Invite” label on desktop, icon only on mobile) and a Manage button with a settings/gear icon linking to /moments/[id]/members (Moment Settings page)</w:t>
+        <w:t xml:space="preserve">— compact single row. Left side: up to 5 overlapping avatar icons; if more members exist, show “+ X more” text. Hovering (desktop) or tapping (mobile) the avatars opens a popover listing all members ordered: owner first, then editors alphabetically, then readers alphabetically; each name has a small role icon (owner / editor / reader). Right side: </w:t>
+      </w:r>
+      <w:r>
+        <w:rPr>
+          <w:sz w:val="20"/>
+          <w:szCs w:val="20"/>
+        </w:rPr>
+        <w:lastRenderedPageBreak/>
+        <w:t>small Invite button (icon + “Invite” label on desktop, icon only on mobile) and a Manage button with a settings/gear icon linking to /moments/[id]/members (Moment Settings page)</w:t>
       </w:r>
     </w:p>
     <w:p>
@@ -1744,7 +1752,7 @@
         <w:pStyle w:val="ListParagraph"/>
         <w:numPr>
           <w:ilvl w:val="1"/>
-          <w:numId w:val="15"/>
+          <w:numId w:val="19"/>
         </w:numPr>
         <w:spacing w:before="30" w:after="30"/>
       </w:pPr>
@@ -1755,7 +1763,7 @@
           <w:sz w:val="20"/>
           <w:szCs w:val="20"/>
         </w:rPr>
-        <w:t xml:space="preserve">5. Posts / Entries </w:t>
+        <w:t xml:space="preserve">5. Posts </w:t>
       </w:r>
       <w:r>
         <w:rPr>
@@ -1770,12 +1778,12 @@
         <w:pStyle w:val="ListParagraph"/>
         <w:numPr>
           <w:ilvl w:val="0"/>
-          <w:numId w:val="14"/>
+          <w:numId w:val="18"/>
         </w:numPr>
         <w:spacing w:before="40" w:after="40"/>
       </w:pPr>
       <w:r>
-        <w:t>Journal entries displayed immediately below the members row</w:t>
+        <w:t>Posts displayed immediately below the members row</w:t>
       </w:r>
     </w:p>
     <w:p>
@@ -1795,7 +1803,362 @@
         <w:pStyle w:val="ListParagraph"/>
         <w:numPr>
           <w:ilvl w:val="1"/>
-          <w:numId w:val="15"/>
+          <w:numId w:val="19"/>
+        </w:numPr>
+        <w:spacing w:before="30" w:after="30"/>
+      </w:pPr>
+      <w:r>
+        <w:rPr>
+          <w:sz w:val="20"/>
+          <w:szCs w:val="20"/>
+        </w:rPr>
+        <w:t>Sort: ascending or descending by date posted</w:t>
+      </w:r>
+    </w:p>
+    <w:p>
+      <w:pPr>
+        <w:pStyle w:val="ListParagraph"/>
+        <w:numPr>
+          <w:ilvl w:val="1"/>
+          <w:numId w:val="19"/>
+        </w:numPr>
+        <w:spacing w:before="30" w:after="30"/>
+      </w:pPr>
+      <w:r>
+        <w:rPr>
+          <w:sz w:val="20"/>
+          <w:szCs w:val="20"/>
+        </w:rPr>
+        <w:t>Filter: by user</w:t>
+      </w:r>
+    </w:p>
+    <w:p>
+      <w:pPr>
+        <w:pStyle w:val="ListParagraph"/>
+        <w:numPr>
+          <w:ilvl w:val="0"/>
+          <w:numId w:val="18"/>
+        </w:numPr>
+        <w:spacing w:before="40" w:after="40"/>
+      </w:pPr>
+      <w:r>
+        <w:t>Each post displays: author name, timestamp, narrative text, embedded media</w:t>
+      </w:r>
+    </w:p>
+    <w:p>
+      <w:pPr>
+        <w:pStyle w:val="ListParagraph"/>
+        <w:numPr>
+          <w:ilvl w:val="0"/>
+          <w:numId w:val="18"/>
+        </w:numPr>
+        <w:spacing w:before="40" w:after="40"/>
+      </w:pPr>
+      <w:r>
+        <w:t>Media supported per post: photos, videos, voice recordings</w:t>
+      </w:r>
+    </w:p>
+    <w:p>
+      <w:pPr>
+        <w:pStyle w:val="ListParagraph"/>
+        <w:numPr>
+          <w:ilvl w:val="0"/>
+          <w:numId w:val="18"/>
+        </w:numPr>
+        <w:spacing w:before="40" w:after="40"/>
+      </w:pPr>
+      <w:r>
+        <w:t>No likes, reactions, or follower counts</w:t>
+      </w:r>
+    </w:p>
+    <w:p/>
+    <w:p>
+      <w:pPr>
+        <w:pStyle w:val="Heading2"/>
+        <w:pBdr>
+          <w:bottom w:val="single" w:sz="4" w:space="4" w:color="4A90B8"/>
+        </w:pBdr>
+      </w:pPr>
+      <w:r>
+        <w:t>2.6  Permissions</w:t>
+      </w:r>
+    </w:p>
+    <w:p>
+      <w:pPr>
+        <w:spacing w:before="60" w:after="60"/>
+      </w:pPr>
+      <w:r>
+        <w:rPr>
+          <w:b/>
+          <w:bCs/>
+        </w:rPr>
+        <w:t>Owner (originator):</w:t>
+      </w:r>
+    </w:p>
+    <w:p>
+      <w:pPr>
+        <w:pStyle w:val="ListParagraph"/>
+        <w:numPr>
+          <w:ilvl w:val="1"/>
+          <w:numId w:val="19"/>
+        </w:numPr>
+        <w:spacing w:before="30" w:after="30"/>
+      </w:pPr>
+      <w:r>
+        <w:rPr>
+          <w:sz w:val="20"/>
+          <w:szCs w:val="20"/>
+        </w:rPr>
+        <w:t>Full control: edit moment details, manage all members (change roles, remove editors and readers), transfer ownership, leave moment</w:t>
+      </w:r>
+    </w:p>
+    <w:p>
+      <w:pPr>
+        <w:pStyle w:val="ListParagraph"/>
+        <w:numPr>
+          <w:ilvl w:val="1"/>
+          <w:numId w:val="19"/>
+        </w:numPr>
+        <w:spacing w:before="30" w:after="30"/>
+      </w:pPr>
+      <w:r>
+        <w:rPr>
+          <w:sz w:val="20"/>
+          <w:szCs w:val="20"/>
+        </w:rPr>
+        <w:t>Leaving requires transferring ownership to an editor first (mandatory). If no editors exist, owner must either promote a reader to editor first, or leave and delete the entire moment for all members</w:t>
+      </w:r>
+    </w:p>
+    <w:p>
+      <w:pPr>
+        <w:pStyle w:val="ListParagraph"/>
+        <w:numPr>
+          <w:ilvl w:val="1"/>
+          <w:numId w:val="19"/>
+        </w:numPr>
+        <w:spacing w:before="30" w:after="30"/>
+      </w:pPr>
+      <w:r>
+        <w:rPr>
+          <w:sz w:val="20"/>
+          <w:szCs w:val="20"/>
+        </w:rPr>
+        <w:t>Ownership can only be transferred to an editor, not a reader. Transfer updates owner_id on the moments table and notifies both parties.</w:t>
+      </w:r>
+    </w:p>
+    <w:p>
+      <w:pPr>
+        <w:spacing w:before="60" w:after="60"/>
+      </w:pPr>
+      <w:r>
+        <w:rPr>
+          <w:b/>
+          <w:bCs/>
+        </w:rPr>
+        <w:t>Editors:</w:t>
+      </w:r>
+    </w:p>
+    <w:p>
+      <w:pPr>
+        <w:pStyle w:val="ListParagraph"/>
+        <w:numPr>
+          <w:ilvl w:val="1"/>
+          <w:numId w:val="19"/>
+        </w:numPr>
+        <w:spacing w:before="30" w:after="30"/>
+      </w:pPr>
+      <w:r>
+        <w:rPr>
+          <w:sz w:val="20"/>
+          <w:szCs w:val="20"/>
+        </w:rPr>
+        <w:t>Can post, edit moment details and tags, invite and remove readers, delete own and others’ posts. Cannot remove editors (owner only).</w:t>
+      </w:r>
+    </w:p>
+    <w:p>
+      <w:pPr>
+        <w:pStyle w:val="ListParagraph"/>
+        <w:numPr>
+          <w:ilvl w:val="1"/>
+          <w:numId w:val="19"/>
+        </w:numPr>
+        <w:spacing w:before="30" w:after="30"/>
+      </w:pPr>
+      <w:r>
+        <w:rPr>
+          <w:sz w:val="20"/>
+          <w:szCs w:val="20"/>
+        </w:rPr>
+        <w:t>Can leave a moment at any time, choosing to delete or keep their posts</w:t>
+      </w:r>
+    </w:p>
+    <w:p>
+      <w:pPr>
+        <w:spacing w:before="60" w:after="60"/>
+      </w:pPr>
+      <w:r>
+        <w:rPr>
+          <w:b/>
+          <w:bCs/>
+        </w:rPr>
+        <w:t>Readers:</w:t>
+      </w:r>
+    </w:p>
+    <w:p>
+      <w:pPr>
+        <w:pStyle w:val="ListParagraph"/>
+        <w:numPr>
+          <w:ilvl w:val="1"/>
+          <w:numId w:val="19"/>
+        </w:numPr>
+        <w:spacing w:before="30" w:after="30"/>
+      </w:pPr>
+      <w:r>
+        <w:rPr>
+          <w:sz w:val="20"/>
+          <w:szCs w:val="20"/>
+        </w:rPr>
+        <w:t>View only — cannot post or edit</w:t>
+      </w:r>
+    </w:p>
+    <w:p>
+      <w:pPr>
+        <w:pStyle w:val="ListParagraph"/>
+        <w:numPr>
+          <w:ilvl w:val="1"/>
+          <w:numId w:val="19"/>
+        </w:numPr>
+        <w:spacing w:before="30" w:after="30"/>
+      </w:pPr>
+      <w:r>
+        <w:rPr>
+          <w:sz w:val="20"/>
+          <w:szCs w:val="20"/>
+        </w:rPr>
+        <w:t>Invited by owner or any editor</w:t>
+      </w:r>
+    </w:p>
+    <w:p/>
+    <w:p>
+      <w:pPr>
+        <w:pStyle w:val="ListParagraph"/>
+        <w:numPr>
+          <w:ilvl w:val="0"/>
+          <w:numId w:val="18"/>
+        </w:numPr>
+        <w:spacing w:before="40" w:after="40"/>
+      </w:pPr>
+      <w:r>
+        <w:t>Any user can archive a moment for themselves only; this does not affect other users</w:t>
+      </w:r>
+    </w:p>
+    <w:p>
+      <w:pPr>
+        <w:pStyle w:val="ListParagraph"/>
+        <w:numPr>
+          <w:ilvl w:val="0"/>
+          <w:numId w:val="18"/>
+        </w:numPr>
+        <w:spacing w:before="40" w:after="40"/>
+      </w:pPr>
+      <w:r>
+        <w:t>Archived moments can be unarchived at any time</w:t>
+      </w:r>
+    </w:p>
+    <w:p>
+      <w:pPr>
+        <w:pStyle w:val="ListParagraph"/>
+        <w:numPr>
+          <w:ilvl w:val="0"/>
+          <w:numId w:val="18"/>
+        </w:numPr>
+        <w:spacing w:before="40" w:after="40"/>
+      </w:pPr>
+      <w:r>
+        <w:t>Notifications for archived moments are disabled by default, re-enableable per user</w:t>
+      </w:r>
+    </w:p>
+    <w:p/>
+    <w:p>
+      <w:pPr>
+        <w:pStyle w:val="Heading2"/>
+        <w:pBdr>
+          <w:bottom w:val="single" w:sz="4" w:space="4" w:color="4A90B8"/>
+        </w:pBdr>
+      </w:pPr>
+      <w:r>
+        <w:t>2.7  Invitations &amp; Links</w:t>
+      </w:r>
+    </w:p>
+    <w:p>
+      <w:pPr>
+        <w:spacing w:before="60" w:after="60"/>
+      </w:pPr>
+      <w:r>
+        <w:rPr>
+          <w:b/>
+          <w:bCs/>
+        </w:rPr>
+        <w:t>Direct invites (editors and readers):</w:t>
+      </w:r>
+    </w:p>
+    <w:p>
+      <w:pPr>
+        <w:pStyle w:val="ListParagraph"/>
+        <w:numPr>
+          <w:ilvl w:val="1"/>
+          <w:numId w:val="19"/>
+        </w:numPr>
+        <w:spacing w:before="30" w:after="30"/>
+      </w:pPr>
+      <w:r>
+        <w:rPr>
+          <w:sz w:val="20"/>
+          <w:szCs w:val="20"/>
+        </w:rPr>
+        <w:t>Sent by username or email; no prior friendship required; full invite modal flow as described in Section 2.4</w:t>
+      </w:r>
+    </w:p>
+    <w:p>
+      <w:pPr>
+        <w:pStyle w:val="ListParagraph"/>
+        <w:numPr>
+          <w:ilvl w:val="1"/>
+          <w:numId w:val="19"/>
+        </w:numPr>
+        <w:spacing w:before="30" w:after="30"/>
+      </w:pPr>
+      <w:r>
+        <w:rPr>
+          <w:sz w:val="20"/>
+          <w:szCs w:val="20"/>
+        </w:rPr>
+        <w:t>Registered users: receive an in-app notification only (no email). Notification states: “[username] ([full name]) invited you as [Editor / Reader] on moment [moment name]”</w:t>
+      </w:r>
+    </w:p>
+    <w:p>
+      <w:pPr>
+        <w:pStyle w:val="ListParagraph"/>
+        <w:numPr>
+          <w:ilvl w:val="1"/>
+          <w:numId w:val="19"/>
+        </w:numPr>
+        <w:spacing w:before="30" w:after="30"/>
+      </w:pPr>
+      <w:r>
+        <w:rPr>
+          <w:sz w:val="20"/>
+          <w:szCs w:val="20"/>
+        </w:rPr>
+        <w:t>Unregistered users: receive a sign-up email stating “[username] ([full name]) invited you as [Editor / Reader] on a moment on Remember When. Create an account to accept or decline.” with a link to the sign-up page with their email pre-filled. After email confirmation and first login they land on the home page with a banner directing them to their notifications where the pending invite awaits</w:t>
+      </w:r>
+    </w:p>
+    <w:p>
+      <w:pPr>
+        <w:pStyle w:val="ListParagraph"/>
+        <w:numPr>
+          <w:ilvl w:val="1"/>
+          <w:numId w:val="19"/>
         </w:numPr>
         <w:spacing w:before="30" w:after="30"/>
       </w:pPr>
@@ -1805,361 +2168,6 @@
           <w:szCs w:val="20"/>
         </w:rPr>
         <w:lastRenderedPageBreak/>
-        <w:t>Sort: ascending or descending by date posted</w:t>
-      </w:r>
-    </w:p>
-    <w:p>
-      <w:pPr>
-        <w:pStyle w:val="ListParagraph"/>
-        <w:numPr>
-          <w:ilvl w:val="1"/>
-          <w:numId w:val="15"/>
-        </w:numPr>
-        <w:spacing w:before="30" w:after="30"/>
-      </w:pPr>
-      <w:r>
-        <w:rPr>
-          <w:sz w:val="20"/>
-          <w:szCs w:val="20"/>
-        </w:rPr>
-        <w:t>Filter: by user</w:t>
-      </w:r>
-    </w:p>
-    <w:p>
-      <w:pPr>
-        <w:pStyle w:val="ListParagraph"/>
-        <w:numPr>
-          <w:ilvl w:val="0"/>
-          <w:numId w:val="14"/>
-        </w:numPr>
-        <w:spacing w:before="40" w:after="40"/>
-      </w:pPr>
-      <w:r>
-        <w:t>Each post displays: author name, timestamp, narrative text, embedded media</w:t>
-      </w:r>
-    </w:p>
-    <w:p>
-      <w:pPr>
-        <w:pStyle w:val="ListParagraph"/>
-        <w:numPr>
-          <w:ilvl w:val="0"/>
-          <w:numId w:val="14"/>
-        </w:numPr>
-        <w:spacing w:before="40" w:after="40"/>
-      </w:pPr>
-      <w:r>
-        <w:t>Media supported per post: photos, videos, voice recordings</w:t>
-      </w:r>
-    </w:p>
-    <w:p>
-      <w:pPr>
-        <w:pStyle w:val="ListParagraph"/>
-        <w:numPr>
-          <w:ilvl w:val="0"/>
-          <w:numId w:val="14"/>
-        </w:numPr>
-        <w:spacing w:before="40" w:after="40"/>
-      </w:pPr>
-      <w:r>
-        <w:t>No likes, reactions, or follower counts</w:t>
-      </w:r>
-    </w:p>
-    <w:p/>
-    <w:p>
-      <w:pPr>
-        <w:pStyle w:val="Heading2"/>
-        <w:pBdr>
-          <w:bottom w:val="single" w:sz="4" w:space="4" w:color="4A90B8"/>
-        </w:pBdr>
-      </w:pPr>
-      <w:r>
-        <w:t>2.6  Permissions</w:t>
-      </w:r>
-    </w:p>
-    <w:p>
-      <w:pPr>
-        <w:spacing w:before="60" w:after="60"/>
-      </w:pPr>
-      <w:r>
-        <w:rPr>
-          <w:b/>
-          <w:bCs/>
-        </w:rPr>
-        <w:t>Owner (originator):</w:t>
-      </w:r>
-    </w:p>
-    <w:p>
-      <w:pPr>
-        <w:pStyle w:val="ListParagraph"/>
-        <w:numPr>
-          <w:ilvl w:val="1"/>
-          <w:numId w:val="15"/>
-        </w:numPr>
-        <w:spacing w:before="30" w:after="30"/>
-      </w:pPr>
-      <w:r>
-        <w:rPr>
-          <w:sz w:val="20"/>
-          <w:szCs w:val="20"/>
-        </w:rPr>
-        <w:t>Full control: edit moment details, manage all members (change roles, remove editors and readers), transfer ownership, leave moment</w:t>
-      </w:r>
-    </w:p>
-    <w:p>
-      <w:pPr>
-        <w:pStyle w:val="ListParagraph"/>
-        <w:numPr>
-          <w:ilvl w:val="1"/>
-          <w:numId w:val="15"/>
-        </w:numPr>
-        <w:spacing w:before="30" w:after="30"/>
-      </w:pPr>
-      <w:r>
-        <w:rPr>
-          <w:sz w:val="20"/>
-          <w:szCs w:val="20"/>
-        </w:rPr>
-        <w:t>Leaving requires transferring ownership to an editor first (mandatory). If no editors exist, owner must either promote a reader to editor first, or leave and delete the entire moment for all members</w:t>
-      </w:r>
-    </w:p>
-    <w:p>
-      <w:pPr>
-        <w:pStyle w:val="ListParagraph"/>
-        <w:numPr>
-          <w:ilvl w:val="1"/>
-          <w:numId w:val="15"/>
-        </w:numPr>
-        <w:spacing w:before="30" w:after="30"/>
-      </w:pPr>
-      <w:r>
-        <w:rPr>
-          <w:sz w:val="20"/>
-          <w:szCs w:val="20"/>
-        </w:rPr>
-        <w:t>Ownership can only be transferred to an editor, not a reader. Transfer updates owner_id on the moments table and notifies both parties.</w:t>
-      </w:r>
-    </w:p>
-    <w:p>
-      <w:pPr>
-        <w:spacing w:before="60" w:after="60"/>
-      </w:pPr>
-      <w:r>
-        <w:rPr>
-          <w:b/>
-          <w:bCs/>
-        </w:rPr>
-        <w:t>Editors:</w:t>
-      </w:r>
-    </w:p>
-    <w:p>
-      <w:pPr>
-        <w:pStyle w:val="ListParagraph"/>
-        <w:numPr>
-          <w:ilvl w:val="1"/>
-          <w:numId w:val="15"/>
-        </w:numPr>
-        <w:spacing w:before="30" w:after="30"/>
-      </w:pPr>
-      <w:r>
-        <w:rPr>
-          <w:sz w:val="20"/>
-          <w:szCs w:val="20"/>
-        </w:rPr>
-        <w:t>Can post, edit moment details and tags, invite and remove readers, delete own and others’ posts. Cannot remove editors (owner only).</w:t>
-      </w:r>
-    </w:p>
-    <w:p>
-      <w:pPr>
-        <w:pStyle w:val="ListParagraph"/>
-        <w:numPr>
-          <w:ilvl w:val="1"/>
-          <w:numId w:val="15"/>
-        </w:numPr>
-        <w:spacing w:before="30" w:after="30"/>
-      </w:pPr>
-      <w:r>
-        <w:rPr>
-          <w:sz w:val="20"/>
-          <w:szCs w:val="20"/>
-        </w:rPr>
-        <w:t>Can leave a moment at any time, choosing to delete or keep their posts</w:t>
-      </w:r>
-    </w:p>
-    <w:p>
-      <w:pPr>
-        <w:spacing w:before="60" w:after="60"/>
-      </w:pPr>
-      <w:r>
-        <w:rPr>
-          <w:b/>
-          <w:bCs/>
-        </w:rPr>
-        <w:t>Readers:</w:t>
-      </w:r>
-    </w:p>
-    <w:p>
-      <w:pPr>
-        <w:pStyle w:val="ListParagraph"/>
-        <w:numPr>
-          <w:ilvl w:val="1"/>
-          <w:numId w:val="15"/>
-        </w:numPr>
-        <w:spacing w:before="30" w:after="30"/>
-      </w:pPr>
-      <w:r>
-        <w:rPr>
-          <w:sz w:val="20"/>
-          <w:szCs w:val="20"/>
-        </w:rPr>
-        <w:t>View only — cannot post or edit</w:t>
-      </w:r>
-    </w:p>
-    <w:p>
-      <w:pPr>
-        <w:pStyle w:val="ListParagraph"/>
-        <w:numPr>
-          <w:ilvl w:val="1"/>
-          <w:numId w:val="15"/>
-        </w:numPr>
-        <w:spacing w:before="30" w:after="30"/>
-      </w:pPr>
-      <w:r>
-        <w:rPr>
-          <w:sz w:val="20"/>
-          <w:szCs w:val="20"/>
-        </w:rPr>
-        <w:t>Invited by owner or any editor</w:t>
-      </w:r>
-    </w:p>
-    <w:p/>
-    <w:p>
-      <w:pPr>
-        <w:pStyle w:val="ListParagraph"/>
-        <w:numPr>
-          <w:ilvl w:val="0"/>
-          <w:numId w:val="14"/>
-        </w:numPr>
-        <w:spacing w:before="40" w:after="40"/>
-      </w:pPr>
-      <w:r>
-        <w:t>Any user can archive a moment for themselves only; this does not affect other users</w:t>
-      </w:r>
-    </w:p>
-    <w:p>
-      <w:pPr>
-        <w:pStyle w:val="ListParagraph"/>
-        <w:numPr>
-          <w:ilvl w:val="0"/>
-          <w:numId w:val="14"/>
-        </w:numPr>
-        <w:spacing w:before="40" w:after="40"/>
-      </w:pPr>
-      <w:r>
-        <w:t>Archived moments can be unarchived at any time</w:t>
-      </w:r>
-    </w:p>
-    <w:p>
-      <w:pPr>
-        <w:pStyle w:val="ListParagraph"/>
-        <w:numPr>
-          <w:ilvl w:val="0"/>
-          <w:numId w:val="14"/>
-        </w:numPr>
-        <w:spacing w:before="40" w:after="40"/>
-      </w:pPr>
-      <w:r>
-        <w:t>Notifications for archived moments are disabled by default, re-enableable per user</w:t>
-      </w:r>
-    </w:p>
-    <w:p/>
-    <w:p>
-      <w:pPr>
-        <w:pStyle w:val="Heading2"/>
-        <w:pBdr>
-          <w:bottom w:val="single" w:sz="4" w:space="4" w:color="4A90B8"/>
-        </w:pBdr>
-      </w:pPr>
-      <w:r>
-        <w:t>2.7  Invitations &amp; Links</w:t>
-      </w:r>
-    </w:p>
-    <w:p>
-      <w:pPr>
-        <w:spacing w:before="60" w:after="60"/>
-      </w:pPr>
-      <w:r>
-        <w:rPr>
-          <w:b/>
-          <w:bCs/>
-        </w:rPr>
-        <w:t>Direct invites (editors and readers):</w:t>
-      </w:r>
-    </w:p>
-    <w:p>
-      <w:pPr>
-        <w:pStyle w:val="ListParagraph"/>
-        <w:numPr>
-          <w:ilvl w:val="1"/>
-          <w:numId w:val="15"/>
-        </w:numPr>
-        <w:spacing w:before="30" w:after="30"/>
-      </w:pPr>
-      <w:r>
-        <w:rPr>
-          <w:sz w:val="20"/>
-          <w:szCs w:val="20"/>
-        </w:rPr>
-        <w:t>Sent by username or email; no prior friendship required; full invite modal flow as described in Section 2.4</w:t>
-      </w:r>
-    </w:p>
-    <w:p>
-      <w:pPr>
-        <w:pStyle w:val="ListParagraph"/>
-        <w:numPr>
-          <w:ilvl w:val="1"/>
-          <w:numId w:val="15"/>
-        </w:numPr>
-        <w:spacing w:before="30" w:after="30"/>
-      </w:pPr>
-      <w:r>
-        <w:rPr>
-          <w:sz w:val="20"/>
-          <w:szCs w:val="20"/>
-        </w:rPr>
-        <w:t>Registered users: receive an in-app notification only (no email). Notification states: “[username] ([full name]) invited you as [Editor / Reader] on moment [moment name]”</w:t>
-      </w:r>
-    </w:p>
-    <w:p>
-      <w:pPr>
-        <w:pStyle w:val="ListParagraph"/>
-        <w:numPr>
-          <w:ilvl w:val="1"/>
-          <w:numId w:val="15"/>
-        </w:numPr>
-        <w:spacing w:before="30" w:after="30"/>
-      </w:pPr>
-      <w:r>
-        <w:rPr>
-          <w:sz w:val="20"/>
-          <w:szCs w:val="20"/>
-        </w:rPr>
-        <w:t>Unregistered users: receive a sign-up email stating “[username] ([full name]) invited you as [Editor / Reader] on a moment on Remember When. Create an account to accept or decline.” with a link to the sign-up page with their email pre-filled. After email confirmation and first login they land on the home page with a banner directing them to their notifications where the pending invite awaits</w:t>
-      </w:r>
-    </w:p>
-    <w:p>
-      <w:pPr>
-        <w:pStyle w:val="ListParagraph"/>
-        <w:numPr>
-          <w:ilvl w:val="1"/>
-          <w:numId w:val="15"/>
-        </w:numPr>
-        <w:spacing w:before="30" w:after="30"/>
-      </w:pPr>
-      <w:r>
-        <w:rPr>
-          <w:sz w:val="20"/>
-          <w:szCs w:val="20"/>
-        </w:rPr>
         <w:t>All invites (registered and unregistered) must be accepted or declined; no expiry on direct invites</w:t>
       </w:r>
     </w:p>
@@ -2180,7 +2188,7 @@
         <w:pStyle w:val="ListParagraph"/>
         <w:numPr>
           <w:ilvl w:val="1"/>
-          <w:numId w:val="15"/>
+          <w:numId w:val="19"/>
         </w:numPr>
         <w:spacing w:before="30" w:after="30"/>
       </w:pPr>
@@ -2197,12 +2205,11 @@
         <w:pStyle w:val="ListParagraph"/>
         <w:numPr>
           <w:ilvl w:val="0"/>
-          <w:numId w:val="14"/>
+          <w:numId w:val="18"/>
         </w:numPr>
         <w:spacing w:before="40" w:after="40"/>
       </w:pPr>
       <w:r>
-        <w:lastRenderedPageBreak/>
         <w:t>At most one active link per moment at any time; issuing a new link immediately invalidates the previous one</w:t>
       </w:r>
     </w:p>
@@ -2211,7 +2218,7 @@
         <w:pStyle w:val="ListParagraph"/>
         <w:numPr>
           <w:ilvl w:val="0"/>
-          <w:numId w:val="14"/>
+          <w:numId w:val="18"/>
         </w:numPr>
         <w:spacing w:before="40" w:after="40"/>
       </w:pPr>
@@ -2224,7 +2231,7 @@
         <w:pStyle w:val="ListParagraph"/>
         <w:numPr>
           <w:ilvl w:val="0"/>
-          <w:numId w:val="14"/>
+          <w:numId w:val="18"/>
         </w:numPr>
         <w:spacing w:before="40" w:after="40"/>
       </w:pPr>
@@ -2271,8 +2278,9 @@
         <w:tblLook w:val="04A0" w:firstRow="1" w:lastRow="0" w:firstColumn="1" w:lastColumn="0" w:noHBand="0" w:noVBand="1"/>
       </w:tblPr>
       <w:tblGrid>
-        <w:gridCol w:w="6240"/>
-        <w:gridCol w:w="3120"/>
+        <w:gridCol w:w="4675"/>
+        <w:gridCol w:w="2409"/>
+        <w:gridCol w:w="2276"/>
       </w:tblGrid>
       <w:tr>
         <w:tblPrEx>
@@ -2281,6 +2289,10 @@
             <w:bottom w:w="0" w:type="dxa"/>
           </w:tblCellMar>
         </w:tblPrEx>
+        <w:trPr>
+          <w:gridAfter w:val="1"/>
+          <w:wAfter w:w="360" w:type="dxa"/>
+        </w:trPr>
         <w:tc>
           <w:tcPr>
             <w:tcW w:w="6240" w:type="dxa"/>
@@ -2349,6 +2361,10 @@
             <w:bottom w:w="0" w:type="dxa"/>
           </w:tblCellMar>
         </w:tblPrEx>
+        <w:trPr>
+          <w:gridAfter w:val="1"/>
+          <w:wAfter w:w="360" w:type="dxa"/>
+        </w:trPr>
         <w:tc>
           <w:tcPr>
             <w:tcW w:w="6240" w:type="dxa"/>
@@ -2411,6 +2427,10 @@
             <w:bottom w:w="0" w:type="dxa"/>
           </w:tblCellMar>
         </w:tblPrEx>
+        <w:trPr>
+          <w:gridAfter w:val="1"/>
+          <w:wAfter w:w="360" w:type="dxa"/>
+        </w:trPr>
         <w:tc>
           <w:tcPr>
             <w:tcW w:w="6240" w:type="dxa"/>
@@ -2473,6 +2493,10 @@
             <w:bottom w:w="0" w:type="dxa"/>
           </w:tblCellMar>
         </w:tblPrEx>
+        <w:trPr>
+          <w:gridAfter w:val="1"/>
+          <w:wAfter w:w="360" w:type="dxa"/>
+        </w:trPr>
         <w:tc>
           <w:tcPr>
             <w:tcW w:w="6240" w:type="dxa"/>
@@ -2535,6 +2559,10 @@
             <w:bottom w:w="0" w:type="dxa"/>
           </w:tblCellMar>
         </w:tblPrEx>
+        <w:trPr>
+          <w:gridAfter w:val="1"/>
+          <w:wAfter w:w="360" w:type="dxa"/>
+        </w:trPr>
         <w:tc>
           <w:tcPr>
             <w:tcW w:w="6240" w:type="dxa"/>
@@ -2597,6 +2625,10 @@
             <w:bottom w:w="0" w:type="dxa"/>
           </w:tblCellMar>
         </w:tblPrEx>
+        <w:trPr>
+          <w:gridAfter w:val="1"/>
+          <w:wAfter w:w="360" w:type="dxa"/>
+        </w:trPr>
         <w:tc>
           <w:tcPr>
             <w:tcW w:w="6240" w:type="dxa"/>
@@ -2659,6 +2691,10 @@
             <w:bottom w:w="0" w:type="dxa"/>
           </w:tblCellMar>
         </w:tblPrEx>
+        <w:trPr>
+          <w:gridAfter w:val="1"/>
+          <w:wAfter w:w="360" w:type="dxa"/>
+        </w:trPr>
         <w:tc>
           <w:tcPr>
             <w:tcW w:w="6240" w:type="dxa"/>
@@ -2721,6 +2757,10 @@
             <w:bottom w:w="0" w:type="dxa"/>
           </w:tblCellMar>
         </w:tblPrEx>
+        <w:trPr>
+          <w:gridAfter w:val="1"/>
+          <w:wAfter w:w="360" w:type="dxa"/>
+        </w:trPr>
         <w:tc>
           <w:tcPr>
             <w:tcW w:w="6240" w:type="dxa"/>
@@ -2783,6 +2823,10 @@
             <w:bottom w:w="0" w:type="dxa"/>
           </w:tblCellMar>
         </w:tblPrEx>
+        <w:trPr>
+          <w:gridAfter w:val="1"/>
+          <w:wAfter w:w="360" w:type="dxa"/>
+        </w:trPr>
         <w:tc>
           <w:tcPr>
             <w:tcW w:w="6240" w:type="dxa"/>
@@ -2806,7 +2850,7 @@
                 <w:sz w:val="20"/>
                 <w:szCs w:val="20"/>
               </w:rPr>
-              <w:t>Notifications for archived moments</w:t>
+              <w:t>Ownership transferred away from you (confirmation to previous owner)</w:t>
             </w:r>
           </w:p>
         </w:tc>
@@ -2833,7 +2877,7 @@
                 <w:sz w:val="20"/>
                 <w:szCs w:val="20"/>
               </w:rPr>
-              <w:t>Off</w:t>
+              <w:t>Always on (no toggle)</w:t>
             </w:r>
           </w:p>
         </w:tc>
@@ -2845,6 +2889,231 @@
             <w:bottom w:w="0" w:type="dxa"/>
           </w:tblCellMar>
         </w:tblPrEx>
+        <w:trPr>
+          <w:gridAfter w:val="1"/>
+          <w:wAfter w:w="360" w:type="dxa"/>
+        </w:trPr>
+        <w:tc>
+          <w:tcPr>
+            <w:tcW w:w="6240" w:type="dxa"/>
+            <w:tcBorders>
+              <w:top w:val="single" w:sz="1" w:space="0" w:color="CCCCCC"/>
+              <w:left w:val="single" w:sz="1" w:space="0" w:color="CCCCCC"/>
+              <w:bottom w:val="single" w:sz="1" w:space="0" w:color="CCCCCC"/>
+              <w:right w:val="single" w:sz="1" w:space="0" w:color="CCCCCC"/>
+            </w:tcBorders>
+            <w:shd w:val="clear" w:color="auto" w:fill="FFFFFF"/>
+            <w:tcMar>
+              <w:top w:w="80" w:type="dxa"/>
+              <w:left w:w="120" w:type="dxa"/>
+              <w:bottom w:w="80" w:type="dxa"/>
+              <w:right w:w="120" w:type="dxa"/>
+            </w:tcMar>
+          </w:tcPr>
+          <w:p>
+            <w:r>
+              <w:rPr>
+                <w:sz w:val="20"/>
+                <w:szCs w:val="20"/>
+              </w:rPr>
+              <w:t>Your role on a moment was changed</w:t>
+            </w:r>
+          </w:p>
+        </w:tc>
+        <w:tc>
+          <w:tcPr>
+            <w:tcW w:w="3120" w:type="dxa"/>
+            <w:tcBorders>
+              <w:top w:val="single" w:sz="1" w:space="0" w:color="CCCCCC"/>
+              <w:left w:val="single" w:sz="1" w:space="0" w:color="CCCCCC"/>
+              <w:bottom w:val="single" w:sz="1" w:space="0" w:color="CCCCCC"/>
+              <w:right w:val="single" w:sz="1" w:space="0" w:color="CCCCCC"/>
+            </w:tcBorders>
+            <w:shd w:val="clear" w:color="auto" w:fill="FFFFFF"/>
+            <w:tcMar>
+              <w:top w:w="80" w:type="dxa"/>
+              <w:left w:w="120" w:type="dxa"/>
+              <w:bottom w:w="80" w:type="dxa"/>
+              <w:right w:w="120" w:type="dxa"/>
+            </w:tcMar>
+          </w:tcPr>
+          <w:p>
+            <w:r>
+              <w:rPr>
+                <w:sz w:val="20"/>
+                <w:szCs w:val="20"/>
+              </w:rPr>
+              <w:t>Always on (no toggle)</w:t>
+            </w:r>
+          </w:p>
+        </w:tc>
+      </w:tr>
+      <w:tr>
+        <w:tblPrEx>
+          <w:tblCellMar>
+            <w:top w:w="0" w:type="dxa"/>
+            <w:bottom w:w="0" w:type="dxa"/>
+          </w:tblCellMar>
+        </w:tblPrEx>
+        <w:tc>
+          <w:tcPr>
+            <w:tcW w:w="6240" w:type="dxa"/>
+            <w:tcBorders>
+              <w:top w:val="single" w:sz="1" w:space="0" w:color="CCCCCC"/>
+              <w:left w:val="single" w:sz="1" w:space="0" w:color="CCCCCC"/>
+              <w:bottom w:val="single" w:sz="1" w:space="0" w:color="CCCCCC"/>
+              <w:right w:val="single" w:sz="1" w:space="0" w:color="CCCCCC"/>
+            </w:tcBorders>
+            <w:shd w:val="clear" w:color="auto" w:fill="F5F5F5"/>
+            <w:tcMar>
+              <w:top w:w="80" w:type="dxa"/>
+              <w:left w:w="120" w:type="dxa"/>
+              <w:bottom w:w="80" w:type="dxa"/>
+              <w:right w:w="120" w:type="dxa"/>
+            </w:tcMar>
+          </w:tcPr>
+          <w:p>
+            <w:r>
+              <w:rPr>
+                <w:sz w:val="20"/>
+                <w:szCs w:val="20"/>
+              </w:rPr>
+              <w:t>A moment you were part of was deleted by its owner</w:t>
+            </w:r>
+          </w:p>
+        </w:tc>
+        <w:tc>
+          <w:tcPr>
+            <w:tcW w:w="3120" w:type="dxa"/>
+            <w:tcBorders>
+              <w:top w:val="single" w:sz="1" w:space="0" w:color="CCCCCC"/>
+              <w:left w:val="single" w:sz="1" w:space="0" w:color="CCCCCC"/>
+              <w:bottom w:val="single" w:sz="1" w:space="0" w:color="CCCCCC"/>
+              <w:right w:val="single" w:sz="1" w:space="0" w:color="CCCCCC"/>
+            </w:tcBorders>
+            <w:shd w:val="clear" w:color="auto" w:fill="F5F5F5"/>
+            <w:tcMar>
+              <w:top w:w="80" w:type="dxa"/>
+              <w:left w:w="120" w:type="dxa"/>
+              <w:bottom w:w="80" w:type="dxa"/>
+              <w:right w:w="120" w:type="dxa"/>
+            </w:tcMar>
+          </w:tcPr>
+          <w:p>
+            <w:r>
+              <w:rPr>
+                <w:sz w:val="20"/>
+                <w:szCs w:val="20"/>
+              </w:rPr>
+              <w:t>Always on (no toggle)</w:t>
+            </w:r>
+          </w:p>
+        </w:tc>
+        <w:tc>
+          <w:tcPr>
+            <w:tcW w:w="3120" w:type="dxa"/>
+            <w:tcBorders>
+              <w:top w:val="single" w:sz="1" w:space="0" w:color="CCCCCC"/>
+              <w:left w:val="single" w:sz="1" w:space="0" w:color="CCCCCC"/>
+              <w:bottom w:val="single" w:sz="1" w:space="0" w:color="CCCCCC"/>
+              <w:right w:val="single" w:sz="1" w:space="0" w:color="CCCCCC"/>
+            </w:tcBorders>
+            <w:shd w:val="clear" w:color="auto" w:fill="FFFFFF"/>
+            <w:tcMar>
+              <w:top w:w="80" w:type="dxa"/>
+              <w:left w:w="120" w:type="dxa"/>
+              <w:bottom w:w="80" w:type="dxa"/>
+              <w:right w:w="120" w:type="dxa"/>
+            </w:tcMar>
+          </w:tcPr>
+          <w:p>
+            <w:r>
+              <w:rPr>
+                <w:sz w:val="20"/>
+                <w:szCs w:val="20"/>
+              </w:rPr>
+              <w:t>On</w:t>
+            </w:r>
+          </w:p>
+        </w:tc>
+      </w:tr>
+      <w:tr>
+        <w:tblPrEx>
+          <w:tblCellMar>
+            <w:top w:w="0" w:type="dxa"/>
+            <w:bottom w:w="0" w:type="dxa"/>
+          </w:tblCellMar>
+        </w:tblPrEx>
+        <w:trPr>
+          <w:gridAfter w:val="1"/>
+          <w:wAfter w:w="360" w:type="dxa"/>
+        </w:trPr>
+        <w:tc>
+          <w:tcPr>
+            <w:tcW w:w="6240" w:type="dxa"/>
+            <w:tcBorders>
+              <w:top w:val="single" w:sz="1" w:space="0" w:color="CCCCCC"/>
+              <w:left w:val="single" w:sz="1" w:space="0" w:color="CCCCCC"/>
+              <w:bottom w:val="single" w:sz="1" w:space="0" w:color="CCCCCC"/>
+              <w:right w:val="single" w:sz="1" w:space="0" w:color="CCCCCC"/>
+            </w:tcBorders>
+            <w:shd w:val="clear" w:color="auto" w:fill="F5F5F5"/>
+            <w:tcMar>
+              <w:top w:w="80" w:type="dxa"/>
+              <w:left w:w="120" w:type="dxa"/>
+              <w:bottom w:w="80" w:type="dxa"/>
+              <w:right w:w="120" w:type="dxa"/>
+            </w:tcMar>
+          </w:tcPr>
+          <w:p>
+            <w:r>
+              <w:rPr>
+                <w:sz w:val="20"/>
+                <w:szCs w:val="20"/>
+              </w:rPr>
+              <w:t>Notifications for archived moments</w:t>
+            </w:r>
+          </w:p>
+        </w:tc>
+        <w:tc>
+          <w:tcPr>
+            <w:tcW w:w="3120" w:type="dxa"/>
+            <w:tcBorders>
+              <w:top w:val="single" w:sz="1" w:space="0" w:color="CCCCCC"/>
+              <w:left w:val="single" w:sz="1" w:space="0" w:color="CCCCCC"/>
+              <w:bottom w:val="single" w:sz="1" w:space="0" w:color="CCCCCC"/>
+              <w:right w:val="single" w:sz="1" w:space="0" w:color="CCCCCC"/>
+            </w:tcBorders>
+            <w:shd w:val="clear" w:color="auto" w:fill="F5F5F5"/>
+            <w:tcMar>
+              <w:top w:w="80" w:type="dxa"/>
+              <w:left w:w="120" w:type="dxa"/>
+              <w:bottom w:w="80" w:type="dxa"/>
+              <w:right w:w="120" w:type="dxa"/>
+            </w:tcMar>
+          </w:tcPr>
+          <w:p>
+            <w:r>
+              <w:rPr>
+                <w:sz w:val="20"/>
+                <w:szCs w:val="20"/>
+              </w:rPr>
+              <w:t>Off</w:t>
+            </w:r>
+          </w:p>
+        </w:tc>
+      </w:tr>
+      <w:tr>
+        <w:tblPrEx>
+          <w:tblCellMar>
+            <w:top w:w="0" w:type="dxa"/>
+            <w:bottom w:w="0" w:type="dxa"/>
+          </w:tblCellMar>
+        </w:tblPrEx>
+        <w:trPr>
+          <w:gridAfter w:val="1"/>
+          <w:wAfter w:w="360" w:type="dxa"/>
+        </w:trPr>
         <w:tc>
           <w:tcPr>
             <w:tcW w:w="6240" w:type="dxa"/>
@@ -2918,7 +3187,7 @@
         <w:pStyle w:val="ListParagraph"/>
         <w:numPr>
           <w:ilvl w:val="0"/>
-          <w:numId w:val="14"/>
+          <w:numId w:val="18"/>
         </w:numPr>
         <w:spacing w:before="40" w:after="40"/>
       </w:pPr>
@@ -2931,7 +3200,7 @@
         <w:pStyle w:val="ListParagraph"/>
         <w:numPr>
           <w:ilvl w:val="0"/>
-          <w:numId w:val="14"/>
+          <w:numId w:val="18"/>
         </w:numPr>
         <w:spacing w:before="40" w:after="40"/>
       </w:pPr>
@@ -2944,7 +3213,7 @@
         <w:pStyle w:val="ListParagraph"/>
         <w:numPr>
           <w:ilvl w:val="0"/>
-          <w:numId w:val="14"/>
+          <w:numId w:val="18"/>
         </w:numPr>
         <w:spacing w:before="40" w:after="40"/>
       </w:pPr>
@@ -2957,7 +3226,7 @@
         <w:pStyle w:val="ListParagraph"/>
         <w:numPr>
           <w:ilvl w:val="0"/>
-          <w:numId w:val="14"/>
+          <w:numId w:val="18"/>
         </w:numPr>
         <w:spacing w:before="40" w:after="40"/>
       </w:pPr>
@@ -2970,7 +3239,7 @@
         <w:pStyle w:val="ListParagraph"/>
         <w:numPr>
           <w:ilvl w:val="0"/>
-          <w:numId w:val="14"/>
+          <w:numId w:val="18"/>
         </w:numPr>
         <w:spacing w:before="40" w:after="40"/>
       </w:pPr>
@@ -2987,6 +3256,7 @@
         </w:pBdr>
       </w:pPr>
       <w:r>
+        <w:lastRenderedPageBreak/>
         <w:t>2.10  Future Layers (Out of Scope Now)</w:t>
       </w:r>
     </w:p>
@@ -2995,7 +3265,7 @@
         <w:pStyle w:val="ListParagraph"/>
         <w:numPr>
           <w:ilvl w:val="0"/>
-          <w:numId w:val="14"/>
+          <w:numId w:val="18"/>
         </w:numPr>
         <w:spacing w:before="40" w:after="40"/>
       </w:pPr>
@@ -3008,7 +3278,7 @@
         <w:pStyle w:val="ListParagraph"/>
         <w:numPr>
           <w:ilvl w:val="0"/>
-          <w:numId w:val="14"/>
+          <w:numId w:val="18"/>
         </w:numPr>
         <w:spacing w:before="40" w:after="40"/>
       </w:pPr>
@@ -3021,12 +3291,144 @@
         <w:pStyle w:val="ListParagraph"/>
         <w:numPr>
           <w:ilvl w:val="0"/>
-          <w:numId w:val="14"/>
+          <w:numId w:val="18"/>
         </w:numPr>
         <w:spacing w:before="40" w:after="40"/>
       </w:pPr>
       <w:r>
         <w:t>Mobile quick-capture widget / home screen shortcut</w:t>
+      </w:r>
+    </w:p>
+    <w:p/>
+    <w:p>
+      <w:pPr>
+        <w:pStyle w:val="Heading2"/>
+        <w:pBdr>
+          <w:bottom w:val="single" w:sz="4" w:space="4" w:color="4A90B8"/>
+        </w:pBdr>
+      </w:pPr>
+      <w:r>
+        <w:t>2.11  Additional Implemented Pages &amp; Flows</w:t>
+      </w:r>
+    </w:p>
+    <w:p>
+      <w:pPr>
+        <w:pStyle w:val="ListParagraph"/>
+        <w:numPr>
+          <w:ilvl w:val="0"/>
+          <w:numId w:val="18"/>
+        </w:numPr>
+        <w:spacing w:before="40" w:after="40"/>
+      </w:pPr>
+      <w:r>
+        <w:rPr>
+          <w:b/>
+          <w:bCs/>
+        </w:rPr>
+        <w:t xml:space="preserve">Auth callback (/auth/callback): </w:t>
+      </w:r>
+      <w:r>
+        <w:t>exchanges Supabase auth code for session; checks for pending moment invites tied to the user’s email and resolves them; creates in-app notifications for resolved invites; redirects to /home?pending_invite=true if invites were resolved, else /home.</w:t>
+      </w:r>
+    </w:p>
+    <w:p>
+      <w:pPr>
+        <w:pStyle w:val="ListParagraph"/>
+        <w:numPr>
+          <w:ilvl w:val="0"/>
+          <w:numId w:val="18"/>
+        </w:numPr>
+        <w:spacing w:before="40" w:after="40"/>
+      </w:pPr>
+      <w:r>
+        <w:rPr>
+          <w:b/>
+          <w:bCs/>
+        </w:rPr>
+        <w:t xml:space="preserve">Complete profile (/auth/complete-profile): </w:t>
+      </w:r>
+      <w:r>
+        <w:t>shown to email-invited users who have an auth entry but no public profile row. Collects first name, last name, username, and optional password. On save, redirects to /home?pending_invite=true or /home.</w:t>
+      </w:r>
+    </w:p>
+    <w:p>
+      <w:pPr>
+        <w:pStyle w:val="ListParagraph"/>
+        <w:numPr>
+          <w:ilvl w:val="0"/>
+          <w:numId w:val="18"/>
+        </w:numPr>
+        <w:spacing w:before="40" w:after="40"/>
+      </w:pPr>
+      <w:r>
+        <w:rPr>
+          <w:b/>
+          <w:bCs/>
+        </w:rPr>
+        <w:t xml:space="preserve">Invite confirm (/auth/invite-confirm): </w:t>
+      </w:r>
+      <w:r>
+        <w:t>handles Supabase magic-link hash tokens for invited users; parses hash fragment, establishes session, and routes to complete-profile or /home depending on profile completeness.</w:t>
+      </w:r>
+    </w:p>
+    <w:p>
+      <w:pPr>
+        <w:pStyle w:val="ListParagraph"/>
+        <w:numPr>
+          <w:ilvl w:val="0"/>
+          <w:numId w:val="18"/>
+        </w:numPr>
+        <w:spacing w:before="40" w:after="40"/>
+      </w:pPr>
+      <w:r>
+        <w:rPr>
+          <w:b/>
+          <w:bCs/>
+        </w:rPr>
+        <w:t xml:space="preserve">Join via shareable link (/join/[token]): </w:t>
+      </w:r>
+      <w:r>
+        <w:t>validates the invite_links token and expiry; creates a moment_members row (role: reader, status: accepted) immediately — no accept/decline step for link-joined readers. Redirects to the moment page. Invalid or expired tokens redirect to /home.</w:t>
+      </w:r>
+    </w:p>
+    <w:p>
+      <w:pPr>
+        <w:pStyle w:val="ListParagraph"/>
+        <w:numPr>
+          <w:ilvl w:val="0"/>
+          <w:numId w:val="18"/>
+        </w:numPr>
+        <w:spacing w:before="40" w:after="40"/>
+      </w:pPr>
+      <w:r>
+        <w:rPr>
+          <w:b/>
+          <w:bCs/>
+        </w:rPr>
+        <w:t xml:space="preserve">Reminder cron job (/api/cron/reminders): </w:t>
+      </w:r>
+      <w:r>
+        <w:t>Vercel Cron job running daily at 09:00 UTC. Fetches users with a non-“never” reminder cadence, checks last_reminder_at against their cadence, sends a reminder notification to eligible users, and updates last_reminder_at.</w:t>
+      </w:r>
+    </w:p>
+    <w:p>
+      <w:pPr>
+        <w:pStyle w:val="ListParagraph"/>
+        <w:numPr>
+          <w:ilvl w:val="0"/>
+          <w:numId w:val="18"/>
+        </w:numPr>
+        <w:spacing w:before="40" w:after="40"/>
+      </w:pPr>
+      <w:r>
+        <w:rPr>
+          <w:b/>
+          <w:bCs/>
+        </w:rPr>
+        <w:t xml:space="preserve">Notification suppression for archived moments: </w:t>
+      </w:r>
+      <w:r>
+        <w:t>when sending any notification, the system checks the recipient’s notification_preferences and moment_archive. If archived_moment_notifications is false and the moment is archived for that user, the notification is suppressed. Exception: direct invite responses (moment_invite, moment_invite_accepted/declined) bypass this suppression.</w:t>
       </w:r>
     </w:p>
     <w:p/>
@@ -3043,7 +3445,6 @@
         <w:pStyle w:val="Heading1"/>
       </w:pPr>
       <w:r>
-        <w:lastRenderedPageBreak/>
         <w:t>3. Data Model</w:t>
       </w:r>
     </w:p>
@@ -3253,6 +3654,7 @@
                 <w:sz w:val="18"/>
                 <w:szCs w:val="18"/>
               </w:rPr>
+              <w:lastRenderedPageBreak/>
               <w:t>first_name</w:t>
             </w:r>
           </w:p>
@@ -4739,7 +5141,6 @@
                 <w:sz w:val="18"/>
                 <w:szCs w:val="18"/>
               </w:rPr>
-              <w:lastRenderedPageBreak/>
               <w:t>created_at</w:t>
             </w:r>
           </w:p>
@@ -5095,6 +5496,7 @@
                 <w:sz w:val="18"/>
                 <w:szCs w:val="18"/>
               </w:rPr>
+              <w:lastRenderedPageBreak/>
               <w:t>role</w:t>
             </w:r>
           </w:p>
@@ -6421,7 +6823,6 @@
                 <w:sz w:val="20"/>
                 <w:szCs w:val="20"/>
               </w:rPr>
-              <w:lastRenderedPageBreak/>
               <w:t>Field</w:t>
             </w:r>
           </w:p>
@@ -6786,6 +7187,7 @@
         <w:pStyle w:val="Heading3"/>
       </w:pPr>
       <w:r>
+        <w:lastRenderedPageBreak/>
         <w:t>moment_archive</w:t>
       </w:r>
     </w:p>
@@ -8189,7 +8591,6 @@
         <w:pStyle w:val="Heading3"/>
       </w:pPr>
       <w:r>
-        <w:lastRenderedPageBreak/>
         <w:t>notification_preferences</w:t>
       </w:r>
     </w:p>
@@ -8646,6 +9047,7 @@
                 <w:sz w:val="18"/>
                 <w:szCs w:val="18"/>
               </w:rPr>
+              <w:lastRenderedPageBreak/>
               <w:t>moment_invite_response</w:t>
             </w:r>
           </w:p>
@@ -9063,7 +9465,7 @@
         <w:pStyle w:val="ListParagraph"/>
         <w:numPr>
           <w:ilvl w:val="0"/>
-          <w:numId w:val="14"/>
+          <w:numId w:val="18"/>
         </w:numPr>
         <w:spacing w:before="40" w:after="40"/>
       </w:pPr>
@@ -9076,7 +9478,7 @@
         <w:pStyle w:val="ListParagraph"/>
         <w:numPr>
           <w:ilvl w:val="0"/>
-          <w:numId w:val="14"/>
+          <w:numId w:val="18"/>
         </w:numPr>
         <w:spacing w:before="40" w:after="40"/>
       </w:pPr>
@@ -9089,7 +9491,7 @@
         <w:pStyle w:val="ListParagraph"/>
         <w:numPr>
           <w:ilvl w:val="0"/>
-          <w:numId w:val="14"/>
+          <w:numId w:val="18"/>
         </w:numPr>
         <w:spacing w:before="40" w:after="40"/>
       </w:pPr>
@@ -9102,7 +9504,7 @@
         <w:pStyle w:val="ListParagraph"/>
         <w:numPr>
           <w:ilvl w:val="0"/>
-          <w:numId w:val="14"/>
+          <w:numId w:val="18"/>
         </w:numPr>
         <w:spacing w:before="40" w:after="40"/>
       </w:pPr>
@@ -9147,7 +9549,7 @@
         <w:pStyle w:val="ListParagraph"/>
         <w:numPr>
           <w:ilvl w:val="0"/>
-          <w:numId w:val="14"/>
+          <w:numId w:val="18"/>
         </w:numPr>
         <w:spacing w:before="40" w:after="40"/>
       </w:pPr>
@@ -9160,12 +9562,11 @@
         <w:pStyle w:val="ListParagraph"/>
         <w:numPr>
           <w:ilvl w:val="0"/>
-          <w:numId w:val="14"/>
+          <w:numId w:val="18"/>
         </w:numPr>
         <w:spacing w:before="40" w:after="40"/>
       </w:pPr>
       <w:r>
-        <w:lastRenderedPageBreak/>
         <w:t>Settings / Notifications page — two sections: notification toggles (grouped by Friend activity / Moment activity / Reminders) and reminder cadence control (Weekly / Bi-weekly / Monthly / Never). UI only in this phase — no notifications firing yet.</w:t>
       </w:r>
     </w:p>
@@ -9174,7 +9575,7 @@
         <w:pStyle w:val="ListParagraph"/>
         <w:numPr>
           <w:ilvl w:val="0"/>
-          <w:numId w:val="14"/>
+          <w:numId w:val="18"/>
         </w:numPr>
         <w:spacing w:before="40" w:after="40"/>
       </w:pPr>
@@ -9187,7 +9588,7 @@
         <w:pStyle w:val="ListParagraph"/>
         <w:numPr>
           <w:ilvl w:val="0"/>
-          <w:numId w:val="14"/>
+          <w:numId w:val="18"/>
         </w:numPr>
         <w:spacing w:before="40" w:after="40"/>
       </w:pPr>
@@ -9200,7 +9601,7 @@
         <w:pStyle w:val="ListParagraph"/>
         <w:numPr>
           <w:ilvl w:val="0"/>
-          <w:numId w:val="14"/>
+          <w:numId w:val="18"/>
         </w:numPr>
         <w:spacing w:before="40" w:after="40"/>
       </w:pPr>
@@ -9213,7 +9614,7 @@
         <w:pStyle w:val="ListParagraph"/>
         <w:numPr>
           <w:ilvl w:val="0"/>
-          <w:numId w:val="14"/>
+          <w:numId w:val="18"/>
         </w:numPr>
         <w:spacing w:before="40" w:after="40"/>
       </w:pPr>
@@ -9258,7 +9659,7 @@
         <w:pStyle w:val="ListParagraph"/>
         <w:numPr>
           <w:ilvl w:val="0"/>
-          <w:numId w:val="14"/>
+          <w:numId w:val="18"/>
         </w:numPr>
         <w:spacing w:before="40" w:after="40"/>
       </w:pPr>
@@ -9271,7 +9672,7 @@
         <w:pStyle w:val="ListParagraph"/>
         <w:numPr>
           <w:ilvl w:val="0"/>
-          <w:numId w:val="14"/>
+          <w:numId w:val="18"/>
         </w:numPr>
         <w:spacing w:before="40" w:after="40"/>
       </w:pPr>
@@ -9284,7 +9685,7 @@
         <w:pStyle w:val="ListParagraph"/>
         <w:numPr>
           <w:ilvl w:val="0"/>
-          <w:numId w:val="14"/>
+          <w:numId w:val="18"/>
         </w:numPr>
         <w:spacing w:before="40" w:after="40"/>
       </w:pPr>
@@ -9297,7 +9698,7 @@
         <w:pStyle w:val="ListParagraph"/>
         <w:numPr>
           <w:ilvl w:val="0"/>
-          <w:numId w:val="14"/>
+          <w:numId w:val="18"/>
         </w:numPr>
         <w:spacing w:before="40" w:after="40"/>
       </w:pPr>
@@ -9342,7 +9743,7 @@
         <w:pStyle w:val="ListParagraph"/>
         <w:numPr>
           <w:ilvl w:val="0"/>
-          <w:numId w:val="14"/>
+          <w:numId w:val="18"/>
         </w:numPr>
         <w:spacing w:before="40" w:after="40"/>
       </w:pPr>
@@ -9355,7 +9756,7 @@
         <w:pStyle w:val="ListParagraph"/>
         <w:numPr>
           <w:ilvl w:val="0"/>
-          <w:numId w:val="14"/>
+          <w:numId w:val="18"/>
         </w:numPr>
         <w:spacing w:before="40" w:after="40"/>
       </w:pPr>
@@ -9368,7 +9769,7 @@
         <w:pStyle w:val="ListParagraph"/>
         <w:numPr>
           <w:ilvl w:val="0"/>
-          <w:numId w:val="14"/>
+          <w:numId w:val="18"/>
         </w:numPr>
         <w:spacing w:before="40" w:after="40"/>
       </w:pPr>
@@ -9381,7 +9782,7 @@
         <w:pStyle w:val="ListParagraph"/>
         <w:numPr>
           <w:ilvl w:val="0"/>
-          <w:numId w:val="14"/>
+          <w:numId w:val="18"/>
         </w:numPr>
         <w:spacing w:before="40" w:after="40"/>
       </w:pPr>
@@ -9394,7 +9795,7 @@
         <w:pStyle w:val="ListParagraph"/>
         <w:numPr>
           <w:ilvl w:val="0"/>
-          <w:numId w:val="14"/>
+          <w:numId w:val="18"/>
         </w:numPr>
         <w:spacing w:before="40" w:after="40"/>
       </w:pPr>
@@ -9407,7 +9808,7 @@
         <w:pStyle w:val="ListParagraph"/>
         <w:numPr>
           <w:ilvl w:val="0"/>
-          <w:numId w:val="14"/>
+          <w:numId w:val="18"/>
         </w:numPr>
         <w:spacing w:before="40" w:after="40"/>
       </w:pPr>
@@ -9420,7 +9821,7 @@
         <w:pStyle w:val="ListParagraph"/>
         <w:numPr>
           <w:ilvl w:val="0"/>
-          <w:numId w:val="14"/>
+          <w:numId w:val="18"/>
         </w:numPr>
         <w:spacing w:before="40" w:after="40"/>
       </w:pPr>
@@ -9433,7 +9834,7 @@
         <w:pStyle w:val="ListParagraph"/>
         <w:numPr>
           <w:ilvl w:val="0"/>
-          <w:numId w:val="14"/>
+          <w:numId w:val="18"/>
         </w:numPr>
         <w:spacing w:before="40" w:after="40"/>
       </w:pPr>
@@ -9446,7 +9847,7 @@
         <w:pStyle w:val="ListParagraph"/>
         <w:numPr>
           <w:ilvl w:val="0"/>
-          <w:numId w:val="14"/>
+          <w:numId w:val="18"/>
         </w:numPr>
         <w:spacing w:before="40" w:after="40"/>
       </w:pPr>
@@ -9459,7 +9860,7 @@
         <w:pStyle w:val="ListParagraph"/>
         <w:numPr>
           <w:ilvl w:val="0"/>
-          <w:numId w:val="14"/>
+          <w:numId w:val="18"/>
         </w:numPr>
         <w:spacing w:before="40" w:after="40"/>
       </w:pPr>
@@ -9472,12 +9873,12 @@
         <w:pStyle w:val="ListParagraph"/>
         <w:numPr>
           <w:ilvl w:val="0"/>
-          <w:numId w:val="14"/>
+          <w:numId w:val="18"/>
         </w:numPr>
         <w:spacing w:before="40" w:after="40"/>
       </w:pPr>
       <w:r>
-        <w:t>Navigation bar — links to Home, Account, Notifications (placeholder icon), and Friends; collapses to bottom tab bar or hamburger on mobile</w:t>
+        <w:t>Navigation bar — desktop: fixed top bar with Home, Friends, Notifications (bell icon with unread badge), Account (avatar). Mobile: fixed bottom tab bar with Home, Friends, Alerts (bell icon with unread badge), Account. No hamburger menu.</w:t>
       </w:r>
     </w:p>
     <w:p>
@@ -9497,7 +9898,6 @@
         </w:pBdr>
       </w:pPr>
       <w:r>
-        <w:lastRenderedPageBreak/>
         <w:t>Phase 5 — Posts &amp; Media</w:t>
       </w:r>
     </w:p>
@@ -9518,7 +9918,7 @@
         <w:pStyle w:val="ListParagraph"/>
         <w:numPr>
           <w:ilvl w:val="0"/>
-          <w:numId w:val="14"/>
+          <w:numId w:val="18"/>
         </w:numPr>
         <w:spacing w:before="40" w:after="40"/>
       </w:pPr>
@@ -9531,7 +9931,7 @@
         <w:pStyle w:val="ListParagraph"/>
         <w:numPr>
           <w:ilvl w:val="0"/>
-          <w:numId w:val="14"/>
+          <w:numId w:val="18"/>
         </w:numPr>
         <w:spacing w:before="40" w:after="40"/>
       </w:pPr>
@@ -9544,7 +9944,7 @@
         <w:pStyle w:val="ListParagraph"/>
         <w:numPr>
           <w:ilvl w:val="0"/>
-          <w:numId w:val="14"/>
+          <w:numId w:val="18"/>
         </w:numPr>
         <w:spacing w:before="40" w:after="40"/>
       </w:pPr>
@@ -9557,7 +9957,7 @@
         <w:pStyle w:val="ListParagraph"/>
         <w:numPr>
           <w:ilvl w:val="0"/>
-          <w:numId w:val="14"/>
+          <w:numId w:val="18"/>
         </w:numPr>
         <w:spacing w:before="40" w:after="40"/>
       </w:pPr>
@@ -9570,7 +9970,7 @@
         <w:pStyle w:val="ListParagraph"/>
         <w:numPr>
           <w:ilvl w:val="0"/>
-          <w:numId w:val="14"/>
+          <w:numId w:val="18"/>
         </w:numPr>
         <w:spacing w:before="40" w:after="40"/>
       </w:pPr>
@@ -9583,6 +9983,7 @@
         <w:spacing w:before="60" w:after="60"/>
       </w:pPr>
       <w:r>
+        <w:lastRenderedPageBreak/>
         <w:t>✓ End state: moments can be written into and feel alive.</w:t>
       </w:r>
     </w:p>
@@ -9603,7 +10004,7 @@
         <w:pStyle w:val="ListParagraph"/>
         <w:numPr>
           <w:ilvl w:val="0"/>
-          <w:numId w:val="14"/>
+          <w:numId w:val="18"/>
         </w:numPr>
         <w:spacing w:before="40" w:after="40"/>
       </w:pPr>
@@ -9616,7 +10017,7 @@
         <w:pStyle w:val="ListParagraph"/>
         <w:numPr>
           <w:ilvl w:val="0"/>
-          <w:numId w:val="14"/>
+          <w:numId w:val="18"/>
         </w:numPr>
         <w:spacing w:before="40" w:after="40"/>
       </w:pPr>
@@ -9629,7 +10030,7 @@
         <w:pStyle w:val="ListParagraph"/>
         <w:numPr>
           <w:ilvl w:val="0"/>
-          <w:numId w:val="14"/>
+          <w:numId w:val="18"/>
         </w:numPr>
         <w:spacing w:before="40" w:after="40"/>
       </w:pPr>
@@ -9642,7 +10043,7 @@
         <w:pStyle w:val="ListParagraph"/>
         <w:numPr>
           <w:ilvl w:val="0"/>
-          <w:numId w:val="14"/>
+          <w:numId w:val="18"/>
         </w:numPr>
         <w:spacing w:before="40" w:after="40"/>
       </w:pPr>
@@ -9687,7 +10088,7 @@
         <w:pStyle w:val="ListParagraph"/>
         <w:numPr>
           <w:ilvl w:val="0"/>
-          <w:numId w:val="14"/>
+          <w:numId w:val="18"/>
         </w:numPr>
         <w:spacing w:before="40" w:after="40"/>
       </w:pPr>
@@ -9700,7 +10101,7 @@
         <w:pStyle w:val="ListParagraph"/>
         <w:numPr>
           <w:ilvl w:val="0"/>
-          <w:numId w:val="14"/>
+          <w:numId w:val="18"/>
         </w:numPr>
         <w:spacing w:before="40" w:after="40"/>
       </w:pPr>
@@ -9713,7 +10114,7 @@
         <w:pStyle w:val="ListParagraph"/>
         <w:numPr>
           <w:ilvl w:val="0"/>
-          <w:numId w:val="14"/>
+          <w:numId w:val="18"/>
         </w:numPr>
         <w:spacing w:before="40" w:after="40"/>
       </w:pPr>
@@ -9726,7 +10127,7 @@
         <w:pStyle w:val="ListParagraph"/>
         <w:numPr>
           <w:ilvl w:val="0"/>
-          <w:numId w:val="14"/>
+          <w:numId w:val="18"/>
         </w:numPr>
         <w:spacing w:before="40" w:after="40"/>
       </w:pPr>
@@ -9771,7 +10172,7 @@
         <w:pStyle w:val="ListParagraph"/>
         <w:numPr>
           <w:ilvl w:val="0"/>
-          <w:numId w:val="14"/>
+          <w:numId w:val="18"/>
         </w:numPr>
         <w:spacing w:before="40" w:after="40"/>
       </w:pPr>
@@ -9784,7 +10185,7 @@
         <w:pStyle w:val="ListParagraph"/>
         <w:numPr>
           <w:ilvl w:val="0"/>
-          <w:numId w:val="14"/>
+          <w:numId w:val="18"/>
         </w:numPr>
         <w:spacing w:before="40" w:after="40"/>
       </w:pPr>
@@ -9821,7 +10222,6 @@
           <w:i/>
           <w:iCs/>
         </w:rPr>
-        <w:lastRenderedPageBreak/>
         <w:t>The difference between a working app and a good one. Revisit after each phase, not just at the end.</w:t>
       </w:r>
     </w:p>
@@ -9830,7 +10230,7 @@
         <w:pStyle w:val="ListParagraph"/>
         <w:numPr>
           <w:ilvl w:val="0"/>
-          <w:numId w:val="14"/>
+          <w:numId w:val="18"/>
         </w:numPr>
         <w:spacing w:before="40" w:after="40"/>
       </w:pPr>
@@ -9843,7 +10243,7 @@
         <w:pStyle w:val="ListParagraph"/>
         <w:numPr>
           <w:ilvl w:val="0"/>
-          <w:numId w:val="14"/>
+          <w:numId w:val="18"/>
         </w:numPr>
         <w:spacing w:before="40" w:after="40"/>
       </w:pPr>
@@ -9856,7 +10256,7 @@
         <w:pStyle w:val="ListParagraph"/>
         <w:numPr>
           <w:ilvl w:val="0"/>
-          <w:numId w:val="14"/>
+          <w:numId w:val="18"/>
         </w:numPr>
         <w:spacing w:before="40" w:after="40"/>
       </w:pPr>
@@ -9869,7 +10269,7 @@
         <w:pStyle w:val="ListParagraph"/>
         <w:numPr>
           <w:ilvl w:val="0"/>
-          <w:numId w:val="14"/>
+          <w:numId w:val="18"/>
         </w:numPr>
         <w:spacing w:before="40" w:after="40"/>
       </w:pPr>
@@ -10125,16 +10525,12 @@
         <w:pStyle w:val="ListParagraph"/>
         <w:numPr>
           <w:ilvl w:val="0"/>
-          <w:numId w:val="14"/>
+          <w:numId w:val="18"/>
         </w:numPr>
         <w:spacing w:before="40" w:after="40"/>
       </w:pPr>
       <w:r>
-        <w:t xml:space="preserve">“Set up the Supabase schema with all tables. Apply row level security policies so users can only access their own data. Set up Supabase Auth including forgot password / reset. </w:t>
-      </w:r>
-      <w:r>
-        <w:lastRenderedPageBreak/>
-        <w:t>Scaffold the Next.js app with placeholder routes for: home (/), moment detail (/moments/[id]), and account (/account).”</w:t>
+        <w:t>“Set up the Supabase schema with all tables. Apply row level security policies so users can only access their own data. Set up Supabase Auth including forgot password / reset. Scaffold the Next.js app with placeholder routes for: home (/), moment detail (/moments/[id]), and account (/account).”</w:t>
       </w:r>
     </w:p>
     <w:p/>
@@ -10171,7 +10567,7 @@
         <w:pStyle w:val="ListParagraph"/>
         <w:numPr>
           <w:ilvl w:val="0"/>
-          <w:numId w:val="14"/>
+          <w:numId w:val="18"/>
         </w:numPr>
         <w:spacing w:before="40" w:after="40"/>
       </w:pPr>
@@ -10184,11 +10580,12 @@
         <w:pStyle w:val="ListParagraph"/>
         <w:numPr>
           <w:ilvl w:val="0"/>
-          <w:numId w:val="14"/>
+          <w:numId w:val="18"/>
         </w:numPr>
         <w:spacing w:before="40" w:after="40"/>
       </w:pPr>
       <w:r>
+        <w:lastRenderedPageBreak/>
         <w:t>“The Account page (/account) must have three clearly separated sections. (1) Profile: editable fields for first name, last name, username (real-time uniqueness check as the user types), and email address. Email changes require the user to re-authenticate before saving — this is a Supabase Auth requirement. Profile photo: show the current photo with options to upload a new one, replace the existing one, or remove it entirely; store in Supabase Storage. (2) Security: a change password form with three fields — current password, new password, confirm new password. Validate that new and confirm match before submitting. (3) Danger zone: visually distinct section with a red outlined delete account button. Clicking it opens a confirmation modal that clearly states personal data will be permanently deleted but posts in shared moments will remain attributed to the user. The user must type their exact username into a text field in the modal before the delete button becomes active. On confirmation, hard delete all personal data from the users table and sign the user out.”</w:t>
       </w:r>
     </w:p>
@@ -10197,7 +10594,7 @@
         <w:pStyle w:val="ListParagraph"/>
         <w:numPr>
           <w:ilvl w:val="0"/>
-          <w:numId w:val="14"/>
+          <w:numId w:val="18"/>
         </w:numPr>
         <w:spacing w:before="40" w:after="40"/>
       </w:pPr>
@@ -10239,7 +10636,7 @@
         <w:pStyle w:val="ListParagraph"/>
         <w:numPr>
           <w:ilvl w:val="0"/>
-          <w:numId w:val="14"/>
+          <w:numId w:val="18"/>
         </w:numPr>
         <w:spacing w:before="40" w:after="40"/>
       </w:pPr>
@@ -10281,13 +10678,29 @@
         <w:pStyle w:val="ListParagraph"/>
         <w:numPr>
           <w:ilvl w:val="0"/>
-          <w:numId w:val="14"/>
+          <w:numId w:val="18"/>
         </w:numPr>
         <w:spacing w:before="40" w:after="40"/>
       </w:pPr>
       <w:r>
+        <w:t>“The date field in the create modal should support three modes: year only, month + year, or full date. Store as separate date_year, date_month, date_day columns. The collapsing header on the moment page should pin the moment name when scrolling. If an invited email has no matching account, store a pending invite tied to that email address and send a sign-up email; surface the invite automatically once they register. Add a navigation bar with links to Home, Account, Notifications (placeholder), and Friends; on mobile this should collapse to a bottom tab bar or hamburger menu.”</w:t>
+      </w:r>
+    </w:p>
+    <w:p>
+      <w:pPr>
+        <w:pStyle w:val="ListParagraph"/>
+        <w:numPr>
+          <w:ilvl w:val="0"/>
+          <w:numId w:val="18"/>
+        </w:numPr>
+        <w:spacing w:before="40" w:after="40"/>
+      </w:pPr>
+      <w:r>
+        <w:t xml:space="preserve">“Implement moment detail editing as follows. (1) Moment cards on the home page must show a [...] menu icon in the top right corner, visible on hover. The menu contains two options in this order: Edit moment (first), Archive (second). Only owners and editors see the Edit option — readers see Archive only. (2) The moment page header must also </w:t>
+      </w:r>
+      <w:r>
         <w:lastRenderedPageBreak/>
-        <w:t>“The date field in the create modal should support three modes: year only, month + year, or full date. Store as separate date_year, date_month, date_day columns. The collapsing header on the moment page should pin the moment name when scrolling. If an invited email has no matching account, store a pending invite tied to that email address and send a sign-up email; surface the invite automatically once they register. Add a navigation bar with links to Home, Account, Notifications (placeholder), and Friends; on mobile this should collapse to a bottom tab bar or hamburger menu.”</w:t>
+        <w:t>have an edit button or [...] menu allowing owners and editors to edit moment details from within the moment. (3) Both entry points open the same Edit moment modal, which reuses the create moment modal UI pre-populated with existing values. The modal title changes to “Edit moment” and the submit button reads “Save changes”. Editable fields: moment name (required), date including precision level (year only / month + year / full date), location, tags / keywords. Cover photo is NOT editable from this modal — it is only editable from within the moment page itself. (4) On save, update the relevant columns in the moments and moment_tags tables. Send a notification to all editors and readers of the moment that details have been updated.”</w:t>
       </w:r>
     </w:p>
     <w:p>
@@ -10295,25 +10708,12 @@
         <w:pStyle w:val="ListParagraph"/>
         <w:numPr>
           <w:ilvl w:val="0"/>
-          <w:numId w:val="14"/>
+          <w:numId w:val="18"/>
         </w:numPr>
         <w:spacing w:before="40" w:after="40"/>
       </w:pPr>
       <w:r>
-        <w:t>“Implement moment detail editing as follows. (1) Moment cards on the home page must show a [...] menu icon in the top right corner, visible on hover. The menu contains two options in this order: Edit moment (first), Archive (second). Only owners and editors see the Edit option — readers see Archive only. (2) The moment page header must also have an edit button or [...] menu allowing owners and editors to edit moment details from within the moment. (3) Both entry points open the same Edit moment modal, which reuses the create moment modal UI pre-populated with existing values. The modal title changes to “Edit moment” and the submit button reads “Save changes”. Editable fields: moment name (required), date including precision level (year only / month + year / full date), location, tags / keywords. Cover photo is NOT editable from this modal — it is only editable from within the moment page itself. (4) On save, update the relevant columns in the moments and moment_tags tables. Send a notification to all editors and readers of the moment that details have been updated.”</w:t>
-      </w:r>
-    </w:p>
-    <w:p>
-      <w:pPr>
-        <w:pStyle w:val="ListParagraph"/>
-        <w:numPr>
-          <w:ilvl w:val="0"/>
-          <w:numId w:val="14"/>
-        </w:numPr>
-        <w:spacing w:before="40" w:after="40"/>
-      </w:pPr>
-      <w:r>
-        <w:t>“Redesign the main moment page layout so posts appear as high up as possible. The correct top-to-bottom order is: (1) collapsing header with cover photo and gradient overlay, (2) Change cover photo button (owners and editors only — hidden from readers), (3) tags row, (4) members row, (5) posts / entries immediately below with no other content in between. The members row must be a compact single row: left side shows up to 5 overlapping avatar icons followed by ‘+ X more’ text if additional members exist; hovering on desktop or tapping on mobile opens a popover listing all members in order: owner first, then editors alphabetically, then readers alphabetically, each with a small role icon. Right side of the same row has two buttons: a small Invite button (icon + ‘Invite’ label on desktop, icon only on mobile) and a Manage button linking to /moments/[id]/members. The full manage members and invite link functionality must be moved to a dedicated Members page at /moments/[id]/members. This page contains: editor list (remove button visible to owner only), reader list (remove button visible to owners and editors), and the invite link generator with expiry options.”</w:t>
+        <w:t>“Redesign the main moment page layout so posts appear as high up as possible. The correct top-to-bottom order is: (1) collapsing header with cover photo and gradient overlay, (2) Change cover photo button (owners and editors only — hidden from readers), (3) tags row, (4) members row, (5) posts immediately below with no other content in between. The members row must be a compact single row: left side shows up to 5 overlapping avatar icons followed by ‘+ X more’ text if additional members exist; hovering on desktop or tapping on mobile opens a popover listing all members in order: owner first, then editors alphabetically, then readers alphabetically, each with a small role icon. Right side of the same row has two buttons: a small Invite button (icon + ‘Invite’ label on desktop, icon only on mobile) and a Manage button linking to /moments/[id]/members. The full manage members and invite link functionality must be moved to a dedicated Members page at /moments/[id]/members. This page contains: editor list (remove button visible to owner only), reader list (remove button visible to owners and editors), and the invite link generator with expiry options.”</w:t>
       </w:r>
     </w:p>
     <w:p/>
@@ -10350,7 +10750,7 @@
         <w:pStyle w:val="ListParagraph"/>
         <w:numPr>
           <w:ilvl w:val="0"/>
-          <w:numId w:val="14"/>
+          <w:numId w:val="18"/>
         </w:numPr>
         <w:spacing w:before="40" w:after="40"/>
       </w:pPr>
@@ -10363,32 +10763,29 @@
         <w:pStyle w:val="ListParagraph"/>
         <w:numPr>
           <w:ilvl w:val="0"/>
-          <w:numId w:val="14"/>
+          <w:numId w:val="18"/>
         </w:numPr>
         <w:spacing w:before="40" w:after="40"/>
       </w:pPr>
       <w:r>
-        <w:t xml:space="preserve">“Implement post editing with the following rules: (1) Only the original author of a post can edit it — no other editors or the moment owner can edit another user’s post. (2) Both text content and attached media are editable. When editing media, the author can add new items or remove existing ones; removing a media item should soft-delete its row in post_media (add a deleted_at column to post_media if not already present) and remove the file from Supabase Storage. (3) A post must always have at least one of: text content or at least one media item — prevent saving if both would be empty and show a </w:t>
-      </w:r>
+        <w:t>“Implement post editing with the following rules: (1) Only the original author of a post can edit it — no other editors or the moment owner can edit another user’s post. (2) Both text content and attached media are editable. When editing media, the author can add new items or remove existing ones; removing a media item should soft-delete its row in post_media (add a deleted_at column to post_media if not already present) and remove the file from Supabase Storage. (3) A post must always have at least one of: text content or at least one media item — prevent saving if both would be empty and show a validation message. (4) Add an edited_at nullable timestamp column to the posts table; set it to the current timestamp on every save. No edit history is stored — only the current version is kept. (5) UI: show a small pencil icon on each post, visible only to that post’s author. Clicking it opens the post creation modal pre-populated with existing content and media. The modal should clearly indicate the user is editing, not creating. (6) On each post, if edited_at is not null, display a subtle ‘Edited’ label alongside the edited_at timestamp so other users can see the post was modified. (7) Editing a post must not trigger a new post notification to other moment members.”</w:t>
+      </w:r>
+    </w:p>
+    <w:p/>
+    <w:p>
+      <w:pPr>
+        <w:pStyle w:val="Heading3"/>
+      </w:pPr>
+      <w:r>
+        <w:t>Phase 6 — Moment Settings, Leave &amp; Ownership</w:t>
+      </w:r>
+    </w:p>
+    <w:p>
+      <w:pPr>
+        <w:spacing w:before="60" w:after="60"/>
+      </w:pPr>
       <w:r>
         <w:lastRenderedPageBreak/>
-        <w:t>validation message. (4) Add an edited_at nullable timestamp column to the posts table; set it to the current timestamp on every save. No edit history is stored — only the current version is kept. (5) UI: show a small pencil icon on each post, visible only to that post’s author. Clicking it opens the post creation modal pre-populated with existing content and media. The modal should clearly indicate the user is editing, not creating. (6) On each post, if edited_at is not null, display a subtle ‘Edited’ label alongside the edited_at timestamp so other users can see the post was modified. (7) Editing a post must not trigger a new post notification to other moment members.”</w:t>
-      </w:r>
-    </w:p>
-    <w:p/>
-    <w:p>
-      <w:pPr>
-        <w:pStyle w:val="Heading3"/>
-      </w:pPr>
-      <w:r>
-        <w:t>Phase 6 — Moment Settings, Leave &amp; Ownership</w:t>
-      </w:r>
-    </w:p>
-    <w:p>
-      <w:pPr>
-        <w:spacing w:before="60" w:after="60"/>
-      </w:pPr>
-      <w:r>
         <w:t>Paste in: Section 2.5 (Moment Settings page spec), Section 2.6 (full permissions), Section 2.7 (Invitations &amp; Links), the invite_links and moment_members tables, and the Phase 6 build order entry.</w:t>
       </w:r>
     </w:p>
@@ -10409,7 +10806,7 @@
         <w:pStyle w:val="ListParagraph"/>
         <w:numPr>
           <w:ilvl w:val="0"/>
-          <w:numId w:val="14"/>
+          <w:numId w:val="18"/>
         </w:numPr>
         <w:spacing w:before="40" w:after="40"/>
       </w:pPr>
@@ -10422,7 +10819,7 @@
         <w:pStyle w:val="ListParagraph"/>
         <w:numPr>
           <w:ilvl w:val="0"/>
-          <w:numId w:val="14"/>
+          <w:numId w:val="18"/>
         </w:numPr>
         <w:spacing w:before="40" w:after="40"/>
       </w:pPr>
@@ -10435,7 +10832,7 @@
         <w:pStyle w:val="ListParagraph"/>
         <w:numPr>
           <w:ilvl w:val="0"/>
-          <w:numId w:val="14"/>
+          <w:numId w:val="18"/>
         </w:numPr>
         <w:spacing w:before="40" w:after="40"/>
       </w:pPr>
@@ -10448,7 +10845,7 @@
         <w:pStyle w:val="ListParagraph"/>
         <w:numPr>
           <w:ilvl w:val="0"/>
-          <w:numId w:val="14"/>
+          <w:numId w:val="18"/>
         </w:numPr>
         <w:spacing w:before="40" w:after="40"/>
       </w:pPr>
@@ -10461,7 +10858,7 @@
         <w:pStyle w:val="ListParagraph"/>
         <w:numPr>
           <w:ilvl w:val="0"/>
-          <w:numId w:val="14"/>
+          <w:numId w:val="18"/>
         </w:numPr>
         <w:spacing w:before="40" w:after="40"/>
       </w:pPr>
@@ -10483,7 +10880,6 @@
         <w:spacing w:before="60" w:after="60"/>
       </w:pPr>
       <w:r>
-        <w:lastRenderedPageBreak/>
         <w:t>Paste in: Section 2.8 (Notifications), the notifications and notification_preferences tables, and the Phase 7 build order entry.</w:t>
       </w:r>
     </w:p>
@@ -10504,7 +10900,7 @@
         <w:pStyle w:val="ListParagraph"/>
         <w:numPr>
           <w:ilvl w:val="0"/>
-          <w:numId w:val="14"/>
+          <w:numId w:val="18"/>
         </w:numPr>
         <w:spacing w:before="40" w:after="40"/>
       </w:pPr>
@@ -10526,6 +10922,7 @@
         <w:spacing w:before="60" w:after="60"/>
       </w:pPr>
       <w:r>
+        <w:lastRenderedPageBreak/>
         <w:t>Paste in: Section 2.9 (Pricing &amp; Tiers) and the Phase 8 build order entry.</w:t>
       </w:r>
     </w:p>
@@ -10546,7 +10943,7 @@
         <w:pStyle w:val="ListParagraph"/>
         <w:numPr>
           <w:ilvl w:val="0"/>
-          <w:numId w:val="14"/>
+          <w:numId w:val="18"/>
         </w:numPr>
         <w:spacing w:before="40" w:after="40"/>
       </w:pPr>
@@ -10588,7 +10985,7 @@
         <w:pStyle w:val="ListParagraph"/>
         <w:numPr>
           <w:ilvl w:val="0"/>
-          <w:numId w:val="14"/>
+          <w:numId w:val="18"/>
         </w:numPr>
         <w:spacing w:before="40" w:after="40"/>
       </w:pPr>
@@ -10613,7 +11010,7 @@
         <w:pStyle w:val="ListParagraph"/>
         <w:numPr>
           <w:ilvl w:val="0"/>
-          <w:numId w:val="14"/>
+          <w:numId w:val="18"/>
         </w:numPr>
         <w:spacing w:before="40" w:after="40"/>
       </w:pPr>
@@ -10626,7 +11023,7 @@
         <w:pStyle w:val="ListParagraph"/>
         <w:numPr>
           <w:ilvl w:val="0"/>
-          <w:numId w:val="14"/>
+          <w:numId w:val="18"/>
         </w:numPr>
         <w:spacing w:before="40" w:after="40"/>
       </w:pPr>
@@ -10639,7 +11036,7 @@
         <w:pStyle w:val="ListParagraph"/>
         <w:numPr>
           <w:ilvl w:val="0"/>
-          <w:numId w:val="14"/>
+          <w:numId w:val="18"/>
         </w:numPr>
         <w:spacing w:before="40" w:after="40"/>
       </w:pPr>
@@ -10652,7 +11049,7 @@
         <w:pStyle w:val="ListParagraph"/>
         <w:numPr>
           <w:ilvl w:val="0"/>
-          <w:numId w:val="14"/>
+          <w:numId w:val="18"/>
         </w:numPr>
         <w:spacing w:before="40" w:after="40"/>
       </w:pPr>
@@ -10665,7 +11062,7 @@
         <w:pStyle w:val="ListParagraph"/>
         <w:numPr>
           <w:ilvl w:val="0"/>
-          <w:numId w:val="14"/>
+          <w:numId w:val="18"/>
         </w:numPr>
         <w:spacing w:before="40" w:after="40"/>
       </w:pPr>
@@ -10678,7 +11075,7 @@
         <w:pStyle w:val="ListParagraph"/>
         <w:numPr>
           <w:ilvl w:val="0"/>
-          <w:numId w:val="14"/>
+          <w:numId w:val="18"/>
         </w:numPr>
         <w:spacing w:before="40" w:after="40"/>
       </w:pPr>
@@ -11445,6 +11842,118 @@
     </w:lvl>
   </w:abstractNum>
   <w:abstractNum w:abstractNumId="11" w15:restartNumberingAfterBreak="0">
+    <w:nsid w:val="580C086C"/>
+    <w:multiLevelType w:val="hybridMultilevel"/>
+    <w:tmpl w:val="93B06C82"/>
+    <w:lvl w:ilvl="0" w:tplc="30A6AAA2">
+      <w:start w:val="1"/>
+      <w:numFmt w:val="bullet"/>
+      <w:lvlText w:val=""/>
+      <w:lvlJc w:val="left"/>
+      <w:pPr>
+        <w:ind w:left="0"/>
+      </w:pPr>
+    </w:lvl>
+    <w:lvl w:ilvl="1" w:tplc="83B42676">
+      <w:start w:val="1"/>
+      <w:numFmt w:val="bullet"/>
+      <w:lvlText w:val="◦"/>
+      <w:lvlJc w:val="left"/>
+      <w:pPr>
+        <w:ind w:left="1080" w:hanging="360"/>
+      </w:pPr>
+    </w:lvl>
+    <w:lvl w:ilvl="2" w:tplc="D51E69DC">
+      <w:numFmt w:val="decimal"/>
+      <w:lvlText w:val=""/>
+      <w:lvlJc w:val="left"/>
+    </w:lvl>
+    <w:lvl w:ilvl="3" w:tplc="9820A142">
+      <w:numFmt w:val="decimal"/>
+      <w:lvlText w:val=""/>
+      <w:lvlJc w:val="left"/>
+    </w:lvl>
+    <w:lvl w:ilvl="4" w:tplc="EBDC0EBA">
+      <w:numFmt w:val="decimal"/>
+      <w:lvlText w:val=""/>
+      <w:lvlJc w:val="left"/>
+    </w:lvl>
+    <w:lvl w:ilvl="5" w:tplc="3A8C8A38">
+      <w:numFmt w:val="decimal"/>
+      <w:lvlText w:val=""/>
+      <w:lvlJc w:val="left"/>
+    </w:lvl>
+    <w:lvl w:ilvl="6" w:tplc="2CD0900C">
+      <w:numFmt w:val="decimal"/>
+      <w:lvlText w:val=""/>
+      <w:lvlJc w:val="left"/>
+    </w:lvl>
+    <w:lvl w:ilvl="7" w:tplc="9E50EC9A">
+      <w:numFmt w:val="decimal"/>
+      <w:lvlText w:val=""/>
+      <w:lvlJc w:val="left"/>
+    </w:lvl>
+    <w:lvl w:ilvl="8" w:tplc="69926BA0">
+      <w:numFmt w:val="decimal"/>
+      <w:lvlText w:val=""/>
+      <w:lvlJc w:val="left"/>
+    </w:lvl>
+  </w:abstractNum>
+  <w:abstractNum w:abstractNumId="12" w15:restartNumberingAfterBreak="0">
+    <w:nsid w:val="629F48FA"/>
+    <w:multiLevelType w:val="hybridMultilevel"/>
+    <w:tmpl w:val="E36644F0"/>
+    <w:lvl w:ilvl="0" w:tplc="3AB46AE4">
+      <w:start w:val="1"/>
+      <w:numFmt w:val="bullet"/>
+      <w:lvlText w:val="•"/>
+      <w:lvlJc w:val="left"/>
+      <w:pPr>
+        <w:ind w:left="720" w:hanging="360"/>
+      </w:pPr>
+    </w:lvl>
+    <w:lvl w:ilvl="1" w:tplc="15F4B796">
+      <w:numFmt w:val="decimal"/>
+      <w:lvlText w:val=""/>
+      <w:lvlJc w:val="left"/>
+    </w:lvl>
+    <w:lvl w:ilvl="2" w:tplc="7F4E7756">
+      <w:numFmt w:val="decimal"/>
+      <w:lvlText w:val=""/>
+      <w:lvlJc w:val="left"/>
+    </w:lvl>
+    <w:lvl w:ilvl="3" w:tplc="826E425E">
+      <w:numFmt w:val="decimal"/>
+      <w:lvlText w:val=""/>
+      <w:lvlJc w:val="left"/>
+    </w:lvl>
+    <w:lvl w:ilvl="4" w:tplc="5B58BD6A">
+      <w:numFmt w:val="decimal"/>
+      <w:lvlText w:val=""/>
+      <w:lvlJc w:val="left"/>
+    </w:lvl>
+    <w:lvl w:ilvl="5" w:tplc="FED498E0">
+      <w:numFmt w:val="decimal"/>
+      <w:lvlText w:val=""/>
+      <w:lvlJc w:val="left"/>
+    </w:lvl>
+    <w:lvl w:ilvl="6" w:tplc="71BA8758">
+      <w:numFmt w:val="decimal"/>
+      <w:lvlText w:val=""/>
+      <w:lvlJc w:val="left"/>
+    </w:lvl>
+    <w:lvl w:ilvl="7" w:tplc="B58C4058">
+      <w:numFmt w:val="decimal"/>
+      <w:lvlText w:val=""/>
+      <w:lvlJc w:val="left"/>
+    </w:lvl>
+    <w:lvl w:ilvl="8" w:tplc="DFA67BB8">
+      <w:numFmt w:val="decimal"/>
+      <w:lvlText w:val=""/>
+      <w:lvlJc w:val="left"/>
+    </w:lvl>
+  </w:abstractNum>
+  <w:abstractNum w:abstractNumId="13" w15:restartNumberingAfterBreak="0">
     <w:nsid w:val="6B6C68B6"/>
     <w:multiLevelType w:val="hybridMultilevel"/>
     <w:tmpl w:val="A4FC0218"/>
@@ -11498,7 +12007,7 @@
       <w:lvlJc w:val="left"/>
     </w:lvl>
   </w:abstractNum>
-  <w:abstractNum w:abstractNumId="12" w15:restartNumberingAfterBreak="0">
+  <w:abstractNum w:abstractNumId="14" w15:restartNumberingAfterBreak="0">
     <w:nsid w:val="6BD21823"/>
     <w:multiLevelType w:val="hybridMultilevel"/>
     <w:tmpl w:val="4FCEF8C2"/>
@@ -11556,7 +12065,65 @@
       <w:lvlJc w:val="left"/>
     </w:lvl>
   </w:abstractNum>
-  <w:abstractNum w:abstractNumId="13" w15:restartNumberingAfterBreak="0">
+  <w:abstractNum w:abstractNumId="15" w15:restartNumberingAfterBreak="0">
+    <w:nsid w:val="6E0056AB"/>
+    <w:multiLevelType w:val="hybridMultilevel"/>
+    <w:tmpl w:val="32EE4B7E"/>
+    <w:lvl w:ilvl="0" w:tplc="97FE966E">
+      <w:start w:val="1"/>
+      <w:numFmt w:val="bullet"/>
+      <w:lvlText w:val=""/>
+      <w:lvlJc w:val="left"/>
+      <w:pPr>
+        <w:ind w:left="0"/>
+      </w:pPr>
+    </w:lvl>
+    <w:lvl w:ilvl="1" w:tplc="8146E2DA">
+      <w:start w:val="1"/>
+      <w:numFmt w:val="bullet"/>
+      <w:lvlText w:val="◦"/>
+      <w:lvlJc w:val="left"/>
+      <w:pPr>
+        <w:ind w:left="1080" w:hanging="360"/>
+      </w:pPr>
+    </w:lvl>
+    <w:lvl w:ilvl="2" w:tplc="4B0EBE96">
+      <w:numFmt w:val="decimal"/>
+      <w:lvlText w:val=""/>
+      <w:lvlJc w:val="left"/>
+    </w:lvl>
+    <w:lvl w:ilvl="3" w:tplc="306E4EA4">
+      <w:numFmt w:val="decimal"/>
+      <w:lvlText w:val=""/>
+      <w:lvlJc w:val="left"/>
+    </w:lvl>
+    <w:lvl w:ilvl="4" w:tplc="4CCA697A">
+      <w:numFmt w:val="decimal"/>
+      <w:lvlText w:val=""/>
+      <w:lvlJc w:val="left"/>
+    </w:lvl>
+    <w:lvl w:ilvl="5" w:tplc="C980C488">
+      <w:numFmt w:val="decimal"/>
+      <w:lvlText w:val=""/>
+      <w:lvlJc w:val="left"/>
+    </w:lvl>
+    <w:lvl w:ilvl="6" w:tplc="3A10E8B2">
+      <w:numFmt w:val="decimal"/>
+      <w:lvlText w:val=""/>
+      <w:lvlJc w:val="left"/>
+    </w:lvl>
+    <w:lvl w:ilvl="7" w:tplc="B9209846">
+      <w:numFmt w:val="decimal"/>
+      <w:lvlText w:val=""/>
+      <w:lvlJc w:val="left"/>
+    </w:lvl>
+    <w:lvl w:ilvl="8" w:tplc="481CCA04">
+      <w:numFmt w:val="decimal"/>
+      <w:lvlText w:val=""/>
+      <w:lvlJc w:val="left"/>
+    </w:lvl>
+  </w:abstractNum>
+  <w:abstractNum w:abstractNumId="16" w15:restartNumberingAfterBreak="0">
     <w:nsid w:val="6E6901D5"/>
     <w:multiLevelType w:val="hybridMultilevel"/>
     <w:tmpl w:val="DF9E5B0C"/>
@@ -11614,7 +12181,7 @@
       <w:lvlJc w:val="left"/>
     </w:lvl>
   </w:abstractNum>
-  <w:abstractNum w:abstractNumId="14" w15:restartNumberingAfterBreak="0">
+  <w:abstractNum w:abstractNumId="17" w15:restartNumberingAfterBreak="0">
     <w:nsid w:val="7116229D"/>
     <w:multiLevelType w:val="hybridMultilevel"/>
     <w:tmpl w:val="549C3508"/>
@@ -11668,7 +12235,7 @@
       <w:lvlJc w:val="left"/>
     </w:lvl>
   </w:abstractNum>
-  <w:abstractNum w:abstractNumId="15" w15:restartNumberingAfterBreak="0">
+  <w:abstractNum w:abstractNumId="18" w15:restartNumberingAfterBreak="0">
     <w:nsid w:val="72805935"/>
     <w:multiLevelType w:val="hybridMultilevel"/>
     <w:tmpl w:val="11DCA6A0"/>
@@ -11717,6 +12284,60 @@
       <w:lvlJc w:val="left"/>
     </w:lvl>
     <w:lvl w:ilvl="8" w:tplc="7CBA7300">
+      <w:numFmt w:val="decimal"/>
+      <w:lvlText w:val=""/>
+      <w:lvlJc w:val="left"/>
+    </w:lvl>
+  </w:abstractNum>
+  <w:abstractNum w:abstractNumId="19" w15:restartNumberingAfterBreak="0">
+    <w:nsid w:val="7A4921BA"/>
+    <w:multiLevelType w:val="hybridMultilevel"/>
+    <w:tmpl w:val="29AAD890"/>
+    <w:lvl w:ilvl="0" w:tplc="A9BCFC30">
+      <w:start w:val="1"/>
+      <w:numFmt w:val="bullet"/>
+      <w:lvlText w:val="•"/>
+      <w:lvlJc w:val="left"/>
+      <w:pPr>
+        <w:ind w:left="720" w:hanging="360"/>
+      </w:pPr>
+    </w:lvl>
+    <w:lvl w:ilvl="1" w:tplc="4ACE24EC">
+      <w:numFmt w:val="decimal"/>
+      <w:lvlText w:val=""/>
+      <w:lvlJc w:val="left"/>
+    </w:lvl>
+    <w:lvl w:ilvl="2" w:tplc="C1962012">
+      <w:numFmt w:val="decimal"/>
+      <w:lvlText w:val=""/>
+      <w:lvlJc w:val="left"/>
+    </w:lvl>
+    <w:lvl w:ilvl="3" w:tplc="C2524548">
+      <w:numFmt w:val="decimal"/>
+      <w:lvlText w:val=""/>
+      <w:lvlJc w:val="left"/>
+    </w:lvl>
+    <w:lvl w:ilvl="4" w:tplc="39084D0E">
+      <w:numFmt w:val="decimal"/>
+      <w:lvlText w:val=""/>
+      <w:lvlJc w:val="left"/>
+    </w:lvl>
+    <w:lvl w:ilvl="5" w:tplc="8C422700">
+      <w:numFmt w:val="decimal"/>
+      <w:lvlText w:val=""/>
+      <w:lvlJc w:val="left"/>
+    </w:lvl>
+    <w:lvl w:ilvl="6" w:tplc="B0E494D6">
+      <w:numFmt w:val="decimal"/>
+      <w:lvlText w:val=""/>
+      <w:lvlJc w:val="left"/>
+    </w:lvl>
+    <w:lvl w:ilvl="7" w:tplc="74F2E2D6">
+      <w:numFmt w:val="decimal"/>
+      <w:lvlText w:val=""/>
+      <w:lvlJc w:val="left"/>
+    </w:lvl>
+    <w:lvl w:ilvl="8" w:tplc="F1A63030">
       <w:numFmt w:val="decimal"/>
       <w:lvlText w:val=""/>
       <w:lvlJc w:val="left"/>
@@ -11741,19 +12362,19 @@
     </w:lvlOverride>
   </w:num>
   <w:num w:numId="4" w16cid:durableId="796487070">
-    <w:abstractNumId w:val="11"/>
+    <w:abstractNumId w:val="13"/>
     <w:lvlOverride w:ilvl="0">
       <w:startOverride w:val="1"/>
     </w:lvlOverride>
   </w:num>
   <w:num w:numId="5" w16cid:durableId="309794570">
-    <w:abstractNumId w:val="13"/>
+    <w:abstractNumId w:val="16"/>
     <w:lvlOverride w:ilvl="0">
       <w:startOverride w:val="1"/>
     </w:lvlOverride>
   </w:num>
   <w:num w:numId="6" w16cid:durableId="479662805">
-    <w:abstractNumId w:val="14"/>
+    <w:abstractNumId w:val="17"/>
     <w:lvlOverride w:ilvl="0">
       <w:startOverride w:val="1"/>
     </w:lvlOverride>
@@ -11771,7 +12392,7 @@
     </w:lvlOverride>
   </w:num>
   <w:num w:numId="9" w16cid:durableId="55016373">
-    <w:abstractNumId w:val="12"/>
+    <w:abstractNumId w:val="14"/>
     <w:lvlOverride w:ilvl="0">
       <w:startOverride w:val="1"/>
     </w:lvlOverride>
@@ -11789,7 +12410,7 @@
     </w:lvlOverride>
   </w:num>
   <w:num w:numId="12" w16cid:durableId="1319573209">
-    <w:abstractNumId w:val="15"/>
+    <w:abstractNumId w:val="18"/>
     <w:lvlOverride w:ilvl="0">
       <w:startOverride w:val="1"/>
     </w:lvlOverride>
@@ -11808,6 +12429,30 @@
   </w:num>
   <w:num w:numId="15" w16cid:durableId="1335065698">
     <w:abstractNumId w:val="5"/>
+    <w:lvlOverride w:ilvl="0">
+      <w:startOverride w:val="1"/>
+    </w:lvlOverride>
+  </w:num>
+  <w:num w:numId="16" w16cid:durableId="1643844572">
+    <w:abstractNumId w:val="19"/>
+    <w:lvlOverride w:ilvl="0">
+      <w:startOverride w:val="1"/>
+    </w:lvlOverride>
+  </w:num>
+  <w:num w:numId="17" w16cid:durableId="1809738575">
+    <w:abstractNumId w:val="15"/>
+    <w:lvlOverride w:ilvl="0">
+      <w:startOverride w:val="1"/>
+    </w:lvlOverride>
+  </w:num>
+  <w:num w:numId="18" w16cid:durableId="803040082">
+    <w:abstractNumId w:val="12"/>
+    <w:lvlOverride w:ilvl="0">
+      <w:startOverride w:val="1"/>
+    </w:lvlOverride>
+  </w:num>
+  <w:num w:numId="19" w16cid:durableId="1166171277">
+    <w:abstractNumId w:val="11"/>
     <w:lvlOverride w:ilvl="0">
       <w:startOverride w:val="1"/>
     </w:lvlOverride>

</xml_diff>